<commit_message>
Documento: marca d'água do SENAI em todas as páginas
Capa com o papel timbrado completo do modelo; demais páginas sem o
texto do endereço do FIEMS, para não sobrepor o texto com a margem
inferior de 2 cm (ABNT).

Co-Authored-By: Claude Opus 5.5 <noreply@anthropic.com>
</commit_message>
<xml_diff>
--- a/Projeto_Integrador_QRCode_Lubrificantes.docx
+++ b/Projeto_Integrador_QRCode_Lubrificantes.docx
@@ -1275,7 +1275,7 @@
           <w:sz w:val="24"/>
           <w:szCs w:val="24"/>
         </w:rPr>
-        <w:t>20</w:t>
+        <w:t>19</w:t>
       </w:r>
       <w:r>
         <w:rPr>
@@ -12152,7 +12152,7 @@
           <wp:inline distT="0" distB="0" distL="0" distR="0">
             <wp:extent cx="1800225" cy="3895725"/>
             <wp:effectExtent l="0" t="0" r="0" b="0"/>
-            <wp:docPr id="1" name="Tela1" descr=""/>
+            <wp:docPr id="3" name="Tela1" descr=""/>
             <wp:cNvGraphicFramePr>
               <a:graphicFrameLocks xmlns:a="http://schemas.openxmlformats.org/drawingml/2006/main" noChangeAspect="1"/>
             </wp:cNvGraphicFramePr>
@@ -12160,7 +12160,7 @@
               <a:graphicData uri="http://schemas.openxmlformats.org/drawingml/2006/picture">
                 <pic:pic xmlns:pic="http://schemas.openxmlformats.org/drawingml/2006/picture">
                   <pic:nvPicPr>
-                    <pic:cNvPr id="1" name="Tela1" descr=""/>
+                    <pic:cNvPr id="3" name="Tela1" descr=""/>
                     <pic:cNvPicPr>
                       <a:picLocks noChangeAspect="1" noChangeArrowheads="1"/>
                     </pic:cNvPicPr>
@@ -12201,7 +12201,7 @@
           <wp:inline distT="0" distB="0" distL="0" distR="0">
             <wp:extent cx="1800225" cy="3895725"/>
             <wp:effectExtent l="0" t="0" r="0" b="0"/>
-            <wp:docPr id="2" name="Tela2" descr=""/>
+            <wp:docPr id="4" name="Tela2" descr=""/>
             <wp:cNvGraphicFramePr>
               <a:graphicFrameLocks xmlns:a="http://schemas.openxmlformats.org/drawingml/2006/main" noChangeAspect="1"/>
             </wp:cNvGraphicFramePr>
@@ -12209,7 +12209,7 @@
               <a:graphicData uri="http://schemas.openxmlformats.org/drawingml/2006/picture">
                 <pic:pic xmlns:pic="http://schemas.openxmlformats.org/drawingml/2006/picture">
                   <pic:nvPicPr>
-                    <pic:cNvPr id="2" name="Tela2" descr=""/>
+                    <pic:cNvPr id="4" name="Tela2" descr=""/>
                     <pic:cNvPicPr>
                       <a:picLocks noChangeAspect="1" noChangeArrowheads="1"/>
                     </pic:cNvPicPr>
@@ -12250,7 +12250,7 @@
           <wp:inline distT="0" distB="0" distL="0" distR="0">
             <wp:extent cx="1800225" cy="3895725"/>
             <wp:effectExtent l="0" t="0" r="0" b="0"/>
-            <wp:docPr id="3" name="Tela3" descr=""/>
+            <wp:docPr id="5" name="Tela3" descr=""/>
             <wp:cNvGraphicFramePr>
               <a:graphicFrameLocks xmlns:a="http://schemas.openxmlformats.org/drawingml/2006/main" noChangeAspect="1"/>
             </wp:cNvGraphicFramePr>
@@ -12258,7 +12258,7 @@
               <a:graphicData uri="http://schemas.openxmlformats.org/drawingml/2006/picture">
                 <pic:pic xmlns:pic="http://schemas.openxmlformats.org/drawingml/2006/picture">
                   <pic:nvPicPr>
-                    <pic:cNvPr id="3" name="Tela3" descr=""/>
+                    <pic:cNvPr id="5" name="Tela3" descr=""/>
                     <pic:cNvPicPr>
                       <a:picLocks noChangeAspect="1" noChangeArrowheads="1"/>
                     </pic:cNvPicPr>
@@ -12330,6 +12330,51 @@
     </w:pPr>
     <w:r>
       <w:rPr/>
+      <w:drawing>
+        <wp:anchor behindDoc="1" distT="0" distB="0" distL="0" distR="0" simplePos="0" locked="0" layoutInCell="0" allowOverlap="1" relativeHeight="2">
+          <wp:simplePos x="0" y="0"/>
+          <wp:positionH relativeFrom="page">
+            <wp:posOffset>0</wp:posOffset>
+          </wp:positionH>
+          <wp:positionV relativeFrom="page">
+            <wp:posOffset>0</wp:posOffset>
+          </wp:positionV>
+          <wp:extent cx="7560310" cy="10692130"/>
+          <wp:effectExtent l="0" t="0" r="0" b="0"/>
+          <wp:wrapNone/>
+          <wp:docPr id="1" name="MarcaDaguaSENAI1" descr=""/>
+          <wp:cNvGraphicFramePr>
+            <a:graphicFrameLocks xmlns:a="http://schemas.openxmlformats.org/drawingml/2006/main" noChangeAspect="1"/>
+          </wp:cNvGraphicFramePr>
+          <a:graphic xmlns:a="http://schemas.openxmlformats.org/drawingml/2006/main">
+            <a:graphicData uri="http://schemas.openxmlformats.org/drawingml/2006/picture">
+              <pic:pic xmlns:pic="http://schemas.openxmlformats.org/drawingml/2006/picture">
+                <pic:nvPicPr>
+                  <pic:cNvPr id="1" name="MarcaDaguaSENAI1" descr=""/>
+                  <pic:cNvPicPr>
+                    <a:picLocks noChangeAspect="1" noChangeArrowheads="1"/>
+                  </pic:cNvPicPr>
+                </pic:nvPicPr>
+                <pic:blipFill>
+                  <a:blip r:embed="rId1"/>
+                  <a:stretch>
+                    <a:fillRect/>
+                  </a:stretch>
+                </pic:blipFill>
+                <pic:spPr bwMode="auto">
+                  <a:xfrm>
+                    <a:off x="0" y="0"/>
+                    <a:ext cx="7560310" cy="10692130"/>
+                  </a:xfrm>
+                  <a:prstGeom prst="rect">
+                    <a:avLst/>
+                  </a:prstGeom>
+                </pic:spPr>
+              </pic:pic>
+            </a:graphicData>
+          </a:graphic>
+        </wp:anchor>
+      </w:drawing>
     </w:r>
   </w:p>
 </w:hdr>
@@ -12344,6 +12389,51 @@
     </w:pPr>
     <w:r>
       <w:rPr/>
+      <w:drawing>
+        <wp:anchor behindDoc="1" distT="0" distB="0" distL="0" distR="0" simplePos="0" locked="0" layoutInCell="0" allowOverlap="1" relativeHeight="10">
+          <wp:simplePos x="0" y="0"/>
+          <wp:positionH relativeFrom="page">
+            <wp:posOffset>0</wp:posOffset>
+          </wp:positionH>
+          <wp:positionV relativeFrom="page">
+            <wp:posOffset>0</wp:posOffset>
+          </wp:positionV>
+          <wp:extent cx="7560310" cy="10692130"/>
+          <wp:effectExtent l="0" t="0" r="0" b="0"/>
+          <wp:wrapNone/>
+          <wp:docPr id="2" name="MarcaDaguaSENAI2" descr=""/>
+          <wp:cNvGraphicFramePr>
+            <a:graphicFrameLocks xmlns:a="http://schemas.openxmlformats.org/drawingml/2006/main" noChangeAspect="1"/>
+          </wp:cNvGraphicFramePr>
+          <a:graphic xmlns:a="http://schemas.openxmlformats.org/drawingml/2006/main">
+            <a:graphicData uri="http://schemas.openxmlformats.org/drawingml/2006/picture">
+              <pic:pic xmlns:pic="http://schemas.openxmlformats.org/drawingml/2006/picture">
+                <pic:nvPicPr>
+                  <pic:cNvPr id="2" name="MarcaDaguaSENAI2" descr=""/>
+                  <pic:cNvPicPr>
+                    <a:picLocks noChangeAspect="1" noChangeArrowheads="1"/>
+                  </pic:cNvPicPr>
+                </pic:nvPicPr>
+                <pic:blipFill>
+                  <a:blip r:embed="rId1"/>
+                  <a:stretch>
+                    <a:fillRect/>
+                  </a:stretch>
+                </pic:blipFill>
+                <pic:spPr bwMode="auto">
+                  <a:xfrm>
+                    <a:off x="0" y="0"/>
+                    <a:ext cx="7560310" cy="10692130"/>
+                  </a:xfrm>
+                  <a:prstGeom prst="rect">
+                    <a:avLst/>
+                  </a:prstGeom>
+                </pic:spPr>
+              </pic:pic>
+            </a:graphicData>
+          </a:graphic>
+        </wp:anchor>
+      </w:drawing>
     </w:r>
   </w:p>
 </w:hdr>
@@ -12365,6 +12455,51 @@
         <w:sz w:val="20"/>
         <w:szCs w:val="20"/>
       </w:rPr>
+      <w:drawing>
+        <wp:anchor behindDoc="1" distT="0" distB="0" distL="0" distR="0" simplePos="0" locked="0" layoutInCell="0" allowOverlap="1" relativeHeight="15">
+          <wp:simplePos x="0" y="0"/>
+          <wp:positionH relativeFrom="page">
+            <wp:posOffset>0</wp:posOffset>
+          </wp:positionH>
+          <wp:positionV relativeFrom="page">
+            <wp:posOffset>0</wp:posOffset>
+          </wp:positionV>
+          <wp:extent cx="7560310" cy="10692130"/>
+          <wp:effectExtent l="0" t="0" r="0" b="0"/>
+          <wp:wrapNone/>
+          <wp:docPr id="6" name="MarcaDaguaSENAI3" descr=""/>
+          <wp:cNvGraphicFramePr>
+            <a:graphicFrameLocks xmlns:a="http://schemas.openxmlformats.org/drawingml/2006/main" noChangeAspect="1"/>
+          </wp:cNvGraphicFramePr>
+          <a:graphic xmlns:a="http://schemas.openxmlformats.org/drawingml/2006/main">
+            <a:graphicData uri="http://schemas.openxmlformats.org/drawingml/2006/picture">
+              <pic:pic xmlns:pic="http://schemas.openxmlformats.org/drawingml/2006/picture">
+                <pic:nvPicPr>
+                  <pic:cNvPr id="6" name="MarcaDaguaSENAI3" descr=""/>
+                  <pic:cNvPicPr>
+                    <a:picLocks noChangeAspect="1" noChangeArrowheads="1"/>
+                  </pic:cNvPicPr>
+                </pic:nvPicPr>
+                <pic:blipFill>
+                  <a:blip r:embed="rId1"/>
+                  <a:stretch>
+                    <a:fillRect/>
+                  </a:stretch>
+                </pic:blipFill>
+                <pic:spPr bwMode="auto">
+                  <a:xfrm>
+                    <a:off x="0" y="0"/>
+                    <a:ext cx="7560310" cy="10692130"/>
+                  </a:xfrm>
+                  <a:prstGeom prst="rect">
+                    <a:avLst/>
+                  </a:prstGeom>
+                </pic:spPr>
+              </pic:pic>
+            </a:graphicData>
+          </a:graphic>
+        </wp:anchor>
+      </w:drawing>
       <w:fldChar w:fldCharType="begin"/>
     </w:r>
     <w:r>

</xml_diff>

<commit_message>
Documento: vida útil do óleo automática, horas rodadas, tag e cor do óleo; novas telas na Figura 1
Backup da versão anterior em backup_2026-10-08/*_antes_funcoes_novas.*

Co-Authored-By: Claude Opus 5.5 <noreply@anthropic.com>
</commit_message>
<xml_diff>
--- a/Projeto_Integrador_QRCode_Lubrificantes.docx
+++ b/Projeto_Integrador_QRCode_Lubrificantes.docx
@@ -1189,7 +1189,7 @@
           <w:sz w:val="24"/>
           <w:szCs w:val="24"/>
         </w:rPr>
-        <w:t>26</w:t>
+        <w:t>27</w:t>
       </w:r>
       <w:r>
         <w:rPr>
@@ -1275,7 +1275,7 @@
           <w:sz w:val="24"/>
           <w:szCs w:val="24"/>
         </w:rPr>
-        <w:t>19</w:t>
+        <w:t>20</w:t>
       </w:r>
       <w:r>
         <w:rPr>
@@ -1403,7 +1403,7 @@
           <w:sz w:val="24"/>
           <w:szCs w:val="24"/>
         </w:rPr>
-        <w:t>20</w:t>
+        <w:t>21</w:t>
       </w:r>
       <w:r>
         <w:rPr>
@@ -3081,7 +3081,7 @@
           <w:sz w:val="24"/>
           <w:szCs w:val="24"/>
         </w:rPr>
-        <w:t>17</w:t>
+        <w:t>18</w:t>
       </w:r>
       <w:r>
         <w:rPr>
@@ -3211,7 +3211,7 @@
           <w:sz w:val="24"/>
           <w:szCs w:val="24"/>
         </w:rPr>
-        <w:t>19</w:t>
+        <w:t>20</w:t>
       </w:r>
       <w:r>
         <w:rPr>
@@ -3277,7 +3277,7 @@
           <w:sz w:val="24"/>
           <w:szCs w:val="24"/>
         </w:rPr>
-        <w:t>19</w:t>
+        <w:t>20</w:t>
       </w:r>
       <w:r>
         <w:rPr>
@@ -3343,7 +3343,7 @@
           <w:sz w:val="24"/>
           <w:szCs w:val="24"/>
         </w:rPr>
-        <w:t>20</w:t>
+        <w:t>21</w:t>
       </w:r>
       <w:r>
         <w:rPr>
@@ -3409,7 +3409,7 @@
           <w:sz w:val="24"/>
           <w:szCs w:val="24"/>
         </w:rPr>
-        <w:t>22</w:t>
+        <w:t>23</w:t>
       </w:r>
       <w:r>
         <w:rPr>
@@ -3473,7 +3473,7 @@
           <w:sz w:val="24"/>
           <w:szCs w:val="24"/>
         </w:rPr>
-        <w:t>23</w:t>
+        <w:t>24</w:t>
       </w:r>
       <w:r>
         <w:rPr>
@@ -3537,7 +3537,7 @@
           <w:sz w:val="24"/>
           <w:szCs w:val="24"/>
         </w:rPr>
-        <w:t>24</w:t>
+        <w:t>25</w:t>
       </w:r>
       <w:r>
         <w:rPr>
@@ -3601,7 +3601,7 @@
           <w:sz w:val="24"/>
           <w:szCs w:val="24"/>
         </w:rPr>
-        <w:t>25</w:t>
+        <w:t>26</w:t>
       </w:r>
       <w:r>
         <w:rPr>
@@ -3675,7 +3675,7 @@
           <w:sz w:val="24"/>
           <w:szCs w:val="24"/>
         </w:rPr>
-        <w:t>26</w:t>
+        <w:t>27</w:t>
       </w:r>
       <w:r>
         <w:rPr>
@@ -6345,6 +6345,92 @@
                 <w:sz w:val="20"/>
                 <w:szCs w:val="20"/>
               </w:rPr>
+              <w:t>Requisição ao almoxarifado</w:t>
+            </w:r>
+          </w:p>
+        </w:tc>
+        <w:tc>
+          <w:tcPr>
+            <w:tcW w:w="5771" w:type="dxa"/>
+            <w:tcBorders>
+              <w:top w:val="single" w:sz="4" w:space="0" w:color="000000"/>
+              <w:left w:val="single" w:sz="4" w:space="0" w:color="000000"/>
+              <w:bottom w:val="single" w:sz="4" w:space="0" w:color="000000"/>
+              <w:right w:val="single" w:sz="4" w:space="0" w:color="000000"/>
+            </w:tcBorders>
+            <w:vAlign w:val="center"/>
+          </w:tcPr>
+          <w:p>
+            <w:pPr>
+              <w:pStyle w:val="Normal"/>
+              <w:spacing w:lineRule="auto" w:line="240" w:before="0" w:after="0"/>
+              <w:jc w:val="left"/>
+              <w:rPr>
+                <w:b w:val="false"/>
+                <w:b w:val="false"/>
+                <w:bCs w:val="false"/>
+                <w:sz w:val="20"/>
+                <w:szCs w:val="20"/>
+              </w:rPr>
+            </w:pPr>
+            <w:r>
+              <w:rPr>
+                <w:b w:val="false"/>
+                <w:bCs w:val="false"/>
+                <w:sz w:val="20"/>
+                <w:szCs w:val="20"/>
+              </w:rPr>
+              <w:t xml:space="preserve">Tag RED-001-OLE-01; galão identificado pela cor azul </w:t>
+            </w:r>
+            <w:r>
+              <w:rPr>
+                <w:b w:val="false"/>
+                <w:bCs w:val="false"/>
+                <w:sz w:val="20"/>
+                <w:szCs w:val="20"/>
+                <w:shd w:fill="FFFF00" w:val="clear"/>
+              </w:rPr>
+              <w:t>[confirmar o código e a cor adotados]</w:t>
+            </w:r>
+          </w:p>
+        </w:tc>
+      </w:tr>
+      <w:tr>
+        <w:trPr>
+          <w:cantSplit w:val="true"/>
+        </w:trPr>
+        <w:tc>
+          <w:tcPr>
+            <w:tcW w:w="3300" w:type="dxa"/>
+            <w:tcBorders>
+              <w:top w:val="single" w:sz="4" w:space="0" w:color="000000"/>
+              <w:left w:val="single" w:sz="4" w:space="0" w:color="000000"/>
+              <w:bottom w:val="single" w:sz="4" w:space="0" w:color="000000"/>
+              <w:right w:val="single" w:sz="4" w:space="0" w:color="000000"/>
+            </w:tcBorders>
+            <w:vAlign w:val="center"/>
+          </w:tcPr>
+          <w:p>
+            <w:pPr>
+              <w:pStyle w:val="Normal"/>
+              <w:keepNext w:val="true"/>
+              <w:spacing w:lineRule="auto" w:line="240" w:before="0" w:after="0"/>
+              <w:jc w:val="left"/>
+              <w:rPr>
+                <w:b/>
+                <w:b/>
+                <w:bCs/>
+                <w:sz w:val="20"/>
+                <w:szCs w:val="20"/>
+              </w:rPr>
+            </w:pPr>
+            <w:r>
+              <w:rPr>
+                <w:b/>
+                <w:bCs/>
+                <w:sz w:val="20"/>
+                <w:szCs w:val="20"/>
+              </w:rPr>
               <w:t>Descarte do óleo usado</w:t>
             </w:r>
           </w:p>
@@ -6459,6 +6545,68 @@
       <w:r>
         <w:rPr/>
         <w:t>O registro da lubrificação foi projetado para ser feito em poucos toques: o mecânico escolhe o tipo de intervenção (inspeção, complemento ou troca) e confirma, em um único item de checklist, que o equipamento está bloqueado e o bocal limpo; na troca, a quantidade já aparece preenchida com o volume correspondente à posição de trabalho adotada; há um campo opcional para a temperatura da carcaça e o nome do responsável fica memorizado no aparelho. O histórico dos últimos registros fica recolhido na tela, para não atrapalhar a consulta. O QR Code é gerado a partir do endereço da página de cada equipamento.</w:t>
+      </w:r>
+    </w:p>
+    <w:p>
+      <w:pPr>
+        <w:pStyle w:val="Normal"/>
+        <w:widowControl/>
+        <w:spacing w:lineRule="auto" w:line="360" w:before="0" w:after="0"/>
+        <w:ind w:left="0" w:right="0" w:firstLine="709"/>
+        <w:jc w:val="both"/>
+        <w:rPr/>
+      </w:pPr>
+      <w:r>
+        <w:rPr/>
+        <w:t>Para que o mecânico não precise calcular nem digitar o tempo de uso do óleo, a ficha apresenta, no topo da tela, a situação da vida útil do lubrificante. A página toma a data da última troca registrada e o regime de trabalho cadastrado para o equipamento (operação contínua, 24 h por dia, sete dias por semana), estima as horas trabalhadas pelo número de dias decorridos e compara o resultado com o intervalo de troca correspondente à temperatura de trabalho do óleo.</w:t>
+      </w:r>
+      <w:r>
+        <w:rPr>
+          <w:vertAlign w:val="superscript"/>
+        </w:rPr>
+        <w:t>2</w:t>
+      </w:r>
+      <w:r>
+        <w:rPr/>
+        <w:t xml:space="preserve"> São exibidas a data da última troca, a data prevista para a próxima e uma indicação por cores, segundo critério adotado pelos autores: verde até 80% do intervalo, amarelo nos últimos 20% e vermelho quando o limite é ultrapassado, cada uma acompanhada da orientação sobre o que fazer. Ao registrar uma troca, a contagem recomeça automaticamente a partir daquela data. Os ajustes ficam recolhidos em uma área separada, destinada ao planejamento da manutenção, na qual é possível corrigir a data, descontar horas de parada, alterar a temperatura de trabalho ou, quando o equipamento dispõe de horímetro, usar a leitura do instrumento no lugar da estimativa.</w:t>
+      </w:r>
+    </w:p>
+    <w:p>
+      <w:pPr>
+        <w:pStyle w:val="Normal"/>
+        <w:widowControl/>
+        <w:spacing w:lineRule="auto" w:line="360" w:before="0" w:after="0"/>
+        <w:ind w:left="0" w:right="0" w:firstLine="709"/>
+        <w:jc w:val="both"/>
+        <w:rPr/>
+      </w:pPr>
+      <w:r>
+        <w:rPr/>
+        <w:t>Além da lubrificação, a página oferece um roteiro de inspeção do redutor, com um modelo tridimensional das peças e uma lista de verificação. Quando o horímetro é informado na inspeção, a página calcula, durante a digitação, as horas trabalhadas desde a inspeção anterior e, no modo com horímetro, soma esse valor às horas de uso do óleo.</w:t>
+      </w:r>
+    </w:p>
+    <w:p>
+      <w:pPr>
+        <w:pStyle w:val="Normal"/>
+        <w:widowControl/>
+        <w:spacing w:lineRule="auto" w:line="360" w:before="0" w:after="0"/>
+        <w:ind w:left="0" w:right="0" w:firstLine="709"/>
+        <w:jc w:val="both"/>
+        <w:rPr/>
+      </w:pPr>
+      <w:r>
+        <w:rPr/>
+        <w:t xml:space="preserve">A ficha também informa como requisitar o lubrificante ao almoxarifado. Cada óleo recebe um código de identificação (tag) no mesmo padrão dos códigos das peças mostrados no roteiro de inspeção, formado pelo código do equipamento e pelo código do item (RED-001-OLE-01), e uma cor, que é a mesma do galão em que o produto é armazenado </w:t>
+      </w:r>
+      <w:r>
+        <w:rPr>
+          <w:shd w:fill="FFFF00" w:val="clear"/>
+        </w:rPr>
+        <w:t>[confirmar o código e a cor adotados]</w:t>
+      </w:r>
+      <w:r>
+        <w:rPr/>
+        <w:t>. O tag e a cor aparecem na ficha, na orientação de troca e na etiqueta fixada no equipamento, o que reduz o risco de aplicação de um produto incorreto.</w:t>
       </w:r>
     </w:p>
     <w:p>
@@ -9590,7 +9738,7 @@
       </w:pPr>
       <w:r>
         <w:rPr/>
-        <w:t>Como limitações do estudo, citam-se a ausência do equipamento físico, que fez com que os dados fossem obtidos apenas da documentação do fabricante e que a cronometragem fosse realizada em simulação; a não inclusão do deslocamento e da consulta ao supervisor no método tradicional; o número reduzido de participantes, que impede generalizar os valores para outros contextos; o efeito de aprendizado entre os métodos, que a ordem contrabalanceada reduz, mas não elimina; o uso de intervalos de troca do manual geral da linha coroa e rosca do fabricante, que devem ser confirmados para o modelo WCR28; a falta de informação sobre a localização dos bujões no tamanho 28; a dependência de que a ficha esteja sempre atualizada; a necessidade de um celular com câmera e de conexão com a internet no primeiro acesso à ficha; e o armazenamento dos registros em cada aparelho, sem uma base central que reúna o histórico de todos os usuários. Essas limitações indicam caminhos para trabalhos futuros.</w:t>
+        <w:t>Como limitações do estudo, citam-se a ausência do equipamento físico, que fez com que os dados fossem obtidos apenas da documentação do fabricante e que a cronometragem fosse realizada em simulação; a não inclusão do deslocamento e da consulta ao supervisor no método tradicional; o número reduzido de participantes, que impede generalizar os valores para outros contextos; o efeito de aprendizado entre os métodos, que a ordem contrabalanceada reduz, mas não elimina; o uso de intervalos de troca do manual geral da linha coroa e rosca do fabricante, que devem ser confirmados para o modelo WCR28; a falta de informação sobre a localização dos bujões no tamanho 28; a dependência de que a ficha esteja sempre atualizada; a necessidade de um celular com câmera e de conexão com a internet no primeiro acesso à ficha; a estimativa das horas trabalhadas pelo tempo decorrido desde a última troca, que supõe operação contínua e só desconta as paradas informadas manualmente; e o armazenamento dos registros em cada aparelho, sem uma base central que reúna o histórico de todos os usuários. Essas limitações indicam caminhos para trabalhos futuros.</w:t>
       </w:r>
       <w:r>
         <w:br w:type="page"/>
@@ -9659,7 +9807,7 @@
       </w:pPr>
       <w:r>
         <w:rPr/>
-        <w:t>Como sugestões para trabalhos futuros, propõem-se a aplicação da solução em um redutor instalado em campo, com mecânicos de manutenção, a ampliação para outros equipamentos da planta, a sincronização dos registros de todos os aparelhos em um banco de dados central, o registro periódico da temperatura da carcaça para acompanhar a condição do óleo, a avaliação de etiquetas NFC para metal em pontos de leitura difícil e a integração do histórico de lubrificações ao sistema de PCM da empresa.</w:t>
+        <w:t>Como sugestões para trabalhos futuros, propõem-se a aplicação da solução em um redutor instalado em campo, com mecânicos de manutenção, a ampliação para outros equipamentos da planta, a sincronização dos registros de todos os aparelhos em um banco de dados central, o registro periódico da temperatura da carcaça para acompanhar a condição do óleo, a avaliação de etiquetas NFC para metal em pontos de leitura difícil, a leitura automática das horas de operação por horímetro ou sensor, em substituição à estimativa pelo tempo decorrido, e a integração do histórico de lubrificações ao sistema de PCM da empresa.</w:t>
       </w:r>
       <w:r>
         <w:br w:type="page"/>
@@ -12085,7 +12233,7 @@
       </w:r>
       <w:r>
         <w:rPr/>
-        <w:t xml:space="preserve"> Como regra prática, a distância de leitura é de cerca de dez vezes o lado do código; um código de 3 cm × 3 cm permite leitura a aproximadamente 30 cm. Dimensão adotada: 3 cm × 3 cm. Endereço codificado: https://ficha-lubrificacao.vercel.app/e/RED-001.</w:t>
+        <w:t xml:space="preserve"> Como regra prática, a distância de leitura é de cerca de dez vezes o lado do código; um código de 3 cm × 3 cm permite leitura a aproximadamente 30 cm. Dimensão adotada: 3 cm × 3 cm. Endereço codificado: https://ficha-lubrificacao.vercel.app/e/RED-001. Além do QR Code e do código do equipamento, a etiqueta traz a cor do galão e o tag do óleo, com o nome da cor escrito por extenso, para que a identificação não dependa de impressão colorida.</w:t>
       </w:r>
       <w:r>
         <w:br w:type="page"/>
@@ -12135,7 +12283,7 @@
           <w:sz w:val="20"/>
           <w:szCs w:val="20"/>
         </w:rPr>
-        <w:t>Figura 1 – Telas da ficha digital do redutor RED-001: informações de lubrificação e alerta de segurança (à esquerda), formulário de registro (ao centro) e histórico de registros (à direita)</w:t>
+        <w:t>Figura 1 – Telas da ficha digital do redutor RED-001: vida útil do óleo, com as datas da última e da próxima troca (à esquerda); lubrificante, com o tag e a cor do galão, e alerta de segurança (ao centro); registro da intervenção e histórico (à direita)</w:t>
       </w:r>
     </w:p>
     <w:p>
@@ -12521,7 +12669,7 @@
         <w:sz w:val="20"/>
         <w:szCs w:val="20"/>
       </w:rPr>
-      <w:t>26</w:t>
+      <w:t>27</w:t>
     </w:r>
     <w:r>
       <w:rPr>

</xml_diff>

<commit_message>
Amostra de óleo: repor o que foi retirado, sem coleta para laboratório no WCR28 (ficha, checklist e documento)
Co-Authored-By: Claude Opus 5.5 <noreply@anthropic.com>
</commit_message>
<xml_diff>
--- a/Projeto_Integrador_QRCode_Lubrificantes.docx
+++ b/Projeto_Integrador_QRCode_Lubrificantes.docx
@@ -1125,7 +1125,7 @@
           <w:sz w:val="24"/>
           <w:szCs w:val="24"/>
         </w:rPr>
-        <w:t>18</w:t>
+        <w:t>19</w:t>
       </w:r>
       <w:r>
         <w:rPr>
@@ -6583,6 +6583,40 @@
       <w:r>
         <w:rPr/>
         <w:t>Além da lubrificação, a página oferece um roteiro de inspeção do redutor, com um modelo tridimensional das peças e uma lista de verificação. Quando o horímetro é informado na inspeção, a página calcula, durante a digitação, as horas trabalhadas desde a inspeção anterior e, no modo com horímetro, soma esse valor às horas de uso do óleo.</w:t>
+      </w:r>
+    </w:p>
+    <w:p>
+      <w:pPr>
+        <w:pStyle w:val="Normal"/>
+        <w:widowControl/>
+        <w:spacing w:lineRule="auto" w:line="360" w:before="0" w:after="0"/>
+        <w:ind w:left="0" w:right="0" w:firstLine="709"/>
+        <w:jc w:val="both"/>
+        <w:rPr/>
+      </w:pPr>
+      <w:r>
+        <w:rPr/>
+        <w:t>O acompanhamento da condição do óleo por análise em laboratório, usual em redutores de maior porte, exige a retirada de uma amostra e a reposição do volume retirado com o mesmo lubrificante, com registro da quantidade. O manual do fabricante orienta verificar o nível e completá-lo, quando necessário, com o lubrificante recomendado, usar nas trocas o mesmo óleo indicado na plaqueta, não misturar óleos de tipos e fabricantes diferentes e substituir o óleo que estiver contaminado ou com partículas.</w:t>
+      </w:r>
+      <w:r>
+        <w:rPr>
+          <w:vertAlign w:val="superscript"/>
+        </w:rPr>
+        <w:t>2</w:t>
+      </w:r>
+      <w:r>
+        <w:rPr/>
+        <w:t xml:space="preserve"> No redutor estudado, cuja carga total é de 30 mL na posição M1, a coleta para laboratório não é viável, pois o frasco de amostra tende a exigir volume superior ao do próprio redutor </w:t>
+      </w:r>
+      <w:r>
+        <w:rPr>
+          <w:shd w:fill="FFFF00" w:val="clear"/>
+        </w:rPr>
+        <w:t>[confirmar com o laboratório o volume mínimo de amostra]</w:t>
+      </w:r>
+      <w:r>
+        <w:rPr/>
+        <w:t>. Por isso, o roteiro de inspeção adota a observação visual de uma pequena quantidade de óleo (cor, transparência e presença de partículas), associada à temperatura da carcaça e às horas de uso, e orienta repor o que foi retirado e registrar a intervenção como complemento.</w:t>
       </w:r>
     </w:p>
     <w:p>
@@ -9738,7 +9772,7 @@
       </w:pPr>
       <w:r>
         <w:rPr/>
-        <w:t>Como limitações do estudo, citam-se a ausência do equipamento físico, que fez com que os dados fossem obtidos apenas da documentação do fabricante e que a cronometragem fosse realizada em simulação; a não inclusão do deslocamento e da consulta ao supervisor no método tradicional; o número reduzido de participantes, que impede generalizar os valores para outros contextos; o efeito de aprendizado entre os métodos, que a ordem contrabalanceada reduz, mas não elimina; o uso de intervalos de troca do manual geral da linha coroa e rosca do fabricante, que devem ser confirmados para o modelo WCR28; a falta de informação sobre a localização dos bujões no tamanho 28; a dependência de que a ficha esteja sempre atualizada; a necessidade de um celular com câmera e de conexão com a internet no primeiro acesso à ficha; a estimativa das horas trabalhadas pelo tempo decorrido desde a última troca, que supõe operação contínua e só desconta as paradas informadas manualmente; e o armazenamento dos registros em cada aparelho, sem uma base central que reúna o histórico de todos os usuários. Essas limitações indicam caminhos para trabalhos futuros.</w:t>
+        <w:t>Como limitações do estudo, citam-se a ausência do equipamento físico, que fez com que os dados fossem obtidos apenas da documentação do fabricante e que a cronometragem fosse realizada em simulação; a não inclusão do deslocamento e da consulta ao supervisor no método tradicional; o número reduzido de participantes, que impede generalizar os valores para outros contextos; o efeito de aprendizado entre os métodos, que a ordem contrabalanceada reduz, mas não elimina; o uso de intervalos de troca do manual geral da linha coroa e rosca do fabricante, que devem ser confirmados para o modelo WCR28, uma vez que o mesmo manual traz também a indicação geral de troca a cada 3.500 horas ou anualmente; a falta de informação sobre a localização dos bujões no tamanho 28; a dependência de que a ficha esteja sempre atualizada; a necessidade de um celular com câmera e de conexão com a internet no primeiro acesso à ficha; a estimativa das horas trabalhadas pelo tempo decorrido desde a última troca, que supõe operação contínua e só desconta as paradas informadas manualmente; e o armazenamento dos registros em cada aparelho, sem uma base central que reúna o histórico de todos os usuários. Essas limitações indicam caminhos para trabalhos futuros.</w:t>
       </w:r>
       <w:r>
         <w:br w:type="page"/>
@@ -9807,7 +9841,7 @@
       </w:pPr>
       <w:r>
         <w:rPr/>
-        <w:t>Como sugestões para trabalhos futuros, propõem-se a aplicação da solução em um redutor instalado em campo, com mecânicos de manutenção, a ampliação para outros equipamentos da planta, a sincronização dos registros de todos os aparelhos em um banco de dados central, o registro periódico da temperatura da carcaça para acompanhar a condição do óleo, a avaliação de etiquetas NFC para metal em pontos de leitura difícil, a leitura automática das horas de operação por horímetro ou sensor, em substituição à estimativa pelo tempo decorrido, e a integração do histórico de lubrificações ao sistema de PCM da empresa.</w:t>
+        <w:t>Como sugestões para trabalhos futuros, propõem-se a aplicação da solução em um redutor instalado em campo, com mecânicos de manutenção, a ampliação para outros equipamentos da planta, a sincronização dos registros de todos os aparelhos em um banco de dados central, o registro periódico da temperatura da carcaça para acompanhar a condição do óleo, a avaliação de etiquetas NFC para metal em pontos de leitura difícil, a leitura automática das horas de operação por horímetro ou sensor, em substituição à estimativa pelo tempo decorrido, a inclusão da análise de óleo em laboratório, com coleta de amostra e reposição do volume, em redutores de maior porte, e a integração do histórico de lubrificações ao sistema de PCM da empresa.</w:t>
       </w:r>
       <w:r>
         <w:br w:type="page"/>

</xml_diff>

<commit_message>
Chão de fábrica: lista Leve com você, tempo da intervenção automático, foto no registro, tudo conforme em um toque e proposta de integração com SAP (simulada); documento atualizado
Co-Authored-By: Claude Opus 5.5 <noreply@anthropic.com>
</commit_message>
<xml_diff>
--- a/Projeto_Integrador_QRCode_Lubrificantes.docx
+++ b/Projeto_Integrador_QRCode_Lubrificantes.docx
@@ -1189,7 +1189,7 @@
           <w:sz w:val="24"/>
           <w:szCs w:val="24"/>
         </w:rPr>
-        <w:t>27</w:t>
+        <w:t>28</w:t>
       </w:r>
       <w:r>
         <w:rPr>
@@ -1275,7 +1275,7 @@
           <w:sz w:val="24"/>
           <w:szCs w:val="24"/>
         </w:rPr>
-        <w:t>20</w:t>
+        <w:t>21</w:t>
       </w:r>
       <w:r>
         <w:rPr>
@@ -1339,7 +1339,7 @@
           <w:sz w:val="24"/>
           <w:szCs w:val="24"/>
         </w:rPr>
-        <w:t>20</w:t>
+        <w:t>21</w:t>
       </w:r>
       <w:r>
         <w:rPr>
@@ -1703,12 +1703,12 @@
           <w:b/>
           <w:bCs/>
         </w:rPr>
-        <w:t>MTTR</w:t>
+        <w:t>MM</w:t>
       </w:r>
       <w:r>
         <w:rPr/>
         <w:tab/>
-        <w:t>Mean Time To Repair (tempo médio de reparo)</w:t>
+        <w:t>Materials Management (módulo de gestão de materiais do SAP)</w:t>
       </w:r>
     </w:p>
     <w:p>
@@ -1726,12 +1726,12 @@
           <w:b/>
           <w:bCs/>
         </w:rPr>
-        <w:t>NBR</w:t>
+        <w:t>MTTR</w:t>
       </w:r>
       <w:r>
         <w:rPr/>
         <w:tab/>
-        <w:t>Norma Brasileira</w:t>
+        <w:t>Mean Time To Repair (tempo médio de reparo)</w:t>
       </w:r>
     </w:p>
     <w:p>
@@ -1749,12 +1749,12 @@
           <w:b/>
           <w:bCs/>
         </w:rPr>
-        <w:t>NFC</w:t>
+        <w:t>NBR</w:t>
       </w:r>
       <w:r>
         <w:rPr/>
         <w:tab/>
-        <w:t>Near Field Communication</w:t>
+        <w:t>Norma Brasileira</w:t>
       </w:r>
     </w:p>
     <w:p>
@@ -1772,12 +1772,12 @@
           <w:b/>
           <w:bCs/>
         </w:rPr>
-        <w:t>PAO</w:t>
+        <w:t>NFC</w:t>
       </w:r>
       <w:r>
         <w:rPr/>
         <w:tab/>
-        <w:t>Polialfaolefina (base de óleo sintético)</w:t>
+        <w:t>Near Field Communication</w:t>
       </w:r>
     </w:p>
     <w:p>
@@ -1795,12 +1795,12 @@
           <w:b/>
           <w:bCs/>
         </w:rPr>
-        <w:t>PCM</w:t>
+        <w:t>PAO</w:t>
       </w:r>
       <w:r>
         <w:rPr/>
         <w:tab/>
-        <w:t>Planejamento e Controle da Manutenção</w:t>
+        <w:t>Polialfaolefina (base de óleo sintético)</w:t>
       </w:r>
     </w:p>
     <w:p>
@@ -1818,12 +1818,12 @@
           <w:b/>
           <w:bCs/>
         </w:rPr>
-        <w:t>PDF</w:t>
+        <w:t>PCM</w:t>
       </w:r>
       <w:r>
         <w:rPr/>
         <w:tab/>
-        <w:t>Portable Document Format</w:t>
+        <w:t>Planejamento e Controle da Manutenção</w:t>
       </w:r>
     </w:p>
     <w:p>
@@ -1841,12 +1841,12 @@
           <w:b/>
           <w:bCs/>
         </w:rPr>
-        <w:t>PG</w:t>
+        <w:t>PDF</w:t>
       </w:r>
       <w:r>
         <w:rPr/>
         <w:tab/>
-        <w:t>Poliglicol (base de óleo sintético)</w:t>
+        <w:t>Portable Document Format</w:t>
       </w:r>
     </w:p>
     <w:p>
@@ -1864,12 +1864,81 @@
           <w:b/>
           <w:bCs/>
         </w:rPr>
+        <w:t>PG</w:t>
+      </w:r>
+      <w:r>
+        <w:rPr/>
+        <w:tab/>
+        <w:t>Poliglicol (base de óleo sintético)</w:t>
+      </w:r>
+    </w:p>
+    <w:p>
+      <w:pPr>
+        <w:pStyle w:val="Normal"/>
+        <w:tabs>
+          <w:tab w:val="clear" w:pos="720"/>
+          <w:tab w:val="left" w:pos="1800" w:leader="none"/>
+        </w:tabs>
+        <w:spacing w:lineRule="auto" w:line="360" w:before="0" w:after="80"/>
+        <w:rPr/>
+      </w:pPr>
+      <w:r>
+        <w:rPr>
+          <w:b/>
+          <w:bCs/>
+        </w:rPr>
+        <w:t>PM</w:t>
+      </w:r>
+      <w:r>
+        <w:rPr/>
+        <w:tab/>
+        <w:t>Plant Maintenance (módulo de manutenção do SAP)</w:t>
+      </w:r>
+    </w:p>
+    <w:p>
+      <w:pPr>
+        <w:pStyle w:val="Normal"/>
+        <w:tabs>
+          <w:tab w:val="clear" w:pos="720"/>
+          <w:tab w:val="left" w:pos="1800" w:leader="none"/>
+        </w:tabs>
+        <w:spacing w:lineRule="auto" w:line="360" w:before="0" w:after="80"/>
+        <w:rPr/>
+      </w:pPr>
+      <w:r>
+        <w:rPr>
+          <w:b/>
+          <w:bCs/>
+        </w:rPr>
         <w:t>QR</w:t>
       </w:r>
       <w:r>
         <w:rPr/>
         <w:tab/>
         <w:t>Quick Response</w:t>
+      </w:r>
+    </w:p>
+    <w:p>
+      <w:pPr>
+        <w:pStyle w:val="Normal"/>
+        <w:tabs>
+          <w:tab w:val="clear" w:pos="720"/>
+          <w:tab w:val="left" w:pos="1800" w:leader="none"/>
+        </w:tabs>
+        <w:spacing w:lineRule="auto" w:line="360" w:before="0" w:after="80"/>
+        <w:rPr/>
+      </w:pPr>
+      <w:r>
+        <w:rPr>
+          <w:b/>
+          <w:bCs/>
+        </w:rPr>
+        <w:t>SAP</w:t>
+      </w:r>
+      <w:r>
+        <w:rPr/>
+        <w:tab/>
+        <w:t>Sistema integrado de gestão empresarial (ERP) da empresa SAP</w:t>
       </w:r>
     </w:p>
     <w:p>
@@ -3081,7 +3150,7 @@
           <w:sz w:val="24"/>
           <w:szCs w:val="24"/>
         </w:rPr>
-        <w:t>18</w:t>
+        <w:t>19</w:t>
       </w:r>
       <w:r>
         <w:rPr>
@@ -3147,7 +3216,7 @@
           <w:sz w:val="24"/>
           <w:szCs w:val="24"/>
         </w:rPr>
-        <w:t>19</w:t>
+        <w:t>20</w:t>
       </w:r>
       <w:r>
         <w:rPr>
@@ -3211,7 +3280,7 @@
           <w:sz w:val="24"/>
           <w:szCs w:val="24"/>
         </w:rPr>
-        <w:t>20</w:t>
+        <w:t>21</w:t>
       </w:r>
       <w:r>
         <w:rPr>
@@ -3277,7 +3346,7 @@
           <w:sz w:val="24"/>
           <w:szCs w:val="24"/>
         </w:rPr>
-        <w:t>20</w:t>
+        <w:t>21</w:t>
       </w:r>
       <w:r>
         <w:rPr>
@@ -3343,7 +3412,7 @@
           <w:sz w:val="24"/>
           <w:szCs w:val="24"/>
         </w:rPr>
-        <w:t>21</w:t>
+        <w:t>22</w:t>
       </w:r>
       <w:r>
         <w:rPr>
@@ -3409,7 +3478,7 @@
           <w:sz w:val="24"/>
           <w:szCs w:val="24"/>
         </w:rPr>
-        <w:t>23</w:t>
+        <w:t>24</w:t>
       </w:r>
       <w:r>
         <w:rPr>
@@ -3473,7 +3542,7 @@
           <w:sz w:val="24"/>
           <w:szCs w:val="24"/>
         </w:rPr>
-        <w:t>24</w:t>
+        <w:t>25</w:t>
       </w:r>
       <w:r>
         <w:rPr>
@@ -3537,7 +3606,7 @@
           <w:sz w:val="24"/>
           <w:szCs w:val="24"/>
         </w:rPr>
-        <w:t>25</w:t>
+        <w:t>26</w:t>
       </w:r>
       <w:r>
         <w:rPr>
@@ -3601,7 +3670,7 @@
           <w:sz w:val="24"/>
           <w:szCs w:val="24"/>
         </w:rPr>
-        <w:t>26</w:t>
+        <w:t>27</w:t>
       </w:r>
       <w:r>
         <w:rPr>
@@ -3675,7 +3744,7 @@
           <w:sz w:val="24"/>
           <w:szCs w:val="24"/>
         </w:rPr>
-        <w:t>27</w:t>
+        <w:t>28</w:t>
       </w:r>
       <w:r>
         <w:rPr>
@@ -6617,6 +6686,20 @@
       <w:r>
         <w:rPr/>
         <w:t>. Por isso, o roteiro de inspeção adota a observação visual de uma pequena quantidade de óleo (cor, transparência e presença de partículas), associada à temperatura da carcaça e às horas de uso, e orienta repor o que foi retirado e registrar a intervenção como complemento.</w:t>
+      </w:r>
+    </w:p>
+    <w:p>
+      <w:pPr>
+        <w:pStyle w:val="Normal"/>
+        <w:widowControl/>
+        <w:spacing w:lineRule="auto" w:line="360" w:before="0" w:after="0"/>
+        <w:ind w:left="0" w:right="0" w:firstLine="709"/>
+        <w:jc w:val="both"/>
+        <w:rPr/>
+      </w:pPr>
+      <w:r>
+        <w:rPr/>
+        <w:t>Três recursos foram acrescentados com foco na rotina do chão de fábrica. O primeiro é a lista “Leve com você”, que reúne o lubrificante, com o volume, o tag e a cor do galão, e as ferramentas e os materiais necessários à intervenção, para evitar o retorno do mecânico ao almoxarifado ou à bancada. O segundo é o registro automático do tempo da intervenção, contado da abertura da ficha, pela leitura do QR Code, até o salvamento do registro, e gravado no histórico e no arquivo exportado. O terceiro é a proposta de integração com o sistema de gestão SAP: a partir dos dados da ficha, a página monta uma reserva de material, para a requisição do óleo ao almoxarifado, e uma nota de manutenção, quando a inspeção resulta em não conformidade ou quando o óleo se aproxima do fim da vida útil. No protótipo, esses documentos são apenas simulados na tela; a criação direta no SAP, nos módulos de materiais (MM) e de manutenção (PM), depende da integração com o sistema da empresa. Além disso, cada registro de lubrificação e cada item da inspeção pode receber uma fotografia, reduzida e guardada no próprio aparelho, e o roteiro de inspeção dispõe de um atalho que marca como conformes os itens ainda não respondidos e leva ao resumo, no qual o mecânico corrige apenas o que estiver diferente; as inspeções feitas com esse atalho ficam identificadas no histórico.</w:t>
       </w:r>
     </w:p>
     <w:p>
@@ -9841,7 +9924,7 @@
       </w:pPr>
       <w:r>
         <w:rPr/>
-        <w:t>Como sugestões para trabalhos futuros, propõem-se a aplicação da solução em um redutor instalado em campo, com mecânicos de manutenção, a ampliação para outros equipamentos da planta, a sincronização dos registros de todos os aparelhos em um banco de dados central, o registro periódico da temperatura da carcaça para acompanhar a condição do óleo, a avaliação de etiquetas NFC para metal em pontos de leitura difícil, a leitura automática das horas de operação por horímetro ou sensor, em substituição à estimativa pelo tempo decorrido, a inclusão da análise de óleo em laboratório, com coleta de amostra e reposição do volume, em redutores de maior porte, e a integração do histórico de lubrificações ao sistema de PCM da empresa.</w:t>
+        <w:t>Como sugestões para trabalhos futuros, propõem-se a aplicação da solução em um redutor instalado em campo, com mecânicos de manutenção, a ampliação para outros equipamentos da planta, a sincronização dos registros de todos os aparelhos em um banco de dados central, o registro periódico da temperatura da carcaça para acompanhar a condição do óleo, a avaliação de etiquetas NFC para metal em pontos de leitura difícil, a leitura automática das horas de operação por horímetro ou sensor, em substituição à estimativa pelo tempo decorrido, a inclusão da análise de óleo em laboratório, com coleta de amostra e reposição do volume, em redutores de maior porte, e a integração da ficha ao sistema SAP da empresa, com a criação automática de reservas de material e de notas de manutenção e o envio do histórico de lubrificações ao PCM.</w:t>
       </w:r>
       <w:r>
         <w:br w:type="page"/>
@@ -12703,7 +12786,7 @@
         <w:sz w:val="20"/>
         <w:szCs w:val="20"/>
       </w:rPr>
-      <w:t>27</w:t>
+      <w:t>28</w:t>
     </w:r>
     <w:r>
       <w:rPr>

</xml_diff>

<commit_message>
Remove o cartão Leve com você: o QR Code é lido na área, junto ao redutor
Co-Authored-By: Claude Opus 5.5 <noreply@anthropic.com>
</commit_message>
<xml_diff>
--- a/Projeto_Integrador_QRCode_Lubrificantes.docx
+++ b/Projeto_Integrador_QRCode_Lubrificantes.docx
@@ -3280,7 +3280,7 @@
           <w:sz w:val="24"/>
           <w:szCs w:val="24"/>
         </w:rPr>
-        <w:t>21</w:t>
+        <w:t>20</w:t>
       </w:r>
       <w:r>
         <w:rPr>
@@ -3346,7 +3346,7 @@
           <w:sz w:val="24"/>
           <w:szCs w:val="24"/>
         </w:rPr>
-        <w:t>21</w:t>
+        <w:t>20</w:t>
       </w:r>
       <w:r>
         <w:rPr>
@@ -6699,7 +6699,7 @@
       </w:pPr>
       <w:r>
         <w:rPr/>
-        <w:t>Três recursos foram acrescentados com foco na rotina do chão de fábrica. O primeiro é a lista “Leve com você”, que reúne o lubrificante, com o volume, o tag e a cor do galão, e as ferramentas e os materiais necessários à intervenção, para evitar o retorno do mecânico ao almoxarifado ou à bancada. O segundo é o registro automático do tempo da intervenção, contado da abertura da ficha, pela leitura do QR Code, até o salvamento do registro, e gravado no histórico e no arquivo exportado. O terceiro é a proposta de integração com o sistema de gestão SAP: a partir dos dados da ficha, a página monta uma reserva de material, para a requisição do óleo ao almoxarifado, e uma nota de manutenção, quando a inspeção resulta em não conformidade ou quando o óleo se aproxima do fim da vida útil. No protótipo, esses documentos são apenas simulados na tela; a criação direta no SAP, nos módulos de materiais (MM) e de manutenção (PM), depende da integração com o sistema da empresa. Além disso, cada registro de lubrificação e cada item da inspeção pode receber uma fotografia, reduzida e guardada no próprio aparelho, e o roteiro de inspeção dispõe de um atalho que marca como conformes os itens ainda não respondidos e leva ao resumo, no qual o mecânico corrige apenas o que estiver diferente; as inspeções feitas com esse atalho ficam identificadas no histórico.</w:t>
+        <w:t>Dois recursos foram acrescentados com foco na rotina do chão de fábrica. O primeiro é o registro automático do tempo da intervenção, contado da abertura da ficha, pela leitura do QR Code, até o salvamento do registro, e gravado no histórico e no arquivo exportado. O segundo é a proposta de integração com o sistema de gestão SAP: a partir dos dados da ficha, a página monta uma reserva de material, para a requisição do óleo ao almoxarifado, e uma nota de manutenção, quando a inspeção resulta em não conformidade ou quando o óleo se aproxima do fim da vida útil. No protótipo, esses documentos são apenas simulados na tela; a criação direta no SAP, nos módulos de materiais (MM) e de manutenção (PM), depende da integração com o sistema da empresa. Além disso, cada registro de lubrificação e cada item da inspeção pode receber uma fotografia, reduzida e guardada no próprio aparelho, e o roteiro de inspeção dispõe de um atalho que marca como conformes os itens ainda não respondidos e leva ao resumo, no qual o mecânico corrige apenas o que estiver diferente; as inspeções feitas com esse atalho ficam identificadas no histórico.</w:t>
       </w:r>
     </w:p>
     <w:p>

</xml_diff>

<commit_message>
Remove o botão Pedir óleo ao almoxarifado; documento descreve só a nota de manutenção como proposta SAP
Co-Authored-By: Claude Opus 5.5 <noreply@anthropic.com>
</commit_message>
<xml_diff>
--- a/Projeto_Integrador_QRCode_Lubrificantes.docx
+++ b/Projeto_Integrador_QRCode_Lubrificantes.docx
@@ -1189,7 +1189,7 @@
           <w:sz w:val="24"/>
           <w:szCs w:val="24"/>
         </w:rPr>
-        <w:t>28</w:t>
+        <w:t>27</w:t>
       </w:r>
       <w:r>
         <w:rPr>
@@ -1703,29 +1703,6 @@
           <w:b/>
           <w:bCs/>
         </w:rPr>
-        <w:t>MM</w:t>
-      </w:r>
-      <w:r>
-        <w:rPr/>
-        <w:tab/>
-        <w:t>Materials Management (módulo de gestão de materiais do SAP)</w:t>
-      </w:r>
-    </w:p>
-    <w:p>
-      <w:pPr>
-        <w:pStyle w:val="Normal"/>
-        <w:tabs>
-          <w:tab w:val="clear" w:pos="720"/>
-          <w:tab w:val="left" w:pos="1800" w:leader="none"/>
-        </w:tabs>
-        <w:spacing w:lineRule="auto" w:line="360" w:before="0" w:after="80"/>
-        <w:rPr/>
-      </w:pPr>
-      <w:r>
-        <w:rPr>
-          <w:b/>
-          <w:bCs/>
-        </w:rPr>
         <w:t>MTTR</w:t>
       </w:r>
       <w:r>
@@ -3412,7 +3389,7 @@
           <w:sz w:val="24"/>
           <w:szCs w:val="24"/>
         </w:rPr>
-        <w:t>22</w:t>
+        <w:t>21</w:t>
       </w:r>
       <w:r>
         <w:rPr>
@@ -3478,7 +3455,7 @@
           <w:sz w:val="24"/>
           <w:szCs w:val="24"/>
         </w:rPr>
-        <w:t>24</w:t>
+        <w:t>23</w:t>
       </w:r>
       <w:r>
         <w:rPr>
@@ -3542,7 +3519,7 @@
           <w:sz w:val="24"/>
           <w:szCs w:val="24"/>
         </w:rPr>
-        <w:t>25</w:t>
+        <w:t>24</w:t>
       </w:r>
       <w:r>
         <w:rPr>
@@ -3606,7 +3583,7 @@
           <w:sz w:val="24"/>
           <w:szCs w:val="24"/>
         </w:rPr>
-        <w:t>26</w:t>
+        <w:t>25</w:t>
       </w:r>
       <w:r>
         <w:rPr>
@@ -3670,7 +3647,7 @@
           <w:sz w:val="24"/>
           <w:szCs w:val="24"/>
         </w:rPr>
-        <w:t>27</w:t>
+        <w:t>26</w:t>
       </w:r>
       <w:r>
         <w:rPr>
@@ -3744,7 +3721,7 @@
           <w:sz w:val="24"/>
           <w:szCs w:val="24"/>
         </w:rPr>
-        <w:t>28</w:t>
+        <w:t>27</w:t>
       </w:r>
       <w:r>
         <w:rPr>
@@ -6699,7 +6676,7 @@
       </w:pPr>
       <w:r>
         <w:rPr/>
-        <w:t>Dois recursos foram acrescentados com foco na rotina do chão de fábrica. O primeiro é o registro automático do tempo da intervenção, contado da abertura da ficha, pela leitura do QR Code, até o salvamento do registro, e gravado no histórico e no arquivo exportado. O segundo é a proposta de integração com o sistema de gestão SAP: a partir dos dados da ficha, a página monta uma reserva de material, para a requisição do óleo ao almoxarifado, e uma nota de manutenção, quando a inspeção resulta em não conformidade ou quando o óleo se aproxima do fim da vida útil. No protótipo, esses documentos são apenas simulados na tela; a criação direta no SAP, nos módulos de materiais (MM) e de manutenção (PM), depende da integração com o sistema da empresa. Além disso, cada registro de lubrificação e cada item da inspeção pode receber uma fotografia, reduzida e guardada no próprio aparelho, e o roteiro de inspeção dispõe de um atalho que marca como conformes os itens ainda não respondidos e leva ao resumo, no qual o mecânico corrige apenas o que estiver diferente; as inspeções feitas com esse atalho ficam identificadas no histórico.</w:t>
+        <w:t>Dois recursos foram acrescentados com foco na rotina do chão de fábrica. O primeiro é o registro automático do tempo da intervenção, contado da abertura da ficha, pela leitura do QR Code, até o salvamento do registro, e gravado no histórico e no arquivo exportado. O segundo é a proposta de integração com o sistema de gestão SAP: a partir dos dados da ficha, a página monta uma nota de manutenção quando a inspeção resulta em não conformidade ou quando o óleo se aproxima do fim da vida útil. No protótipo, esse documento é apenas simulado na tela; a criação direta no SAP, no módulo de manutenção (PM), depende da integração com o sistema da empresa. Além disso, cada registro de lubrificação e cada item da inspeção pode receber uma fotografia, reduzida e guardada no próprio aparelho, e o roteiro de inspeção dispõe de um atalho que marca como conformes os itens ainda não respondidos e leva ao resumo, no qual o mecânico corrige apenas o que estiver diferente; as inspeções feitas com esse atalho ficam identificadas no histórico.</w:t>
       </w:r>
     </w:p>
     <w:p>
@@ -12786,7 +12763,7 @@
         <w:sz w:val="20"/>
         <w:szCs w:val="20"/>
       </w:rPr>
-      <w:t>28</w:t>
+      <w:t>27</w:t>
     </w:r>
     <w:r>
       <w:rPr>

</xml_diff>

<commit_message>
Documento: reescrito para o redutor da oficina (WEG-Cestari Magma M 06, 1:25, ISO VG 460, 0,87 L) e funções novas da ficha; referências 3 e 5 retiradas e renumeradas; Figura 1 com telas novas
Co-Authored-By: Claude Opus 5.5 <noreply@anthropic.com>
</commit_message>
<xml_diff>
--- a/Projeto_Integrador_QRCode_Lubrificantes.docx
+++ b/Projeto_Integrador_QRCode_Lubrificantes.docx
@@ -835,7 +835,7 @@
       </w:pPr>
       <w:r>
         <w:rPr/>
-        <w:t xml:space="preserve">Este trabalho apresenta o desenvolvimento e a avaliação de um sistema digital, baseado em QR Code, para apoiar o mecânico na identificação e na aplicação correta do lubrificante em um redutor de velocidade de coroa e rosca sem fim WEG-Cestari WCR28, com relação de transmissão 1:7,5, lubrificado por imersão em óleo sintético PAO ISO VG 320. A motivação do estudo está no tempo despendido, durante a manutenção, na busca por informações como tipo de lubrificante, viscosidade, volume e pontos de enchimento, dreno e nível, além do risco de erro na aplicação, em especial a mistura de óleos incompatíveis. A solução consiste em uma etiqueta resistente, fixada junto ao equipamento, que dá acesso, pelo celular, a uma ficha objetiva com os dados de lubrificação, alertas de segurança, checklist e registro da intervenção. Como a equipe não dispõe do redutor físico, o modelo foi adotado como equipamento de referência, a partir do catálogo comercial de um distribuidor e da documentação do fabricante, e o ganho de tempo foi avaliado por meio de uma simulação em ambiente didático: cinco participantes cronometraram as etapas de identificação do lubrificante, localização dos pontos e registro, consultando a documentação do fabricante (método tradicional) e a ficha acessada pelo QR Code, em ordem contrabalanceada. Os dados permitem calcular a redução percentual do tempo, o ganho anual e uma estimativa de retorno financeiro, relacionando-os ao tempo de execução da manutenção preventiva e aos princípios da Manutenção Produtiva Total. </w:t>
+        <w:t xml:space="preserve">Este trabalho apresenta o desenvolvimento e a avaliação de um sistema digital, baseado em QR Code, para apoiar o mecânico na identificação e na aplicação correta do lubrificante em um redutor de velocidade de coroa e rosca sem fim WEG-Cestari, da linha Magma M, com relação de transmissão 1:25, lubrificado por imersão em óleo sintético PAO ISO VG 460 e pertencente à oficina de mecânica do SENAI Três Lagoas. A motivação do estudo está no tempo despendido, durante a manutenção, na busca por informações como tipo de lubrificante, viscosidade, volume e pontos de enchimento, dreno e nível, além do risco de erro na aplicação, em especial a mistura de óleos incompatíveis. A solução consiste em uma etiqueta resistente, fixada junto ao equipamento, que dá acesso, pelo celular ou pelo tablet, a uma ficha objetiva com os dados de lubrificação, alertas de segurança, passo a passo da troca com fotografias do próprio redutor, modelo tridimensional com os pontos de lubrificação, conferência do galão de óleo e registro da intervenção. Os dados do redutor foram obtidos da placa de identificação, do manual do fabricante e do levantamento feito no próprio equipamento, e o ganho de tempo foi avaliado por cronometragem em ambiente didático: cinco participantes cronometraram as etapas de identificação do lubrificante, localização dos pontos e registro, consultando a placa e o manual do fabricante (método tradicional) e a ficha acessada pelo QR Code, em ordem contrabalanceada. Os dados permitem calcular a redução percentual do tempo, o ganho anual e uma estimativa de retorno financeiro, relacionando-os ao tempo de execução da manutenção preventiva e aos princípios da Manutenção Produtiva Total. </w:t>
       </w:r>
       <w:r>
         <w:rPr>
@@ -894,7 +894,7 @@
       </w:pPr>
       <w:r>
         <w:rPr/>
-        <w:t xml:space="preserve">This work presents the development and evaluation of a QR Code-based digital system to support mechanics in identifying and correctly applying the lubricant of a WEG-Cestari WCR28 worm gear reducer, with a 1:7.5 ratio, oil-bath lubricated with ISO VG 320 synthetic PAO oil. The study is motivated by the time spent during maintenance searching for information such as lubricant type, viscosity, volume and the location of fill, drain and level points, as well as by the risk of application errors, especially the mixing of incompatible oils. The solution consists of a durable label placed next to the equipment that gives access, through a smartphone, to a concise data sheet with lubrication data, safety alerts, a checklist and an intervention record. Since the team does not have the physical reducer, the model was adopted as a reference equipment, based on a distributor's commercial catalogue and on the manufacturer's documentation, and the time gain was assessed through a simulation in a teaching environment: five participants timed the identification, point location and recording steps, consulting the manufacturer's documentation (traditional method) and the data sheet accessed by the QR Code, in counterbalanced order. The data allow the calculation of the percentage time reduction, the annual gain and an estimate of financial return, relating them to the execution time of preventive maintenance and to the principles of Total Productive Maintenance. </w:t>
+        <w:t xml:space="preserve">This work presents the development and evaluation of a QR Code-based digital system to support mechanics in identifying and correctly applying the lubricant of a WEG-Cestari Magma M worm gear reducer, with a 1:25 ratio, oil-bath lubricated with ISO VG 460 synthetic PAO oil, belonging to the mechanical workshop of SENAI Três Lagoas. The study is motivated by the time spent during maintenance searching for information such as lubricant type, viscosity, volume and the location of fill, drain and level points, as well as by the risk of application errors, especially the mixing of incompatible oils. The solution consists of a durable label placed next to the equipment that gives access, through a smartphone or tablet, to a concise data sheet with lubrication data, safety alerts, a step-by-step oil change guide with photographs of the reducer itself, a three-dimensional model showing the lubrication points, an oil container check and an intervention record. The reducer data were obtained from its nameplate, from the manufacturer's manual and from a survey of the equipment itself, and the time gain was assessed by time measurements in a teaching environment: five participants timed the identification, point location and recording steps, consulting the nameplate and the manufacturer's manual (traditional method) and the data sheet accessed by the QR Code, in counterbalanced order. The data allow the calculation of the percentage time reduction, the annual gain and an estimate of financial return, relating them to the execution time of preventive maintenance and to the principles of Total Productive Maintenance. </w:t>
       </w:r>
       <w:r>
         <w:rPr>
@@ -962,7 +962,7 @@
           <w:sz w:val="24"/>
           <w:szCs w:val="24"/>
         </w:rPr>
-        <w:t>Quadro 1 – Características técnicas do redutor WCR28</w:t>
+        <w:t>Quadro 1 – Características técnicas do redutor estudado</w:t>
       </w:r>
       <w:r>
         <w:rPr>
@@ -1026,7 +1026,7 @@
           <w:sz w:val="24"/>
           <w:szCs w:val="24"/>
         </w:rPr>
-        <w:t>Quadro 2 – Ficha de lubrificação do redutor WCR28</w:t>
+        <w:t>Quadro 2 – Ficha de lubrificação do redutor RED-001</w:t>
       </w:r>
       <w:r>
         <w:rPr>
@@ -1061,7 +1061,7 @@
           <w:sz w:val="24"/>
           <w:szCs w:val="24"/>
         </w:rPr>
-        <w:t>16</w:t>
+        <w:t>17</w:t>
       </w:r>
       <w:r>
         <w:rPr>
@@ -1125,7 +1125,7 @@
           <w:sz w:val="24"/>
           <w:szCs w:val="24"/>
         </w:rPr>
-        <w:t>19</w:t>
+        <w:t>20</w:t>
       </w:r>
       <w:r>
         <w:rPr>
@@ -1189,7 +1189,7 @@
           <w:sz w:val="24"/>
           <w:szCs w:val="24"/>
         </w:rPr>
-        <w:t>27</w:t>
+        <w:t>29</w:t>
       </w:r>
       <w:r>
         <w:rPr>
@@ -1275,7 +1275,7 @@
           <w:sz w:val="24"/>
           <w:szCs w:val="24"/>
         </w:rPr>
-        <w:t>21</w:t>
+        <w:t>22</w:t>
       </w:r>
       <w:r>
         <w:rPr>
@@ -1339,7 +1339,7 @@
           <w:sz w:val="24"/>
           <w:szCs w:val="24"/>
         </w:rPr>
-        <w:t>21</w:t>
+        <w:t>22</w:t>
       </w:r>
       <w:r>
         <w:rPr>
@@ -1403,7 +1403,7 @@
           <w:sz w:val="24"/>
           <w:szCs w:val="24"/>
         </w:rPr>
-        <w:t>21</w:t>
+        <w:t>23</w:t>
       </w:r>
       <w:r>
         <w:rPr>
@@ -1571,29 +1571,6 @@
         <w:rPr/>
         <w:tab/>
         <w:t>Equipamento de Proteção Individual</w:t>
-      </w:r>
-    </w:p>
-    <w:p>
-      <w:pPr>
-        <w:pStyle w:val="Normal"/>
-        <w:tabs>
-          <w:tab w:val="clear" w:pos="720"/>
-          <w:tab w:val="left" w:pos="1800" w:leader="none"/>
-        </w:tabs>
-        <w:spacing w:lineRule="auto" w:line="360" w:before="0" w:after="80"/>
-        <w:rPr/>
-      </w:pPr>
-      <w:r>
-        <w:rPr>
-          <w:b/>
-          <w:bCs/>
-        </w:rPr>
-        <w:t>HRC</w:t>
-      </w:r>
-      <w:r>
-        <w:rPr/>
-        <w:tab/>
-        <w:t>Dureza Rockwell na escala C</w:t>
       </w:r>
     </w:p>
     <w:p>
@@ -3061,7 +3038,7 @@
           <w:sz w:val="24"/>
           <w:szCs w:val="24"/>
         </w:rPr>
-        <w:t>16</w:t>
+        <w:t>17</w:t>
       </w:r>
       <w:r>
         <w:rPr>
@@ -3127,7 +3104,7 @@
           <w:sz w:val="24"/>
           <w:szCs w:val="24"/>
         </w:rPr>
-        <w:t>19</w:t>
+        <w:t>20</w:t>
       </w:r>
       <w:r>
         <w:rPr>
@@ -3193,7 +3170,7 @@
           <w:sz w:val="24"/>
           <w:szCs w:val="24"/>
         </w:rPr>
-        <w:t>20</w:t>
+        <w:t>21</w:t>
       </w:r>
       <w:r>
         <w:rPr>
@@ -3257,7 +3234,7 @@
           <w:sz w:val="24"/>
           <w:szCs w:val="24"/>
         </w:rPr>
-        <w:t>20</w:t>
+        <w:t>22</w:t>
       </w:r>
       <w:r>
         <w:rPr>
@@ -3323,7 +3300,7 @@
           <w:sz w:val="24"/>
           <w:szCs w:val="24"/>
         </w:rPr>
-        <w:t>20</w:t>
+        <w:t>22</w:t>
       </w:r>
       <w:r>
         <w:rPr>
@@ -3389,7 +3366,7 @@
           <w:sz w:val="24"/>
           <w:szCs w:val="24"/>
         </w:rPr>
-        <w:t>21</w:t>
+        <w:t>23</w:t>
       </w:r>
       <w:r>
         <w:rPr>
@@ -3455,7 +3432,7 @@
           <w:sz w:val="24"/>
           <w:szCs w:val="24"/>
         </w:rPr>
-        <w:t>23</w:t>
+        <w:t>25</w:t>
       </w:r>
       <w:r>
         <w:rPr>
@@ -3519,7 +3496,7 @@
           <w:sz w:val="24"/>
           <w:szCs w:val="24"/>
         </w:rPr>
-        <w:t>24</w:t>
+        <w:t>26</w:t>
       </w:r>
       <w:r>
         <w:rPr>
@@ -3583,7 +3560,7 @@
           <w:sz w:val="24"/>
           <w:szCs w:val="24"/>
         </w:rPr>
-        <w:t>25</w:t>
+        <w:t>27</w:t>
       </w:r>
       <w:r>
         <w:rPr>
@@ -3647,7 +3624,7 @@
           <w:sz w:val="24"/>
           <w:szCs w:val="24"/>
         </w:rPr>
-        <w:t>26</w:t>
+        <w:t>28</w:t>
       </w:r>
       <w:r>
         <w:rPr>
@@ -3721,7 +3698,7 @@
           <w:sz w:val="24"/>
           <w:szCs w:val="24"/>
         </w:rPr>
-        <w:t>27</w:t>
+        <w:t>29</w:t>
       </w:r>
       <w:r>
         <w:rPr>
@@ -3791,7 +3768,7 @@
       </w:pPr>
       <w:r>
         <w:rPr/>
-        <w:t>Este trabalho propõe o uso de um QR Code fixado no próprio equipamento, que dá acesso, pelo celular, a uma ficha digital com as informações de lubrificação. O estudo toma como equipamento de referência um redutor de velocidade de coroa e rosca sem fim WEG-Cestari WCR28, com relação de transmissão 1:7,5, e tem como foco a redução do tempo do mecânico na identificação e no registro da lubrificação.</w:t>
+        <w:t>Este trabalho propõe o uso de um QR Code fixado no próprio equipamento, que dá acesso, pelo celular, a uma ficha digital com as informações de lubrificação. O estudo toma como equipamento um redutor de velocidade de coroa e rosca sem fim WEG-Cestari, da linha Magma M, com relação de transmissão 1:25, disponível na oficina de mecânica do SENAI Três Lagoas, e tem como foco a redução do tempo do mecânico na identificação e no registro da lubrificação.</w:t>
       </w:r>
     </w:p>
     <w:p>
@@ -3817,7 +3794,7 @@
       </w:pPr>
       <w:r>
         <w:rPr/>
-        <w:t>A justificativa do trabalho apoia-se em cinco pontos: (i) o tempo do mecânico é um recurso valioso, e a busca por informação é uma etapa que não agrega valor à intervenção; (ii) a aplicação de lubrificante incorreto, a mistura de óleos de bases diferentes ou o volume inadequado podem comprometer o equipamento, e, no redutor estudado, cuja carga de óleo é de apenas 30 a 55 mL, qualquer erro de volume representa uma variação proporcionalmente grande; (iii) o registro das lubrificações, quando feito em papel e posteriormente, tende a ser incompleto ou a se perder, o que prejudica o Planejamento e Controle da Manutenção (PCM); (iv) o próprio fabricante recomenda que cada redutor tenha um registro individual das manutenções executadas, das peças trocadas e das datas,</w:t>
+        <w:t>A justificativa do trabalho apoia-se em cinco pontos: (i) o tempo do mecânico é um recurso valioso, e a busca por informação é uma etapa que não agrega valor à intervenção; (ii) a aplicação de lubrificante incorreto, a mistura de óleos de bases diferentes ou o volume inadequado podem comprometer o equipamento, e, no redutor estudado, a placa de identificação indica óleo sintético PAO ISO VG 460, que não deve ser misturado com óleo mineral nem com sintético de outra base; (iii) o registro das lubrificações, quando feito em papel e posteriormente, tende a ser incompleto ou a se perder, o que prejudica o Planejamento e Controle da Manutenção (PCM); (iv) o próprio fabricante recomenda que cada redutor tenha um registro individual das manutenções executadas, das peças trocadas e das datas,</w:t>
       </w:r>
       <w:r>
         <w:rPr>
@@ -3853,17 +3830,7 @@
       </w:pPr>
       <w:r>
         <w:rPr/>
-        <w:t>O estudo limita-se à lubrificação de um redutor de velocidade de coroa e rosca sem fim WEG-Cestari, modelo WCR28 1 HS U, com relação de transmissão 1:7,5 (referência comercial WCR28.7,5.NAB), selecionado no catálogo comercial de um distribuidor.</w:t>
-      </w:r>
-      <w:r>
-        <w:rPr>
-          <w:vertAlign w:val="superscript"/>
-        </w:rPr>
-        <w:t>3</w:t>
-      </w:r>
-      <w:r>
-        <w:rPr/>
-        <w:t xml:space="preserve"> Como a equipe não dispõe do equipamento físico, o redutor é tratado como equipamento de referência, em uma aplicação hipotética </w:t>
+        <w:t xml:space="preserve">O estudo limita-se à lubrificação de um redutor de velocidade de coroa e rosca sem fim WEG-Cestari, da linha Magma M, tamanho 06, com relação de transmissão 1:25 (código M0612802V0D001), pertencente à oficina de mecânica do SENAI Três Lagoas e considerado na posição de trabalho adotada pela equipe, vertical, com a placa de identificação voltada para cima. O redutor está disponível em bancada e é tratado em uma aplicação hipotética </w:t>
       </w:r>
       <w:r>
         <w:rPr>
@@ -3873,7 +3840,7 @@
       </w:r>
       <w:r>
         <w:rPr/>
-        <w:t>, na posição de trabalho 1 (M1). São consideradas as etapas de identificação do lubrificante, localização dos pontos de enchimento, dreno e nível, e registro da intervenção. Não fazem parte do escopo a análise laboratorial do óleo, a desmontagem do redutor, a avaliação em campo com o equipamento instalado nem a integração com sistemas de gestão de manutenção de terceiros.</w:t>
+        <w:t>. São consideradas as etapas de identificação do lubrificante, localização dos pontos de enchimento, dreno e nível, e registro da intervenção. Não fazem parte do escopo a análise laboratorial do óleo, a desmontagem do redutor, a avaliação em campo com o equipamento instalado em uma linha de produção e a integração efetiva com sistemas de gestão de manutenção, que é apresentada apenas como proposta, simulada na tela da ficha.</w:t>
       </w:r>
     </w:p>
     <w:p>
@@ -3966,7 +3933,7 @@
       </w:pPr>
       <w:r>
         <w:rPr/>
-        <w:t>levantar os dados técnicos e de lubrificação do redutor WCR28 a partir do catálogo e do manual do fabricante;</w:t>
+        <w:t>levantar os dados técnicos e de lubrificação do redutor na placa de identificação, no manual do fabricante e no próprio equipamento;</w:t>
       </w:r>
     </w:p>
     <w:p>
@@ -3982,7 +3949,7 @@
       </w:pPr>
       <w:r>
         <w:rPr/>
-        <w:t>desenvolver uma ficha digital, acessível por QR Code, com informações do lubrificante, alertas de segurança, checklist e registro da intervenção;</w:t>
+        <w:t>desenvolver uma ficha digital, acessível por QR Code, com informações do lubrificante, alertas de segurança, passo a passo da troca, localização dos pontos de lubrificação e registro da intervenção;</w:t>
       </w:r>
     </w:p>
     <w:p>
@@ -4014,7 +3981,7 @@
       </w:pPr>
       <w:r>
         <w:rPr/>
-        <w:t>medir, em uma simulação em ambiente didático, o tempo das etapas de lubrificação no método tradicional e no método com QR Code;</w:t>
+        <w:t>medir, em ambiente didático, o tempo das etapas de lubrificação no método tradicional e no método com QR Code;</w:t>
       </w:r>
     </w:p>
     <w:p>
@@ -4072,7 +4039,7 @@
       </w:pPr>
       <w:r>
         <w:rPr/>
-        <w:t>Trata-se de uma pesquisa aplicada, de abordagem quantitativa, realizada por meio de simulação em ambiente didático, com comparação entre dois métodos de trabalho (tradicional e com QR Code) aplicados a um equipamento de referência. Espera-se, como contribuições, a redução do tempo de intervenção do mecânico, a padronização do acesso às informações de lubrificação, a formação de um histórico de lubrificações para o PCM e a disponibilização de um modelo simples que possa ser replicado em outros equipamentos.</w:t>
+        <w:t>Trata-se de uma pesquisa aplicada, de abordagem quantitativa, realizada em ambiente didático, com comparação entre dois métodos de trabalho (tradicional e com QR Code) aplicados a um redutor da oficina do SENAI Três Lagoas. Espera-se, como contribuições, a redução do tempo de intervenção do mecânico, a padronização do acesso às informações de lubrificação, a formação de um histórico de lubrificações para o PCM e a disponibilização de um modelo simples que possa ser replicado em outros equipamentos.</w:t>
       </w:r>
     </w:p>
     <w:p>
@@ -4098,7 +4065,7 @@
       </w:pPr>
       <w:r>
         <w:rPr/>
-        <w:t>A metodologia consistiu em quatro etapas: levantamento dos dados do redutor de referência no catálogo e no manual do fabricante; desenvolvimento de uma ficha digital simples, acessada pelo navegador do celular; geração e impressão da etiqueta de QR Code; e cronometragem simulada das etapas de lubrificação nos dois métodos, com cinco participantes e ordem contrabalanceada, seguida do cálculo da redução de tempo e de uma estimativa de retorno financeiro. O detalhamento está na seção 2.2.</w:t>
+        <w:t>A metodologia consistiu em quatro etapas: levantamento dos dados do redutor na placa de identificação, no manual do fabricante e no próprio equipamento, onde foram identificados e fotografados os pontos de enchimento, nível e dreno; desenvolvimento de uma ficha digital simples, acessada pelo navegador do celular; geração e impressão da etiqueta de QR Code; e cronometragem das etapas de lubrificação nos dois métodos, com cinco participantes e ordem contrabalanceada, seguida do cálculo da redução de tempo e de uma estimativa de retorno financeiro. O detalhamento está na seção 2.2.</w:t>
       </w:r>
       <w:r>
         <w:br w:type="page"/>
@@ -4159,7 +4126,7 @@
         <w:rPr>
           <w:vertAlign w:val="superscript"/>
         </w:rPr>
-        <w:t>4</w:t>
+        <w:t>3</w:t>
       </w:r>
       <w:r>
         <w:rPr/>
@@ -4227,13 +4194,13 @@
       </w:pPr>
       <w:r>
         <w:rPr/>
-        <w:t>Nos redutores de coroa e rosca sem fim, o contato entre os dentes ocorre com elevado escorregamento entre a rosca, de aço, e a coroa, de bronze, o que gera mais calor do que em um par de engrenagens cilíndricas e exige do lubrificante uma película resistente. No redutor WCR28, a rosca sem fim é de aço cromo-níquel cementado, com dureza de 54 a 59 HRC, e a coroa é de bronze. A lubrificação é feita por imersão em óleo sintético de polialfaolefina (PAO) com grau ISO VG 320, e o redutor sai de fábrica já abastecido; o óleo padrão de fábrica para os tamanhos 28 a 63 é o Klübersynth EG4-320.</w:t>
+        <w:t>Nos redutores de coroa e rosca sem fim, o contato entre os dentes ocorre com elevado escorregamento entre a rosca, de aço, e a coroa, de bronze, o que gera mais calor do que em um par de engrenagens cilíndricas e exige do lubrificante uma película resistente. No redutor estudado, a lubrificação é feita por imersão em óleo sintético de polialfaolefina (PAO) com grau ISO VG 460, conforme a placa de identificação, e o manual do fabricante relaciona, para esse grau, produtos como ExxonMobil SHC 634, Shell Omala S4 GX 460 e Klübersynth EG4-460.</w:t>
       </w:r>
       <w:r>
         <w:rPr>
           <w:vertAlign w:val="superscript"/>
         </w:rPr>
-        <w:t>5</w:t>
+        <w:t>2</w:t>
       </w:r>
     </w:p>
     <w:p>
@@ -4253,7 +4220,7 @@
         <w:rPr>
           <w:vertAlign w:val="superscript"/>
         </w:rPr>
-        <w:t>6</w:t>
+        <w:t>4</w:t>
       </w:r>
       <w:r>
         <w:rPr/>
@@ -4267,13 +4234,13 @@
       </w:r>
       <w:r>
         <w:rPr/>
-        <w:t xml:space="preserve"> Esse cuidado é importante porque o catálogo lista, para o mesmo grau ISO VG 320, óleos sintéticos de base PAO e de base poliglicol (PG), que não devem ser misturados entre si nem com óleo mineral.</w:t>
+        <w:t xml:space="preserve"> Esse cuidado é importante porque o mesmo manual prevê, para os redutores da linha, óleos minerais (CLP) e sintéticos de base PAO (CLP HC) e poliglicol (CLP PG), cada um com seus próprios intervalos de troca, e é a placa de identificação que informa o tipo adotado em cada redutor.</w:t>
       </w:r>
       <w:r>
         <w:rPr>
           <w:vertAlign w:val="superscript"/>
         </w:rPr>
-        <w:t>5</w:t>
+        <w:t>2</w:t>
       </w:r>
     </w:p>
     <w:p>
@@ -4317,17 +4284,21 @@
         <w:rPr>
           <w:vertAlign w:val="superscript"/>
         </w:rPr>
-        <w:t>7</w:t>
-      </w:r>
-      <w:r>
-        <w:rPr/>
-        <w:t xml:space="preserve"> No WCR28, essa diferença aparece diretamente na tabela do fabricante, em que o volume varia de 30 a 55 mL conforme a posição.</w:t>
+        <w:t>5</w:t>
+      </w:r>
+      <w:r>
+        <w:rPr/>
+        <w:t xml:space="preserve"> Na linha Magma M, o fabricante informa um único volume por tamanho, válido para todas as posições de trabalho (0,87 L no tamanho 06 de um estágio),</w:t>
       </w:r>
       <w:r>
         <w:rPr>
           <w:vertAlign w:val="superscript"/>
         </w:rPr>
-        <w:t>5</w:t>
+        <w:t>2</w:t>
+      </w:r>
+      <w:r>
+        <w:rPr/>
+        <w:t xml:space="preserve"> mas a posição de montagem continua definindo quais bujões funcionam como enchimento, nível e dreno.</w:t>
       </w:r>
     </w:p>
     <w:p>
@@ -4391,7 +4362,7 @@
         <w:rPr>
           <w:vertAlign w:val="superscript"/>
         </w:rPr>
-        <w:t>8</w:t>
+        <w:t>6</w:t>
       </w:r>
       <w:r>
         <w:rPr/>
@@ -4423,17 +4394,7 @@
       </w:pPr>
       <w:r>
         <w:rPr/>
-        <w:t>Vale observar que a própria placa de identificação dos redutores WCR, de alumínio, com 39 mm × 45 mm, já informa a quantidade e o tipo de óleo e traz um QR Code do fabricante.</w:t>
-      </w:r>
-      <w:r>
-        <w:rPr>
-          <w:vertAlign w:val="superscript"/>
-        </w:rPr>
-        <w:t>5</w:t>
-      </w:r>
-      <w:r>
-        <w:rPr/>
-        <w:t xml:space="preserve"> Essa informação, porém, é genérica do produto, ocupa uma área pequena, sujeita a sujeira e desgaste, e não contempla dados específicos da instalação, como a posição de trabalho, o código do equipamento na planta, os procedimentos de segurança e o histórico das intervenções. A ficha proposta complementa a placa do fabricante, sem substituí-la.</w:t>
+        <w:t>Vale observar que a própria placa de identificação do redutor estudado já informa o tipo e a viscosidade do óleo (ISO VG 460 CLP PAO). Essa informação, porém, ocupa uma área pequena, sujeita a sujeira e desgaste, não traz a quantidade de óleo nem a localização dos bujões e não contempla dados específicos da instalação, como a posição de trabalho, o código do equipamento na planta, os procedimentos de segurança e o histórico das intervenções. A ficha proposta complementa a placa do fabricante, sem substituí-la.</w:t>
       </w:r>
     </w:p>
     <w:p>
@@ -4472,27 +4433,27 @@
       </w:pPr>
       <w:r>
         <w:rPr/>
-        <w:t>Como a equipe não dispõe de um redutor físico, foi adotado como equipamento de referência um redutor de velocidade de coroa e rosca sem fim, de eixos ortogonais, fabricado pela WEG-Cestari, modelo WCR28 1 HS U, com relação de transmissão 1:7,5, selecionado no catálogo comercial de um distribuidor.</w:t>
+        <w:t>O equipamento estudado é um redutor de velocidade de coroa e rosca sem fim, de eixos ortogonais, fabricado pela WEG-Cestari e pertencente à oficina de mecânica do SENAI Três Lagoas. Pela placa de identificação, trata-se do código M0612802V0D001, série 818100, fabricado em 2018, com relação de transmissão 1:25 (1.750 rpm na entrada e 70 rpm na saída) e lubrificação com óleo sintético ISO VG 460 CLP PAO. O código corresponde à linha Magma M, tamanho 06, cujas instruções de instalação, lubrificação e manutenção constam do manual da linha coroa e rosca do fabricante</w:t>
       </w:r>
       <w:r>
         <w:rPr>
           <w:vertAlign w:val="superscript"/>
         </w:rPr>
-        <w:t>3</w:t>
-      </w:r>
-      <w:r>
-        <w:rPr/>
-        <w:t xml:space="preserve"> Pela denominação do fabricante, o código indica carcaça de tamanho 28, um estágio de redução (1), fixação pela carcaça (H), eixo de saída maciço (S) e entrada por eixo maciço (U).</w:t>
-      </w:r>
-      <w:r>
-        <w:rPr>
-          <w:vertAlign w:val="superscript"/>
-        </w:rPr>
-        <w:t>5</w:t>
-      </w:r>
-      <w:r>
-        <w:rPr/>
-        <w:t xml:space="preserve"> Os dados foram obtidos do catálogo da linha WCR e do manual da linha coroa e rosca do fabricante e estão resumidos no Quadro 1.</w:t>
+        <w:t>2</w:t>
+      </w:r>
+      <w:r>
+        <w:rPr/>
+        <w:t xml:space="preserve"> </w:t>
+      </w:r>
+      <w:r>
+        <w:rPr>
+          <w:shd w:fill="FFFF00" w:val="clear"/>
+        </w:rPr>
+        <w:t>[confirmar a linha e o tamanho com o fabricante ou com o professor]</w:t>
+      </w:r>
+      <w:r>
+        <w:rPr/>
+        <w:t>. Os dados da placa, do manual e do levantamento feito pela equipe no próprio redutor estão resumidos no Quadro 1.</w:t>
       </w:r>
     </w:p>
     <w:p>
@@ -4518,7 +4479,7 @@
           <w:sz w:val="20"/>
           <w:szCs w:val="20"/>
         </w:rPr>
-        <w:t>Quadro 1 – Características técnicas do redutor WCR28</w:t>
+        <w:t>Quadro 1 – Características técnicas do redutor estudado</w:t>
       </w:r>
     </w:p>
     <w:tbl>
@@ -4762,7 +4723,7 @@
                 <w:sz w:val="20"/>
                 <w:szCs w:val="20"/>
               </w:rPr>
-              <w:t>WCR28 1 HS U, relação 1:7,5 (ref. comercial WCR28.7,5.NAB)</w:t>
+              <w:t>Linha Magma M, tamanho 06, um estágio; código M0612802V0D001; série 818100; fabricado em 2018</w:t>
             </w:r>
           </w:p>
         </w:tc>
@@ -4914,7 +4875,7 @@
                 <w:sz w:val="20"/>
                 <w:szCs w:val="20"/>
               </w:rPr>
-              <w:t>Maciço, Ø 11 mm (tolerância j6)</w:t>
+              <w:t>Vazado e estriado, com flange para acoplamento direto do motor</w:t>
             </w:r>
           </w:p>
         </w:tc>
@@ -4990,7 +4951,17 @@
                 <w:sz w:val="20"/>
                 <w:szCs w:val="20"/>
               </w:rPr>
-              <w:t>Maciço, Ø 14 mm, com chaveta DIN 6885</w:t>
+              <w:t xml:space="preserve">Vazado, com rasgo de chaveta </w:t>
+            </w:r>
+            <w:r>
+              <w:rPr>
+                <w:b w:val="false"/>
+                <w:bCs w:val="false"/>
+                <w:sz w:val="20"/>
+                <w:szCs w:val="20"/>
+                <w:shd w:fill="FFFF00" w:val="clear"/>
+              </w:rPr>
+              <w:t>[medir o diâmetro]</w:t>
             </w:r>
           </w:p>
         </w:tc>
@@ -5066,7 +5037,17 @@
                 <w:sz w:val="20"/>
                 <w:szCs w:val="20"/>
               </w:rPr>
-              <w:t>Alumínio, aletada, sem pintura externa</w:t>
+              <w:t xml:space="preserve">Fundida, pintada em azul sobre fundo vermelho, com sapatas de fixação </w:t>
+            </w:r>
+            <w:r>
+              <w:rPr>
+                <w:b w:val="false"/>
+                <w:bCs w:val="false"/>
+                <w:sz w:val="20"/>
+                <w:szCs w:val="20"/>
+                <w:shd w:fill="FFFF00" w:val="clear"/>
+              </w:rPr>
+              <w:t>[confirmar o material]</w:t>
             </w:r>
           </w:p>
         </w:tc>
@@ -5142,7 +5123,17 @@
                 <w:sz w:val="20"/>
                 <w:szCs w:val="20"/>
               </w:rPr>
-              <w:t>Rosca sem fim de aço Cr-Ni cementado (54 a 59 HRC); coroa de bronze</w:t>
+              <w:t xml:space="preserve">Rosca sem fim de aço e coroa de bronze </w:t>
+            </w:r>
+            <w:r>
+              <w:rPr>
+                <w:b w:val="false"/>
+                <w:bCs w:val="false"/>
+                <w:sz w:val="20"/>
+                <w:szCs w:val="20"/>
+                <w:shd w:fill="FFFF00" w:val="clear"/>
+              </w:rPr>
+              <w:t>[confirmar no manual ou com o fabricante]</w:t>
             </w:r>
           </w:p>
         </w:tc>
@@ -5218,7 +5209,7 @@
                 <w:sz w:val="20"/>
                 <w:szCs w:val="20"/>
               </w:rPr>
-              <w:t>Retentores de borracha nitrílica, conforme DIN 3760</w:t>
+              <w:t>Retentores nos eixos de entrada e de saída; tampa cega na ponta da rosca sem fim</w:t>
             </w:r>
           </w:p>
         </w:tc>
@@ -5259,7 +5250,7 @@
                 <w:sz w:val="20"/>
                 <w:szCs w:val="20"/>
               </w:rPr>
-              <w:t>Desempenho com 1.800 rpm na entrada</w:t>
+              <w:t>Dados da placa</w:t>
             </w:r>
           </w:p>
         </w:tc>
@@ -5294,7 +5285,17 @@
                 <w:sz w:val="20"/>
                 <w:szCs w:val="20"/>
               </w:rPr>
-              <w:t>Saída a 240 rpm; torque máximo de 20,7 N·m; potência máxima de entrada de 0,58 kW (≈ 0,79 cv); rendimento de 87%</w:t>
+              <w:t xml:space="preserve">1.750 rpm na entrada e 70 rpm na saída (redução 1:25); 1,75 kW; fator de serviço 1 </w:t>
+            </w:r>
+            <w:r>
+              <w:rPr>
+                <w:b w:val="false"/>
+                <w:bCs w:val="false"/>
+                <w:sz w:val="20"/>
+                <w:szCs w:val="20"/>
+                <w:shd w:fill="FFFF00" w:val="clear"/>
+              </w:rPr>
+              <w:t>[conferir a potência, pouco legível na placa]</w:t>
             </w:r>
           </w:p>
         </w:tc>
@@ -5370,7 +5371,7 @@
                 <w:sz w:val="20"/>
                 <w:szCs w:val="20"/>
               </w:rPr>
-              <w:t>Imersão em óleo sintético PAO ISO VG 320, fornecido abastecido de fábrica</w:t>
+              <w:t>Imersão em óleo sintético PAO ISO VG 460 (CLP PAO); 0,87 L, para todas as posições de trabalho</w:t>
             </w:r>
           </w:p>
         </w:tc>
@@ -5411,7 +5412,7 @@
                 <w:sz w:val="20"/>
                 <w:szCs w:val="20"/>
               </w:rPr>
-              <w:t>Condições ideais de operação</w:t>
+              <w:t>Temperatura de operação</w:t>
             </w:r>
           </w:p>
         </w:tc>
@@ -5446,7 +5447,7 @@
                 <w:sz w:val="20"/>
                 <w:szCs w:val="20"/>
               </w:rPr>
-              <w:t>Entrada de 500 a 1.800 rpm; ambiente de 10 °C a 40 °C; óleo até 90 °C</w:t>
+              <w:t>Óleo até 90 °C em operação normal; a carcaça fica cerca de 15 °C abaixo da temperatura do óleo</w:t>
             </w:r>
           </w:p>
         </w:tc>
@@ -5513,6 +5514,7 @@
                 <w:bCs w:val="false"/>
                 <w:sz w:val="20"/>
                 <w:szCs w:val="20"/>
+                <w:shd w:fill="FFFF00" w:val="clear"/>
               </w:rPr>
             </w:pPr>
             <w:r>
@@ -5521,8 +5523,9 @@
                 <w:bCs w:val="false"/>
                 <w:sz w:val="20"/>
                 <w:szCs w:val="20"/>
-              </w:rPr>
-              <w:t>1,5 kg</w:t>
+                <w:shd w:fill="FFFF00" w:val="clear"/>
+              </w:rPr>
+              <w:t>[pesar o redutor]</w:t>
             </w:r>
           </w:p>
         </w:tc>
@@ -5542,7 +5545,7 @@
           <w:sz w:val="20"/>
           <w:szCs w:val="20"/>
         </w:rPr>
-        <w:t>Fonte: Adaptado de WEG-Cestari.</w:t>
+        <w:t>Fonte: Placa de identificação do redutor, levantamento dos autores e WEG-Cestari.</w:t>
       </w:r>
       <w:r>
         <w:rPr>
@@ -5550,7 +5553,7 @@
           <w:szCs w:val="20"/>
           <w:vertAlign w:val="superscript"/>
         </w:rPr>
-        <w:t>5</w:t>
+        <w:t>2</w:t>
       </w:r>
     </w:p>
     <w:p>
@@ -5564,27 +5567,17 @@
       </w:pPr>
       <w:r>
         <w:rPr/>
-        <w:t>A quantidade de óleo depende da posição de trabalho em que o redutor está montado: 0,030 L na posição 1, 0,055 L nas posições 2 e 4, 0,035 L na posição 3 e 0,040 L nas posições 5 e 6.</w:t>
+        <w:t>Para a linha Magma M, o fabricante informa um único volume de óleo por tamanho, válido para todas as posições de trabalho: 0,87 L no tamanho 06 de um estágio.</w:t>
       </w:r>
       <w:r>
         <w:rPr>
           <w:vertAlign w:val="superscript"/>
         </w:rPr>
-        <w:t>5</w:t>
-      </w:r>
-      <w:r>
-        <w:rPr/>
-        <w:t xml:space="preserve"> Para o estudo, adotou-se a posição de trabalho 1 (M1), que o fabricante utiliza como referência para orientar os acessórios e o eixo de saída,</w:t>
-      </w:r>
-      <w:r>
-        <w:rPr>
-          <w:vertAlign w:val="superscript"/>
-        </w:rPr>
-        <w:t>5</w:t>
-      </w:r>
-      <w:r>
-        <w:rPr/>
-        <w:t xml:space="preserve"> o que corresponde a um volume de 30 mL. A ficha informa o volume dessa posição, e não um valor único para o modelo. O Quadro 2 apresenta a ficha de lubrificação preenchida com esses dados.</w:t>
+        <w:t>2</w:t>
+      </w:r>
+      <w:r>
+        <w:rPr/>
+        <w:t xml:space="preserve"> O redutor do estudo foi considerado na posição de trabalho adotada pela equipe, vertical, com a placa de identificação voltada para cima, e é nessa posição que os pontos de lubrificação foram identificados. O Quadro 2 apresenta a ficha de lubrificação preenchida com esses dados.</w:t>
       </w:r>
     </w:p>
     <w:p>
@@ -5598,23 +5591,27 @@
       </w:pPr>
       <w:r>
         <w:rPr/>
-        <w:t>O catálogo do fabricante não informa a localização dos bujões de enchimento, dreno e nível nem do respiro para o tamanho 28. Como esses pontos dependem da posição de montagem</w:t>
+        <w:t>Como a equipe dispõe do redutor, os pontos de lubrificação foram identificados no próprio equipamento e registrados em fotografias, usadas também na ficha: o respiro de latão, na face superior, serve de enchimento; dois bujões de nível ficam na face lateral oposta ao motor, onde está a tampa cega da rosca sem fim; e o dreno é feito pelo bujão mais baixo dessa face e por um bujão na base. O redutor não possui visor de nível: o nível é conferido pela retirada do bujão, com o equipamento parado e bloqueado, e qual dos dois bujões de nível deve ser usado depende da posição de montagem</w:t>
       </w:r>
       <w:r>
         <w:rPr>
           <w:vertAlign w:val="superscript"/>
         </w:rPr>
-        <w:t>7</w:t>
-      </w:r>
-      <w:r>
-        <w:rPr/>
-        <w:t xml:space="preserve"> e não puderam ser verificados em um equipamento físico, a ficha indica que devem ser confirmados no redutor instalado ou junto ao fabricante. Na ausência de bujões, a orientação da ficha passa a ser a inspeção (vazamentos, temperatura e ruído), e a troca do óleo é encaminhada à assistência técnica autorizada, à qual o fabricante atribui os reparos.</w:t>
-      </w:r>
-      <w:r>
-        <w:rPr>
-          <w:vertAlign w:val="superscript"/>
-        </w:rPr>
-        <w:t>2</w:t>
+        <w:t>5</w:t>
+      </w:r>
+      <w:r>
+        <w:rPr/>
+        <w:t xml:space="preserve"> </w:t>
+      </w:r>
+      <w:r>
+        <w:rPr>
+          <w:shd w:fill="FFFF00" w:val="clear"/>
+        </w:rPr>
+        <w:t>[confirmar com o professor ou com o fabricante]</w:t>
+      </w:r>
+      <w:r>
+        <w:rPr/>
+        <w:t>. Um adesivo no próprio redutor lembra que o lacre do respiro deve ser retirado antes da operação.</w:t>
       </w:r>
     </w:p>
     <w:p>
@@ -5640,7 +5637,7 @@
           <w:sz w:val="20"/>
           <w:szCs w:val="20"/>
         </w:rPr>
-        <w:t>Quadro 2 – Ficha de lubrificação do redutor WCR28</w:t>
+        <w:t>Quadro 2 – Ficha de lubrificação do redutor RED-001</w:t>
       </w:r>
     </w:p>
     <w:tbl>
@@ -5808,7 +5805,7 @@
                 <w:sz w:val="20"/>
                 <w:szCs w:val="20"/>
               </w:rPr>
-              <w:t>Redutor coroa e rosca WEG-Cestari WCR28, relação 1:7,5 / RED-001</w:t>
+              <w:t>Redutor coroa e rosca WEG-Cestari, linha Magma M, tamanho 06, relação 1:25 / RED-001</w:t>
             </w:r>
           </w:p>
         </w:tc>
@@ -5884,7 +5881,7 @@
                 <w:sz w:val="20"/>
                 <w:szCs w:val="20"/>
               </w:rPr>
-              <w:t>Óleo sintético PAO (CLP HC). Padrão de fábrica: Klübersynth EG4-320. Equivalentes de mesma base: Mobilgear SHC 632; Shell Omala S4 GX 320; Lubrax Syntesys Gear PAO 320</w:t>
+              <w:t>Óleo sintético PAO (CLP PAO), conforme a placa. Recomendados pelo fabricante para ISO VG 460: ExxonMobil SHC 634; Shell Omala S4 GX 460; Klübersynth EG4-460</w:t>
             </w:r>
           </w:p>
         </w:tc>
@@ -5960,7 +5957,7 @@
                 <w:sz w:val="20"/>
                 <w:szCs w:val="20"/>
               </w:rPr>
-              <w:t>ISO VG 320</w:t>
+              <w:t>ISO VG 460</w:t>
             </w:r>
           </w:p>
         </w:tc>
@@ -6036,7 +6033,7 @@
                 <w:sz w:val="20"/>
                 <w:szCs w:val="20"/>
               </w:rPr>
-              <w:t>Conforme a posição de trabalho: posição 1 = 30 mL; posições 2 e 4 = 55 mL; posição 3 = 35 mL; posições 5 e 6 = 40 mL. Posição adotada no estudo: 1 (M1) = 30 mL</w:t>
+              <w:t>0,87 L (870 mL), válido para todas as posições de trabalho</w:t>
             </w:r>
           </w:p>
         </w:tc>
@@ -6198,7 +6195,7 @@
                 <w:sz w:val="20"/>
                 <w:szCs w:val="20"/>
               </w:rPr>
-              <w:t>Não informados no catálogo para o tamanho 28; confirmar no redutor instalado ou com o fabricante antes da intervenção</w:t>
+              <w:t>Enchimento pelo respiro, na face superior; nível por bujão na face da tampa cega (não há visor); dreno pelo bujão mais baixo dessa face e pelo bujão da base</w:t>
             </w:r>
           </w:p>
         </w:tc>
@@ -6274,7 +6271,7 @@
                 <w:sz w:val="20"/>
                 <w:szCs w:val="20"/>
               </w:rPr>
-              <w:t>Luvas nitrílicas e óculos de proteção; bloqueio e etiquetagem (LOTO) antes de intervir</w:t>
+              <w:t>Luvas nitrílicas e óculos de proteção; bloqueio e etiquetagem (LOTO) no complemento e na troca; inspeção visual feita por fora, com a máquina em funcionamento, sem abrir bujões</w:t>
             </w:r>
           </w:p>
         </w:tc>
@@ -6426,7 +6423,7 @@
                 <w:sz w:val="20"/>
                 <w:szCs w:val="20"/>
               </w:rPr>
-              <w:t xml:space="preserve">Tag RED-001-OLE-01; galão identificado pela cor azul </w:t>
+              <w:t xml:space="preserve">Tag RED-001-OLE-04; galão identificado pela cor laranja </w:t>
             </w:r>
             <w:r>
               <w:rPr>
@@ -6522,7 +6519,7 @@
                 <w:szCs w:val="20"/>
                 <w:vertAlign w:val="superscript"/>
               </w:rPr>
-              <w:t>9</w:t>
+              <w:t>7</w:t>
             </w:r>
           </w:p>
         </w:tc>
@@ -6542,7 +6539,7 @@
           <w:sz w:val="20"/>
           <w:szCs w:val="20"/>
         </w:rPr>
-        <w:t>Fonte: Elaborado pelos autores com dados de WEG-Cestari.</w:t>
+        <w:t>Fonte: Elaborado pelos autores com dados da placa de identificação e de WEG-Cestari.</w:t>
       </w:r>
       <w:r>
         <w:rPr>
@@ -6550,7 +6547,7 @@
           <w:szCs w:val="20"/>
           <w:vertAlign w:val="superscript"/>
         </w:rPr>
-        <w:t>2, 5</w:t>
+        <w:t>2</w:t>
       </w:r>
     </w:p>
     <w:p>
@@ -6576,7 +6573,7 @@
       </w:pPr>
       <w:r>
         <w:rPr/>
-        <w:t>A ficha digital foi desenvolvida como uma página web simples, hospedada na internet e acessada pelo navegador do celular, sem necessidade de instalar aplicativo. Após o primeiro acesso, a página fica armazenada no aparelho e passa a funcionar também sem conexão com a rede, e os registros são gravados no armazenamento local do navegador, podendo ser exportados em arquivo CSV. A página abre com as informações essenciais em destaque e em letras grandes: qual lubrificante aplicar, a viscosidade, o volume e onde ficam os pontos de enchimento, dreno e nível. Logo abaixo, uma linha de alerta lembra o bloqueio do equipamento (LOTO), os EPIs necessários e a proibição de misturar óleos de bases diferentes.</w:t>
+        <w:t>A ficha digital foi desenvolvida como uma página web simples, hospedada na internet e acessada pelo navegador do celular ou do tablet, sem necessidade de instalar aplicativo. Após o primeiro acesso, a página fica armazenada no aparelho e passa a funcionar também sem conexão com a rede, e os registros são gravados no armazenamento local do navegador, podendo ser exportados em arquivo CSV. A página abre com o quadro de segurança, que lembra o bloqueio do equipamento (LOTO), os EPIs necessários e a proibição de misturar óleos de bases diferentes; em seguida, aparecem em destaque e em letras grandes as informações essenciais: qual lubrificante aplicar, a viscosidade, o volume e onde ficam os pontos de enchimento, dreno e nível. Em telas largas, como a de um tablet na horizontal, a ficha é exibida em duas colunas.</w:t>
       </w:r>
     </w:p>
     <w:p>
@@ -6590,7 +6587,17 @@
       </w:pPr>
       <w:r>
         <w:rPr/>
-        <w:t>O registro da lubrificação foi projetado para ser feito em poucos toques: o mecânico escolhe o tipo de intervenção (inspeção, complemento ou troca) e confirma, em um único item de checklist, que o equipamento está bloqueado e o bocal limpo; na troca, a quantidade já aparece preenchida com o volume correspondente à posição de trabalho adotada; há um campo opcional para a temperatura da carcaça e o nome do responsável fica memorizado no aparelho. O histórico dos últimos registros fica recolhido na tela, para não atrapalhar a consulta. O QR Code é gerado a partir do endereço da página de cada equipamento.</w:t>
+        <w:t xml:space="preserve">O registro da lubrificação foi projetado para ser feito em poucos toques: o mecânico escolhe o tipo de intervenção (inspeção, complemento ou troca); no complemento e na troca, confirma, em um único item de checklist, que o equipamento está bloqueado e o bocal limpo, e, na troca, a quantidade já aparece preenchida com o volume indicado pelo fabricante. A inspeção é apenas visual, feita por fora e com a máquina em funcionamento (vazamentos, ruído e temperatura da carcaça), sem abertura de bujões e, por isso, sem bloqueio </w:t>
+      </w:r>
+      <w:r>
+        <w:rPr>
+          <w:shd w:fill="FFFF00" w:val="clear"/>
+        </w:rPr>
+        <w:t>[confirmar a regra com o professor e com o procedimento de segurança]</w:t>
+      </w:r>
+      <w:r>
+        <w:rPr/>
+        <w:t>; para conferir o nível ou completar o óleo, a intervenção é registrada como complemento. Há um campo opcional para a temperatura da carcaça, e o nome do responsável fica memorizado no aparelho. O histórico dos últimos registros fica recolhido na tela, para não atrapalhar a consulta. O QR Code é gerado a partir do endereço da página de cada equipamento; como a lubrificação e a inspeção do redutor são trabalhos de projetos integradores diferentes, cada uma tem o seu QR Code, que abre diretamente a parte correspondente.</w:t>
       </w:r>
     </w:p>
     <w:p>
@@ -6628,7 +6635,7 @@
       </w:pPr>
       <w:r>
         <w:rPr/>
-        <w:t>Além da lubrificação, a página oferece um roteiro de inspeção do redutor, com um modelo tridimensional das peças e uma lista de verificação. Quando o horímetro é informado na inspeção, a página calcula, durante a digitação, as horas trabalhadas desde a inspeção anterior e, no modo com horímetro, soma esse valor às horas de uso do óleo.</w:t>
+        <w:t>Além da lubrificação, o mesmo site reúne o roteiro de inspeção do redutor, desenvolvido em outro projeto integrador, com um modelo tridimensional das peças e uma lista de verificação. Quando o horímetro é informado nessa inspeção, a página calcula as horas trabalhadas desde a inspeção anterior e, no modo com horímetro, soma esse valor às horas de uso do óleo.</w:t>
       </w:r>
     </w:p>
     <w:p>
@@ -6642,7 +6649,7 @@
       </w:pPr>
       <w:r>
         <w:rPr/>
-        <w:t>O acompanhamento da condição do óleo por análise em laboratório, usual em redutores de maior porte, exige a retirada de uma amostra e a reposição do volume retirado com o mesmo lubrificante, com registro da quantidade. O manual do fabricante orienta verificar o nível e completá-lo, quando necessário, com o lubrificante recomendado, usar nas trocas o mesmo óleo indicado na plaqueta, não misturar óleos de tipos e fabricantes diferentes e substituir o óleo que estiver contaminado ou com partículas.</w:t>
+        <w:t>O acompanhamento da condição do óleo por análise em laboratório exige a retirada de uma amostra e a reposição do volume retirado com o mesmo lubrificante. O manual do fabricante orienta verificar o nível e completá-lo, quando necessário, com o lubrificante recomendado, usar nas trocas o mesmo óleo indicado na placa, não misturar óleos de tipos e fabricantes diferentes e substituir o óleo que estiver contaminado ou com partículas.</w:t>
       </w:r>
       <w:r>
         <w:rPr>
@@ -6652,17 +6659,7 @@
       </w:r>
       <w:r>
         <w:rPr/>
-        <w:t xml:space="preserve"> No redutor estudado, cuja carga total é de 30 mL na posição M1, a coleta para laboratório não é viável, pois o frasco de amostra tende a exigir volume superior ao do próprio redutor </w:t>
-      </w:r>
-      <w:r>
-        <w:rPr>
-          <w:shd w:fill="FFFF00" w:val="clear"/>
-        </w:rPr>
-        <w:t>[confirmar com o laboratório o volume mínimo de amostra]</w:t>
-      </w:r>
-      <w:r>
-        <w:rPr/>
-        <w:t>. Por isso, o roteiro de inspeção adota a observação visual de uma pequena quantidade de óleo (cor, transparência e presença de partículas), associada à temperatura da carcaça e às horas de uso, e orienta repor o que foi retirado e registrar a intervenção como complemento.</w:t>
+        <w:t xml:space="preserve"> Neste trabalho, a análise laboratorial não foi incluída: a condição do óleo é acompanhada pela observação do óleo retirado na troca (cor, transparência e presença de partículas), pela temperatura da carcaça e pelas horas de uso, e o passo a passo da troca orienta o mecânico sobre o que cada aspecto pode indicar.</w:t>
       </w:r>
     </w:p>
     <w:p>
@@ -6690,7 +6687,7 @@
       </w:pPr>
       <w:r>
         <w:rPr/>
-        <w:t xml:space="preserve">A ficha também informa como requisitar o lubrificante ao almoxarifado. Cada óleo recebe um código de identificação (tag) no mesmo padrão dos códigos das peças mostrados no roteiro de inspeção, formado pelo código do equipamento e pelo código do item (RED-001-OLE-01), e uma cor, que é a mesma do galão em que o produto é armazenado </w:t>
+        <w:t xml:space="preserve">A ficha também informa como requisitar o lubrificante ao almoxarifado. Cada óleo recebe um código de identificação (tag) no mesmo padrão dos códigos das peças mostrados no roteiro de inspeção, formado pelo código do equipamento e pelo código do item (RED-001-OLE-04), e uma cor, que é a mesma do galão em que o produto é armazenado </w:t>
       </w:r>
       <w:r>
         <w:rPr>
@@ -6701,18 +6698,6 @@
       <w:r>
         <w:rPr/>
         <w:t>. O tag e a cor aparecem na ficha, na orientação de troca e na etiqueta fixada no equipamento, o que reduz o risco de aplicação de um produto incorreto.</w:t>
-      </w:r>
-    </w:p>
-    <w:p>
-      <w:pPr>
-        <w:pStyle w:val="Heading3"/>
-        <w:rPr/>
-      </w:pPr>
-      <w:bookmarkStart w:id="19" w:name="pag25"/>
-      <w:bookmarkEnd w:id="19"/>
-      <w:r>
-        <w:rPr/>
-        <w:t>2.2.3 Cronometragem</w:t>
       </w:r>
     </w:p>
     <w:p>
@@ -6726,7 +6711,47 @@
       </w:pPr>
       <w:r>
         <w:rPr/>
-        <w:t xml:space="preserve">Para avaliar o ganho de tempo sem o equipamento físico, foi realizada uma simulação em ambiente didático com cinco participantes </w:t>
+        <w:t>A ficha também indica a situação do equipamento por cores, como um semáforo, na tela de abertura e em uma faixa sob o cabeçalho: verde quando o óleo está dentro da vida útil, amarelo nos últimos 20% do intervalo de troca e vermelho quando o limite é ultrapassado. Para evitar a aplicação do óleo errado, cada galão recebe uma etiqueta com o próprio QR Code; antes de abastecer, o mecânico lê esse código pela ficha, que confirma se o galão é o indicado para o redutor e não deixa salvar o registro quando o último galão lido é o errado.</w:t>
+      </w:r>
+    </w:p>
+    <w:p>
+      <w:pPr>
+        <w:pStyle w:val="Normal"/>
+        <w:widowControl/>
+        <w:spacing w:lineRule="auto" w:line="360" w:before="0" w:after="0"/>
+        <w:ind w:left="0" w:right="0" w:firstLine="709"/>
+        <w:jc w:val="both"/>
+        <w:rPr/>
+      </w:pPr>
+      <w:r>
+        <w:rPr/>
+        <w:t>A troca do óleo é apresentada como um passo a passo, uma etapa por tela, com fotografias do próprio redutor em que os pontos estão marcados: separar o material, desligar e bloquear, limpar em volta dos bujões, drenar o óleo usado, observar o óleo retirado, fechar o dreno, conferir o galão, abastecer, fechar e testar e, por fim, descartar o óleo usado. Ao final, o registro já fica marcado como troca. A ficha traz, ainda, um modelo tridimensional simplificado do redutor, construído a partir das fotografias, no qual o mecânico toca em Enchimento, Nível, Dreno ou QR Code e o modelo gira até o ponto escolhido, que fica destacado e é acompanhado da fotografia correspondente.</w:t>
+      </w:r>
+    </w:p>
+    <w:p>
+      <w:pPr>
+        <w:pStyle w:val="Heading3"/>
+        <w:rPr/>
+      </w:pPr>
+      <w:bookmarkStart w:id="19" w:name="pag25"/>
+      <w:bookmarkEnd w:id="19"/>
+      <w:r>
+        <w:rPr/>
+        <w:t>2.2.3 Cronometragem</w:t>
+      </w:r>
+    </w:p>
+    <w:p>
+      <w:pPr>
+        <w:pStyle w:val="Normal"/>
+        <w:widowControl/>
+        <w:spacing w:lineRule="auto" w:line="360" w:before="0" w:after="0"/>
+        <w:ind w:left="0" w:right="0" w:firstLine="709"/>
+        <w:jc w:val="both"/>
+        <w:rPr/>
+      </w:pPr>
+      <w:r>
+        <w:rPr/>
+        <w:t xml:space="preserve">Para avaliar o ganho de tempo, foi realizada uma cronometragem em ambiente didático com cinco participantes </w:t>
       </w:r>
       <w:r>
         <w:rPr>
@@ -6736,23 +6761,33 @@
       </w:r>
       <w:r>
         <w:rPr/>
-        <w:t xml:space="preserve">, cada um executando a tarefa pelos dois métodos. No método tradicional, o participante consultou a documentação do fabricante (catálogo da linha WCR e manual da linha coroa e rosca, </w:t>
+        <w:t xml:space="preserve">, cada um executando a tarefa pelos dois métodos </w:t>
       </w:r>
       <w:r>
         <w:rPr>
           <w:shd w:fill="FFFF00" w:val="clear"/>
         </w:rPr>
-        <w:t>[impressos ou em PDF]</w:t>
-      </w:r>
-      <w:r>
-        <w:rPr/>
-        <w:t xml:space="preserve">) e registrou a intervenção em formulário de papel. No método com QR Code, escaneou a etiqueta impressa, afixada em </w:t>
+        <w:t>[informar o local: oficina de mecânica, junto ao redutor]</w:t>
+      </w:r>
+      <w:r>
+        <w:rPr/>
+        <w:t xml:space="preserve">. No método tradicional, o participante consultou a placa de identificação e o manual da linha coroa e rosca do fabricante </w:t>
       </w:r>
       <w:r>
         <w:rPr>
           <w:shd w:fill="FFFF00" w:val="clear"/>
         </w:rPr>
-        <w:t>[uma imagem impressa do redutor ou em uma bancada]</w:t>
+        <w:t>[impresso ou em PDF]</w:t>
+      </w:r>
+      <w:r>
+        <w:rPr/>
+        <w:t xml:space="preserve"> e registrou a intervenção em formulário de papel. No método com QR Code, escaneou a etiqueta impressa, afixada </w:t>
+      </w:r>
+      <w:r>
+        <w:rPr>
+          <w:shd w:fill="FFFF00" w:val="clear"/>
+        </w:rPr>
+        <w:t>[no redutor ou junto a ele]</w:t>
       </w:r>
       <w:r>
         <w:rPr/>
@@ -6983,7 +7018,7 @@
                 <w:sz w:val="20"/>
                 <w:szCs w:val="20"/>
               </w:rPr>
-              <w:t>Procurar no catálogo e no manual do fabricante o tipo de óleo e a viscosidade</w:t>
+              <w:t>Procurar na placa e no manual do fabricante o tipo de óleo e a viscosidade</w:t>
             </w:r>
           </w:p>
         </w:tc>
@@ -7092,7 +7127,7 @@
                 <w:sz w:val="20"/>
                 <w:szCs w:val="20"/>
               </w:rPr>
-              <w:t>Procurar no catálogo o volume para a posição de trabalho e os pontos de lubrificação</w:t>
+              <w:t>Procurar no manual o volume e localizar no redutor os pontos de lubrificação</w:t>
             </w:r>
           </w:p>
         </w:tc>
@@ -7284,7 +7319,7 @@
       </w:pPr>
       <w:r>
         <w:rPr/>
-        <w:t>Como quem executa um método primeiro tende a memorizar as informações e a ganhar tempo no segundo, foi adotada uma ordem contrabalanceada: os participantes 1, 3 e 5 começaram pelo método tradicional, e os participantes 2 e 4, pelo método com QR Code. A simulação não inclui o deslocamento até a sala de manutenção nem a consulta ao supervisor, que ocorrem no método tradicional em campo; por isso, os tempos tradicionais medidos tendem a ser menores que os reais, e o ganho calculado deve ser entendido como uma estimativa conservadora.</w:t>
+        <w:t>Como quem executa um método primeiro tende a memorizar as informações e a ganhar tempo no segundo, foi adotada uma ordem contrabalanceada: os participantes 1, 3 e 5 começaram pelo método tradicional, e os participantes 2 e 4, pelo método com QR Code. A cronometragem não inclui o deslocamento até a sala de manutenção nem a consulta ao supervisor, que ocorrem no método tradicional em campo; por isso, os tempos tradicionais medidos tendem a ser menores que os reais, e o ganho calculado deve ser entendido como uma estimativa conservadora.</w:t>
       </w:r>
     </w:p>
     <w:p>
@@ -7389,7 +7424,7 @@
         <w:rPr>
           <w:shd w:fill="FFFF00" w:val="clear"/>
         </w:rPr>
-        <w:t>[Descrever, após a coleta, os participantes, a data, o local e as condições da simulação.]</w:t>
+        <w:t>[Descrever, após a coleta, os participantes, a data, o local e as condições da cronometragem.]</w:t>
       </w:r>
     </w:p>
     <w:p>
@@ -9818,7 +9853,7 @@
       </w:pPr>
       <w:r>
         <w:rPr/>
-        <w:t>Deve-se considerar, ainda, que o WCR28 é um redutor pequeno, com carga de óleo de 30 a 55 mL e longos intervalos de troca. Por isso, o ganho anual em um único equipamento tende a ser modesto, e o benefício da solução cresce com o número de equipamentos atendidos, já que o custo de cada nova ficha e etiqueta é baixo.</w:t>
+        <w:t>Deve-se considerar, ainda, que o redutor estudado é de pequeno porte, com carga de 0,87 L de óleo sintético e longos intervalos de troca. Por isso, o ganho anual em um único equipamento tende a ser modesto, e o benefício da solução cresce com o número de equipamentos atendidos, já que o custo de cada nova ficha e etiqueta é baixo.</w:t>
       </w:r>
     </w:p>
     <w:p>
@@ -9832,7 +9867,7 @@
       </w:pPr>
       <w:r>
         <w:rPr/>
-        <w:t>Como limitações do estudo, citam-se a ausência do equipamento físico, que fez com que os dados fossem obtidos apenas da documentação do fabricante e que a cronometragem fosse realizada em simulação; a não inclusão do deslocamento e da consulta ao supervisor no método tradicional; o número reduzido de participantes, que impede generalizar os valores para outros contextos; o efeito de aprendizado entre os métodos, que a ordem contrabalanceada reduz, mas não elimina; o uso de intervalos de troca do manual geral da linha coroa e rosca do fabricante, que devem ser confirmados para o modelo WCR28, uma vez que o mesmo manual traz também a indicação geral de troca a cada 3.500 horas ou anualmente; a falta de informação sobre a localização dos bujões no tamanho 28; a dependência de que a ficha esteja sempre atualizada; a necessidade de um celular com câmera e de conexão com a internet no primeiro acesso à ficha; a estimativa das horas trabalhadas pelo tempo decorrido desde a última troca, que supõe operação contínua e só desconta as paradas informadas manualmente; e o armazenamento dos registros em cada aparelho, sem uma base central que reúna o histórico de todos os usuários. Essas limitações indicam caminhos para trabalhos futuros.</w:t>
+        <w:t>Como limitações do estudo, citam-se a realização da cronometragem em ambiente didático, e não com o redutor instalado em uma linha de produção; a não inclusão do deslocamento e da consulta ao supervisor no método tradicional; o número reduzido de participantes, que impede generalizar os valores para outros contextos; o efeito de aprendizado entre os métodos, que a ordem contrabalanceada reduz, mas não elimina; o uso de intervalos de troca do manual geral da linha coroa e rosca do fabricante, que traz também a indicação geral de troca a cada 3.500 horas ou anualmente; a identificação da linha e do tamanho do redutor a partir do código da placa, que deve ser confirmada com o fabricante; a dependência de que a ficha esteja sempre atualizada; a necessidade de um celular com câmera e de conexão com a internet no primeiro acesso à ficha; a estimativa das horas trabalhadas pelo tempo decorrido desde a última troca, que supõe operação contínua e só desconta as paradas informadas manualmente; e o armazenamento dos registros em cada aparelho, sem uma base central que reúna o histórico de todos os usuários. Essas limitações indicam caminhos para trabalhos futuros.</w:t>
       </w:r>
       <w:r>
         <w:br w:type="page"/>
@@ -9861,7 +9896,7 @@
       </w:pPr>
       <w:r>
         <w:rPr/>
-        <w:t xml:space="preserve">O trabalho teve como objetivo reduzir o tempo do mecânico na identificação e no registro da lubrificação de um redutor de coroa e rosca sem fim WEG-Cestari WCR28 por meio de um QR Code fixado no equipamento. </w:t>
+        <w:t xml:space="preserve">O trabalho teve como objetivo reduzir o tempo do mecânico na identificação e no registro da lubrificação de um redutor de coroa e rosca sem fim WEG-Cestari, da linha Magma M, por meio de um QR Code fixado no equipamento. </w:t>
       </w:r>
       <w:r>
         <w:rPr>
@@ -9901,7 +9936,7 @@
       </w:pPr>
       <w:r>
         <w:rPr/>
-        <w:t>Como sugestões para trabalhos futuros, propõem-se a aplicação da solução em um redutor instalado em campo, com mecânicos de manutenção, a ampliação para outros equipamentos da planta, a sincronização dos registros de todos os aparelhos em um banco de dados central, o registro periódico da temperatura da carcaça para acompanhar a condição do óleo, a avaliação de etiquetas NFC para metal em pontos de leitura difícil, a leitura automática das horas de operação por horímetro ou sensor, em substituição à estimativa pelo tempo decorrido, a inclusão da análise de óleo em laboratório, com coleta de amostra e reposição do volume, em redutores de maior porte, e a integração da ficha ao sistema SAP da empresa, com a criação automática de reservas de material e de notas de manutenção e o envio do histórico de lubrificações ao PCM.</w:t>
+        <w:t>Como sugestões para trabalhos futuros, propõem-se a aplicação da solução em um redutor instalado em campo, com mecânicos de manutenção, a ampliação para outros equipamentos da planta, a sincronização dos registros de todos os aparelhos em um banco de dados central, o registro periódico da temperatura da carcaça para acompanhar a condição do óleo, a avaliação de etiquetas NFC para metal em pontos de leitura difícil, a leitura automática das horas de operação por horímetro ou sensor, em substituição à estimativa pelo tempo decorrido, a inclusão da análise de óleo em laboratório, com coleta de amostra e reposição do volume retirado, e a integração da ficha ao sistema SAP da empresa, com a criação automática de reservas de material e de notas de manutenção e o envio do histórico de lubrificações ao PCM.</w:t>
       </w:r>
       <w:r>
         <w:br w:type="page"/>
@@ -9983,18 +10018,18 @@
       </w:pPr>
       <w:r>
         <w:rPr/>
-        <w:t xml:space="preserve">3. LILO REDUTORES. </w:t>
-      </w:r>
-      <w:r>
-        <w:rPr>
-          <w:b/>
-          <w:bCs/>
-        </w:rPr>
-        <w:t>Redutor de velocidade WCR28 1:7,5 coroa e rosca sem fim Weg Cestari NAB</w:t>
-      </w:r>
-      <w:r>
-        <w:rPr/>
-        <w:t>. [S. l.]: Lilo Redutores, [2026]. Disponível em: https://www.liloredutores.com.br/redutor-de-velocidade-wcr28-175-coroa-e-rosca-sem-fim-weg-cestari-nab/prod-10364106/. Acesso em: 7 out. 2026.</w:t>
+        <w:t xml:space="preserve">3. ASSOCIAÇÃO BRASILEIRA DE NORMAS TÉCNICAS. </w:t>
+      </w:r>
+      <w:r>
+        <w:rPr>
+          <w:b/>
+          <w:bCs/>
+        </w:rPr>
+        <w:t>NBR 5462</w:t>
+      </w:r>
+      <w:r>
+        <w:rPr/>
+        <w:t>: confiabilidade e mantenabilidade. Rio de Janeiro: ABNT, 1994.</w:t>
       </w:r>
     </w:p>
     <w:p>
@@ -10006,18 +10041,18 @@
       </w:pPr>
       <w:r>
         <w:rPr/>
-        <w:t xml:space="preserve">4. ASSOCIAÇÃO BRASILEIRA DE NORMAS TÉCNICAS. </w:t>
-      </w:r>
-      <w:r>
-        <w:rPr>
-          <w:b/>
-          <w:bCs/>
-        </w:rPr>
-        <w:t>NBR 5462</w:t>
-      </w:r>
-      <w:r>
-        <w:rPr/>
-        <w:t>: confiabilidade e mantenabilidade. Rio de Janeiro: ABNT, 1994.</w:t>
+        <w:t xml:space="preserve">4. INTERNATIONAL ORGANIZATION FOR STANDARDIZATION. </w:t>
+      </w:r>
+      <w:r>
+        <w:rPr>
+          <w:b/>
+          <w:bCs/>
+        </w:rPr>
+        <w:t>ISO 3448</w:t>
+      </w:r>
+      <w:r>
+        <w:rPr/>
+        <w:t>: industrial liquid lubricants: ISO viscosity classification. Geneva: ISO, 1992.</w:t>
       </w:r>
     </w:p>
     <w:p>
@@ -10029,18 +10064,18 @@
       </w:pPr>
       <w:r>
         <w:rPr/>
-        <w:t xml:space="preserve">5. WEG-CESTARI. </w:t>
-      </w:r>
-      <w:r>
-        <w:rPr>
-          <w:b/>
-          <w:bCs/>
-        </w:rPr>
-        <w:t>WCR</w:t>
-      </w:r>
-      <w:r>
-        <w:rPr/>
-        <w:t>: coroa e rosca. Catálogo 50129187, rev. 04. Monte Alto: WEG-Cestari, 2025. Disponível em: https://static.weg.net/medias/downloadcenter/hb2/hcd/WEG-CESTARI-WCR-50129187-brochure-pt-web.pdf. Acesso em: 7 out. 2026.</w:t>
+        <w:t xml:space="preserve">5. FARIA, V. </w:t>
+      </w:r>
+      <w:r>
+        <w:rPr>
+          <w:b/>
+          <w:bCs/>
+        </w:rPr>
+        <w:t>Posição de montagem de redutores</w:t>
+      </w:r>
+      <w:r>
+        <w:rPr/>
+        <w:t>: o que muda na lubrificação e no desempenho? Blog Acoplast Brasil, 1 out. 2026. Disponível em: https://blog.acoplastbrasil.com.br/posicao-de-montagem-de-redutores/. Acesso em: 7 out. 2026.</w:t>
       </w:r>
     </w:p>
     <w:p>
@@ -10052,18 +10087,18 @@
       </w:pPr>
       <w:r>
         <w:rPr/>
-        <w:t xml:space="preserve">6. INTERNATIONAL ORGANIZATION FOR STANDARDIZATION. </w:t>
-      </w:r>
-      <w:r>
-        <w:rPr>
-          <w:b/>
-          <w:bCs/>
-        </w:rPr>
-        <w:t>ISO 3448</w:t>
-      </w:r>
-      <w:r>
-        <w:rPr/>
-        <w:t>: industrial liquid lubricants: ISO viscosity classification. Geneva: ISO, 1992.</w:t>
+        <w:t xml:space="preserve">6. INTERNATIONAL ORGANIZATION FOR STANDARDIZATION; INTERNATIONAL ELECTROTECHNICAL COMMISSION. </w:t>
+      </w:r>
+      <w:r>
+        <w:rPr>
+          <w:b/>
+          <w:bCs/>
+        </w:rPr>
+        <w:t>ISO/IEC 18004</w:t>
+      </w:r>
+      <w:r>
+        <w:rPr/>
+        <w:t>: information technology: automatic identification and data capture techniques: QR Code bar code symbology specification. Geneva: ISO/IEC, 2015.</w:t>
       </w:r>
     </w:p>
     <w:p>
@@ -10075,53 +10110,7 @@
       </w:pPr>
       <w:r>
         <w:rPr/>
-        <w:t xml:space="preserve">7. FARIA, V. </w:t>
-      </w:r>
-      <w:r>
-        <w:rPr>
-          <w:b/>
-          <w:bCs/>
-        </w:rPr>
-        <w:t>Posição de montagem de redutores</w:t>
-      </w:r>
-      <w:r>
-        <w:rPr/>
-        <w:t>: o que muda na lubrificação e no desempenho? Blog Acoplast Brasil, 1 out. 2026. Disponível em: https://blog.acoplastbrasil.com.br/posicao-de-montagem-de-redutores/. Acesso em: 7 out. 2026.</w:t>
-      </w:r>
-    </w:p>
-    <w:p>
-      <w:pPr>
-        <w:pStyle w:val="Normal"/>
-        <w:spacing w:lineRule="auto" w:line="240" w:before="0" w:after="240"/>
-        <w:jc w:val="left"/>
-        <w:rPr/>
-      </w:pPr>
-      <w:r>
-        <w:rPr/>
-        <w:t xml:space="preserve">8. INTERNATIONAL ORGANIZATION FOR STANDARDIZATION; INTERNATIONAL ELECTROTECHNICAL COMMISSION. </w:t>
-      </w:r>
-      <w:r>
-        <w:rPr>
-          <w:b/>
-          <w:bCs/>
-        </w:rPr>
-        <w:t>ISO/IEC 18004</w:t>
-      </w:r>
-      <w:r>
-        <w:rPr/>
-        <w:t>: information technology: automatic identification and data capture techniques: QR Code bar code symbology specification. Geneva: ISO/IEC, 2015.</w:t>
-      </w:r>
-    </w:p>
-    <w:p>
-      <w:pPr>
-        <w:pStyle w:val="Normal"/>
-        <w:spacing w:lineRule="auto" w:line="240" w:before="0" w:after="240"/>
-        <w:jc w:val="left"/>
-        <w:rPr/>
-      </w:pPr>
-      <w:r>
-        <w:rPr/>
-        <w:t xml:space="preserve">9. BRASIL. Conselho Nacional do Meio Ambiente. </w:t>
+        <w:t xml:space="preserve">7. BRASIL. Conselho Nacional do Meio Ambiente. </w:t>
       </w:r>
       <w:r>
         <w:rPr>
@@ -10173,7 +10162,7 @@
           <w:sz w:val="20"/>
           <w:szCs w:val="20"/>
         </w:rPr>
-        <w:t>Redutor de referência: WCR28 1:7,5 – posição M1 Local: ____________________ Data: ____/____/______</w:t>
+        <w:t>Redutor: WEG-Cestari Magma M 06, 1:25 – posição vertical (RED-001) Local: ____________________ Data: ____/____/______</w:t>
       </w:r>
     </w:p>
     <w:p>
@@ -12283,17 +12272,17 @@
       </w:pPr>
       <w:r>
         <w:rPr/>
-        <w:t>Como o WCR28 é compacto (carcaça de alumínio aletada e massa de 1,5 kg), a etiqueta não deve ser colada sobre as aletas, responsáveis pela refrigeração do redutor,</w:t>
-      </w:r>
-      <w:r>
-        <w:rPr>
-          <w:vertAlign w:val="superscript"/>
-        </w:rPr>
-        <w:t>5</w:t>
-      </w:r>
-      <w:r>
-        <w:rPr/>
-        <w:t xml:space="preserve"> nem sobre a placa de identificação do fabricante. Recomenda-se fixá-la na estrutura da máquina, ao lado do redutor, ou em uma plaqueta de alumínio presa junto à fixação, em local visível, de fácil acesso e fora de regiões de calor excessivo. Na simulação, a etiqueta foi impressa em papel e afixada em </w:t>
+        <w:t xml:space="preserve">A etiqueta não deve ser colada sobre a placa de identificação do fabricante, sobre o respiro ou os bujões, nem em regiões que esquentam ou recebem respingos de óleo. No redutor estudado, sugere-se a parte superior da face lateral oposta ao motor, que é lisa e fica visível </w:t>
+      </w:r>
+      <w:r>
+        <w:rPr>
+          <w:shd w:fill="FFFF00" w:val="clear"/>
+        </w:rPr>
+        <w:t>[confirmar o local de fixação]</w:t>
+      </w:r>
+      <w:r>
+        <w:rPr/>
+        <w:t xml:space="preserve">, ou uma plaqueta de alumínio presa junto à fixação do redutor, em local de fácil acesso. Na cronometragem, a etiqueta foi impressa em papel e afixada em </w:t>
       </w:r>
       <w:r>
         <w:rPr>
@@ -12323,11 +12312,11 @@
         <w:rPr>
           <w:vertAlign w:val="superscript"/>
         </w:rPr>
-        <w:t>8</w:t>
-      </w:r>
-      <w:r>
-        <w:rPr/>
-        <w:t xml:space="preserve"> Como regra prática, a distância de leitura é de cerca de dez vezes o lado do código; um código de 3 cm × 3 cm permite leitura a aproximadamente 30 cm. Dimensão adotada: 3 cm × 3 cm. Endereço codificado: https://ficha-lubrificacao.vercel.app/e/RED-001. Além do QR Code e do código do equipamento, a etiqueta traz a cor do galão e o tag do óleo, com o nome da cor escrito por extenso, para que a identificação não dependa de impressão colorida.</w:t>
+        <w:t>6</w:t>
+      </w:r>
+      <w:r>
+        <w:rPr/>
+        <w:t xml:space="preserve"> Como regra prática, a distância de leitura é de cerca de dez vezes o lado do código; um código de 3 cm × 3 cm permite leitura a aproximadamente 30 cm. Dimensão adotada: 3 cm × 3 cm. Endereço codificado: https://ficha-lubrificacao.vercel.app/l/RED-001. Além do QR Code e do código do equipamento, a etiqueta traz a cor do galão e o tag do óleo, com o nome da cor escrito por extenso, para que a identificação não dependa de impressão colorida. A etiqueta da inspeção, do outro projeto integrador, leva ao endereço https://ficha-lubrificacao.vercel.app/i/RED-001, e cada galão de óleo recebe uma etiqueta própria, com QR Code que abre a página do óleo e é usado na conferência do galão antes do abastecimento.</w:t>
       </w:r>
       <w:r>
         <w:br w:type="page"/>
@@ -12377,7 +12366,7 @@
           <w:sz w:val="20"/>
           <w:szCs w:val="20"/>
         </w:rPr>
-        <w:t>Figura 1 – Telas da ficha digital do redutor RED-001: vida útil do óleo, com as datas da última e da próxima troca (à esquerda); lubrificante, com o tag e a cor do galão, e alerta de segurança (ao centro); registro da intervenção e histórico (à direita)</w:t>
+        <w:t>Figura 1 – Telas da ficha digital do redutor RED-001: segurança e vida útil do óleo, com as datas da última e da próxima troca (à esquerda); modelo tridimensional com a localização dos bujões de nível e a fotografia do redutor (ao centro); registro da intervenção (à direita)</w:t>
       </w:r>
     </w:p>
     <w:p>
@@ -12698,7 +12687,7 @@
         <w:szCs w:val="20"/>
       </w:rPr>
       <w:drawing>
-        <wp:anchor behindDoc="1" distT="0" distB="0" distL="0" distR="0" simplePos="0" locked="0" layoutInCell="0" allowOverlap="1" relativeHeight="15">
+        <wp:anchor behindDoc="1" distT="0" distB="0" distL="0" distR="0" simplePos="0" locked="0" layoutInCell="0" allowOverlap="1" relativeHeight="16">
           <wp:simplePos x="0" y="0"/>
           <wp:positionH relativeFrom="page">
             <wp:posOffset>0</wp:posOffset>
@@ -12763,7 +12752,7 @@
         <w:sz w:val="20"/>
         <w:szCs w:val="20"/>
       </w:rPr>
-      <w:t>27</w:t>
+      <w:t>29</w:t>
     </w:r>
     <w:r>
       <w:rPr>

</xml_diff>

<commit_message>
Documento: diâmetro do eixo de saída (55 mm) e altura (225 mm) medidos pela equipe; troca simulada de 14/10/2026
Co-Authored-By: Claude Opus 5.5 <noreply@anthropic.com>
</commit_message>
<xml_diff>
--- a/Projeto_Integrador_QRCode_Lubrificantes.docx
+++ b/Projeto_Integrador_QRCode_Lubrificantes.docx
@@ -997,7 +997,7 @@
           <w:sz w:val="24"/>
           <w:szCs w:val="24"/>
         </w:rPr>
-        <w:t>15</w:t>
+        <w:t>16</w:t>
       </w:r>
       <w:r>
         <w:rPr>
@@ -1125,7 +1125,7 @@
           <w:sz w:val="24"/>
           <w:szCs w:val="24"/>
         </w:rPr>
-        <w:t>20</w:t>
+        <w:t>21</w:t>
       </w:r>
       <w:r>
         <w:rPr>
@@ -1339,7 +1339,7 @@
           <w:sz w:val="24"/>
           <w:szCs w:val="24"/>
         </w:rPr>
-        <w:t>22</w:t>
+        <w:t>23</w:t>
       </w:r>
       <w:r>
         <w:rPr>
@@ -3038,7 +3038,7 @@
           <w:sz w:val="24"/>
           <w:szCs w:val="24"/>
         </w:rPr>
-        <w:t>17</w:t>
+        <w:t>18</w:t>
       </w:r>
       <w:r>
         <w:rPr>
@@ -3170,7 +3170,7 @@
           <w:sz w:val="24"/>
           <w:szCs w:val="24"/>
         </w:rPr>
-        <w:t>21</w:t>
+        <w:t>22</w:t>
       </w:r>
       <w:r>
         <w:rPr>
@@ -4951,17 +4951,7 @@
                 <w:sz w:val="20"/>
                 <w:szCs w:val="20"/>
               </w:rPr>
-              <w:t xml:space="preserve">Vazado, com rasgo de chaveta </w:t>
-            </w:r>
-            <w:r>
-              <w:rPr>
-                <w:b w:val="false"/>
-                <w:bCs w:val="false"/>
-                <w:sz w:val="20"/>
-                <w:szCs w:val="20"/>
-                <w:shd w:fill="FFFF00" w:val="clear"/>
-              </w:rPr>
-              <w:t>[medir o diâmetro]</w:t>
+              <w:t>Vazado, com rasgo de chaveta; diâmetro de 55 mm (medido pela equipe)</w:t>
             </w:r>
           </w:p>
         </w:tc>
@@ -5488,7 +5478,7 @@
                 <w:sz w:val="20"/>
                 <w:szCs w:val="20"/>
               </w:rPr>
-              <w:t>Massa</w:t>
+              <w:t>Altura e massa</w:t>
             </w:r>
           </w:p>
         </w:tc>
@@ -5514,9 +5504,17 @@
                 <w:bCs w:val="false"/>
                 <w:sz w:val="20"/>
                 <w:szCs w:val="20"/>
-                <w:shd w:fill="FFFF00" w:val="clear"/>
-              </w:rPr>
-            </w:pPr>
+              </w:rPr>
+            </w:pPr>
+            <w:r>
+              <w:rPr>
+                <w:b w:val="false"/>
+                <w:bCs w:val="false"/>
+                <w:sz w:val="20"/>
+                <w:szCs w:val="20"/>
+              </w:rPr>
+              <w:t xml:space="preserve">Altura de 225 mm (medida pela equipe); massa: </w:t>
+            </w:r>
             <w:r>
               <w:rPr>
                 <w:b w:val="false"/>
@@ -6711,7 +6709,7 @@
       </w:pPr>
       <w:r>
         <w:rPr/>
-        <w:t>A ficha também indica a situação do equipamento por cores, como um semáforo, na tela de abertura e em uma faixa sob o cabeçalho: verde quando o óleo está dentro da vida útil, amarelo nos últimos 20% do intervalo de troca e vermelho quando o limite é ultrapassado. Para evitar a aplicação do óleo errado, cada galão recebe uma etiqueta com o próprio QR Code; antes de abastecer, o mecânico lê esse código pela ficha, que confirma se o galão é o indicado para o redutor e não deixa salvar o registro quando o último galão lido é o errado.</w:t>
+        <w:t>Além disso, a ficha indica a situação do equipamento por cores, como um semáforo, na tela de abertura e em uma faixa sob o cabeçalho: verde quando o óleo está dentro da vida útil, amarelo nos últimos 20% do intervalo de troca e vermelho quando o limite é ultrapassado. Para evitar a aplicação do óleo errado, cada galão recebe uma etiqueta com o próprio QR Code; antes de abastecer, o mecânico lê esse código pela ficha, que confirma se o galão é o indicado para o redutor e não deixa salvar o registro quando o último galão lido é o errado.</w:t>
       </w:r>
     </w:p>
     <w:p>
@@ -6725,7 +6723,7 @@
       </w:pPr>
       <w:r>
         <w:rPr/>
-        <w:t>A troca do óleo é apresentada como um passo a passo, uma etapa por tela, com fotografias do próprio redutor em que os pontos estão marcados: separar o material, desligar e bloquear, limpar em volta dos bujões, drenar o óleo usado, observar o óleo retirado, fechar o dreno, conferir o galão, abastecer, fechar e testar e, por fim, descartar o óleo usado. Ao final, o registro já fica marcado como troca. A ficha traz, ainda, um modelo tridimensional simplificado do redutor, construído a partir das fotografias, no qual o mecânico toca em Enchimento, Nível, Dreno ou QR Code e o modelo gira até o ponto escolhido, que fica destacado e é acompanhado da fotografia correspondente.</w:t>
+        <w:t>A troca do óleo é apresentada como um passo a passo, uma etapa por tela, com fotografias do próprio redutor em que os pontos estão marcados: separar o material, desligar e bloquear, limpar em volta dos bujões, drenar o óleo usado, observar o óleo retirado, fechar o dreno, conferir o galão, abastecer, fechar e testar e, por fim, descartar o óleo usado. Ao final, o registro já fica marcado como troca. A equipe realizou uma troca simulada no redutor da oficina em 14 de outubro de 2026 e a registrou na ficha; com o regime de operação contínua cadastrado e o intervalo de 15.000 horas, a próxima troca ficou prevista para 30 de junho de 2028. A ficha traz, ainda, um modelo tridimensional simplificado do redutor, construído a partir das fotografias, no qual o mecânico toca em Enchimento, Nível, Dreno ou QR Code e o modelo gira até o ponto escolhido, que fica destacado e é acompanhado da fotografia correspondente.</w:t>
       </w:r>
     </w:p>
     <w:p>

</xml_diff>

<commit_message>
Documento: largura da carcaça (116 mm), foto da medição com paquímetro como Figura 1 (telas viram Figura 2) e Quadro 2 começando em página nova
Co-Authored-By: Claude Opus 5.5 <noreply@anthropic.com>
</commit_message>
<xml_diff>
--- a/Projeto_Integrador_QRCode_Lubrificantes.docx
+++ b/Projeto_Integrador_QRCode_Lubrificantes.docx
@@ -1061,7 +1061,7 @@
           <w:sz w:val="24"/>
           <w:szCs w:val="24"/>
         </w:rPr>
-        <w:t>17</w:t>
+        <w:t>18</w:t>
       </w:r>
       <w:r>
         <w:rPr>
@@ -1154,7 +1154,7 @@
           <w:sz w:val="24"/>
           <w:szCs w:val="24"/>
         </w:rPr>
-        <w:t>Figura 1 – Telas da ficha digital do redutor RED-001</w:t>
+        <w:t>Figura 1 – Medição da carcaça do redutor com paquímetro</w:t>
       </w:r>
       <w:r>
         <w:rPr>
@@ -1175,7 +1175,7 @@
           <w:sz w:val="24"/>
           <w:szCs w:val="24"/>
         </w:rPr>
-        <w:instrText xml:space="preserve"> PAGEREF pag04 \h </w:instrText>
+        <w:instrText xml:space="preserve"> PAGEREF pagfig1 \h </w:instrText>
       </w:r>
       <w:r>
         <w:rPr>
@@ -1189,7 +1189,7 @@
           <w:sz w:val="24"/>
           <w:szCs w:val="24"/>
         </w:rPr>
-        <w:t>29</w:t>
+        <w:t>17</w:t>
       </w:r>
       <w:r>
         <w:rPr>
@@ -1197,28 +1197,6 @@
           <w:szCs w:val="24"/>
         </w:rPr>
         <w:fldChar w:fldCharType="end"/>
-      </w:r>
-      <w:r>
-        <w:br w:type="page"/>
-      </w:r>
-    </w:p>
-    <w:p>
-      <w:pPr>
-        <w:pStyle w:val="Normal"/>
-        <w:spacing w:lineRule="auto" w:line="360" w:before="0" w:after="360"/>
-        <w:jc w:val="center"/>
-        <w:rPr>
-          <w:b/>
-          <w:b/>
-          <w:bCs/>
-        </w:rPr>
-      </w:pPr>
-      <w:r>
-        <w:rPr>
-          <w:b/>
-          <w:bCs/>
-        </w:rPr>
-        <w:t>LISTA DE TABELAS</w:t>
       </w:r>
     </w:p>
     <w:p>
@@ -1240,7 +1218,7 @@
           <w:sz w:val="24"/>
           <w:szCs w:val="24"/>
         </w:rPr>
-        <w:t>Tabela 1 – Tempos medidos no método tradicional</w:t>
+        <w:t>Figura 2 – Telas da ficha digital do redutor RED-001</w:t>
       </w:r>
       <w:r>
         <w:rPr>
@@ -1261,7 +1239,7 @@
           <w:sz w:val="24"/>
           <w:szCs w:val="24"/>
         </w:rPr>
-        <w:instrText xml:space="preserve"> PAGEREF pag05 \h </w:instrText>
+        <w:instrText xml:space="preserve"> PAGEREF pag04 \h </w:instrText>
       </w:r>
       <w:r>
         <w:rPr>
@@ -1275,7 +1253,7 @@
           <w:sz w:val="24"/>
           <w:szCs w:val="24"/>
         </w:rPr>
-        <w:t>22</w:t>
+        <w:t>30</w:t>
       </w:r>
       <w:r>
         <w:rPr>
@@ -1283,6 +1261,28 @@
           <w:szCs w:val="24"/>
         </w:rPr>
         <w:fldChar w:fldCharType="end"/>
+      </w:r>
+      <w:r>
+        <w:br w:type="page"/>
+      </w:r>
+    </w:p>
+    <w:p>
+      <w:pPr>
+        <w:pStyle w:val="Normal"/>
+        <w:spacing w:lineRule="auto" w:line="360" w:before="0" w:after="360"/>
+        <w:jc w:val="center"/>
+        <w:rPr>
+          <w:b/>
+          <w:b/>
+          <w:bCs/>
+        </w:rPr>
+      </w:pPr>
+      <w:r>
+        <w:rPr>
+          <w:b/>
+          <w:bCs/>
+        </w:rPr>
+        <w:t>LISTA DE TABELAS</w:t>
       </w:r>
     </w:p>
     <w:p>
@@ -1304,7 +1304,7 @@
           <w:sz w:val="24"/>
           <w:szCs w:val="24"/>
         </w:rPr>
-        <w:t>Tabela 2 – Tempos medidos no método com QR Code</w:t>
+        <w:t>Tabela 1 – Tempos medidos no método tradicional</w:t>
       </w:r>
       <w:r>
         <w:rPr>
@@ -1325,7 +1325,7 @@
           <w:sz w:val="24"/>
           <w:szCs w:val="24"/>
         </w:rPr>
-        <w:instrText xml:space="preserve"> PAGEREF pag06 \h </w:instrText>
+        <w:instrText xml:space="preserve"> PAGEREF pag05 \h </w:instrText>
       </w:r>
       <w:r>
         <w:rPr>
@@ -1368,7 +1368,7 @@
           <w:sz w:val="24"/>
           <w:szCs w:val="24"/>
         </w:rPr>
-        <w:t>Tabela 3 – Comparação entre os métodos</w:t>
+        <w:t>Tabela 2 – Tempos medidos no método com QR Code</w:t>
       </w:r>
       <w:r>
         <w:rPr>
@@ -1389,7 +1389,7 @@
           <w:sz w:val="24"/>
           <w:szCs w:val="24"/>
         </w:rPr>
-        <w:instrText xml:space="preserve"> PAGEREF pag07 \h </w:instrText>
+        <w:instrText xml:space="preserve"> PAGEREF pag06 \h </w:instrText>
       </w:r>
       <w:r>
         <w:rPr>
@@ -1411,533 +1411,6 @@
           <w:szCs w:val="24"/>
         </w:rPr>
         <w:fldChar w:fldCharType="end"/>
-      </w:r>
-      <w:r>
-        <w:br w:type="page"/>
-      </w:r>
-    </w:p>
-    <w:p>
-      <w:pPr>
-        <w:pStyle w:val="Normal"/>
-        <w:spacing w:lineRule="auto" w:line="360" w:before="0" w:after="360"/>
-        <w:jc w:val="center"/>
-        <w:rPr>
-          <w:b/>
-          <w:b/>
-          <w:bCs/>
-        </w:rPr>
-      </w:pPr>
-      <w:r>
-        <w:rPr>
-          <w:b/>
-          <w:bCs/>
-        </w:rPr>
-        <w:t>LISTA DE ABREVIATURAS E SIGLAS</w:t>
-      </w:r>
-    </w:p>
-    <w:p>
-      <w:pPr>
-        <w:pStyle w:val="Normal"/>
-        <w:tabs>
-          <w:tab w:val="clear" w:pos="720"/>
-          <w:tab w:val="left" w:pos="1800" w:leader="none"/>
-        </w:tabs>
-        <w:spacing w:lineRule="auto" w:line="360" w:before="0" w:after="80"/>
-        <w:rPr/>
-      </w:pPr>
-      <w:r>
-        <w:rPr>
-          <w:b/>
-          <w:bCs/>
-        </w:rPr>
-        <w:t>ABNT</w:t>
-      </w:r>
-      <w:r>
-        <w:rPr/>
-        <w:tab/>
-        <w:t>Associação Brasileira de Normas Técnicas</w:t>
-      </w:r>
-    </w:p>
-    <w:p>
-      <w:pPr>
-        <w:pStyle w:val="Normal"/>
-        <w:tabs>
-          <w:tab w:val="clear" w:pos="720"/>
-          <w:tab w:val="left" w:pos="1800" w:leader="none"/>
-        </w:tabs>
-        <w:spacing w:lineRule="auto" w:line="360" w:before="0" w:after="80"/>
-        <w:rPr/>
-      </w:pPr>
-      <w:r>
-        <w:rPr>
-          <w:b/>
-          <w:bCs/>
-        </w:rPr>
-        <w:t>CLP HC</w:t>
-      </w:r>
-      <w:r>
-        <w:rPr/>
-        <w:tab/>
-        <w:t>Óleo para engrenagens de base sintética (designação DIN)</w:t>
-      </w:r>
-    </w:p>
-    <w:p>
-      <w:pPr>
-        <w:pStyle w:val="Normal"/>
-        <w:tabs>
-          <w:tab w:val="clear" w:pos="720"/>
-          <w:tab w:val="left" w:pos="1800" w:leader="none"/>
-        </w:tabs>
-        <w:spacing w:lineRule="auto" w:line="360" w:before="0" w:after="80"/>
-        <w:rPr/>
-      </w:pPr>
-      <w:r>
-        <w:rPr>
-          <w:b/>
-          <w:bCs/>
-        </w:rPr>
-        <w:t>CONAMA</w:t>
-      </w:r>
-      <w:r>
-        <w:rPr/>
-        <w:tab/>
-        <w:t>Conselho Nacional do Meio Ambiente</w:t>
-      </w:r>
-    </w:p>
-    <w:p>
-      <w:pPr>
-        <w:pStyle w:val="Normal"/>
-        <w:tabs>
-          <w:tab w:val="clear" w:pos="720"/>
-          <w:tab w:val="left" w:pos="1800" w:leader="none"/>
-        </w:tabs>
-        <w:spacing w:lineRule="auto" w:line="360" w:before="0" w:after="80"/>
-        <w:rPr/>
-      </w:pPr>
-      <w:r>
-        <w:rPr>
-          <w:b/>
-          <w:bCs/>
-        </w:rPr>
-        <w:t>CSV</w:t>
-      </w:r>
-      <w:r>
-        <w:rPr/>
-        <w:tab/>
-        <w:t>Comma-Separated Values (valores separados por vírgula)</w:t>
-      </w:r>
-    </w:p>
-    <w:p>
-      <w:pPr>
-        <w:pStyle w:val="Normal"/>
-        <w:tabs>
-          <w:tab w:val="clear" w:pos="720"/>
-          <w:tab w:val="left" w:pos="1800" w:leader="none"/>
-        </w:tabs>
-        <w:spacing w:lineRule="auto" w:line="360" w:before="0" w:after="80"/>
-        <w:rPr/>
-      </w:pPr>
-      <w:r>
-        <w:rPr>
-          <w:b/>
-          <w:bCs/>
-        </w:rPr>
-        <w:t>DIN</w:t>
-      </w:r>
-      <w:r>
-        <w:rPr/>
-        <w:tab/>
-        <w:t>Deutsches Institut für Normung (Instituto Alemão de Normalização)</w:t>
-      </w:r>
-    </w:p>
-    <w:p>
-      <w:pPr>
-        <w:pStyle w:val="Normal"/>
-        <w:tabs>
-          <w:tab w:val="clear" w:pos="720"/>
-          <w:tab w:val="left" w:pos="1800" w:leader="none"/>
-        </w:tabs>
-        <w:spacing w:lineRule="auto" w:line="360" w:before="0" w:after="80"/>
-        <w:rPr/>
-      </w:pPr>
-      <w:r>
-        <w:rPr>
-          <w:b/>
-          <w:bCs/>
-        </w:rPr>
-        <w:t>EPI</w:t>
-      </w:r>
-      <w:r>
-        <w:rPr/>
-        <w:tab/>
-        <w:t>Equipamento de Proteção Individual</w:t>
-      </w:r>
-    </w:p>
-    <w:p>
-      <w:pPr>
-        <w:pStyle w:val="Normal"/>
-        <w:tabs>
-          <w:tab w:val="clear" w:pos="720"/>
-          <w:tab w:val="left" w:pos="1800" w:leader="none"/>
-        </w:tabs>
-        <w:spacing w:lineRule="auto" w:line="360" w:before="0" w:after="80"/>
-        <w:rPr/>
-      </w:pPr>
-      <w:r>
-        <w:rPr>
-          <w:b/>
-          <w:bCs/>
-        </w:rPr>
-        <w:t>IEC</w:t>
-      </w:r>
-      <w:r>
-        <w:rPr/>
-        <w:tab/>
-        <w:t>International Electrotechnical Commission</w:t>
-      </w:r>
-    </w:p>
-    <w:p>
-      <w:pPr>
-        <w:pStyle w:val="Normal"/>
-        <w:tabs>
-          <w:tab w:val="clear" w:pos="720"/>
-          <w:tab w:val="left" w:pos="1800" w:leader="none"/>
-        </w:tabs>
-        <w:spacing w:lineRule="auto" w:line="360" w:before="0" w:after="80"/>
-        <w:rPr/>
-      </w:pPr>
-      <w:r>
-        <w:rPr>
-          <w:b/>
-          <w:bCs/>
-        </w:rPr>
-        <w:t>ISO</w:t>
-      </w:r>
-      <w:r>
-        <w:rPr/>
-        <w:tab/>
-        <w:t>International Organization for Standardization</w:t>
-      </w:r>
-    </w:p>
-    <w:p>
-      <w:pPr>
-        <w:pStyle w:val="Normal"/>
-        <w:tabs>
-          <w:tab w:val="clear" w:pos="720"/>
-          <w:tab w:val="left" w:pos="1800" w:leader="none"/>
-        </w:tabs>
-        <w:spacing w:lineRule="auto" w:line="360" w:before="0" w:after="80"/>
-        <w:rPr/>
-      </w:pPr>
-      <w:r>
-        <w:rPr>
-          <w:b/>
-          <w:bCs/>
-        </w:rPr>
-        <w:t>ISO VG</w:t>
-      </w:r>
-      <w:r>
-        <w:rPr/>
-        <w:tab/>
-        <w:t>Grau de viscosidade ISO (Viscosity Grade)</w:t>
-      </w:r>
-    </w:p>
-    <w:p>
-      <w:pPr>
-        <w:pStyle w:val="Normal"/>
-        <w:tabs>
-          <w:tab w:val="clear" w:pos="720"/>
-          <w:tab w:val="left" w:pos="1800" w:leader="none"/>
-        </w:tabs>
-        <w:spacing w:lineRule="auto" w:line="360" w:before="0" w:after="80"/>
-        <w:rPr/>
-      </w:pPr>
-      <w:r>
-        <w:rPr>
-          <w:b/>
-          <w:bCs/>
-        </w:rPr>
-        <w:t>LOTO</w:t>
-      </w:r>
-      <w:r>
-        <w:rPr/>
-        <w:tab/>
-        <w:t>Lockout/Tagout (bloqueio e etiquetagem)</w:t>
-      </w:r>
-    </w:p>
-    <w:p>
-      <w:pPr>
-        <w:pStyle w:val="Normal"/>
-        <w:tabs>
-          <w:tab w:val="clear" w:pos="720"/>
-          <w:tab w:val="left" w:pos="1800" w:leader="none"/>
-        </w:tabs>
-        <w:spacing w:lineRule="auto" w:line="360" w:before="0" w:after="80"/>
-        <w:rPr/>
-      </w:pPr>
-      <w:r>
-        <w:rPr>
-          <w:b/>
-          <w:bCs/>
-        </w:rPr>
-        <w:t>MTTR</w:t>
-      </w:r>
-      <w:r>
-        <w:rPr/>
-        <w:tab/>
-        <w:t>Mean Time To Repair (tempo médio de reparo)</w:t>
-      </w:r>
-    </w:p>
-    <w:p>
-      <w:pPr>
-        <w:pStyle w:val="Normal"/>
-        <w:tabs>
-          <w:tab w:val="clear" w:pos="720"/>
-          <w:tab w:val="left" w:pos="1800" w:leader="none"/>
-        </w:tabs>
-        <w:spacing w:lineRule="auto" w:line="360" w:before="0" w:after="80"/>
-        <w:rPr/>
-      </w:pPr>
-      <w:r>
-        <w:rPr>
-          <w:b/>
-          <w:bCs/>
-        </w:rPr>
-        <w:t>NBR</w:t>
-      </w:r>
-      <w:r>
-        <w:rPr/>
-        <w:tab/>
-        <w:t>Norma Brasileira</w:t>
-      </w:r>
-    </w:p>
-    <w:p>
-      <w:pPr>
-        <w:pStyle w:val="Normal"/>
-        <w:tabs>
-          <w:tab w:val="clear" w:pos="720"/>
-          <w:tab w:val="left" w:pos="1800" w:leader="none"/>
-        </w:tabs>
-        <w:spacing w:lineRule="auto" w:line="360" w:before="0" w:after="80"/>
-        <w:rPr/>
-      </w:pPr>
-      <w:r>
-        <w:rPr>
-          <w:b/>
-          <w:bCs/>
-        </w:rPr>
-        <w:t>NFC</w:t>
-      </w:r>
-      <w:r>
-        <w:rPr/>
-        <w:tab/>
-        <w:t>Near Field Communication</w:t>
-      </w:r>
-    </w:p>
-    <w:p>
-      <w:pPr>
-        <w:pStyle w:val="Normal"/>
-        <w:tabs>
-          <w:tab w:val="clear" w:pos="720"/>
-          <w:tab w:val="left" w:pos="1800" w:leader="none"/>
-        </w:tabs>
-        <w:spacing w:lineRule="auto" w:line="360" w:before="0" w:after="80"/>
-        <w:rPr/>
-      </w:pPr>
-      <w:r>
-        <w:rPr>
-          <w:b/>
-          <w:bCs/>
-        </w:rPr>
-        <w:t>PAO</w:t>
-      </w:r>
-      <w:r>
-        <w:rPr/>
-        <w:tab/>
-        <w:t>Polialfaolefina (base de óleo sintético)</w:t>
-      </w:r>
-    </w:p>
-    <w:p>
-      <w:pPr>
-        <w:pStyle w:val="Normal"/>
-        <w:tabs>
-          <w:tab w:val="clear" w:pos="720"/>
-          <w:tab w:val="left" w:pos="1800" w:leader="none"/>
-        </w:tabs>
-        <w:spacing w:lineRule="auto" w:line="360" w:before="0" w:after="80"/>
-        <w:rPr/>
-      </w:pPr>
-      <w:r>
-        <w:rPr>
-          <w:b/>
-          <w:bCs/>
-        </w:rPr>
-        <w:t>PCM</w:t>
-      </w:r>
-      <w:r>
-        <w:rPr/>
-        <w:tab/>
-        <w:t>Planejamento e Controle da Manutenção</w:t>
-      </w:r>
-    </w:p>
-    <w:p>
-      <w:pPr>
-        <w:pStyle w:val="Normal"/>
-        <w:tabs>
-          <w:tab w:val="clear" w:pos="720"/>
-          <w:tab w:val="left" w:pos="1800" w:leader="none"/>
-        </w:tabs>
-        <w:spacing w:lineRule="auto" w:line="360" w:before="0" w:after="80"/>
-        <w:rPr/>
-      </w:pPr>
-      <w:r>
-        <w:rPr>
-          <w:b/>
-          <w:bCs/>
-        </w:rPr>
-        <w:t>PDF</w:t>
-      </w:r>
-      <w:r>
-        <w:rPr/>
-        <w:tab/>
-        <w:t>Portable Document Format</w:t>
-      </w:r>
-    </w:p>
-    <w:p>
-      <w:pPr>
-        <w:pStyle w:val="Normal"/>
-        <w:tabs>
-          <w:tab w:val="clear" w:pos="720"/>
-          <w:tab w:val="left" w:pos="1800" w:leader="none"/>
-        </w:tabs>
-        <w:spacing w:lineRule="auto" w:line="360" w:before="0" w:after="80"/>
-        <w:rPr/>
-      </w:pPr>
-      <w:r>
-        <w:rPr>
-          <w:b/>
-          <w:bCs/>
-        </w:rPr>
-        <w:t>PG</w:t>
-      </w:r>
-      <w:r>
-        <w:rPr/>
-        <w:tab/>
-        <w:t>Poliglicol (base de óleo sintético)</w:t>
-      </w:r>
-    </w:p>
-    <w:p>
-      <w:pPr>
-        <w:pStyle w:val="Normal"/>
-        <w:tabs>
-          <w:tab w:val="clear" w:pos="720"/>
-          <w:tab w:val="left" w:pos="1800" w:leader="none"/>
-        </w:tabs>
-        <w:spacing w:lineRule="auto" w:line="360" w:before="0" w:after="80"/>
-        <w:rPr/>
-      </w:pPr>
-      <w:r>
-        <w:rPr>
-          <w:b/>
-          <w:bCs/>
-        </w:rPr>
-        <w:t>PM</w:t>
-      </w:r>
-      <w:r>
-        <w:rPr/>
-        <w:tab/>
-        <w:t>Plant Maintenance (módulo de manutenção do SAP)</w:t>
-      </w:r>
-    </w:p>
-    <w:p>
-      <w:pPr>
-        <w:pStyle w:val="Normal"/>
-        <w:tabs>
-          <w:tab w:val="clear" w:pos="720"/>
-          <w:tab w:val="left" w:pos="1800" w:leader="none"/>
-        </w:tabs>
-        <w:spacing w:lineRule="auto" w:line="360" w:before="0" w:after="80"/>
-        <w:rPr/>
-      </w:pPr>
-      <w:r>
-        <w:rPr>
-          <w:b/>
-          <w:bCs/>
-        </w:rPr>
-        <w:t>QR</w:t>
-      </w:r>
-      <w:r>
-        <w:rPr/>
-        <w:tab/>
-        <w:t>Quick Response</w:t>
-      </w:r>
-    </w:p>
-    <w:p>
-      <w:pPr>
-        <w:pStyle w:val="Normal"/>
-        <w:tabs>
-          <w:tab w:val="clear" w:pos="720"/>
-          <w:tab w:val="left" w:pos="1800" w:leader="none"/>
-        </w:tabs>
-        <w:spacing w:lineRule="auto" w:line="360" w:before="0" w:after="80"/>
-        <w:rPr/>
-      </w:pPr>
-      <w:r>
-        <w:rPr>
-          <w:b/>
-          <w:bCs/>
-        </w:rPr>
-        <w:t>SAP</w:t>
-      </w:r>
-      <w:r>
-        <w:rPr/>
-        <w:tab/>
-        <w:t>Sistema integrado de gestão empresarial (ERP) da empresa SAP</w:t>
-      </w:r>
-    </w:p>
-    <w:p>
-      <w:pPr>
-        <w:pStyle w:val="Normal"/>
-        <w:tabs>
-          <w:tab w:val="clear" w:pos="720"/>
-          <w:tab w:val="left" w:pos="1800" w:leader="none"/>
-        </w:tabs>
-        <w:spacing w:lineRule="auto" w:line="360" w:before="0" w:after="80"/>
-        <w:rPr/>
-      </w:pPr>
-      <w:r>
-        <w:rPr>
-          <w:b/>
-          <w:bCs/>
-        </w:rPr>
-        <w:t>TPM</w:t>
-      </w:r>
-      <w:r>
-        <w:rPr/>
-        <w:tab/>
-        <w:t>Total Productive Maintenance (Manutenção Produtiva Total)</w:t>
-      </w:r>
-      <w:r>
-        <w:br w:type="page"/>
-      </w:r>
-    </w:p>
-    <w:p>
-      <w:pPr>
-        <w:pStyle w:val="Normal"/>
-        <w:spacing w:lineRule="auto" w:line="360" w:before="0" w:after="360"/>
-        <w:jc w:val="center"/>
-        <w:rPr>
-          <w:b/>
-          <w:b/>
-          <w:bCs/>
-        </w:rPr>
-      </w:pPr>
-      <w:r>
-        <w:rPr>
-          <w:b/>
-          <w:bCs/>
-        </w:rPr>
-        <w:t>SUMÁRIO</w:t>
       </w:r>
     </w:p>
     <w:p>
@@ -1954,56 +1427,581 @@
       </w:pPr>
       <w:r>
         <w:rPr>
-          <w:b/>
-          <w:bCs/>
-          <w:sz w:val="24"/>
-          <w:szCs w:val="24"/>
-        </w:rPr>
-        <w:t>1</w:t>
+          <w:b w:val="false"/>
+          <w:bCs w:val="false"/>
+          <w:sz w:val="24"/>
+          <w:szCs w:val="24"/>
+        </w:rPr>
+        <w:t>Tabela 3 – Comparação entre os métodos</w:t>
+      </w:r>
+      <w:r>
+        <w:rPr>
+          <w:sz w:val="24"/>
+          <w:szCs w:val="24"/>
+        </w:rPr>
         <w:tab/>
-        <w:t>INTRODUÇÃO</w:t>
-      </w:r>
-      <w:r>
-        <w:rPr>
-          <w:sz w:val="24"/>
-          <w:szCs w:val="24"/>
-        </w:rPr>
+      </w:r>
+      <w:r>
+        <w:rPr>
+          <w:sz w:val="24"/>
+          <w:szCs w:val="24"/>
+        </w:rPr>
+        <w:fldChar w:fldCharType="begin"/>
+      </w:r>
+      <w:r>
+        <w:rPr>
+          <w:sz w:val="24"/>
+          <w:szCs w:val="24"/>
+        </w:rPr>
+        <w:instrText xml:space="preserve"> PAGEREF pag07 \h </w:instrText>
+      </w:r>
+      <w:r>
+        <w:rPr>
+          <w:sz w:val="24"/>
+          <w:szCs w:val="24"/>
+        </w:rPr>
+        <w:fldChar w:fldCharType="separate"/>
+      </w:r>
+      <w:r>
+        <w:rPr>
+          <w:sz w:val="24"/>
+          <w:szCs w:val="24"/>
+        </w:rPr>
+        <w:t>24</w:t>
+      </w:r>
+      <w:r>
+        <w:rPr>
+          <w:sz w:val="24"/>
+          <w:szCs w:val="24"/>
+        </w:rPr>
+        <w:fldChar w:fldCharType="end"/>
+      </w:r>
+      <w:r>
+        <w:br w:type="page"/>
+      </w:r>
+    </w:p>
+    <w:p>
+      <w:pPr>
+        <w:pStyle w:val="Normal"/>
+        <w:spacing w:lineRule="auto" w:line="360" w:before="0" w:after="360"/>
+        <w:jc w:val="center"/>
+        <w:rPr>
+          <w:b/>
+          <w:b/>
+          <w:bCs/>
+        </w:rPr>
+      </w:pPr>
+      <w:r>
+        <w:rPr>
+          <w:b/>
+          <w:bCs/>
+        </w:rPr>
+        <w:t>LISTA DE ABREVIATURAS E SIGLAS</w:t>
+      </w:r>
+    </w:p>
+    <w:p>
+      <w:pPr>
+        <w:pStyle w:val="Normal"/>
+        <w:tabs>
+          <w:tab w:val="clear" w:pos="720"/>
+          <w:tab w:val="left" w:pos="1800" w:leader="none"/>
+        </w:tabs>
+        <w:spacing w:lineRule="auto" w:line="360" w:before="0" w:after="80"/>
+        <w:rPr/>
+      </w:pPr>
+      <w:r>
+        <w:rPr>
+          <w:b/>
+          <w:bCs/>
+        </w:rPr>
+        <w:t>ABNT</w:t>
+      </w:r>
+      <w:r>
+        <w:rPr/>
         <w:tab/>
-      </w:r>
-      <w:r>
-        <w:rPr>
-          <w:sz w:val="24"/>
-          <w:szCs w:val="24"/>
-        </w:rPr>
-        <w:fldChar w:fldCharType="begin"/>
-      </w:r>
-      <w:r>
-        <w:rPr>
-          <w:sz w:val="24"/>
-          <w:szCs w:val="24"/>
-        </w:rPr>
-        <w:instrText xml:space="preserve"> PAGEREF pag08 \h </w:instrText>
-      </w:r>
-      <w:r>
-        <w:rPr>
-          <w:sz w:val="24"/>
-          <w:szCs w:val="24"/>
-        </w:rPr>
-        <w:fldChar w:fldCharType="separate"/>
-      </w:r>
-      <w:r>
-        <w:rPr>
-          <w:sz w:val="24"/>
-          <w:szCs w:val="24"/>
-        </w:rPr>
-        <w:t>9</w:t>
-      </w:r>
-      <w:r>
-        <w:rPr>
-          <w:sz w:val="24"/>
-          <w:szCs w:val="24"/>
-        </w:rPr>
-        <w:fldChar w:fldCharType="end"/>
+        <w:t>Associação Brasileira de Normas Técnicas</w:t>
+      </w:r>
+    </w:p>
+    <w:p>
+      <w:pPr>
+        <w:pStyle w:val="Normal"/>
+        <w:tabs>
+          <w:tab w:val="clear" w:pos="720"/>
+          <w:tab w:val="left" w:pos="1800" w:leader="none"/>
+        </w:tabs>
+        <w:spacing w:lineRule="auto" w:line="360" w:before="0" w:after="80"/>
+        <w:rPr/>
+      </w:pPr>
+      <w:r>
+        <w:rPr>
+          <w:b/>
+          <w:bCs/>
+        </w:rPr>
+        <w:t>CLP HC</w:t>
+      </w:r>
+      <w:r>
+        <w:rPr/>
+        <w:tab/>
+        <w:t>Óleo para engrenagens de base sintética (designação DIN)</w:t>
+      </w:r>
+    </w:p>
+    <w:p>
+      <w:pPr>
+        <w:pStyle w:val="Normal"/>
+        <w:tabs>
+          <w:tab w:val="clear" w:pos="720"/>
+          <w:tab w:val="left" w:pos="1800" w:leader="none"/>
+        </w:tabs>
+        <w:spacing w:lineRule="auto" w:line="360" w:before="0" w:after="80"/>
+        <w:rPr/>
+      </w:pPr>
+      <w:r>
+        <w:rPr>
+          <w:b/>
+          <w:bCs/>
+        </w:rPr>
+        <w:t>CONAMA</w:t>
+      </w:r>
+      <w:r>
+        <w:rPr/>
+        <w:tab/>
+        <w:t>Conselho Nacional do Meio Ambiente</w:t>
+      </w:r>
+    </w:p>
+    <w:p>
+      <w:pPr>
+        <w:pStyle w:val="Normal"/>
+        <w:tabs>
+          <w:tab w:val="clear" w:pos="720"/>
+          <w:tab w:val="left" w:pos="1800" w:leader="none"/>
+        </w:tabs>
+        <w:spacing w:lineRule="auto" w:line="360" w:before="0" w:after="80"/>
+        <w:rPr/>
+      </w:pPr>
+      <w:r>
+        <w:rPr>
+          <w:b/>
+          <w:bCs/>
+        </w:rPr>
+        <w:t>CSV</w:t>
+      </w:r>
+      <w:r>
+        <w:rPr/>
+        <w:tab/>
+        <w:t>Comma-Separated Values (valores separados por vírgula)</w:t>
+      </w:r>
+    </w:p>
+    <w:p>
+      <w:pPr>
+        <w:pStyle w:val="Normal"/>
+        <w:tabs>
+          <w:tab w:val="clear" w:pos="720"/>
+          <w:tab w:val="left" w:pos="1800" w:leader="none"/>
+        </w:tabs>
+        <w:spacing w:lineRule="auto" w:line="360" w:before="0" w:after="80"/>
+        <w:rPr/>
+      </w:pPr>
+      <w:r>
+        <w:rPr>
+          <w:b/>
+          <w:bCs/>
+        </w:rPr>
+        <w:t>DIN</w:t>
+      </w:r>
+      <w:r>
+        <w:rPr/>
+        <w:tab/>
+        <w:t>Deutsches Institut für Normung (Instituto Alemão de Normalização)</w:t>
+      </w:r>
+    </w:p>
+    <w:p>
+      <w:pPr>
+        <w:pStyle w:val="Normal"/>
+        <w:tabs>
+          <w:tab w:val="clear" w:pos="720"/>
+          <w:tab w:val="left" w:pos="1800" w:leader="none"/>
+        </w:tabs>
+        <w:spacing w:lineRule="auto" w:line="360" w:before="0" w:after="80"/>
+        <w:rPr/>
+      </w:pPr>
+      <w:r>
+        <w:rPr>
+          <w:b/>
+          <w:bCs/>
+        </w:rPr>
+        <w:t>EPI</w:t>
+      </w:r>
+      <w:r>
+        <w:rPr/>
+        <w:tab/>
+        <w:t>Equipamento de Proteção Individual</w:t>
+      </w:r>
+    </w:p>
+    <w:p>
+      <w:pPr>
+        <w:pStyle w:val="Normal"/>
+        <w:tabs>
+          <w:tab w:val="clear" w:pos="720"/>
+          <w:tab w:val="left" w:pos="1800" w:leader="none"/>
+        </w:tabs>
+        <w:spacing w:lineRule="auto" w:line="360" w:before="0" w:after="80"/>
+        <w:rPr/>
+      </w:pPr>
+      <w:r>
+        <w:rPr>
+          <w:b/>
+          <w:bCs/>
+        </w:rPr>
+        <w:t>IEC</w:t>
+      </w:r>
+      <w:r>
+        <w:rPr/>
+        <w:tab/>
+        <w:t>International Electrotechnical Commission</w:t>
+      </w:r>
+    </w:p>
+    <w:p>
+      <w:pPr>
+        <w:pStyle w:val="Normal"/>
+        <w:tabs>
+          <w:tab w:val="clear" w:pos="720"/>
+          <w:tab w:val="left" w:pos="1800" w:leader="none"/>
+        </w:tabs>
+        <w:spacing w:lineRule="auto" w:line="360" w:before="0" w:after="80"/>
+        <w:rPr/>
+      </w:pPr>
+      <w:r>
+        <w:rPr>
+          <w:b/>
+          <w:bCs/>
+        </w:rPr>
+        <w:t>ISO</w:t>
+      </w:r>
+      <w:r>
+        <w:rPr/>
+        <w:tab/>
+        <w:t>International Organization for Standardization</w:t>
+      </w:r>
+    </w:p>
+    <w:p>
+      <w:pPr>
+        <w:pStyle w:val="Normal"/>
+        <w:tabs>
+          <w:tab w:val="clear" w:pos="720"/>
+          <w:tab w:val="left" w:pos="1800" w:leader="none"/>
+        </w:tabs>
+        <w:spacing w:lineRule="auto" w:line="360" w:before="0" w:after="80"/>
+        <w:rPr/>
+      </w:pPr>
+      <w:r>
+        <w:rPr>
+          <w:b/>
+          <w:bCs/>
+        </w:rPr>
+        <w:t>ISO VG</w:t>
+      </w:r>
+      <w:r>
+        <w:rPr/>
+        <w:tab/>
+        <w:t>Grau de viscosidade ISO (Viscosity Grade)</w:t>
+      </w:r>
+    </w:p>
+    <w:p>
+      <w:pPr>
+        <w:pStyle w:val="Normal"/>
+        <w:tabs>
+          <w:tab w:val="clear" w:pos="720"/>
+          <w:tab w:val="left" w:pos="1800" w:leader="none"/>
+        </w:tabs>
+        <w:spacing w:lineRule="auto" w:line="360" w:before="0" w:after="80"/>
+        <w:rPr/>
+      </w:pPr>
+      <w:r>
+        <w:rPr>
+          <w:b/>
+          <w:bCs/>
+        </w:rPr>
+        <w:t>LOTO</w:t>
+      </w:r>
+      <w:r>
+        <w:rPr/>
+        <w:tab/>
+        <w:t>Lockout/Tagout (bloqueio e etiquetagem)</w:t>
+      </w:r>
+    </w:p>
+    <w:p>
+      <w:pPr>
+        <w:pStyle w:val="Normal"/>
+        <w:tabs>
+          <w:tab w:val="clear" w:pos="720"/>
+          <w:tab w:val="left" w:pos="1800" w:leader="none"/>
+        </w:tabs>
+        <w:spacing w:lineRule="auto" w:line="360" w:before="0" w:after="80"/>
+        <w:rPr/>
+      </w:pPr>
+      <w:r>
+        <w:rPr>
+          <w:b/>
+          <w:bCs/>
+        </w:rPr>
+        <w:t>MTTR</w:t>
+      </w:r>
+      <w:r>
+        <w:rPr/>
+        <w:tab/>
+        <w:t>Mean Time To Repair (tempo médio de reparo)</w:t>
+      </w:r>
+    </w:p>
+    <w:p>
+      <w:pPr>
+        <w:pStyle w:val="Normal"/>
+        <w:tabs>
+          <w:tab w:val="clear" w:pos="720"/>
+          <w:tab w:val="left" w:pos="1800" w:leader="none"/>
+        </w:tabs>
+        <w:spacing w:lineRule="auto" w:line="360" w:before="0" w:after="80"/>
+        <w:rPr/>
+      </w:pPr>
+      <w:r>
+        <w:rPr>
+          <w:b/>
+          <w:bCs/>
+        </w:rPr>
+        <w:t>NBR</w:t>
+      </w:r>
+      <w:r>
+        <w:rPr/>
+        <w:tab/>
+        <w:t>Norma Brasileira</w:t>
+      </w:r>
+    </w:p>
+    <w:p>
+      <w:pPr>
+        <w:pStyle w:val="Normal"/>
+        <w:tabs>
+          <w:tab w:val="clear" w:pos="720"/>
+          <w:tab w:val="left" w:pos="1800" w:leader="none"/>
+        </w:tabs>
+        <w:spacing w:lineRule="auto" w:line="360" w:before="0" w:after="80"/>
+        <w:rPr/>
+      </w:pPr>
+      <w:r>
+        <w:rPr>
+          <w:b/>
+          <w:bCs/>
+        </w:rPr>
+        <w:t>NFC</w:t>
+      </w:r>
+      <w:r>
+        <w:rPr/>
+        <w:tab/>
+        <w:t>Near Field Communication</w:t>
+      </w:r>
+    </w:p>
+    <w:p>
+      <w:pPr>
+        <w:pStyle w:val="Normal"/>
+        <w:tabs>
+          <w:tab w:val="clear" w:pos="720"/>
+          <w:tab w:val="left" w:pos="1800" w:leader="none"/>
+        </w:tabs>
+        <w:spacing w:lineRule="auto" w:line="360" w:before="0" w:after="80"/>
+        <w:rPr/>
+      </w:pPr>
+      <w:r>
+        <w:rPr>
+          <w:b/>
+          <w:bCs/>
+        </w:rPr>
+        <w:t>PAO</w:t>
+      </w:r>
+      <w:r>
+        <w:rPr/>
+        <w:tab/>
+        <w:t>Polialfaolefina (base de óleo sintético)</w:t>
+      </w:r>
+    </w:p>
+    <w:p>
+      <w:pPr>
+        <w:pStyle w:val="Normal"/>
+        <w:tabs>
+          <w:tab w:val="clear" w:pos="720"/>
+          <w:tab w:val="left" w:pos="1800" w:leader="none"/>
+        </w:tabs>
+        <w:spacing w:lineRule="auto" w:line="360" w:before="0" w:after="80"/>
+        <w:rPr/>
+      </w:pPr>
+      <w:r>
+        <w:rPr>
+          <w:b/>
+          <w:bCs/>
+        </w:rPr>
+        <w:t>PCM</w:t>
+      </w:r>
+      <w:r>
+        <w:rPr/>
+        <w:tab/>
+        <w:t>Planejamento e Controle da Manutenção</w:t>
+      </w:r>
+    </w:p>
+    <w:p>
+      <w:pPr>
+        <w:pStyle w:val="Normal"/>
+        <w:tabs>
+          <w:tab w:val="clear" w:pos="720"/>
+          <w:tab w:val="left" w:pos="1800" w:leader="none"/>
+        </w:tabs>
+        <w:spacing w:lineRule="auto" w:line="360" w:before="0" w:after="80"/>
+        <w:rPr/>
+      </w:pPr>
+      <w:r>
+        <w:rPr>
+          <w:b/>
+          <w:bCs/>
+        </w:rPr>
+        <w:t>PDF</w:t>
+      </w:r>
+      <w:r>
+        <w:rPr/>
+        <w:tab/>
+        <w:t>Portable Document Format</w:t>
+      </w:r>
+    </w:p>
+    <w:p>
+      <w:pPr>
+        <w:pStyle w:val="Normal"/>
+        <w:tabs>
+          <w:tab w:val="clear" w:pos="720"/>
+          <w:tab w:val="left" w:pos="1800" w:leader="none"/>
+        </w:tabs>
+        <w:spacing w:lineRule="auto" w:line="360" w:before="0" w:after="80"/>
+        <w:rPr/>
+      </w:pPr>
+      <w:r>
+        <w:rPr>
+          <w:b/>
+          <w:bCs/>
+        </w:rPr>
+        <w:t>PG</w:t>
+      </w:r>
+      <w:r>
+        <w:rPr/>
+        <w:tab/>
+        <w:t>Poliglicol (base de óleo sintético)</w:t>
+      </w:r>
+    </w:p>
+    <w:p>
+      <w:pPr>
+        <w:pStyle w:val="Normal"/>
+        <w:tabs>
+          <w:tab w:val="clear" w:pos="720"/>
+          <w:tab w:val="left" w:pos="1800" w:leader="none"/>
+        </w:tabs>
+        <w:spacing w:lineRule="auto" w:line="360" w:before="0" w:after="80"/>
+        <w:rPr/>
+      </w:pPr>
+      <w:r>
+        <w:rPr>
+          <w:b/>
+          <w:bCs/>
+        </w:rPr>
+        <w:t>PM</w:t>
+      </w:r>
+      <w:r>
+        <w:rPr/>
+        <w:tab/>
+        <w:t>Plant Maintenance (módulo de manutenção do SAP)</w:t>
+      </w:r>
+    </w:p>
+    <w:p>
+      <w:pPr>
+        <w:pStyle w:val="Normal"/>
+        <w:tabs>
+          <w:tab w:val="clear" w:pos="720"/>
+          <w:tab w:val="left" w:pos="1800" w:leader="none"/>
+        </w:tabs>
+        <w:spacing w:lineRule="auto" w:line="360" w:before="0" w:after="80"/>
+        <w:rPr/>
+      </w:pPr>
+      <w:r>
+        <w:rPr>
+          <w:b/>
+          <w:bCs/>
+        </w:rPr>
+        <w:t>QR</w:t>
+      </w:r>
+      <w:r>
+        <w:rPr/>
+        <w:tab/>
+        <w:t>Quick Response</w:t>
+      </w:r>
+    </w:p>
+    <w:p>
+      <w:pPr>
+        <w:pStyle w:val="Normal"/>
+        <w:tabs>
+          <w:tab w:val="clear" w:pos="720"/>
+          <w:tab w:val="left" w:pos="1800" w:leader="none"/>
+        </w:tabs>
+        <w:spacing w:lineRule="auto" w:line="360" w:before="0" w:after="80"/>
+        <w:rPr/>
+      </w:pPr>
+      <w:r>
+        <w:rPr>
+          <w:b/>
+          <w:bCs/>
+        </w:rPr>
+        <w:t>SAP</w:t>
+      </w:r>
+      <w:r>
+        <w:rPr/>
+        <w:tab/>
+        <w:t>Sistema integrado de gestão empresarial (ERP) da empresa SAP</w:t>
+      </w:r>
+    </w:p>
+    <w:p>
+      <w:pPr>
+        <w:pStyle w:val="Normal"/>
+        <w:tabs>
+          <w:tab w:val="clear" w:pos="720"/>
+          <w:tab w:val="left" w:pos="1800" w:leader="none"/>
+        </w:tabs>
+        <w:spacing w:lineRule="auto" w:line="360" w:before="0" w:after="80"/>
+        <w:rPr/>
+      </w:pPr>
+      <w:r>
+        <w:rPr>
+          <w:b/>
+          <w:bCs/>
+        </w:rPr>
+        <w:t>TPM</w:t>
+      </w:r>
+      <w:r>
+        <w:rPr/>
+        <w:tab/>
+        <w:t>Total Productive Maintenance (Manutenção Produtiva Total)</w:t>
+      </w:r>
+      <w:r>
+        <w:br w:type="page"/>
+      </w:r>
+    </w:p>
+    <w:p>
+      <w:pPr>
+        <w:pStyle w:val="Normal"/>
+        <w:spacing w:lineRule="auto" w:line="360" w:before="0" w:after="360"/>
+        <w:jc w:val="center"/>
+        <w:rPr>
+          <w:b/>
+          <w:b/>
+          <w:bCs/>
+        </w:rPr>
+      </w:pPr>
+      <w:r>
+        <w:rPr>
+          <w:b/>
+          <w:bCs/>
+        </w:rPr>
+        <w:t>SUMÁRIO</w:t>
       </w:r>
     </w:p>
     <w:p>
@@ -2022,10 +2020,12 @@
         <w:rPr>
           <w:b/>
           <w:bCs/>
-        </w:rPr>
-        <w:t>1.1</w:t>
+          <w:sz w:val="24"/>
+          <w:szCs w:val="24"/>
+        </w:rPr>
+        <w:t>1</w:t>
         <w:tab/>
-        <w:t>Justificativa</w:t>
+        <w:t>INTRODUÇÃO</w:t>
       </w:r>
       <w:r>
         <w:rPr>
@@ -2046,7 +2046,7 @@
           <w:sz w:val="24"/>
           <w:szCs w:val="24"/>
         </w:rPr>
-        <w:instrText xml:space="preserve"> PAGEREF pag09 \h </w:instrText>
+        <w:instrText xml:space="preserve"> PAGEREF pag08 \h </w:instrText>
       </w:r>
       <w:r>
         <w:rPr>
@@ -2087,9 +2087,9 @@
           <w:b/>
           <w:bCs/>
         </w:rPr>
-        <w:t>1.2</w:t>
+        <w:t>1.1</w:t>
         <w:tab/>
-        <w:t>Delimitação do tema e problema de pesquisa</w:t>
+        <w:t>Justificativa</w:t>
       </w:r>
       <w:r>
         <w:rPr>
@@ -2110,7 +2110,7 @@
           <w:sz w:val="24"/>
           <w:szCs w:val="24"/>
         </w:rPr>
-        <w:instrText xml:space="preserve"> PAGEREF pag10 \h </w:instrText>
+        <w:instrText xml:space="preserve"> PAGEREF pag09 \h </w:instrText>
       </w:r>
       <w:r>
         <w:rPr>
@@ -2124,7 +2124,7 @@
           <w:sz w:val="24"/>
           <w:szCs w:val="24"/>
         </w:rPr>
-        <w:t>10</w:t>
+        <w:t>9</w:t>
       </w:r>
       <w:r>
         <w:rPr>
@@ -2151,9 +2151,9 @@
           <w:b/>
           <w:bCs/>
         </w:rPr>
-        <w:t>1.3</w:t>
+        <w:t>1.2</w:t>
         <w:tab/>
-        <w:t>Objetivos</w:t>
+        <w:t>Delimitação do tema e problema de pesquisa</w:t>
       </w:r>
       <w:r>
         <w:rPr>
@@ -2174,7 +2174,7 @@
           <w:sz w:val="24"/>
           <w:szCs w:val="24"/>
         </w:rPr>
-        <w:instrText xml:space="preserve"> PAGEREF pag11 \h </w:instrText>
+        <w:instrText xml:space="preserve"> PAGEREF pag10 \h </w:instrText>
       </w:r>
       <w:r>
         <w:rPr>
@@ -2214,12 +2214,10 @@
         <w:rPr>
           <w:b/>
           <w:bCs/>
-          <w:i/>
-          <w:iCs/>
-        </w:rPr>
-        <w:t>1.3.1</w:t>
+        </w:rPr>
+        <w:t>1.3</w:t>
         <w:tab/>
-        <w:t>Objetivo geral</w:t>
+        <w:t>Objetivos</w:t>
       </w:r>
       <w:r>
         <w:rPr>
@@ -2240,7 +2238,7 @@
           <w:sz w:val="24"/>
           <w:szCs w:val="24"/>
         </w:rPr>
-        <w:instrText xml:space="preserve"> PAGEREF pag12 \h </w:instrText>
+        <w:instrText xml:space="preserve"> PAGEREF pag11 \h </w:instrText>
       </w:r>
       <w:r>
         <w:rPr>
@@ -2283,9 +2281,9 @@
           <w:i/>
           <w:iCs/>
         </w:rPr>
-        <w:t>1.3.2</w:t>
+        <w:t>1.3.1</w:t>
         <w:tab/>
-        <w:t>Objetivos específicos</w:t>
+        <w:t>Objetivo geral</w:t>
       </w:r>
       <w:r>
         <w:rPr>
@@ -2306,7 +2304,7 @@
           <w:sz w:val="24"/>
           <w:szCs w:val="24"/>
         </w:rPr>
-        <w:instrText xml:space="preserve"> PAGEREF pag13 \h </w:instrText>
+        <w:instrText xml:space="preserve"> PAGEREF pag12 \h </w:instrText>
       </w:r>
       <w:r>
         <w:rPr>
@@ -2346,10 +2344,12 @@
         <w:rPr>
           <w:b/>
           <w:bCs/>
-        </w:rPr>
-        <w:t>1.4</w:t>
+          <w:i/>
+          <w:iCs/>
+        </w:rPr>
+        <w:t>1.3.2</w:t>
         <w:tab/>
-        <w:t>Tipo de pesquisa e contribuições esperadas</w:t>
+        <w:t>Objetivos específicos</w:t>
       </w:r>
       <w:r>
         <w:rPr>
@@ -2370,7 +2370,7 @@
           <w:sz w:val="24"/>
           <w:szCs w:val="24"/>
         </w:rPr>
-        <w:instrText xml:space="preserve"> PAGEREF pag14 \h </w:instrText>
+        <w:instrText xml:space="preserve"> PAGEREF pag13 \h </w:instrText>
       </w:r>
       <w:r>
         <w:rPr>
@@ -2384,7 +2384,7 @@
           <w:sz w:val="24"/>
           <w:szCs w:val="24"/>
         </w:rPr>
-        <w:t>11</w:t>
+        <w:t>10</w:t>
       </w:r>
       <w:r>
         <w:rPr>
@@ -2411,9 +2411,9 @@
           <w:b/>
           <w:bCs/>
         </w:rPr>
-        <w:t>1.5</w:t>
+        <w:t>1.4</w:t>
         <w:tab/>
-        <w:t>Metodologia</w:t>
+        <w:t>Tipo de pesquisa e contribuições esperadas</w:t>
       </w:r>
       <w:r>
         <w:rPr>
@@ -2434,7 +2434,7 @@
           <w:sz w:val="24"/>
           <w:szCs w:val="24"/>
         </w:rPr>
-        <w:instrText xml:space="preserve"> PAGEREF pag15 \h </w:instrText>
+        <w:instrText xml:space="preserve"> PAGEREF pag14 \h </w:instrText>
       </w:r>
       <w:r>
         <w:rPr>
@@ -2474,12 +2474,10 @@
         <w:rPr>
           <w:b/>
           <w:bCs/>
-          <w:sz w:val="24"/>
-          <w:szCs w:val="24"/>
-        </w:rPr>
-        <w:t>2</w:t>
+        </w:rPr>
+        <w:t>1.5</w:t>
         <w:tab/>
-        <w:t>DESENVOLVIMENTO</w:t>
+        <w:t>Metodologia</w:t>
       </w:r>
       <w:r>
         <w:rPr>
@@ -2500,7 +2498,7 @@
           <w:sz w:val="24"/>
           <w:szCs w:val="24"/>
         </w:rPr>
-        <w:instrText xml:space="preserve"> PAGEREF pag16 \h </w:instrText>
+        <w:instrText xml:space="preserve"> PAGEREF pag15 \h </w:instrText>
       </w:r>
       <w:r>
         <w:rPr>
@@ -2514,7 +2512,7 @@
           <w:sz w:val="24"/>
           <w:szCs w:val="24"/>
         </w:rPr>
-        <w:t>12</w:t>
+        <w:t>11</w:t>
       </w:r>
       <w:r>
         <w:rPr>
@@ -2540,10 +2538,12 @@
         <w:rPr>
           <w:b/>
           <w:bCs/>
-        </w:rPr>
-        <w:t>2.1</w:t>
+          <w:sz w:val="24"/>
+          <w:szCs w:val="24"/>
+        </w:rPr>
+        <w:t>2</w:t>
         <w:tab/>
-        <w:t>Fundamentação teórica</w:t>
+        <w:t>DESENVOLVIMENTO</w:t>
       </w:r>
       <w:r>
         <w:rPr>
@@ -2564,7 +2564,7 @@
           <w:sz w:val="24"/>
           <w:szCs w:val="24"/>
         </w:rPr>
-        <w:instrText xml:space="preserve"> PAGEREF pag17 \h </w:instrText>
+        <w:instrText xml:space="preserve"> PAGEREF pag16 \h </w:instrText>
       </w:r>
       <w:r>
         <w:rPr>
@@ -2604,12 +2604,10 @@
         <w:rPr>
           <w:b/>
           <w:bCs/>
-          <w:i/>
-          <w:iCs/>
-        </w:rPr>
-        <w:t>2.1.1</w:t>
+        </w:rPr>
+        <w:t>2.1</w:t>
         <w:tab/>
-        <w:t>Manutenção, TPM e PCM</w:t>
+        <w:t>Fundamentação teórica</w:t>
       </w:r>
       <w:r>
         <w:rPr>
@@ -2630,7 +2628,7 @@
           <w:sz w:val="24"/>
           <w:szCs w:val="24"/>
         </w:rPr>
-        <w:instrText xml:space="preserve"> PAGEREF pag18 \h </w:instrText>
+        <w:instrText xml:space="preserve"> PAGEREF pag17 \h </w:instrText>
       </w:r>
       <w:r>
         <w:rPr>
@@ -2673,9 +2671,9 @@
           <w:i/>
           <w:iCs/>
         </w:rPr>
-        <w:t>2.1.2</w:t>
+        <w:t>2.1.1</w:t>
         <w:tab/>
-        <w:t>Lubrificação de redutores de velocidade</w:t>
+        <w:t>Manutenção, TPM e PCM</w:t>
       </w:r>
       <w:r>
         <w:rPr>
@@ -2696,7 +2694,7 @@
           <w:sz w:val="24"/>
           <w:szCs w:val="24"/>
         </w:rPr>
-        <w:instrText xml:space="preserve"> PAGEREF pag19 \h </w:instrText>
+        <w:instrText xml:space="preserve"> PAGEREF pag18 \h </w:instrText>
       </w:r>
       <w:r>
         <w:rPr>
@@ -2739,9 +2737,9 @@
           <w:i/>
           <w:iCs/>
         </w:rPr>
-        <w:t>2.1.3</w:t>
+        <w:t>2.1.2</w:t>
         <w:tab/>
-        <w:t>Gestão Visual e 5S</w:t>
+        <w:t>Lubrificação de redutores de velocidade</w:t>
       </w:r>
       <w:r>
         <w:rPr>
@@ -2762,7 +2760,7 @@
           <w:sz w:val="24"/>
           <w:szCs w:val="24"/>
         </w:rPr>
-        <w:instrText xml:space="preserve"> PAGEREF pag20 \h </w:instrText>
+        <w:instrText xml:space="preserve"> PAGEREF pag19 \h </w:instrText>
       </w:r>
       <w:r>
         <w:rPr>
@@ -2776,7 +2774,7 @@
           <w:sz w:val="24"/>
           <w:szCs w:val="24"/>
         </w:rPr>
-        <w:t>14</w:t>
+        <w:t>12</w:t>
       </w:r>
       <w:r>
         <w:rPr>
@@ -2805,9 +2803,9 @@
           <w:i/>
           <w:iCs/>
         </w:rPr>
-        <w:t>2.1.4</w:t>
+        <w:t>2.1.3</w:t>
         <w:tab/>
-        <w:t>QR Code e NFC</w:t>
+        <w:t>Gestão Visual e 5S</w:t>
       </w:r>
       <w:r>
         <w:rPr>
@@ -2828,7 +2826,7 @@
           <w:sz w:val="24"/>
           <w:szCs w:val="24"/>
         </w:rPr>
-        <w:instrText xml:space="preserve"> PAGEREF pag21 \h </w:instrText>
+        <w:instrText xml:space="preserve"> PAGEREF pag20 \h </w:instrText>
       </w:r>
       <w:r>
         <w:rPr>
@@ -2868,10 +2866,12 @@
         <w:rPr>
           <w:b/>
           <w:bCs/>
-        </w:rPr>
-        <w:t>2.2</w:t>
+          <w:i/>
+          <w:iCs/>
+        </w:rPr>
+        <w:t>2.1.4</w:t>
         <w:tab/>
-        <w:t>Metodologia</w:t>
+        <w:t>QR Code e NFC</w:t>
       </w:r>
       <w:r>
         <w:rPr>
@@ -2892,7 +2892,7 @@
           <w:sz w:val="24"/>
           <w:szCs w:val="24"/>
         </w:rPr>
-        <w:instrText xml:space="preserve"> PAGEREF pag22 \h </w:instrText>
+        <w:instrText xml:space="preserve"> PAGEREF pag21 \h </w:instrText>
       </w:r>
       <w:r>
         <w:rPr>
@@ -2906,7 +2906,7 @@
           <w:sz w:val="24"/>
           <w:szCs w:val="24"/>
         </w:rPr>
-        <w:t>15</w:t>
+        <w:t>14</w:t>
       </w:r>
       <w:r>
         <w:rPr>
@@ -2932,12 +2932,10 @@
         <w:rPr>
           <w:b/>
           <w:bCs/>
-          <w:i/>
-          <w:iCs/>
-        </w:rPr>
-        <w:t>2.2.1</w:t>
+        </w:rPr>
+        <w:t>2.2</w:t>
         <w:tab/>
-        <w:t>Equipamento estudado</w:t>
+        <w:t>Metodologia</w:t>
       </w:r>
       <w:r>
         <w:rPr>
@@ -2958,7 +2956,7 @@
           <w:sz w:val="24"/>
           <w:szCs w:val="24"/>
         </w:rPr>
-        <w:instrText xml:space="preserve"> PAGEREF pag23 \h </w:instrText>
+        <w:instrText xml:space="preserve"> PAGEREF pag22 \h </w:instrText>
       </w:r>
       <w:r>
         <w:rPr>
@@ -3001,9 +2999,9 @@
           <w:i/>
           <w:iCs/>
         </w:rPr>
-        <w:t>2.2.2</w:t>
+        <w:t>2.2.1</w:t>
         <w:tab/>
-        <w:t>Ficha digital e protótipo</w:t>
+        <w:t>Equipamento estudado</w:t>
       </w:r>
       <w:r>
         <w:rPr>
@@ -3024,7 +3022,7 @@
           <w:sz w:val="24"/>
           <w:szCs w:val="24"/>
         </w:rPr>
-        <w:instrText xml:space="preserve"> PAGEREF pag24 \h </w:instrText>
+        <w:instrText xml:space="preserve"> PAGEREF pag23 \h </w:instrText>
       </w:r>
       <w:r>
         <w:rPr>
@@ -3038,7 +3036,7 @@
           <w:sz w:val="24"/>
           <w:szCs w:val="24"/>
         </w:rPr>
-        <w:t>18</w:t>
+        <w:t>15</w:t>
       </w:r>
       <w:r>
         <w:rPr>
@@ -3067,9 +3065,9 @@
           <w:i/>
           <w:iCs/>
         </w:rPr>
-        <w:t>2.2.3</w:t>
+        <w:t>2.2.2</w:t>
         <w:tab/>
-        <w:t>Cronometragem</w:t>
+        <w:t>Ficha digital e protótipo</w:t>
       </w:r>
       <w:r>
         <w:rPr>
@@ -3090,7 +3088,7 @@
           <w:sz w:val="24"/>
           <w:szCs w:val="24"/>
         </w:rPr>
-        <w:instrText xml:space="preserve"> PAGEREF pag25 \h </w:instrText>
+        <w:instrText xml:space="preserve"> PAGEREF pag24 \h </w:instrText>
       </w:r>
       <w:r>
         <w:rPr>
@@ -3104,7 +3102,7 @@
           <w:sz w:val="24"/>
           <w:szCs w:val="24"/>
         </w:rPr>
-        <w:t>20</w:t>
+        <w:t>18</w:t>
       </w:r>
       <w:r>
         <w:rPr>
@@ -3133,9 +3131,9 @@
           <w:i/>
           <w:iCs/>
         </w:rPr>
-        <w:t>2.2.4</w:t>
+        <w:t>2.2.3</w:t>
         <w:tab/>
-        <w:t>Análise dos dados e retorno financeiro</w:t>
+        <w:t>Cronometragem</w:t>
       </w:r>
       <w:r>
         <w:rPr>
@@ -3156,7 +3154,7 @@
           <w:sz w:val="24"/>
           <w:szCs w:val="24"/>
         </w:rPr>
-        <w:instrText xml:space="preserve"> PAGEREF pag26 \h </w:instrText>
+        <w:instrText xml:space="preserve"> PAGEREF pag25 \h </w:instrText>
       </w:r>
       <w:r>
         <w:rPr>
@@ -3170,7 +3168,7 @@
           <w:sz w:val="24"/>
           <w:szCs w:val="24"/>
         </w:rPr>
-        <w:t>22</w:t>
+        <w:t>21</w:t>
       </w:r>
       <w:r>
         <w:rPr>
@@ -3196,10 +3194,12 @@
         <w:rPr>
           <w:b/>
           <w:bCs/>
-        </w:rPr>
-        <w:t>2.3</w:t>
+          <w:i/>
+          <w:iCs/>
+        </w:rPr>
+        <w:t>2.2.4</w:t>
         <w:tab/>
-        <w:t>Resultados e Discussões</w:t>
+        <w:t>Análise dos dados e retorno financeiro</w:t>
       </w:r>
       <w:r>
         <w:rPr>
@@ -3220,7 +3220,7 @@
           <w:sz w:val="24"/>
           <w:szCs w:val="24"/>
         </w:rPr>
-        <w:instrText xml:space="preserve"> PAGEREF pag27 \h </w:instrText>
+        <w:instrText xml:space="preserve"> PAGEREF pag26 \h </w:instrText>
       </w:r>
       <w:r>
         <w:rPr>
@@ -3260,12 +3260,10 @@
         <w:rPr>
           <w:b/>
           <w:bCs/>
-          <w:i/>
-          <w:iCs/>
-        </w:rPr>
-        <w:t>2.3.1</w:t>
+        </w:rPr>
+        <w:t>2.3</w:t>
         <w:tab/>
-        <w:t>Dados coletados</w:t>
+        <w:t>Resultados e Discussões</w:t>
       </w:r>
       <w:r>
         <w:rPr>
@@ -3286,7 +3284,7 @@
           <w:sz w:val="24"/>
           <w:szCs w:val="24"/>
         </w:rPr>
-        <w:instrText xml:space="preserve"> PAGEREF pag28 \h </w:instrText>
+        <w:instrText xml:space="preserve"> PAGEREF pag27 \h </w:instrText>
       </w:r>
       <w:r>
         <w:rPr>
@@ -3300,7 +3298,7 @@
           <w:sz w:val="24"/>
           <w:szCs w:val="24"/>
         </w:rPr>
-        <w:t>22</w:t>
+        <w:t>23</w:t>
       </w:r>
       <w:r>
         <w:rPr>
@@ -3329,9 +3327,9 @@
           <w:i/>
           <w:iCs/>
         </w:rPr>
-        <w:t>2.3.2</w:t>
+        <w:t>2.3.1</w:t>
         <w:tab/>
-        <w:t>Discussão</w:t>
+        <w:t>Dados coletados</w:t>
       </w:r>
       <w:r>
         <w:rPr>
@@ -3352,7 +3350,7 @@
           <w:sz w:val="24"/>
           <w:szCs w:val="24"/>
         </w:rPr>
-        <w:instrText xml:space="preserve"> PAGEREF pag29 \h </w:instrText>
+        <w:instrText xml:space="preserve"> PAGEREF pag28 \h </w:instrText>
       </w:r>
       <w:r>
         <w:rPr>
@@ -3392,12 +3390,12 @@
         <w:rPr>
           <w:b/>
           <w:bCs/>
-          <w:sz w:val="24"/>
-          <w:szCs w:val="24"/>
-        </w:rPr>
-        <w:t>3</w:t>
+          <w:i/>
+          <w:iCs/>
+        </w:rPr>
+        <w:t>2.3.2</w:t>
         <w:tab/>
-        <w:t>CONCLUSÃO</w:t>
+        <w:t>Discussão</w:t>
       </w:r>
       <w:r>
         <w:rPr>
@@ -3418,7 +3416,7 @@
           <w:sz w:val="24"/>
           <w:szCs w:val="24"/>
         </w:rPr>
-        <w:instrText xml:space="preserve"> PAGEREF pag30 \h </w:instrText>
+        <w:instrText xml:space="preserve"> PAGEREF pag29 \h </w:instrText>
       </w:r>
       <w:r>
         <w:rPr>
@@ -3432,7 +3430,7 @@
           <w:sz w:val="24"/>
           <w:szCs w:val="24"/>
         </w:rPr>
-        <w:t>25</w:t>
+        <w:t>24</w:t>
       </w:r>
       <w:r>
         <w:rPr>
@@ -3461,14 +3459,16 @@
           <w:sz w:val="24"/>
           <w:szCs w:val="24"/>
         </w:rPr>
-        <w:t>REFERÊNCIAS</w:t>
-      </w:r>
-      <w:r>
-        <w:rPr>
-          <w:sz w:val="24"/>
-          <w:szCs w:val="24"/>
-        </w:rPr>
+        <w:t>3</w:t>
         <w:tab/>
+        <w:t>CONCLUSÃO</w:t>
+      </w:r>
+      <w:r>
+        <w:rPr>
+          <w:sz w:val="24"/>
+          <w:szCs w:val="24"/>
+        </w:rPr>
+        <w:tab/>
       </w:r>
       <w:r>
         <w:rPr>
@@ -3482,7 +3482,7 @@
           <w:sz w:val="24"/>
           <w:szCs w:val="24"/>
         </w:rPr>
-        <w:instrText xml:space="preserve"> PAGEREF pag31 \h </w:instrText>
+        <w:instrText xml:space="preserve"> PAGEREF pag30 \h </w:instrText>
       </w:r>
       <w:r>
         <w:rPr>
@@ -3525,7 +3525,7 @@
           <w:sz w:val="24"/>
           <w:szCs w:val="24"/>
         </w:rPr>
-        <w:t>APÊNDICE A – FOLHA DE COLETA DE TEMPOS</w:t>
+        <w:t>REFERÊNCIAS</w:t>
       </w:r>
       <w:r>
         <w:rPr>
@@ -3546,7 +3546,7 @@
           <w:sz w:val="24"/>
           <w:szCs w:val="24"/>
         </w:rPr>
-        <w:instrText xml:space="preserve"> PAGEREF pag32 \h </w:instrText>
+        <w:instrText xml:space="preserve"> PAGEREF pag31 \h </w:instrText>
       </w:r>
       <w:r>
         <w:rPr>
@@ -3589,6 +3589,70 @@
           <w:sz w:val="24"/>
           <w:szCs w:val="24"/>
         </w:rPr>
+        <w:t>APÊNDICE A – FOLHA DE COLETA DE TEMPOS</w:t>
+      </w:r>
+      <w:r>
+        <w:rPr>
+          <w:sz w:val="24"/>
+          <w:szCs w:val="24"/>
+        </w:rPr>
+        <w:tab/>
+      </w:r>
+      <w:r>
+        <w:rPr>
+          <w:sz w:val="24"/>
+          <w:szCs w:val="24"/>
+        </w:rPr>
+        <w:fldChar w:fldCharType="begin"/>
+      </w:r>
+      <w:r>
+        <w:rPr>
+          <w:sz w:val="24"/>
+          <w:szCs w:val="24"/>
+        </w:rPr>
+        <w:instrText xml:space="preserve"> PAGEREF pag32 \h </w:instrText>
+      </w:r>
+      <w:r>
+        <w:rPr>
+          <w:sz w:val="24"/>
+          <w:szCs w:val="24"/>
+        </w:rPr>
+        <w:fldChar w:fldCharType="separate"/>
+      </w:r>
+      <w:r>
+        <w:rPr>
+          <w:sz w:val="24"/>
+          <w:szCs w:val="24"/>
+        </w:rPr>
+        <w:t>28</w:t>
+      </w:r>
+      <w:r>
+        <w:rPr>
+          <w:sz w:val="24"/>
+          <w:szCs w:val="24"/>
+        </w:rPr>
+        <w:fldChar w:fldCharType="end"/>
+      </w:r>
+    </w:p>
+    <w:p>
+      <w:pPr>
+        <w:pStyle w:val="Normal"/>
+        <w:tabs>
+          <w:tab w:val="clear" w:pos="720"/>
+          <w:tab w:val="left" w:pos="794" w:leader="none"/>
+          <w:tab w:val="right" w:pos="9071" w:leader="dot"/>
+        </w:tabs>
+        <w:spacing w:lineRule="auto" w:line="360" w:before="0" w:after="0"/>
+        <w:ind w:left="0" w:right="0" w:hanging="0"/>
+        <w:rPr/>
+      </w:pPr>
+      <w:r>
+        <w:rPr>
+          <w:b/>
+          <w:bCs/>
+          <w:sz w:val="24"/>
+          <w:szCs w:val="24"/>
+        </w:rPr>
         <w:t>APÊNDICE B – ESPECIFICAÇÃO DA ETIQUETA E DO QR CODE</w:t>
       </w:r>
       <w:r>
@@ -3624,7 +3688,7 @@
           <w:sz w:val="24"/>
           <w:szCs w:val="24"/>
         </w:rPr>
-        <w:t>28</w:t>
+        <w:t>29</w:t>
       </w:r>
       <w:r>
         <w:rPr>
@@ -3698,7 +3762,7 @@
           <w:sz w:val="24"/>
           <w:szCs w:val="24"/>
         </w:rPr>
-        <w:t>29</w:t>
+        <w:t>30</w:t>
       </w:r>
       <w:r>
         <w:rPr>
@@ -4453,7 +4517,7 @@
       </w:r>
       <w:r>
         <w:rPr/>
-        <w:t>. Os dados da placa, do manual e do levantamento feito pela equipe no próprio redutor estão resumidos no Quadro 1.</w:t>
+        <w:t>. Os dados da placa, do manual e do levantamento feito pela equipe no próprio redutor, no qual a carcaça e o eixo de saída foram medidos com paquímetro (Figura 1), estão resumidos no Quadro 1.</w:t>
       </w:r>
     </w:p>
     <w:p>
@@ -5478,7 +5542,7 @@
                 <w:sz w:val="20"/>
                 <w:szCs w:val="20"/>
               </w:rPr>
-              <w:t>Altura e massa</w:t>
+              <w:t>Dimensões e massa</w:t>
             </w:r>
           </w:p>
         </w:tc>
@@ -5513,7 +5577,7 @@
                 <w:sz w:val="20"/>
                 <w:szCs w:val="20"/>
               </w:rPr>
-              <w:t xml:space="preserve">Altura de 225 mm (medida pela equipe); massa: </w:t>
+              <w:t xml:space="preserve">Altura de 225 mm e largura da carcaça de 116 mm (medidas pela equipe com paquímetro); massa: </w:t>
             </w:r>
             <w:r>
               <w:rPr>
@@ -5552,6 +5616,103 @@
           <w:vertAlign w:val="superscript"/>
         </w:rPr>
         <w:t>2</w:t>
+      </w:r>
+    </w:p>
+    <w:p>
+      <w:pPr>
+        <w:pStyle w:val="Normal"/>
+        <w:keepNext w:val="true"/>
+        <w:spacing w:lineRule="auto" w:line="240" w:before="200" w:after="80"/>
+        <w:jc w:val="center"/>
+        <w:rPr>
+          <w:b/>
+          <w:b/>
+          <w:bCs/>
+          <w:sz w:val="20"/>
+          <w:szCs w:val="20"/>
+        </w:rPr>
+      </w:pPr>
+      <w:bookmarkStart w:id="17" w:name="pagfig1"/>
+      <w:bookmarkEnd w:id="17"/>
+      <w:r>
+        <w:rPr>
+          <w:b/>
+          <w:bCs/>
+          <w:sz w:val="20"/>
+          <w:szCs w:val="20"/>
+        </w:rPr>
+        <w:t>Figura 1 – Medição da carcaça do redutor com paquímetro, na oficina de mecânica do SENAI Três Lagoas</w:t>
+      </w:r>
+    </w:p>
+    <w:p>
+      <w:pPr>
+        <w:pStyle w:val="Normal"/>
+        <w:spacing w:lineRule="auto" w:line="240" w:before="0" w:after="0"/>
+        <w:ind w:left="0" w:right="0" w:hanging="0"/>
+        <w:jc w:val="center"/>
+        <w:rPr/>
+      </w:pPr>
+      <w:r>
+        <w:rPr/>
+        <w:drawing>
+          <wp:inline distT="0" distB="0" distL="0" distR="0">
+            <wp:extent cx="2700020" cy="3599815"/>
+            <wp:effectExtent l="0" t="0" r="0" b="0"/>
+            <wp:docPr id="3" name="Medicao" descr=""/>
+            <wp:cNvGraphicFramePr>
+              <a:graphicFrameLocks xmlns:a="http://schemas.openxmlformats.org/drawingml/2006/main" noChangeAspect="1"/>
+            </wp:cNvGraphicFramePr>
+            <a:graphic xmlns:a="http://schemas.openxmlformats.org/drawingml/2006/main">
+              <a:graphicData uri="http://schemas.openxmlformats.org/drawingml/2006/picture">
+                <pic:pic xmlns:pic="http://schemas.openxmlformats.org/drawingml/2006/picture">
+                  <pic:nvPicPr>
+                    <pic:cNvPr id="3" name="Medicao" descr=""/>
+                    <pic:cNvPicPr>
+                      <a:picLocks noChangeAspect="1" noChangeArrowheads="1"/>
+                    </pic:cNvPicPr>
+                  </pic:nvPicPr>
+                  <pic:blipFill>
+                    <a:blip r:embed="rId4"/>
+                    <a:stretch>
+                      <a:fillRect/>
+                    </a:stretch>
+                  </pic:blipFill>
+                  <pic:spPr bwMode="auto">
+                    <a:xfrm>
+                      <a:off x="0" y="0"/>
+                      <a:ext cx="2700020" cy="3599815"/>
+                    </a:xfrm>
+                    <a:prstGeom prst="rect">
+                      <a:avLst/>
+                    </a:prstGeom>
+                    <a:ln w="6350">
+                      <a:solidFill>
+                        <a:srgbClr val="808080"/>
+                      </a:solidFill>
+                    </a:ln>
+                  </pic:spPr>
+                </pic:pic>
+              </a:graphicData>
+            </a:graphic>
+          </wp:inline>
+        </w:drawing>
+      </w:r>
+    </w:p>
+    <w:p>
+      <w:pPr>
+        <w:pStyle w:val="Normal"/>
+        <w:spacing w:lineRule="auto" w:line="240" w:before="60" w:after="200"/>
+        <w:rPr>
+          <w:sz w:val="20"/>
+          <w:szCs w:val="20"/>
+        </w:rPr>
+      </w:pPr>
+      <w:r>
+        <w:rPr>
+          <w:sz w:val="20"/>
+          <w:szCs w:val="20"/>
+        </w:rPr>
+        <w:t>Fonte: Acervo dos autores (2026).</w:t>
       </w:r>
     </w:p>
     <w:p>
@@ -5611,6 +5772,9 @@
         <w:rPr/>
         <w:t>. Um adesivo no próprio redutor lembra que o lacre do respiro deve ser retirado antes da operação.</w:t>
       </w:r>
+      <w:r>
+        <w:br w:type="page"/>
+      </w:r>
     </w:p>
     <w:p>
       <w:pPr>
@@ -5626,8 +5790,8 @@
           <w:szCs w:val="20"/>
         </w:rPr>
       </w:pPr>
-      <w:bookmarkStart w:id="17" w:name="pag02"/>
-      <w:bookmarkEnd w:id="17"/>
+      <w:bookmarkStart w:id="18" w:name="pag02"/>
+      <w:bookmarkEnd w:id="18"/>
       <w:r>
         <w:rPr>
           <w:b/>
@@ -6553,8 +6717,8 @@
         <w:pStyle w:val="Heading3"/>
         <w:rPr/>
       </w:pPr>
-      <w:bookmarkStart w:id="18" w:name="pag24"/>
-      <w:bookmarkEnd w:id="18"/>
+      <w:bookmarkStart w:id="19" w:name="pag24"/>
+      <w:bookmarkEnd w:id="19"/>
       <w:r>
         <w:rPr/>
         <w:t>2.2.2 Ficha digital e protótipo</w:t>
@@ -6731,8 +6895,8 @@
         <w:pStyle w:val="Heading3"/>
         <w:rPr/>
       </w:pPr>
-      <w:bookmarkStart w:id="19" w:name="pag25"/>
-      <w:bookmarkEnd w:id="19"/>
+      <w:bookmarkStart w:id="20" w:name="pag25"/>
+      <w:bookmarkEnd w:id="20"/>
       <w:r>
         <w:rPr/>
         <w:t>2.2.3 Cronometragem</w:t>
@@ -6806,8 +6970,8 @@
           <w:szCs w:val="20"/>
         </w:rPr>
       </w:pPr>
-      <w:bookmarkStart w:id="20" w:name="pag03"/>
-      <w:bookmarkEnd w:id="20"/>
+      <w:bookmarkStart w:id="21" w:name="pag03"/>
+      <w:bookmarkEnd w:id="21"/>
       <w:r>
         <w:rPr>
           <w:b/>
@@ -7325,8 +7489,8 @@
         <w:pStyle w:val="Heading3"/>
         <w:rPr/>
       </w:pPr>
-      <w:bookmarkStart w:id="21" w:name="pag26"/>
-      <w:bookmarkEnd w:id="21"/>
+      <w:bookmarkStart w:id="22" w:name="pag26"/>
+      <w:bookmarkEnd w:id="22"/>
       <w:r>
         <w:rPr/>
         <w:t>2.2.4 Análise dos dados e retorno financeiro</w:t>
@@ -7385,8 +7549,8 @@
         <w:pStyle w:val="Heading2"/>
         <w:rPr/>
       </w:pPr>
-      <w:bookmarkStart w:id="22" w:name="pag27"/>
-      <w:bookmarkEnd w:id="22"/>
+      <w:bookmarkStart w:id="23" w:name="pag27"/>
+      <w:bookmarkEnd w:id="23"/>
       <w:r>
         <w:rPr/>
         <w:t>2.3 Resultados e Discussões</w:t>
@@ -7398,8 +7562,8 @@
         <w:spacing w:before="0" w:after="414"/>
         <w:rPr/>
       </w:pPr>
-      <w:bookmarkStart w:id="23" w:name="pag28"/>
-      <w:bookmarkEnd w:id="23"/>
+      <w:bookmarkStart w:id="24" w:name="pag28"/>
+      <w:bookmarkEnd w:id="24"/>
       <w:r>
         <w:rPr/>
         <w:t>2.3.1 Dados coletados</w:t>
@@ -7439,8 +7603,8 @@
           <w:szCs w:val="20"/>
         </w:rPr>
       </w:pPr>
-      <w:bookmarkStart w:id="24" w:name="pag05"/>
-      <w:bookmarkEnd w:id="24"/>
+      <w:bookmarkStart w:id="25" w:name="pag05"/>
+      <w:bookmarkEnd w:id="25"/>
       <w:r>
         <w:rPr>
           <w:b/>
@@ -8327,8 +8491,8 @@
           <w:szCs w:val="20"/>
         </w:rPr>
       </w:pPr>
-      <w:bookmarkStart w:id="25" w:name="pag06"/>
-      <w:bookmarkEnd w:id="25"/>
+      <w:bookmarkStart w:id="26" w:name="pag06"/>
+      <w:bookmarkEnd w:id="26"/>
       <w:r>
         <w:rPr>
           <w:b/>
@@ -9229,8 +9393,8 @@
           <w:szCs w:val="20"/>
         </w:rPr>
       </w:pPr>
-      <w:bookmarkStart w:id="26" w:name="pag07"/>
-      <w:bookmarkEnd w:id="26"/>
+      <w:bookmarkStart w:id="27" w:name="pag07"/>
+      <w:bookmarkEnd w:id="27"/>
       <w:r>
         <w:rPr>
           <w:b/>
@@ -9785,8 +9949,8 @@
         <w:pStyle w:val="Heading3"/>
         <w:rPr/>
       </w:pPr>
-      <w:bookmarkStart w:id="27" w:name="pag29"/>
-      <w:bookmarkEnd w:id="27"/>
+      <w:bookmarkStart w:id="28" w:name="pag29"/>
+      <w:bookmarkEnd w:id="28"/>
       <w:r>
         <w:rPr/>
         <w:t>2.3.2 Discussão</w:t>
@@ -9876,8 +10040,8 @@
         <w:pStyle w:val="Heading1"/>
         <w:rPr/>
       </w:pPr>
-      <w:bookmarkStart w:id="28" w:name="pag30"/>
-      <w:bookmarkEnd w:id="28"/>
+      <w:bookmarkStart w:id="29" w:name="pag30"/>
+      <w:bookmarkEnd w:id="29"/>
       <w:r>
         <w:rPr/>
         <w:t>3 CONCLUSÃO</w:t>
@@ -9951,8 +10115,8 @@
           <w:bCs/>
         </w:rPr>
       </w:pPr>
-      <w:bookmarkStart w:id="29" w:name="pag31"/>
-      <w:bookmarkEnd w:id="29"/>
+      <w:bookmarkStart w:id="30" w:name="pag31"/>
+      <w:bookmarkEnd w:id="30"/>
       <w:r>
         <w:rPr>
           <w:b/>
@@ -10136,8 +10300,8 @@
           <w:bCs/>
         </w:rPr>
       </w:pPr>
-      <w:bookmarkStart w:id="30" w:name="pag32"/>
-      <w:bookmarkEnd w:id="30"/>
+      <w:bookmarkStart w:id="31" w:name="pag32"/>
+      <w:bookmarkEnd w:id="31"/>
       <w:r>
         <w:rPr>
           <w:b/>
@@ -12235,8 +12399,8 @@
           <w:bCs/>
         </w:rPr>
       </w:pPr>
-      <w:bookmarkStart w:id="31" w:name="pag33"/>
-      <w:bookmarkEnd w:id="31"/>
+      <w:bookmarkStart w:id="32" w:name="pag33"/>
+      <w:bookmarkEnd w:id="32"/>
       <w:r>
         <w:rPr>
           <w:b/>
@@ -12331,8 +12495,8 @@
           <w:bCs/>
         </w:rPr>
       </w:pPr>
-      <w:bookmarkStart w:id="32" w:name="pag34"/>
-      <w:bookmarkEnd w:id="32"/>
+      <w:bookmarkStart w:id="33" w:name="pag34"/>
+      <w:bookmarkEnd w:id="33"/>
       <w:r>
         <w:rPr>
           <w:b/>
@@ -12355,8 +12519,8 @@
           <w:szCs w:val="20"/>
         </w:rPr>
       </w:pPr>
-      <w:bookmarkStart w:id="33" w:name="pag04"/>
-      <w:bookmarkEnd w:id="33"/>
+      <w:bookmarkStart w:id="34" w:name="pag04"/>
+      <w:bookmarkEnd w:id="34"/>
       <w:r>
         <w:rPr>
           <w:b/>
@@ -12364,7 +12528,7 @@
           <w:sz w:val="20"/>
           <w:szCs w:val="20"/>
         </w:rPr>
-        <w:t>Figura 1 – Telas da ficha digital do redutor RED-001: segurança e vida útil do óleo, com as datas da última e da próxima troca (à esquerda); modelo tridimensional com a localização dos bujões de nível e a fotografia do redutor (ao centro); registro da intervenção (à direita)</w:t>
+        <w:t>Figura 2 – Telas da ficha digital do redutor RED-001: segurança e vida útil do óleo, com as datas da última e da próxima troca (à esquerda); modelo tridimensional com a localização dos bujões de nível e a fotografia do redutor (ao centro); registro da intervenção (à direita)</w:t>
       </w:r>
     </w:p>
     <w:p>
@@ -12381,7 +12545,7 @@
           <wp:inline distT="0" distB="0" distL="0" distR="0">
             <wp:extent cx="1800225" cy="3895725"/>
             <wp:effectExtent l="0" t="0" r="0" b="0"/>
-            <wp:docPr id="3" name="Tela1" descr=""/>
+            <wp:docPr id="4" name="Tela1" descr=""/>
             <wp:cNvGraphicFramePr>
               <a:graphicFrameLocks xmlns:a="http://schemas.openxmlformats.org/drawingml/2006/main" noChangeAspect="1"/>
             </wp:cNvGraphicFramePr>
@@ -12389,56 +12553,7 @@
               <a:graphicData uri="http://schemas.openxmlformats.org/drawingml/2006/picture">
                 <pic:pic xmlns:pic="http://schemas.openxmlformats.org/drawingml/2006/picture">
                   <pic:nvPicPr>
-                    <pic:cNvPr id="3" name="Tela1" descr=""/>
-                    <pic:cNvPicPr>
-                      <a:picLocks noChangeAspect="1" noChangeArrowheads="1"/>
-                    </pic:cNvPicPr>
-                  </pic:nvPicPr>
-                  <pic:blipFill>
-                    <a:blip r:embed="rId4"/>
-                    <a:stretch>
-                      <a:fillRect/>
-                    </a:stretch>
-                  </pic:blipFill>
-                  <pic:spPr bwMode="auto">
-                    <a:xfrm>
-                      <a:off x="0" y="0"/>
-                      <a:ext cx="1800225" cy="3895725"/>
-                    </a:xfrm>
-                    <a:prstGeom prst="rect">
-                      <a:avLst/>
-                    </a:prstGeom>
-                    <a:ln w="6350">
-                      <a:solidFill>
-                        <a:srgbClr val="808080"/>
-                      </a:solidFill>
-                    </a:ln>
-                  </pic:spPr>
-                </pic:pic>
-              </a:graphicData>
-            </a:graphic>
-          </wp:inline>
-        </w:drawing>
-      </w:r>
-      <w:r>
-        <w:rPr/>
-        <w:t xml:space="preserve">  </w:t>
-      </w:r>
-      <w:r>
-        <w:rPr/>
-        <w:drawing>
-          <wp:inline distT="0" distB="0" distL="0" distR="0">
-            <wp:extent cx="1800225" cy="3895725"/>
-            <wp:effectExtent l="0" t="0" r="0" b="0"/>
-            <wp:docPr id="4" name="Tela2" descr=""/>
-            <wp:cNvGraphicFramePr>
-              <a:graphicFrameLocks xmlns:a="http://schemas.openxmlformats.org/drawingml/2006/main" noChangeAspect="1"/>
-            </wp:cNvGraphicFramePr>
-            <a:graphic xmlns:a="http://schemas.openxmlformats.org/drawingml/2006/main">
-              <a:graphicData uri="http://schemas.openxmlformats.org/drawingml/2006/picture">
-                <pic:pic xmlns:pic="http://schemas.openxmlformats.org/drawingml/2006/picture">
-                  <pic:nvPicPr>
-                    <pic:cNvPr id="4" name="Tela2" descr=""/>
+                    <pic:cNvPr id="4" name="Tela1" descr=""/>
                     <pic:cNvPicPr>
                       <a:picLocks noChangeAspect="1" noChangeArrowheads="1"/>
                     </pic:cNvPicPr>
@@ -12479,7 +12594,7 @@
           <wp:inline distT="0" distB="0" distL="0" distR="0">
             <wp:extent cx="1800225" cy="3895725"/>
             <wp:effectExtent l="0" t="0" r="0" b="0"/>
-            <wp:docPr id="5" name="Tela3" descr=""/>
+            <wp:docPr id="5" name="Tela2" descr=""/>
             <wp:cNvGraphicFramePr>
               <a:graphicFrameLocks xmlns:a="http://schemas.openxmlformats.org/drawingml/2006/main" noChangeAspect="1"/>
             </wp:cNvGraphicFramePr>
@@ -12487,7 +12602,7 @@
               <a:graphicData uri="http://schemas.openxmlformats.org/drawingml/2006/picture">
                 <pic:pic xmlns:pic="http://schemas.openxmlformats.org/drawingml/2006/picture">
                   <pic:nvPicPr>
-                    <pic:cNvPr id="5" name="Tela3" descr=""/>
+                    <pic:cNvPr id="5" name="Tela2" descr=""/>
                     <pic:cNvPicPr>
                       <a:picLocks noChangeAspect="1" noChangeArrowheads="1"/>
                     </pic:cNvPicPr>
@@ -12518,6 +12633,55 @@
           </wp:inline>
         </w:drawing>
       </w:r>
+      <w:r>
+        <w:rPr/>
+        <w:t xml:space="preserve">  </w:t>
+      </w:r>
+      <w:r>
+        <w:rPr/>
+        <w:drawing>
+          <wp:inline distT="0" distB="0" distL="0" distR="0">
+            <wp:extent cx="1800225" cy="3895725"/>
+            <wp:effectExtent l="0" t="0" r="0" b="0"/>
+            <wp:docPr id="6" name="Tela3" descr=""/>
+            <wp:cNvGraphicFramePr>
+              <a:graphicFrameLocks xmlns:a="http://schemas.openxmlformats.org/drawingml/2006/main" noChangeAspect="1"/>
+            </wp:cNvGraphicFramePr>
+            <a:graphic xmlns:a="http://schemas.openxmlformats.org/drawingml/2006/main">
+              <a:graphicData uri="http://schemas.openxmlformats.org/drawingml/2006/picture">
+                <pic:pic xmlns:pic="http://schemas.openxmlformats.org/drawingml/2006/picture">
+                  <pic:nvPicPr>
+                    <pic:cNvPr id="6" name="Tela3" descr=""/>
+                    <pic:cNvPicPr>
+                      <a:picLocks noChangeAspect="1" noChangeArrowheads="1"/>
+                    </pic:cNvPicPr>
+                  </pic:nvPicPr>
+                  <pic:blipFill>
+                    <a:blip r:embed="rId7"/>
+                    <a:stretch>
+                      <a:fillRect/>
+                    </a:stretch>
+                  </pic:blipFill>
+                  <pic:spPr bwMode="auto">
+                    <a:xfrm>
+                      <a:off x="0" y="0"/>
+                      <a:ext cx="1800225" cy="3895725"/>
+                    </a:xfrm>
+                    <a:prstGeom prst="rect">
+                      <a:avLst/>
+                    </a:prstGeom>
+                    <a:ln w="6350">
+                      <a:solidFill>
+                        <a:srgbClr val="808080"/>
+                      </a:solidFill>
+                    </a:ln>
+                  </pic:spPr>
+                </pic:pic>
+              </a:graphicData>
+            </a:graphic>
+          </wp:inline>
+        </w:drawing>
+      </w:r>
     </w:p>
     <w:p>
       <w:pPr>
@@ -12537,7 +12701,7 @@
       </w:r>
     </w:p>
     <w:sectPr>
-      <w:headerReference w:type="default" r:id="rId7"/>
+      <w:headerReference w:type="default" r:id="rId8"/>
       <w:type w:val="nextPage"/>
       <w:pgSz w:w="11906" w:h="16838"/>
       <w:pgMar w:left="1701" w:right="1134" w:gutter="0" w:header="1134" w:top="1701" w:footer="0" w:bottom="1134"/>
@@ -12560,7 +12724,7 @@
     <w:r>
       <w:rPr/>
       <w:drawing>
-        <wp:anchor behindDoc="1" distT="0" distB="0" distL="0" distR="0" simplePos="0" locked="0" layoutInCell="0" allowOverlap="1" relativeHeight="2">
+        <wp:anchor behindDoc="1" distT="0" distB="0" distL="0" distR="0" simplePos="0" locked="0" layoutInCell="0" allowOverlap="1" relativeHeight="5">
           <wp:simplePos x="0" y="0"/>
           <wp:positionH relativeFrom="page">
             <wp:posOffset>0</wp:posOffset>
@@ -12619,7 +12783,7 @@
     <w:r>
       <w:rPr/>
       <w:drawing>
-        <wp:anchor behindDoc="1" distT="0" distB="0" distL="0" distR="0" simplePos="0" locked="0" layoutInCell="0" allowOverlap="1" relativeHeight="10">
+        <wp:anchor behindDoc="1" distT="0" distB="0" distL="0" distR="0" simplePos="0" locked="0" layoutInCell="0" allowOverlap="1" relativeHeight="14">
           <wp:simplePos x="0" y="0"/>
           <wp:positionH relativeFrom="page">
             <wp:posOffset>0</wp:posOffset>
@@ -12685,7 +12849,7 @@
         <w:szCs w:val="20"/>
       </w:rPr>
       <w:drawing>
-        <wp:anchor behindDoc="1" distT="0" distB="0" distL="0" distR="0" simplePos="0" locked="0" layoutInCell="0" allowOverlap="1" relativeHeight="16">
+        <wp:anchor behindDoc="1" distT="0" distB="0" distL="0" distR="0" simplePos="0" locked="0" layoutInCell="0" allowOverlap="1" relativeHeight="20">
           <wp:simplePos x="0" y="0"/>
           <wp:positionH relativeFrom="page">
             <wp:posOffset>0</wp:posOffset>
@@ -12696,7 +12860,7 @@
           <wp:extent cx="7560310" cy="10692130"/>
           <wp:effectExtent l="0" t="0" r="0" b="0"/>
           <wp:wrapNone/>
-          <wp:docPr id="6" name="MarcaDaguaSENAI3" descr=""/>
+          <wp:docPr id="7" name="MarcaDaguaSENAI3" descr=""/>
           <wp:cNvGraphicFramePr>
             <a:graphicFrameLocks xmlns:a="http://schemas.openxmlformats.org/drawingml/2006/main" noChangeAspect="1"/>
           </wp:cNvGraphicFramePr>
@@ -12704,7 +12868,7 @@
             <a:graphicData uri="http://schemas.openxmlformats.org/drawingml/2006/picture">
               <pic:pic xmlns:pic="http://schemas.openxmlformats.org/drawingml/2006/picture">
                 <pic:nvPicPr>
-                  <pic:cNvPr id="6" name="MarcaDaguaSENAI3" descr=""/>
+                  <pic:cNvPr id="7" name="MarcaDaguaSENAI3" descr=""/>
                   <pic:cNvPicPr>
                     <a:picLocks noChangeAspect="1" noChangeArrowheads="1"/>
                   </pic:cNvPicPr>
@@ -12750,7 +12914,7 @@
         <w:sz w:val="20"/>
         <w:szCs w:val="20"/>
       </w:rPr>
-      <w:t>29</w:t>
+      <w:t>30</w:t>
     </w:r>
     <w:r>
       <w:rPr>

</xml_diff>

<commit_message>
Bujão de nível do meio na posição adotada (ficha, foto marcada, 3D e documento); potência e engrenamento conferidos pela equipe
Co-Authored-By: Claude Opus 5.5 <noreply@anthropic.com>
</commit_message>
<xml_diff>
--- a/Projeto_Integrador_QRCode_Lubrificantes.docx
+++ b/Projeto_Integrador_QRCode_Lubrificantes.docx
@@ -5177,17 +5177,7 @@
                 <w:sz w:val="20"/>
                 <w:szCs w:val="20"/>
               </w:rPr>
-              <w:t xml:space="preserve">Rosca sem fim de aço e coroa de bronze </w:t>
-            </w:r>
-            <w:r>
-              <w:rPr>
-                <w:b w:val="false"/>
-                <w:bCs w:val="false"/>
-                <w:sz w:val="20"/>
-                <w:szCs w:val="20"/>
-                <w:shd w:fill="FFFF00" w:val="clear"/>
-              </w:rPr>
-              <w:t>[confirmar no manual ou com o fabricante]</w:t>
+              <w:t>Pinhão de entrada em rosca sem fim de aço e coroa de saída de bronze (conferido pela equipe)</w:t>
             </w:r>
           </w:p>
         </w:tc>
@@ -5339,17 +5329,7 @@
                 <w:sz w:val="20"/>
                 <w:szCs w:val="20"/>
               </w:rPr>
-              <w:t xml:space="preserve">1.750 rpm na entrada e 70 rpm na saída (redução 1:25); 1,75 kW; fator de serviço 1 </w:t>
-            </w:r>
-            <w:r>
-              <w:rPr>
-                <w:b w:val="false"/>
-                <w:bCs w:val="false"/>
-                <w:sz w:val="20"/>
-                <w:szCs w:val="20"/>
-                <w:shd w:fill="FFFF00" w:val="clear"/>
-              </w:rPr>
-              <w:t>[conferir a potência, pouco legível na placa]</w:t>
+              <w:t>1.750 rpm na entrada e 70 rpm na saída (redução 1:25); 1,75 kW; fator de serviço 1 (conferidos pela equipe)</w:t>
             </w:r>
           </w:p>
         </w:tc>
@@ -5750,7 +5730,7 @@
       </w:pPr>
       <w:r>
         <w:rPr/>
-        <w:t>Como a equipe dispõe do redutor, os pontos de lubrificação foram identificados no próprio equipamento e registrados em fotografias, usadas também na ficha: o respiro de latão, na face superior, serve de enchimento; dois bujões de nível ficam na face lateral oposta ao motor, onde está a tampa cega da rosca sem fim; e o dreno é feito pelo bujão mais baixo dessa face e por um bujão na base. O redutor não possui visor de nível: o nível é conferido pela retirada do bujão, com o equipamento parado e bloqueado, e qual dos dois bujões de nível deve ser usado depende da posição de montagem</w:t>
+        <w:t>Como a equipe dispõe do redutor, os pontos de lubrificação foram identificados no próprio equipamento e registrados em fotografias, usadas também na ficha: o respiro de latão, na face superior, serve de enchimento; na face lateral oposta ao motor, onde está a tampa cega da rosca sem fim, ficam dois bujões de nível; e o dreno é feito pelo bujão mais baixo dessa face e por um bujão na base. O redutor não possui visor de nível: o nível é conferido pela retirada do bujão, com o equipamento parado e bloqueado, e, como o bujão a ser usado depende da posição de montagem,</w:t>
       </w:r>
       <w:r>
         <w:rPr>
@@ -5760,17 +5740,7 @@
       </w:r>
       <w:r>
         <w:rPr/>
-        <w:t xml:space="preserve"> </w:t>
-      </w:r>
-      <w:r>
-        <w:rPr>
-          <w:shd w:fill="FFFF00" w:val="clear"/>
-        </w:rPr>
-        <w:t>[confirmar com o professor ou com o fabricante]</w:t>
-      </w:r>
-      <w:r>
-        <w:rPr/>
-        <w:t>. Um adesivo no próprio redutor lembra que o lacre do respiro deve ser retirado antes da operação.</w:t>
+        <w:t xml:space="preserve"> na posição adotada pela equipe o nível é conferido pelo bujão do meio dessa face. Um adesivo no próprio redutor lembra que o lacre do respiro deve ser retirado antes da operação.</w:t>
       </w:r>
       <w:r>
         <w:br w:type="page"/>
@@ -6357,7 +6327,7 @@
                 <w:sz w:val="20"/>
                 <w:szCs w:val="20"/>
               </w:rPr>
-              <w:t>Enchimento pelo respiro, na face superior; nível por bujão na face da tampa cega (não há visor); dreno pelo bujão mais baixo dessa face e pelo bujão da base</w:t>
+              <w:t>Enchimento pelo respiro, na face superior; nível pelo bujão do meio da face da tampa cega (não há visor); dreno pelo bujão mais baixo dessa face e pelo bujão da base</w:t>
             </w:r>
           </w:p>
         </w:tc>

</xml_diff>

<commit_message>
Documento no formato do modelo do SENAI: resumo e abstract em espaço simples com título à esquerda e PALAVRAS-CHAVE/KEYWORDS, folha de aprovação com assinaturas, natureza do trabalho em 12 pt, Fonte centralizada, espaço entre parágrafos e títulos com tabulação
Co-Authored-By: Claude Opus 5.5 <noreply@anthropic.com>
</commit_message>
<xml_diff>
--- a/Projeto_Integrador_QRCode_Lubrificantes.docx
+++ b/Projeto_Integrador_QRCode_Lubrificantes.docx
@@ -345,38 +345,38 @@
       </w:pPr>
       <w:r>
         <w:rPr>
-          <w:sz w:val="20"/>
-          <w:szCs w:val="20"/>
+          <w:sz w:val="24"/>
+          <w:szCs w:val="24"/>
         </w:rPr>
         <w:t xml:space="preserve">Projeto Integrador apresentado como requisito parcial para a conclusão do curso Técnico em Mecânica, ao SENAI </w:t>
       </w:r>
       <w:r>
         <w:rPr>
-          <w:sz w:val="20"/>
-          <w:szCs w:val="20"/>
+          <w:sz w:val="24"/>
+          <w:szCs w:val="24"/>
           <w:shd w:fill="auto" w:val="clear"/>
         </w:rPr>
         <w:t>TRÊS LAGOAS</w:t>
       </w:r>
       <w:r>
         <w:rPr>
-          <w:sz w:val="20"/>
-          <w:szCs w:val="20"/>
+          <w:sz w:val="24"/>
+          <w:szCs w:val="24"/>
         </w:rPr>
         <w:t xml:space="preserve"> – </w:t>
       </w:r>
       <w:r>
         <w:rPr>
-          <w:sz w:val="20"/>
-          <w:szCs w:val="20"/>
+          <w:sz w:val="24"/>
+          <w:szCs w:val="24"/>
           <w:shd w:fill="auto" w:val="clear"/>
         </w:rPr>
         <w:t>TRÊS LAGOAS</w:t>
       </w:r>
       <w:r>
         <w:rPr>
-          <w:sz w:val="20"/>
-          <w:szCs w:val="20"/>
+          <w:sz w:val="24"/>
+          <w:szCs w:val="24"/>
         </w:rPr>
         <w:t>/MS.</w:t>
       </w:r>
@@ -390,15 +390,15 @@
       </w:pPr>
       <w:r>
         <w:rPr>
-          <w:sz w:val="20"/>
-          <w:szCs w:val="20"/>
+          <w:sz w:val="24"/>
+          <w:szCs w:val="24"/>
         </w:rPr>
         <w:t xml:space="preserve">Orientador(a): </w:t>
       </w:r>
       <w:r>
         <w:rPr>
-          <w:sz w:val="20"/>
-          <w:szCs w:val="20"/>
+          <w:sz w:val="24"/>
+          <w:szCs w:val="24"/>
           <w:shd w:fill="FFFF00" w:val="clear"/>
         </w:rPr>
         <w:t>[NOME DO ORIENTADOR]</w:t>
@@ -407,7 +407,7 @@
     <w:p>
       <w:pPr>
         <w:pStyle w:val="Normal"/>
-        <w:spacing w:lineRule="auto" w:line="360" w:before="4824" w:after="0"/>
+        <w:spacing w:lineRule="auto" w:line="360" w:before="3744" w:after="0"/>
         <w:jc w:val="center"/>
         <w:rPr/>
       </w:pPr>
@@ -589,38 +589,38 @@
       </w:pPr>
       <w:r>
         <w:rPr>
-          <w:sz w:val="20"/>
-          <w:szCs w:val="20"/>
+          <w:sz w:val="24"/>
+          <w:szCs w:val="24"/>
         </w:rPr>
         <w:t xml:space="preserve">Projeto Integrador apresentado, avaliado e aprovado como requisito parcial para a conclusão do curso Técnico em Mecânica, ao SENAI </w:t>
       </w:r>
       <w:r>
         <w:rPr>
-          <w:sz w:val="20"/>
-          <w:szCs w:val="20"/>
+          <w:sz w:val="24"/>
+          <w:szCs w:val="24"/>
           <w:shd w:fill="auto" w:val="clear"/>
         </w:rPr>
         <w:t>TRÊS LAGOAS</w:t>
       </w:r>
       <w:r>
         <w:rPr>
-          <w:sz w:val="20"/>
-          <w:szCs w:val="20"/>
+          <w:sz w:val="24"/>
+          <w:szCs w:val="24"/>
         </w:rPr>
         <w:t xml:space="preserve"> – </w:t>
       </w:r>
       <w:r>
         <w:rPr>
-          <w:sz w:val="20"/>
-          <w:szCs w:val="20"/>
+          <w:sz w:val="24"/>
+          <w:szCs w:val="24"/>
           <w:shd w:fill="auto" w:val="clear"/>
         </w:rPr>
         <w:t>TRÊS LAGOAS</w:t>
       </w:r>
       <w:r>
         <w:rPr>
-          <w:sz w:val="20"/>
-          <w:szCs w:val="20"/>
+          <w:sz w:val="24"/>
+          <w:szCs w:val="24"/>
         </w:rPr>
         <w:t>/MS.</w:t>
       </w:r>
@@ -634,15 +634,15 @@
       </w:pPr>
       <w:r>
         <w:rPr>
-          <w:sz w:val="20"/>
-          <w:szCs w:val="20"/>
+          <w:sz w:val="24"/>
+          <w:szCs w:val="24"/>
         </w:rPr>
         <w:t xml:space="preserve">Orientador(a): </w:t>
       </w:r>
       <w:r>
         <w:rPr>
-          <w:sz w:val="20"/>
-          <w:szCs w:val="20"/>
+          <w:sz w:val="24"/>
+          <w:szCs w:val="24"/>
           <w:shd w:fill="FFFF00" w:val="clear"/>
         </w:rPr>
         <w:t>[NOME DO ORIENTADOR]</w:t>
@@ -651,7 +651,8 @@
     <w:p>
       <w:pPr>
         <w:pStyle w:val="Normal"/>
-        <w:spacing w:lineRule="auto" w:line="360" w:before="200" w:after="200"/>
+        <w:spacing w:lineRule="auto" w:line="240" w:before="72" w:after="200"/>
+        <w:ind w:left="4535" w:right="0" w:hanging="0"/>
         <w:rPr/>
       </w:pPr>
       <w:r>
@@ -662,7 +663,8 @@
     <w:p>
       <w:pPr>
         <w:pStyle w:val="Normal"/>
-        <w:spacing w:lineRule="auto" w:line="360" w:before="0" w:after="400"/>
+        <w:spacing w:lineRule="auto" w:line="360" w:before="648" w:after="400"/>
+        <w:jc w:val="center"/>
         <w:rPr>
           <w:b/>
           <w:b/>
@@ -680,18 +682,21 @@
     <w:p>
       <w:pPr>
         <w:pStyle w:val="Normal"/>
-        <w:spacing w:lineRule="auto" w:line="240" w:before="520" w:after="0"/>
-        <w:rPr/>
-      </w:pPr>
-      <w:r>
-        <w:rPr/>
-        <w:t>__________________________________________</w:t>
+        <w:pBdr>
+          <w:bottom w:val="single" w:sz="4" w:space="0" w:color="000000"/>
+        </w:pBdr>
+        <w:spacing w:lineRule="auto" w:line="240" w:before="605" w:after="58"/>
+        <w:rPr/>
+      </w:pPr>
+      <w:r>
+        <w:rPr/>
       </w:r>
     </w:p>
     <w:p>
       <w:pPr>
         <w:pStyle w:val="Normal"/>
         <w:spacing w:lineRule="auto" w:line="240" w:before="0" w:after="0"/>
+        <w:jc w:val="center"/>
         <w:rPr/>
       </w:pPr>
       <w:r>
@@ -708,18 +713,21 @@
     <w:p>
       <w:pPr>
         <w:pStyle w:val="Normal"/>
-        <w:spacing w:lineRule="auto" w:line="240" w:before="520" w:after="0"/>
-        <w:rPr/>
-      </w:pPr>
-      <w:r>
-        <w:rPr/>
-        <w:t>__________________________________________</w:t>
+        <w:pBdr>
+          <w:bottom w:val="single" w:sz="4" w:space="0" w:color="000000"/>
+        </w:pBdr>
+        <w:spacing w:lineRule="auto" w:line="240" w:before="605" w:after="58"/>
+        <w:rPr/>
+      </w:pPr>
+      <w:r>
+        <w:rPr/>
       </w:r>
     </w:p>
     <w:p>
       <w:pPr>
         <w:pStyle w:val="Normal"/>
         <w:spacing w:lineRule="auto" w:line="240" w:before="0" w:after="0"/>
+        <w:jc w:val="center"/>
         <w:rPr/>
       </w:pPr>
       <w:r>
@@ -736,18 +744,21 @@
     <w:p>
       <w:pPr>
         <w:pStyle w:val="Normal"/>
-        <w:spacing w:lineRule="auto" w:line="240" w:before="520" w:after="0"/>
-        <w:rPr/>
-      </w:pPr>
-      <w:r>
-        <w:rPr/>
-        <w:t>__________________________________________</w:t>
+        <w:pBdr>
+          <w:bottom w:val="single" w:sz="4" w:space="0" w:color="000000"/>
+        </w:pBdr>
+        <w:spacing w:lineRule="auto" w:line="240" w:before="605" w:after="58"/>
+        <w:rPr/>
+      </w:pPr>
+      <w:r>
+        <w:rPr/>
       </w:r>
     </w:p>
     <w:p>
       <w:pPr>
         <w:pStyle w:val="Normal"/>
         <w:spacing w:lineRule="auto" w:line="240" w:before="0" w:after="0"/>
+        <w:jc w:val="center"/>
         <w:rPr/>
       </w:pPr>
       <w:r>
@@ -764,7 +775,7 @@
     <w:p>
       <w:pPr>
         <w:pStyle w:val="Normal"/>
-        <w:spacing w:lineRule="auto" w:line="360" w:before="3061" w:after="0"/>
+        <w:spacing w:lineRule="auto" w:line="360" w:before="1361" w:after="0"/>
         <w:jc w:val="center"/>
         <w:rPr/>
       </w:pPr>
@@ -809,8 +820,8 @@
     <w:p>
       <w:pPr>
         <w:pStyle w:val="Normal"/>
-        <w:spacing w:lineRule="auto" w:line="360" w:before="0" w:after="360"/>
-        <w:jc w:val="center"/>
+        <w:spacing w:lineRule="auto" w:line="240" w:before="0" w:after="216"/>
+        <w:jc w:val="left"/>
         <w:rPr>
           <w:b/>
           <w:b/>
@@ -828,7 +839,7 @@
     <w:p>
       <w:pPr>
         <w:pStyle w:val="Normal"/>
-        <w:spacing w:lineRule="auto" w:line="360" w:before="0" w:after="200"/>
+        <w:spacing w:lineRule="auto" w:line="240" w:before="0" w:after="86"/>
         <w:ind w:left="0" w:right="0" w:hanging="0"/>
         <w:jc w:val="both"/>
         <w:rPr/>
@@ -847,15 +858,15 @@
     <w:p>
       <w:pPr>
         <w:pStyle w:val="Normal"/>
-        <w:spacing w:lineRule="auto" w:line="360"/>
-        <w:rPr/>
-      </w:pPr>
-      <w:r>
-        <w:rPr>
-          <w:b/>
-          <w:bCs/>
-        </w:rPr>
-        <w:t xml:space="preserve">Palavras-chave: </w:t>
+        <w:spacing w:lineRule="auto" w:line="240" w:before="86" w:after="0"/>
+        <w:rPr/>
+      </w:pPr>
+      <w:r>
+        <w:rPr>
+          <w:b/>
+          <w:bCs/>
+        </w:rPr>
+        <w:t xml:space="preserve">PALAVRAS-CHAVE: </w:t>
       </w:r>
       <w:r>
         <w:rPr/>
@@ -868,8 +879,8 @@
     <w:p>
       <w:pPr>
         <w:pStyle w:val="Normal"/>
-        <w:spacing w:lineRule="auto" w:line="360" w:before="0" w:after="360"/>
-        <w:jc w:val="center"/>
+        <w:spacing w:lineRule="auto" w:line="240" w:before="0" w:after="216"/>
+        <w:jc w:val="left"/>
         <w:rPr>
           <w:b/>
           <w:b/>
@@ -887,7 +898,7 @@
     <w:p>
       <w:pPr>
         <w:pStyle w:val="Normal"/>
-        <w:spacing w:lineRule="auto" w:line="360" w:before="0" w:after="200"/>
+        <w:spacing w:lineRule="auto" w:line="240" w:before="0" w:after="86"/>
         <w:ind w:left="0" w:right="0" w:hanging="0"/>
         <w:jc w:val="both"/>
         <w:rPr/>
@@ -906,15 +917,15 @@
     <w:p>
       <w:pPr>
         <w:pStyle w:val="Normal"/>
-        <w:spacing w:lineRule="auto" w:line="360"/>
-        <w:rPr/>
-      </w:pPr>
-      <w:r>
-        <w:rPr>
-          <w:b/>
-          <w:bCs/>
-        </w:rPr>
-        <w:t xml:space="preserve">Keywords: </w:t>
+        <w:spacing w:lineRule="auto" w:line="240" w:before="86" w:after="0"/>
+        <w:rPr/>
+      </w:pPr>
+      <w:r>
+        <w:rPr>
+          <w:b/>
+          <w:bCs/>
+        </w:rPr>
+        <w:t xml:space="preserve">KEYWORDS: </w:t>
       </w:r>
       <w:r>
         <w:rPr/>
@@ -997,7 +1008,7 @@
           <w:sz w:val="24"/>
           <w:szCs w:val="24"/>
         </w:rPr>
-        <w:t>16</w:t>
+        <w:t>17</w:t>
       </w:r>
       <w:r>
         <w:rPr>
@@ -1061,7 +1072,7 @@
           <w:sz w:val="24"/>
           <w:szCs w:val="24"/>
         </w:rPr>
-        <w:t>18</w:t>
+        <w:t>19</w:t>
       </w:r>
       <w:r>
         <w:rPr>
@@ -1125,7 +1136,7 @@
           <w:sz w:val="24"/>
           <w:szCs w:val="24"/>
         </w:rPr>
-        <w:t>21</w:t>
+        <w:t>22</w:t>
       </w:r>
       <w:r>
         <w:rPr>
@@ -1189,7 +1200,7 @@
           <w:sz w:val="24"/>
           <w:szCs w:val="24"/>
         </w:rPr>
-        <w:t>17</w:t>
+        <w:t>18</w:t>
       </w:r>
       <w:r>
         <w:rPr>
@@ -1253,7 +1264,7 @@
           <w:sz w:val="24"/>
           <w:szCs w:val="24"/>
         </w:rPr>
-        <w:t>30</w:t>
+        <w:t>31</w:t>
       </w:r>
       <w:r>
         <w:rPr>
@@ -1339,7 +1350,7 @@
           <w:sz w:val="24"/>
           <w:szCs w:val="24"/>
         </w:rPr>
-        <w:t>23</w:t>
+        <w:t>24</w:t>
       </w:r>
       <w:r>
         <w:rPr>
@@ -1403,7 +1414,7 @@
           <w:sz w:val="24"/>
           <w:szCs w:val="24"/>
         </w:rPr>
-        <w:t>23</w:t>
+        <w:t>24</w:t>
       </w:r>
       <w:r>
         <w:rPr>
@@ -1467,7 +1478,7 @@
           <w:sz w:val="24"/>
           <w:szCs w:val="24"/>
         </w:rPr>
-        <w:t>24</w:t>
+        <w:t>25</w:t>
       </w:r>
       <w:r>
         <w:rPr>
@@ -2384,7 +2395,7 @@
           <w:sz w:val="24"/>
           <w:szCs w:val="24"/>
         </w:rPr>
-        <w:t>10</w:t>
+        <w:t>11</w:t>
       </w:r>
       <w:r>
         <w:rPr>
@@ -2578,7 +2589,7 @@
           <w:sz w:val="24"/>
           <w:szCs w:val="24"/>
         </w:rPr>
-        <w:t>12</w:t>
+        <w:t>13</w:t>
       </w:r>
       <w:r>
         <w:rPr>
@@ -2642,7 +2653,7 @@
           <w:sz w:val="24"/>
           <w:szCs w:val="24"/>
         </w:rPr>
-        <w:t>12</w:t>
+        <w:t>13</w:t>
       </w:r>
       <w:r>
         <w:rPr>
@@ -2708,7 +2719,7 @@
           <w:sz w:val="24"/>
           <w:szCs w:val="24"/>
         </w:rPr>
-        <w:t>12</w:t>
+        <w:t>13</w:t>
       </w:r>
       <w:r>
         <w:rPr>
@@ -2774,7 +2785,7 @@
           <w:sz w:val="24"/>
           <w:szCs w:val="24"/>
         </w:rPr>
-        <w:t>12</w:t>
+        <w:t>13</w:t>
       </w:r>
       <w:r>
         <w:rPr>
@@ -2840,7 +2851,7 @@
           <w:sz w:val="24"/>
           <w:szCs w:val="24"/>
         </w:rPr>
-        <w:t>14</w:t>
+        <w:t>15</w:t>
       </w:r>
       <w:r>
         <w:rPr>
@@ -2906,7 +2917,7 @@
           <w:sz w:val="24"/>
           <w:szCs w:val="24"/>
         </w:rPr>
-        <w:t>14</w:t>
+        <w:t>15</w:t>
       </w:r>
       <w:r>
         <w:rPr>
@@ -2970,7 +2981,7 @@
           <w:sz w:val="24"/>
           <w:szCs w:val="24"/>
         </w:rPr>
-        <w:t>15</w:t>
+        <w:t>16</w:t>
       </w:r>
       <w:r>
         <w:rPr>
@@ -3036,7 +3047,7 @@
           <w:sz w:val="24"/>
           <w:szCs w:val="24"/>
         </w:rPr>
-        <w:t>15</w:t>
+        <w:t>16</w:t>
       </w:r>
       <w:r>
         <w:rPr>
@@ -3102,7 +3113,7 @@
           <w:sz w:val="24"/>
           <w:szCs w:val="24"/>
         </w:rPr>
-        <w:t>18</w:t>
+        <w:t>19</w:t>
       </w:r>
       <w:r>
         <w:rPr>
@@ -3168,7 +3179,7 @@
           <w:sz w:val="24"/>
           <w:szCs w:val="24"/>
         </w:rPr>
-        <w:t>21</w:t>
+        <w:t>22</w:t>
       </w:r>
       <w:r>
         <w:rPr>
@@ -3234,7 +3245,7 @@
           <w:sz w:val="24"/>
           <w:szCs w:val="24"/>
         </w:rPr>
-        <w:t>22</w:t>
+        <w:t>23</w:t>
       </w:r>
       <w:r>
         <w:rPr>
@@ -3298,7 +3309,7 @@
           <w:sz w:val="24"/>
           <w:szCs w:val="24"/>
         </w:rPr>
-        <w:t>23</w:t>
+        <w:t>24</w:t>
       </w:r>
       <w:r>
         <w:rPr>
@@ -3364,7 +3375,7 @@
           <w:sz w:val="24"/>
           <w:szCs w:val="24"/>
         </w:rPr>
-        <w:t>23</w:t>
+        <w:t>24</w:t>
       </w:r>
       <w:r>
         <w:rPr>
@@ -3430,7 +3441,7 @@
           <w:sz w:val="24"/>
           <w:szCs w:val="24"/>
         </w:rPr>
-        <w:t>24</w:t>
+        <w:t>25</w:t>
       </w:r>
       <w:r>
         <w:rPr>
@@ -3496,7 +3507,7 @@
           <w:sz w:val="24"/>
           <w:szCs w:val="24"/>
         </w:rPr>
-        <w:t>26</w:t>
+        <w:t>27</w:t>
       </w:r>
       <w:r>
         <w:rPr>
@@ -3560,7 +3571,7 @@
           <w:sz w:val="24"/>
           <w:szCs w:val="24"/>
         </w:rPr>
-        <w:t>27</w:t>
+        <w:t>28</w:t>
       </w:r>
       <w:r>
         <w:rPr>
@@ -3624,7 +3635,7 @@
           <w:sz w:val="24"/>
           <w:szCs w:val="24"/>
         </w:rPr>
-        <w:t>28</w:t>
+        <w:t>29</w:t>
       </w:r>
       <w:r>
         <w:rPr>
@@ -3688,7 +3699,7 @@
           <w:sz w:val="24"/>
           <w:szCs w:val="24"/>
         </w:rPr>
-        <w:t>29</w:t>
+        <w:t>30</w:t>
       </w:r>
       <w:r>
         <w:rPr>
@@ -3762,7 +3773,7 @@
           <w:sz w:val="24"/>
           <w:szCs w:val="24"/>
         </w:rPr>
-        <w:t>30</w:t>
+        <w:t>31</w:t>
       </w:r>
       <w:r>
         <w:rPr>
@@ -3784,14 +3795,16 @@
       <w:bookmarkEnd w:id="0"/>
       <w:r>
         <w:rPr/>
-        <w:t>1 INTRODUÇÃO</w:t>
+        <w:t>1</w:t>
+        <w:tab/>
+        <w:t>INTRODUÇÃO</w:t>
       </w:r>
     </w:p>
     <w:p>
       <w:pPr>
         <w:pStyle w:val="Normal"/>
         <w:widowControl/>
-        <w:spacing w:lineRule="auto" w:line="360" w:before="0" w:after="0"/>
+        <w:spacing w:lineRule="auto" w:line="360" w:before="0" w:after="120"/>
         <w:ind w:left="0" w:right="0" w:firstLine="709"/>
         <w:jc w:val="both"/>
         <w:rPr/>
@@ -3811,7 +3824,7 @@
       <w:pPr>
         <w:pStyle w:val="Normal"/>
         <w:widowControl/>
-        <w:spacing w:lineRule="auto" w:line="360" w:before="0" w:after="0"/>
+        <w:spacing w:lineRule="auto" w:line="360" w:before="0" w:after="120"/>
         <w:ind w:left="0" w:right="0" w:firstLine="709"/>
         <w:jc w:val="both"/>
         <w:rPr/>
@@ -3825,7 +3838,7 @@
       <w:pPr>
         <w:pStyle w:val="Normal"/>
         <w:widowControl/>
-        <w:spacing w:lineRule="auto" w:line="360" w:before="0" w:after="0"/>
+        <w:spacing w:lineRule="auto" w:line="360" w:before="0" w:after="120"/>
         <w:ind w:left="0" w:right="0" w:firstLine="709"/>
         <w:jc w:val="both"/>
         <w:rPr/>
@@ -3844,14 +3857,16 @@
       <w:bookmarkEnd w:id="1"/>
       <w:r>
         <w:rPr/>
-        <w:t>1.1 Justificativa</w:t>
+        <w:t>1.1</w:t>
+        <w:tab/>
+        <w:t>Justificativa</w:t>
       </w:r>
     </w:p>
     <w:p>
       <w:pPr>
         <w:pStyle w:val="Normal"/>
         <w:widowControl/>
-        <w:spacing w:lineRule="auto" w:line="360" w:before="0" w:after="0"/>
+        <w:spacing w:lineRule="auto" w:line="360" w:before="0" w:after="120"/>
         <w:ind w:left="0" w:right="0" w:firstLine="709"/>
         <w:jc w:val="both"/>
         <w:rPr/>
@@ -3880,14 +3895,16 @@
       <w:bookmarkEnd w:id="2"/>
       <w:r>
         <w:rPr/>
-        <w:t>1.2 Delimitação do tema e problema de pesquisa</w:t>
+        <w:t>1.2</w:t>
+        <w:tab/>
+        <w:t>Delimitação do tema e problema de pesquisa</w:t>
       </w:r>
     </w:p>
     <w:p>
       <w:pPr>
         <w:pStyle w:val="Normal"/>
         <w:widowControl/>
-        <w:spacing w:lineRule="auto" w:line="360" w:before="0" w:after="0"/>
+        <w:spacing w:lineRule="auto" w:line="360" w:before="0" w:after="120"/>
         <w:ind w:left="0" w:right="0" w:firstLine="709"/>
         <w:jc w:val="both"/>
         <w:rPr/>
@@ -3911,7 +3928,7 @@
       <w:pPr>
         <w:pStyle w:val="Normal"/>
         <w:widowControl/>
-        <w:spacing w:lineRule="auto" w:line="360" w:before="0" w:after="0"/>
+        <w:spacing w:lineRule="auto" w:line="360" w:before="0" w:after="120"/>
         <w:ind w:left="0" w:right="0" w:firstLine="709"/>
         <w:jc w:val="both"/>
         <w:rPr/>
@@ -3930,7 +3947,9 @@
       <w:bookmarkEnd w:id="3"/>
       <w:r>
         <w:rPr/>
-        <w:t>1.3 Objetivos</w:t>
+        <w:t>1.3</w:t>
+        <w:tab/>
+        <w:t>Objetivos</w:t>
       </w:r>
     </w:p>
     <w:p>
@@ -3950,7 +3969,7 @@
       <w:pPr>
         <w:pStyle w:val="Normal"/>
         <w:widowControl/>
-        <w:spacing w:lineRule="auto" w:line="360" w:before="0" w:after="0"/>
+        <w:spacing w:lineRule="auto" w:line="360" w:before="0" w:after="120"/>
         <w:ind w:left="0" w:right="0" w:firstLine="709"/>
         <w:jc w:val="both"/>
         <w:rPr/>
@@ -4089,7 +4108,37 @@
       <w:bookmarkEnd w:id="6"/>
       <w:r>
         <w:rPr/>
-        <w:t>1.4 Tipo de pesquisa e contribuições esperadas</w:t>
+        <w:t>1.4</w:t>
+        <w:tab/>
+        <w:t>Tipo de pesquisa e contribuições esperadas</w:t>
+      </w:r>
+    </w:p>
+    <w:p>
+      <w:pPr>
+        <w:pStyle w:val="Normal"/>
+        <w:widowControl/>
+        <w:spacing w:lineRule="auto" w:line="360" w:before="0" w:after="120"/>
+        <w:ind w:left="0" w:right="0" w:firstLine="709"/>
+        <w:jc w:val="both"/>
+        <w:rPr/>
+      </w:pPr>
+      <w:r>
+        <w:rPr/>
+        <w:t>Trata-se de uma pesquisa aplicada, de abordagem quantitativa, realizada em ambiente didático, com comparação entre dois métodos de trabalho (tradicional e com QR Code) aplicados a um redutor da oficina do SENAI Três Lagoas. Espera-se, como contribuições, a redução do tempo de intervenção do mecânico, a padronização do acesso às informações de lubrificação, a formação de um histórico de lubrificações para o PCM e a disponibilização de um modelo simples que possa ser replicado em outros equipamentos.</w:t>
+      </w:r>
+    </w:p>
+    <w:p>
+      <w:pPr>
+        <w:pStyle w:val="Heading2"/>
+        <w:rPr/>
+      </w:pPr>
+      <w:bookmarkStart w:id="7" w:name="pag15"/>
+      <w:bookmarkEnd w:id="7"/>
+      <w:r>
+        <w:rPr/>
+        <w:t>1.5</w:t>
+        <w:tab/>
+        <w:t>Metodologia</w:t>
       </w:r>
     </w:p>
     <w:p>
@@ -4103,61 +4152,354 @@
       </w:pPr>
       <w:r>
         <w:rPr/>
-        <w:t>Trata-se de uma pesquisa aplicada, de abordagem quantitativa, realizada em ambiente didático, com comparação entre dois métodos de trabalho (tradicional e com QR Code) aplicados a um redutor da oficina do SENAI Três Lagoas. Espera-se, como contribuições, a redução do tempo de intervenção do mecânico, a padronização do acesso às informações de lubrificação, a formação de um histórico de lubrificações para o PCM e a disponibilização de um modelo simples que possa ser replicado em outros equipamentos.</w:t>
+        <w:t>A metodologia consistiu em quatro etapas: levantamento dos dados do redutor na placa de identificação, no manual do fabricante e no próprio equipamento, onde foram identificados e fotografados os pontos de enchimento, nível e dreno; desenvolvimento de uma ficha digital simples, acessada pelo navegador do celular; geração e impressão da etiqueta de QR Code; e cronometragem das etapas de lubrificação nos dois métodos, com cinco participantes e ordem contrabalanceada, seguida do cálculo da redução de tempo e de uma estimativa de retorno financeiro. O detalhamento está na seção 2.2.</w:t>
+      </w:r>
+      <w:r>
+        <w:br w:type="page"/>
+      </w:r>
+    </w:p>
+    <w:p>
+      <w:pPr>
+        <w:pStyle w:val="Heading1"/>
+        <w:rPr/>
+      </w:pPr>
+      <w:bookmarkStart w:id="8" w:name="pag16"/>
+      <w:bookmarkEnd w:id="8"/>
+      <w:r>
+        <w:rPr/>
+        <w:t>2</w:t>
+        <w:tab/>
+        <w:t>DESENVOLVIMENTO</w:t>
       </w:r>
     </w:p>
     <w:p>
       <w:pPr>
         <w:pStyle w:val="Heading2"/>
-        <w:rPr/>
-      </w:pPr>
-      <w:bookmarkStart w:id="7" w:name="pag15"/>
-      <w:bookmarkEnd w:id="7"/>
-      <w:r>
-        <w:rPr/>
-        <w:t>1.5 Metodologia</w:t>
+        <w:spacing w:before="0" w:after="414"/>
+        <w:rPr/>
+      </w:pPr>
+      <w:bookmarkStart w:id="9" w:name="pag17"/>
+      <w:bookmarkEnd w:id="9"/>
+      <w:r>
+        <w:rPr/>
+        <w:t>2.1</w:t>
+        <w:tab/>
+        <w:t>Fundamentação teórica</w:t>
+      </w:r>
+    </w:p>
+    <w:p>
+      <w:pPr>
+        <w:pStyle w:val="Heading3"/>
+        <w:spacing w:before="0" w:after="414"/>
+        <w:rPr/>
+      </w:pPr>
+      <w:bookmarkStart w:id="10" w:name="pag18"/>
+      <w:bookmarkEnd w:id="10"/>
+      <w:r>
+        <w:rPr/>
+        <w:t>2.1.1 Manutenção, TPM e PCM</w:t>
       </w:r>
     </w:p>
     <w:p>
       <w:pPr>
         <w:pStyle w:val="Normal"/>
         <w:widowControl/>
-        <w:spacing w:lineRule="auto" w:line="360" w:before="0" w:after="0"/>
+        <w:spacing w:lineRule="auto" w:line="360" w:before="0" w:after="120"/>
         <w:ind w:left="0" w:right="0" w:firstLine="709"/>
         <w:jc w:val="both"/>
         <w:rPr/>
       </w:pPr>
       <w:r>
         <w:rPr/>
-        <w:t>A metodologia consistiu em quatro etapas: levantamento dos dados do redutor na placa de identificação, no manual do fabricante e no próprio equipamento, onde foram identificados e fotografados os pontos de enchimento, nível e dreno; desenvolvimento de uma ficha digital simples, acessada pelo navegador do celular; geração e impressão da etiqueta de QR Code; e cronometragem das etapas de lubrificação nos dois métodos, com cinco participantes e ordem contrabalanceada, seguida do cálculo da redução de tempo e de uma estimativa de retorno financeiro. O detalhamento está na seção 2.2.</w:t>
-      </w:r>
-      <w:r>
-        <w:br w:type="page"/>
-      </w:r>
-    </w:p>
-    <w:p>
-      <w:pPr>
-        <w:pStyle w:val="Heading1"/>
-        <w:rPr/>
-      </w:pPr>
-      <w:bookmarkStart w:id="8" w:name="pag16"/>
-      <w:bookmarkEnd w:id="8"/>
-      <w:r>
-        <w:rPr/>
-        <w:t>2 DESENVOLVIMENTO</w:t>
+        <w:t>A manutenção é definida pela norma brasileira de terminologia como o conjunto de ações técnicas e administrativas, incluindo as de supervisão, destinadas a manter ou recolocar um item em um estado no qual possa desempenhar a função requerida.</w:t>
+      </w:r>
+      <w:r>
+        <w:rPr>
+          <w:vertAlign w:val="superscript"/>
+        </w:rPr>
+        <w:t>3</w:t>
+      </w:r>
+      <w:r>
+        <w:rPr/>
+        <w:t xml:space="preserve"> Dentro desse conjunto, a lubrificação é uma ação preventiva de execução frequente.</w:t>
+      </w:r>
+    </w:p>
+    <w:p>
+      <w:pPr>
+        <w:pStyle w:val="Normal"/>
+        <w:widowControl/>
+        <w:spacing w:lineRule="auto" w:line="360" w:before="0" w:after="120"/>
+        <w:ind w:left="0" w:right="0" w:firstLine="709"/>
+        <w:jc w:val="both"/>
+        <w:rPr/>
+      </w:pPr>
+      <w:r>
+        <w:rPr/>
+        <w:t>A TPM propõe a participação dos operadores e mantenedores na conservação dos equipamentos e organiza-se em pilares, entre os quais a manutenção autônoma e a manutenção planejada.</w:t>
+      </w:r>
+      <w:r>
+        <w:rPr>
+          <w:vertAlign w:val="superscript"/>
+        </w:rPr>
+        <w:t>1</w:t>
+      </w:r>
+      <w:r>
+        <w:rPr/>
+        <w:t xml:space="preserve"> O PCM, por sua vez, organiza, programa e acompanha as atividades de manutenção, e depende de registros confiáveis do que foi realizado em cada equipamento. Como a lubrificação é uma atividade preventiva, o indicador mais adequado para avaliar a solução proposta é o tempo de execução da intervenção preventiva. O tempo médio de reparo (MTTR), que se refere às intervenções corretivas, é afetado apenas de forma indireta, quando a lubrificação é feita durante um reparo, como na reposição do óleo após a troca de um retentor.</w:t>
+      </w:r>
+    </w:p>
+    <w:p>
+      <w:pPr>
+        <w:pStyle w:val="Heading3"/>
+        <w:rPr/>
+      </w:pPr>
+      <w:bookmarkStart w:id="11" w:name="pag19"/>
+      <w:bookmarkEnd w:id="11"/>
+      <w:r>
+        <w:rPr/>
+        <w:t>2.1.2 Lubrificação de redutores de velocidade</w:t>
+      </w:r>
+    </w:p>
+    <w:p>
+      <w:pPr>
+        <w:pStyle w:val="Normal"/>
+        <w:widowControl/>
+        <w:spacing w:lineRule="auto" w:line="360" w:before="0" w:after="120"/>
+        <w:ind w:left="0" w:right="0" w:firstLine="709"/>
+        <w:jc w:val="both"/>
+        <w:rPr/>
+      </w:pPr>
+      <w:r>
+        <w:rPr/>
+        <w:t>O lubrificante tem a função de reduzir o atrito e o desgaste entre as superfícies em movimento, auxiliar na dissipação do calor e proteger os componentes contra a corrosão. Em redutores, a escolha do produto depende, entre outros fatores, do tipo de engrenamento e da viscosidade indicada pelo fabricante do equipamento.</w:t>
+      </w:r>
+    </w:p>
+    <w:p>
+      <w:pPr>
+        <w:pStyle w:val="Normal"/>
+        <w:widowControl/>
+        <w:spacing w:lineRule="auto" w:line="360" w:before="0" w:after="120"/>
+        <w:ind w:left="0" w:right="0" w:firstLine="709"/>
+        <w:jc w:val="both"/>
+        <w:rPr/>
+      </w:pPr>
+      <w:r>
+        <w:rPr/>
+        <w:t>Nos redutores de coroa e rosca sem fim, o contato entre os dentes ocorre com elevado escorregamento entre a rosca, de aço, e a coroa, de bronze, o que gera mais calor do que em um par de engrenagens cilíndricas e exige do lubrificante uma película resistente. No redutor estudado, a lubrificação é feita por imersão em óleo sintético de polialfaolefina (PAO) com grau ISO VG 460, conforme a placa de identificação, e o manual do fabricante relaciona, para esse grau, produtos como ExxonMobil SHC 634, Shell Omala S4 GX 460 e Klübersynth EG4-460.</w:t>
+      </w:r>
+      <w:r>
+        <w:rPr>
+          <w:vertAlign w:val="superscript"/>
+        </w:rPr>
+        <w:t>2</w:t>
+      </w:r>
+    </w:p>
+    <w:p>
+      <w:pPr>
+        <w:pStyle w:val="Normal"/>
+        <w:widowControl/>
+        <w:spacing w:lineRule="auto" w:line="360" w:before="0" w:after="120"/>
+        <w:ind w:left="0" w:right="0" w:firstLine="709"/>
+        <w:jc w:val="both"/>
+        <w:rPr/>
+      </w:pPr>
+      <w:r>
+        <w:rPr/>
+        <w:t>A classificação ISO de viscosidade para lubrificantes líquidos industriais, estabelecida pela ISO 3448, define graus (ISO VG) em que cada número corresponde à viscosidade cinemática média, em mm²/s, a 40 °C.</w:t>
+      </w:r>
+      <w:r>
+        <w:rPr>
+          <w:vertAlign w:val="superscript"/>
+        </w:rPr>
+        <w:t>4</w:t>
+      </w:r>
+      <w:r>
+        <w:rPr/>
+        <w:t xml:space="preserve"> A aplicação de produto com viscosidade diferente da especificada, a mistura de lubrificantes incompatíveis, o nível incorreto e a contaminação por água ou partículas são exemplos de falhas de lubrificação que se pretende evitar com o acesso rápido e padronizado às informações do equipamento. O fabricante orienta que, nas trocas, seja usado o mesmo óleo indicado na placa e que não sejam misturados óleos de tipos e fabricantes diferentes.</w:t>
+      </w:r>
+      <w:r>
+        <w:rPr>
+          <w:vertAlign w:val="superscript"/>
+        </w:rPr>
+        <w:t>2</w:t>
+      </w:r>
+      <w:r>
+        <w:rPr/>
+        <w:t xml:space="preserve"> Esse cuidado é importante porque o mesmo manual prevê, para os redutores da linha, óleos minerais (CLP) e sintéticos de base PAO (CLP HC) e poliglicol (CLP PG), cada um com seus próprios intervalos de troca, e é a placa de identificação que informa o tipo adotado em cada redutor.</w:t>
+      </w:r>
+      <w:r>
+        <w:rPr>
+          <w:vertAlign w:val="superscript"/>
+        </w:rPr>
+        <w:t>2</w:t>
+      </w:r>
+    </w:p>
+    <w:p>
+      <w:pPr>
+        <w:pStyle w:val="Normal"/>
+        <w:widowControl/>
+        <w:spacing w:lineRule="auto" w:line="360" w:before="0" w:after="120"/>
+        <w:ind w:left="0" w:right="0" w:firstLine="709"/>
+        <w:jc w:val="both"/>
+        <w:rPr/>
+      </w:pPr>
+      <w:r>
+        <w:rPr/>
+        <w:t>A vida útil do óleo depende da temperatura de operação. Para óleos sintéticos CLP HC (PAO), o manual da linha coroa e rosca do fabricante indica intervalos de troca de 15.000 horas com o óleo a 80 °C, 10.000 horas a 85 °C e 7.500 horas a 90 °C, que é a temperatura máxima de operação em condições normais. O mesmo manual informa que a temperatura externa da carcaça é cerca de 15 °C inferior à do óleo e recomenda observar a qualidade do óleo nas primeiras 500 horas.</w:t>
+      </w:r>
+      <w:r>
+        <w:rPr>
+          <w:vertAlign w:val="superscript"/>
+        </w:rPr>
+        <w:t>2</w:t>
+      </w:r>
+      <w:r>
+        <w:rPr/>
+        <w:t xml:space="preserve"> Assim, a medição da temperatura da carcaça com um termômetro infravermelho permite estimar a condição de trabalho do óleo sem abrir o redutor.</w:t>
+      </w:r>
+    </w:p>
+    <w:p>
+      <w:pPr>
+        <w:pStyle w:val="Normal"/>
+        <w:widowControl/>
+        <w:spacing w:lineRule="auto" w:line="360" w:before="0" w:after="120"/>
+        <w:ind w:left="0" w:right="0" w:firstLine="709"/>
+        <w:jc w:val="both"/>
+        <w:rPr/>
+      </w:pPr>
+      <w:r>
+        <w:rPr/>
+        <w:t>A posição de montagem também influencia a lubrificação, pois altera a distribuição do óleo dentro da carcaça. Por isso, o volume, o nível e a localização do respiro e dos pontos de inspeção devem corresponder à posição real de instalação, e tanto a falta quanto o excesso de óleo prejudicam o redutor: o primeiro reduz a alimentação de engrenagens e rolamentos, e o segundo aumenta a agitação interna, a temperatura e a tendência a vazamentos.</w:t>
+      </w:r>
+      <w:r>
+        <w:rPr>
+          <w:vertAlign w:val="superscript"/>
+        </w:rPr>
+        <w:t>5</w:t>
+      </w:r>
+      <w:r>
+        <w:rPr/>
+        <w:t xml:space="preserve"> Na linha Magma M, o fabricante informa um único volume por tamanho, válido para todas as posições de trabalho (0,87 L no tamanho 06 de um estágio),</w:t>
+      </w:r>
+      <w:r>
+        <w:rPr>
+          <w:vertAlign w:val="superscript"/>
+        </w:rPr>
+        <w:t>2</w:t>
+      </w:r>
+      <w:r>
+        <w:rPr/>
+        <w:t xml:space="preserve"> mas a posição de montagem continua definindo quais bujões funcionam como enchimento, nível e dreno.</w:t>
+      </w:r>
+    </w:p>
+    <w:p>
+      <w:pPr>
+        <w:pStyle w:val="Heading3"/>
+        <w:rPr/>
+      </w:pPr>
+      <w:bookmarkStart w:id="12" w:name="pag20"/>
+      <w:bookmarkEnd w:id="12"/>
+      <w:r>
+        <w:rPr/>
+        <w:t>2.1.3 Gestão Visual e 5S</w:t>
+      </w:r>
+    </w:p>
+    <w:p>
+      <w:pPr>
+        <w:pStyle w:val="Normal"/>
+        <w:widowControl/>
+        <w:spacing w:lineRule="auto" w:line="360" w:before="0" w:after="120"/>
+        <w:ind w:left="0" w:right="0" w:firstLine="709"/>
+        <w:jc w:val="both"/>
+        <w:rPr/>
+      </w:pPr>
+      <w:r>
+        <w:rPr/>
+        <w:t xml:space="preserve">A Gestão Visual consiste em disponibilizar a informação no local e no momento em que ela é necessária, de forma que seja compreendida rapidamente. Está associada ao programa 5S e ao ambiente organizado, em que o que é preciso para executar a tarefa está identificado e ao alcance de quem a executa. A etiqueta de QR Code no redutor pode ser entendida como uma extensão digital da Gestão Visual, pois leva ao ponto de uso informações que ocupariam várias páginas de manual. </w:t>
+      </w:r>
+      <w:r>
+        <w:rPr>
+          <w:shd w:fill="FFFF00" w:val="clear"/>
+        </w:rPr>
+        <w:t>[Inserir citação de um autor sobre Gestão Visual e 5S.]</w:t>
+      </w:r>
+    </w:p>
+    <w:p>
+      <w:pPr>
+        <w:pStyle w:val="Heading3"/>
+        <w:rPr/>
+      </w:pPr>
+      <w:bookmarkStart w:id="13" w:name="pag21"/>
+      <w:bookmarkEnd w:id="13"/>
+      <w:r>
+        <w:rPr/>
+        <w:t>2.1.4 QR Code e NFC</w:t>
+      </w:r>
+    </w:p>
+    <w:p>
+      <w:pPr>
+        <w:pStyle w:val="Normal"/>
+        <w:widowControl/>
+        <w:spacing w:lineRule="auto" w:line="360" w:before="0" w:after="120"/>
+        <w:ind w:left="0" w:right="0" w:firstLine="709"/>
+        <w:jc w:val="both"/>
+        <w:rPr/>
+      </w:pPr>
+      <w:r>
+        <w:rPr/>
+        <w:t>O QR Code é um código de barras bidimensional, especificado pela norma ISO/IEC 18004, capaz de armazenar, por exemplo, o endereço de uma página na internet e de ser lido pela câmera de um celular.</w:t>
+      </w:r>
+      <w:r>
+        <w:rPr>
+          <w:vertAlign w:val="superscript"/>
+        </w:rPr>
+        <w:t>6</w:t>
+      </w:r>
+      <w:r>
+        <w:rPr/>
+        <w:t xml:space="preserve"> O padrão prevê mecanismos de correção de erros, que permitem a leitura mesmo quando parte do código está danificada ou suja, característica relevante para ambientes com óleo e graxa.</w:t>
+      </w:r>
+    </w:p>
+    <w:p>
+      <w:pPr>
+        <w:pStyle w:val="Normal"/>
+        <w:widowControl/>
+        <w:spacing w:lineRule="auto" w:line="360" w:before="0" w:after="120"/>
+        <w:ind w:left="0" w:right="0" w:firstLine="709"/>
+        <w:jc w:val="both"/>
+        <w:rPr/>
+      </w:pPr>
+      <w:r>
+        <w:rPr/>
+        <w:t>Uma alternativa tecnológica é o NFC, em que uma etiqueta passiva é lida pela aproximação do celular, a poucos centímetros. A leitura independe de iluminação e de uma superfície limpa, mas as etiquetas têm custo maior e, em superfícies metálicas como as de um redutor, exigem modelos próprios para aplicação sobre metal. Por essa razão, o QR Code foi adotado como solução principal, ficando o NFC como possibilidade de melhoria para pontos de difícil leitura.</w:t>
+      </w:r>
+    </w:p>
+    <w:p>
+      <w:pPr>
+        <w:pStyle w:val="Normal"/>
+        <w:widowControl/>
+        <w:spacing w:lineRule="auto" w:line="360" w:before="0" w:after="120"/>
+        <w:ind w:left="0" w:right="0" w:firstLine="709"/>
+        <w:jc w:val="both"/>
+        <w:rPr/>
+      </w:pPr>
+      <w:r>
+        <w:rPr/>
+        <w:t>Vale observar que a própria placa de identificação do redutor estudado já informa o tipo e a viscosidade do óleo (ISO VG 460 CLP PAO). Essa informação, porém, ocupa uma área pequena, sujeita a sujeira e desgaste, não traz a quantidade de óleo nem a localização dos bujões e não contempla dados específicos da instalação, como a posição de trabalho, o código do equipamento na planta, os procedimentos de segurança e o histórico das intervenções. A ficha proposta complementa a placa do fabricante, sem substituí-la.</w:t>
       </w:r>
     </w:p>
     <w:p>
       <w:pPr>
         <w:pStyle w:val="Heading2"/>
-        <w:spacing w:before="0" w:after="414"/>
-        <w:rPr/>
-      </w:pPr>
-      <w:bookmarkStart w:id="9" w:name="pag17"/>
-      <w:bookmarkEnd w:id="9"/>
-      <w:r>
-        <w:rPr/>
-        <w:t>2.1 Fundamentação teórica</w:t>
+        <w:rPr/>
+      </w:pPr>
+      <w:bookmarkStart w:id="14" w:name="pag22"/>
+      <w:bookmarkEnd w:id="14"/>
+      <w:r>
+        <w:rPr/>
+        <w:t>2.2</w:t>
+        <w:tab/>
+        <w:t>Metodologia</w:t>
       </w:r>
     </w:p>
     <w:p>
@@ -4166,319 +4508,6 @@
         <w:spacing w:before="0" w:after="414"/>
         <w:rPr/>
       </w:pPr>
-      <w:bookmarkStart w:id="10" w:name="pag18"/>
-      <w:bookmarkEnd w:id="10"/>
-      <w:r>
-        <w:rPr/>
-        <w:t>2.1.1 Manutenção, TPM e PCM</w:t>
-      </w:r>
-    </w:p>
-    <w:p>
-      <w:pPr>
-        <w:pStyle w:val="Normal"/>
-        <w:widowControl/>
-        <w:spacing w:lineRule="auto" w:line="360" w:before="0" w:after="0"/>
-        <w:ind w:left="0" w:right="0" w:firstLine="709"/>
-        <w:jc w:val="both"/>
-        <w:rPr/>
-      </w:pPr>
-      <w:r>
-        <w:rPr/>
-        <w:t>A manutenção é definida pela norma brasileira de terminologia como o conjunto de ações técnicas e administrativas, incluindo as de supervisão, destinadas a manter ou recolocar um item em um estado no qual possa desempenhar a função requerida.</w:t>
-      </w:r>
-      <w:r>
-        <w:rPr>
-          <w:vertAlign w:val="superscript"/>
-        </w:rPr>
-        <w:t>3</w:t>
-      </w:r>
-      <w:r>
-        <w:rPr/>
-        <w:t xml:space="preserve"> Dentro desse conjunto, a lubrificação é uma ação preventiva de execução frequente.</w:t>
-      </w:r>
-    </w:p>
-    <w:p>
-      <w:pPr>
-        <w:pStyle w:val="Normal"/>
-        <w:widowControl/>
-        <w:spacing w:lineRule="auto" w:line="360" w:before="0" w:after="0"/>
-        <w:ind w:left="0" w:right="0" w:firstLine="709"/>
-        <w:jc w:val="both"/>
-        <w:rPr/>
-      </w:pPr>
-      <w:r>
-        <w:rPr/>
-        <w:t>A TPM propõe a participação dos operadores e mantenedores na conservação dos equipamentos e organiza-se em pilares, entre os quais a manutenção autônoma e a manutenção planejada.</w:t>
-      </w:r>
-      <w:r>
-        <w:rPr>
-          <w:vertAlign w:val="superscript"/>
-        </w:rPr>
-        <w:t>1</w:t>
-      </w:r>
-      <w:r>
-        <w:rPr/>
-        <w:t xml:space="preserve"> O PCM, por sua vez, organiza, programa e acompanha as atividades de manutenção, e depende de registros confiáveis do que foi realizado em cada equipamento. Como a lubrificação é uma atividade preventiva, o indicador mais adequado para avaliar a solução proposta é o tempo de execução da intervenção preventiva. O tempo médio de reparo (MTTR), que se refere às intervenções corretivas, é afetado apenas de forma indireta, quando a lubrificação é feita durante um reparo, como na reposição do óleo após a troca de um retentor.</w:t>
-      </w:r>
-    </w:p>
-    <w:p>
-      <w:pPr>
-        <w:pStyle w:val="Heading3"/>
-        <w:rPr/>
-      </w:pPr>
-      <w:bookmarkStart w:id="11" w:name="pag19"/>
-      <w:bookmarkEnd w:id="11"/>
-      <w:r>
-        <w:rPr/>
-        <w:t>2.1.2 Lubrificação de redutores de velocidade</w:t>
-      </w:r>
-    </w:p>
-    <w:p>
-      <w:pPr>
-        <w:pStyle w:val="Normal"/>
-        <w:widowControl/>
-        <w:spacing w:lineRule="auto" w:line="360" w:before="0" w:after="0"/>
-        <w:ind w:left="0" w:right="0" w:firstLine="709"/>
-        <w:jc w:val="both"/>
-        <w:rPr/>
-      </w:pPr>
-      <w:r>
-        <w:rPr/>
-        <w:t>O lubrificante tem a função de reduzir o atrito e o desgaste entre as superfícies em movimento, auxiliar na dissipação do calor e proteger os componentes contra a corrosão. Em redutores, a escolha do produto depende, entre outros fatores, do tipo de engrenamento e da viscosidade indicada pelo fabricante do equipamento.</w:t>
-      </w:r>
-    </w:p>
-    <w:p>
-      <w:pPr>
-        <w:pStyle w:val="Normal"/>
-        <w:widowControl/>
-        <w:spacing w:lineRule="auto" w:line="360" w:before="0" w:after="0"/>
-        <w:ind w:left="0" w:right="0" w:firstLine="709"/>
-        <w:jc w:val="both"/>
-        <w:rPr/>
-      </w:pPr>
-      <w:r>
-        <w:rPr/>
-        <w:t>Nos redutores de coroa e rosca sem fim, o contato entre os dentes ocorre com elevado escorregamento entre a rosca, de aço, e a coroa, de bronze, o que gera mais calor do que em um par de engrenagens cilíndricas e exige do lubrificante uma película resistente. No redutor estudado, a lubrificação é feita por imersão em óleo sintético de polialfaolefina (PAO) com grau ISO VG 460, conforme a placa de identificação, e o manual do fabricante relaciona, para esse grau, produtos como ExxonMobil SHC 634, Shell Omala S4 GX 460 e Klübersynth EG4-460.</w:t>
-      </w:r>
-      <w:r>
-        <w:rPr>
-          <w:vertAlign w:val="superscript"/>
-        </w:rPr>
-        <w:t>2</w:t>
-      </w:r>
-    </w:p>
-    <w:p>
-      <w:pPr>
-        <w:pStyle w:val="Normal"/>
-        <w:widowControl/>
-        <w:spacing w:lineRule="auto" w:line="360" w:before="0" w:after="0"/>
-        <w:ind w:left="0" w:right="0" w:firstLine="709"/>
-        <w:jc w:val="both"/>
-        <w:rPr/>
-      </w:pPr>
-      <w:r>
-        <w:rPr/>
-        <w:t>A classificação ISO de viscosidade para lubrificantes líquidos industriais, estabelecida pela ISO 3448, define graus (ISO VG) em que cada número corresponde à viscosidade cinemática média, em mm²/s, a 40 °C.</w:t>
-      </w:r>
-      <w:r>
-        <w:rPr>
-          <w:vertAlign w:val="superscript"/>
-        </w:rPr>
-        <w:t>4</w:t>
-      </w:r>
-      <w:r>
-        <w:rPr/>
-        <w:t xml:space="preserve"> A aplicação de produto com viscosidade diferente da especificada, a mistura de lubrificantes incompatíveis, o nível incorreto e a contaminação por água ou partículas são exemplos de falhas de lubrificação que se pretende evitar com o acesso rápido e padronizado às informações do equipamento. O fabricante orienta que, nas trocas, seja usado o mesmo óleo indicado na placa e que não sejam misturados óleos de tipos e fabricantes diferentes.</w:t>
-      </w:r>
-      <w:r>
-        <w:rPr>
-          <w:vertAlign w:val="superscript"/>
-        </w:rPr>
-        <w:t>2</w:t>
-      </w:r>
-      <w:r>
-        <w:rPr/>
-        <w:t xml:space="preserve"> Esse cuidado é importante porque o mesmo manual prevê, para os redutores da linha, óleos minerais (CLP) e sintéticos de base PAO (CLP HC) e poliglicol (CLP PG), cada um com seus próprios intervalos de troca, e é a placa de identificação que informa o tipo adotado em cada redutor.</w:t>
-      </w:r>
-      <w:r>
-        <w:rPr>
-          <w:vertAlign w:val="superscript"/>
-        </w:rPr>
-        <w:t>2</w:t>
-      </w:r>
-    </w:p>
-    <w:p>
-      <w:pPr>
-        <w:pStyle w:val="Normal"/>
-        <w:widowControl/>
-        <w:spacing w:lineRule="auto" w:line="360" w:before="0" w:after="0"/>
-        <w:ind w:left="0" w:right="0" w:firstLine="709"/>
-        <w:jc w:val="both"/>
-        <w:rPr/>
-      </w:pPr>
-      <w:r>
-        <w:rPr/>
-        <w:t>A vida útil do óleo depende da temperatura de operação. Para óleos sintéticos CLP HC (PAO), o manual da linha coroa e rosca do fabricante indica intervalos de troca de 15.000 horas com o óleo a 80 °C, 10.000 horas a 85 °C e 7.500 horas a 90 °C, que é a temperatura máxima de operação em condições normais. O mesmo manual informa que a temperatura externa da carcaça é cerca de 15 °C inferior à do óleo e recomenda observar a qualidade do óleo nas primeiras 500 horas.</w:t>
-      </w:r>
-      <w:r>
-        <w:rPr>
-          <w:vertAlign w:val="superscript"/>
-        </w:rPr>
-        <w:t>2</w:t>
-      </w:r>
-      <w:r>
-        <w:rPr/>
-        <w:t xml:space="preserve"> Assim, a medição da temperatura da carcaça com um termômetro infravermelho permite estimar a condição de trabalho do óleo sem abrir o redutor.</w:t>
-      </w:r>
-    </w:p>
-    <w:p>
-      <w:pPr>
-        <w:pStyle w:val="Normal"/>
-        <w:widowControl/>
-        <w:spacing w:lineRule="auto" w:line="360" w:before="0" w:after="0"/>
-        <w:ind w:left="0" w:right="0" w:firstLine="709"/>
-        <w:jc w:val="both"/>
-        <w:rPr/>
-      </w:pPr>
-      <w:r>
-        <w:rPr/>
-        <w:t>A posição de montagem também influencia a lubrificação, pois altera a distribuição do óleo dentro da carcaça. Por isso, o volume, o nível e a localização do respiro e dos pontos de inspeção devem corresponder à posição real de instalação, e tanto a falta quanto o excesso de óleo prejudicam o redutor: o primeiro reduz a alimentação de engrenagens e rolamentos, e o segundo aumenta a agitação interna, a temperatura e a tendência a vazamentos.</w:t>
-      </w:r>
-      <w:r>
-        <w:rPr>
-          <w:vertAlign w:val="superscript"/>
-        </w:rPr>
-        <w:t>5</w:t>
-      </w:r>
-      <w:r>
-        <w:rPr/>
-        <w:t xml:space="preserve"> Na linha Magma M, o fabricante informa um único volume por tamanho, válido para todas as posições de trabalho (0,87 L no tamanho 06 de um estágio),</w:t>
-      </w:r>
-      <w:r>
-        <w:rPr>
-          <w:vertAlign w:val="superscript"/>
-        </w:rPr>
-        <w:t>2</w:t>
-      </w:r>
-      <w:r>
-        <w:rPr/>
-        <w:t xml:space="preserve"> mas a posição de montagem continua definindo quais bujões funcionam como enchimento, nível e dreno.</w:t>
-      </w:r>
-    </w:p>
-    <w:p>
-      <w:pPr>
-        <w:pStyle w:val="Heading3"/>
-        <w:rPr/>
-      </w:pPr>
-      <w:bookmarkStart w:id="12" w:name="pag20"/>
-      <w:bookmarkEnd w:id="12"/>
-      <w:r>
-        <w:rPr/>
-        <w:t>2.1.3 Gestão Visual e 5S</w:t>
-      </w:r>
-    </w:p>
-    <w:p>
-      <w:pPr>
-        <w:pStyle w:val="Normal"/>
-        <w:widowControl/>
-        <w:spacing w:lineRule="auto" w:line="360" w:before="0" w:after="0"/>
-        <w:ind w:left="0" w:right="0" w:firstLine="709"/>
-        <w:jc w:val="both"/>
-        <w:rPr/>
-      </w:pPr>
-      <w:r>
-        <w:rPr/>
-        <w:t xml:space="preserve">A Gestão Visual consiste em disponibilizar a informação no local e no momento em que ela é necessária, de forma que seja compreendida rapidamente. Está associada ao programa 5S e ao ambiente organizado, em que o que é preciso para executar a tarefa está identificado e ao alcance de quem a executa. A etiqueta de QR Code no redutor pode ser entendida como uma extensão digital da Gestão Visual, pois leva ao ponto de uso informações que ocupariam várias páginas de manual. </w:t>
-      </w:r>
-      <w:r>
-        <w:rPr>
-          <w:shd w:fill="FFFF00" w:val="clear"/>
-        </w:rPr>
-        <w:t>[Inserir citação de um autor sobre Gestão Visual e 5S.]</w:t>
-      </w:r>
-    </w:p>
-    <w:p>
-      <w:pPr>
-        <w:pStyle w:val="Heading3"/>
-        <w:rPr/>
-      </w:pPr>
-      <w:bookmarkStart w:id="13" w:name="pag21"/>
-      <w:bookmarkEnd w:id="13"/>
-      <w:r>
-        <w:rPr/>
-        <w:t>2.1.4 QR Code e NFC</w:t>
-      </w:r>
-    </w:p>
-    <w:p>
-      <w:pPr>
-        <w:pStyle w:val="Normal"/>
-        <w:widowControl/>
-        <w:spacing w:lineRule="auto" w:line="360" w:before="0" w:after="0"/>
-        <w:ind w:left="0" w:right="0" w:firstLine="709"/>
-        <w:jc w:val="both"/>
-        <w:rPr/>
-      </w:pPr>
-      <w:r>
-        <w:rPr/>
-        <w:t>O QR Code é um código de barras bidimensional, especificado pela norma ISO/IEC 18004, capaz de armazenar, por exemplo, o endereço de uma página na internet e de ser lido pela câmera de um celular.</w:t>
-      </w:r>
-      <w:r>
-        <w:rPr>
-          <w:vertAlign w:val="superscript"/>
-        </w:rPr>
-        <w:t>6</w:t>
-      </w:r>
-      <w:r>
-        <w:rPr/>
-        <w:t xml:space="preserve"> O padrão prevê mecanismos de correção de erros, que permitem a leitura mesmo quando parte do código está danificada ou suja, característica relevante para ambientes com óleo e graxa.</w:t>
-      </w:r>
-    </w:p>
-    <w:p>
-      <w:pPr>
-        <w:pStyle w:val="Normal"/>
-        <w:widowControl/>
-        <w:spacing w:lineRule="auto" w:line="360" w:before="0" w:after="0"/>
-        <w:ind w:left="0" w:right="0" w:firstLine="709"/>
-        <w:jc w:val="both"/>
-        <w:rPr/>
-      </w:pPr>
-      <w:r>
-        <w:rPr/>
-        <w:t>Uma alternativa tecnológica é o NFC, em que uma etiqueta passiva é lida pela aproximação do celular, a poucos centímetros. A leitura independe de iluminação e de uma superfície limpa, mas as etiquetas têm custo maior e, em superfícies metálicas como as de um redutor, exigem modelos próprios para aplicação sobre metal. Por essa razão, o QR Code foi adotado como solução principal, ficando o NFC como possibilidade de melhoria para pontos de difícil leitura.</w:t>
-      </w:r>
-    </w:p>
-    <w:p>
-      <w:pPr>
-        <w:pStyle w:val="Normal"/>
-        <w:widowControl/>
-        <w:spacing w:lineRule="auto" w:line="360" w:before="0" w:after="0"/>
-        <w:ind w:left="0" w:right="0" w:firstLine="709"/>
-        <w:jc w:val="both"/>
-        <w:rPr/>
-      </w:pPr>
-      <w:r>
-        <w:rPr/>
-        <w:t>Vale observar que a própria placa de identificação do redutor estudado já informa o tipo e a viscosidade do óleo (ISO VG 460 CLP PAO). Essa informação, porém, ocupa uma área pequena, sujeita a sujeira e desgaste, não traz a quantidade de óleo nem a localização dos bujões e não contempla dados específicos da instalação, como a posição de trabalho, o código do equipamento na planta, os procedimentos de segurança e o histórico das intervenções. A ficha proposta complementa a placa do fabricante, sem substituí-la.</w:t>
-      </w:r>
-    </w:p>
-    <w:p>
-      <w:pPr>
-        <w:pStyle w:val="Heading2"/>
-        <w:rPr/>
-      </w:pPr>
-      <w:bookmarkStart w:id="14" w:name="pag22"/>
-      <w:bookmarkEnd w:id="14"/>
-      <w:r>
-        <w:rPr/>
-        <w:t>2.2 Metodologia</w:t>
-      </w:r>
-    </w:p>
-    <w:p>
-      <w:pPr>
-        <w:pStyle w:val="Heading3"/>
-        <w:spacing w:before="0" w:after="414"/>
-        <w:rPr/>
-      </w:pPr>
       <w:bookmarkStart w:id="15" w:name="pag23"/>
       <w:bookmarkEnd w:id="15"/>
       <w:r>
@@ -4490,7 +4519,7 @@
       <w:pPr>
         <w:pStyle w:val="Normal"/>
         <w:widowControl/>
-        <w:spacing w:lineRule="auto" w:line="360" w:before="0" w:after="0"/>
+        <w:spacing w:lineRule="auto" w:line="360" w:before="0" w:after="120"/>
         <w:ind w:left="0" w:right="0" w:firstLine="709"/>
         <w:jc w:val="both"/>
         <w:rPr/>
@@ -5577,6 +5606,7 @@
       <w:pPr>
         <w:pStyle w:val="Normal"/>
         <w:spacing w:lineRule="auto" w:line="240" w:before="60" w:after="200"/>
+        <w:jc w:val="center"/>
         <w:rPr>
           <w:sz w:val="20"/>
           <w:szCs w:val="20"/>
@@ -5682,6 +5712,7 @@
       <w:pPr>
         <w:pStyle w:val="Normal"/>
         <w:spacing w:lineRule="auto" w:line="240" w:before="60" w:after="200"/>
+        <w:jc w:val="center"/>
         <w:rPr>
           <w:sz w:val="20"/>
           <w:szCs w:val="20"/>
@@ -5699,7 +5730,7 @@
       <w:pPr>
         <w:pStyle w:val="Normal"/>
         <w:widowControl/>
-        <w:spacing w:lineRule="auto" w:line="360" w:before="0" w:after="0"/>
+        <w:spacing w:lineRule="auto" w:line="360" w:before="0" w:after="120"/>
         <w:ind w:left="0" w:right="0" w:firstLine="709"/>
         <w:jc w:val="both"/>
         <w:rPr/>
@@ -5723,7 +5754,7 @@
       <w:pPr>
         <w:pStyle w:val="Normal"/>
         <w:widowControl/>
-        <w:spacing w:lineRule="auto" w:line="360" w:before="0" w:after="0"/>
+        <w:spacing w:lineRule="auto" w:line="360" w:before="0" w:after="120"/>
         <w:ind w:left="0" w:right="0" w:firstLine="709"/>
         <w:jc w:val="both"/>
         <w:rPr/>
@@ -6661,6 +6692,7 @@
       <w:pPr>
         <w:pStyle w:val="Normal"/>
         <w:spacing w:lineRule="auto" w:line="240" w:before="60" w:after="200"/>
+        <w:jc w:val="center"/>
         <w:rPr>
           <w:sz w:val="20"/>
           <w:szCs w:val="20"/>
@@ -6698,7 +6730,7 @@
       <w:pPr>
         <w:pStyle w:val="Normal"/>
         <w:widowControl/>
-        <w:spacing w:lineRule="auto" w:line="360" w:before="0" w:after="0"/>
+        <w:spacing w:lineRule="auto" w:line="360" w:before="0" w:after="120"/>
         <w:ind w:left="0" w:right="0" w:firstLine="709"/>
         <w:jc w:val="both"/>
         <w:rPr/>
@@ -6712,7 +6744,7 @@
       <w:pPr>
         <w:pStyle w:val="Normal"/>
         <w:widowControl/>
-        <w:spacing w:lineRule="auto" w:line="360" w:before="0" w:after="0"/>
+        <w:spacing w:lineRule="auto" w:line="360" w:before="0" w:after="120"/>
         <w:ind w:left="0" w:right="0" w:firstLine="709"/>
         <w:jc w:val="both"/>
         <w:rPr/>
@@ -6736,7 +6768,7 @@
       <w:pPr>
         <w:pStyle w:val="Normal"/>
         <w:widowControl/>
-        <w:spacing w:lineRule="auto" w:line="360" w:before="0" w:after="0"/>
+        <w:spacing w:lineRule="auto" w:line="360" w:before="0" w:after="120"/>
         <w:ind w:left="0" w:right="0" w:firstLine="709"/>
         <w:jc w:val="both"/>
         <w:rPr/>
@@ -6760,7 +6792,7 @@
       <w:pPr>
         <w:pStyle w:val="Normal"/>
         <w:widowControl/>
-        <w:spacing w:lineRule="auto" w:line="360" w:before="0" w:after="0"/>
+        <w:spacing w:lineRule="auto" w:line="360" w:before="0" w:after="120"/>
         <w:ind w:left="0" w:right="0" w:firstLine="709"/>
         <w:jc w:val="both"/>
         <w:rPr/>
@@ -6774,7 +6806,7 @@
       <w:pPr>
         <w:pStyle w:val="Normal"/>
         <w:widowControl/>
-        <w:spacing w:lineRule="auto" w:line="360" w:before="0" w:after="0"/>
+        <w:spacing w:lineRule="auto" w:line="360" w:before="0" w:after="120"/>
         <w:ind w:left="0" w:right="0" w:firstLine="709"/>
         <w:jc w:val="both"/>
         <w:rPr/>
@@ -6798,7 +6830,7 @@
       <w:pPr>
         <w:pStyle w:val="Normal"/>
         <w:widowControl/>
-        <w:spacing w:lineRule="auto" w:line="360" w:before="0" w:after="0"/>
+        <w:spacing w:lineRule="auto" w:line="360" w:before="0" w:after="120"/>
         <w:ind w:left="0" w:right="0" w:firstLine="709"/>
         <w:jc w:val="both"/>
         <w:rPr/>
@@ -6812,7 +6844,7 @@
       <w:pPr>
         <w:pStyle w:val="Normal"/>
         <w:widowControl/>
-        <w:spacing w:lineRule="auto" w:line="360" w:before="0" w:after="0"/>
+        <w:spacing w:lineRule="auto" w:line="360" w:before="0" w:after="120"/>
         <w:ind w:left="0" w:right="0" w:firstLine="709"/>
         <w:jc w:val="both"/>
         <w:rPr/>
@@ -6836,7 +6868,7 @@
       <w:pPr>
         <w:pStyle w:val="Normal"/>
         <w:widowControl/>
-        <w:spacing w:lineRule="auto" w:line="360" w:before="0" w:after="0"/>
+        <w:spacing w:lineRule="auto" w:line="360" w:before="0" w:after="120"/>
         <w:ind w:left="0" w:right="0" w:firstLine="709"/>
         <w:jc w:val="both"/>
         <w:rPr/>
@@ -6850,7 +6882,7 @@
       <w:pPr>
         <w:pStyle w:val="Normal"/>
         <w:widowControl/>
-        <w:spacing w:lineRule="auto" w:line="360" w:before="0" w:after="0"/>
+        <w:spacing w:lineRule="auto" w:line="360" w:before="0" w:after="120"/>
         <w:ind w:left="0" w:right="0" w:firstLine="709"/>
         <w:jc w:val="both"/>
         <w:rPr/>
@@ -6876,7 +6908,7 @@
       <w:pPr>
         <w:pStyle w:val="Normal"/>
         <w:widowControl/>
-        <w:spacing w:lineRule="auto" w:line="360" w:before="0" w:after="0"/>
+        <w:spacing w:lineRule="auto" w:line="360" w:before="0" w:after="120"/>
         <w:ind w:left="0" w:right="0" w:firstLine="709"/>
         <w:jc w:val="both"/>
         <w:rPr/>
@@ -7413,6 +7445,7 @@
       <w:pPr>
         <w:pStyle w:val="Normal"/>
         <w:spacing w:lineRule="auto" w:line="240" w:before="60" w:after="200"/>
+        <w:jc w:val="center"/>
         <w:rPr>
           <w:sz w:val="20"/>
           <w:szCs w:val="20"/>
@@ -7430,7 +7463,7 @@
       <w:pPr>
         <w:pStyle w:val="Normal"/>
         <w:widowControl/>
-        <w:spacing w:lineRule="auto" w:line="360" w:before="0" w:after="0"/>
+        <w:spacing w:lineRule="auto" w:line="360" w:before="0" w:after="120"/>
         <w:ind w:left="0" w:right="0" w:firstLine="709"/>
         <w:jc w:val="both"/>
         <w:rPr/>
@@ -7444,7 +7477,7 @@
       <w:pPr>
         <w:pStyle w:val="Normal"/>
         <w:widowControl/>
-        <w:spacing w:lineRule="auto" w:line="360" w:before="0" w:after="0"/>
+        <w:spacing w:lineRule="auto" w:line="360" w:before="0" w:after="120"/>
         <w:ind w:left="0" w:right="0" w:firstLine="709"/>
         <w:jc w:val="both"/>
         <w:rPr/>
@@ -7470,7 +7503,7 @@
       <w:pPr>
         <w:pStyle w:val="Normal"/>
         <w:widowControl/>
-        <w:spacing w:lineRule="auto" w:line="360" w:before="0" w:after="0"/>
+        <w:spacing w:lineRule="auto" w:line="360" w:before="0" w:after="120"/>
         <w:ind w:left="0" w:right="0" w:firstLine="709"/>
         <w:jc w:val="both"/>
         <w:rPr/>
@@ -7494,7 +7527,7 @@
       <w:pPr>
         <w:pStyle w:val="Normal"/>
         <w:widowControl/>
-        <w:spacing w:lineRule="auto" w:line="360" w:before="0" w:after="0"/>
+        <w:spacing w:lineRule="auto" w:line="360" w:before="0" w:after="120"/>
         <w:ind w:left="0" w:right="0" w:firstLine="709"/>
         <w:jc w:val="both"/>
         <w:rPr/>
@@ -7523,7 +7556,9 @@
       <w:bookmarkEnd w:id="23"/>
       <w:r>
         <w:rPr/>
-        <w:t>2.3 Resultados e Discussões</w:t>
+        <w:t>2.3</w:t>
+        <w:tab/>
+        <w:t>Resultados e Discussões</w:t>
       </w:r>
     </w:p>
     <w:p>
@@ -7543,7 +7578,7 @@
       <w:pPr>
         <w:pStyle w:val="Normal"/>
         <w:widowControl/>
-        <w:spacing w:lineRule="auto" w:line="360" w:before="0" w:after="0"/>
+        <w:spacing w:lineRule="auto" w:line="360" w:before="0" w:after="120"/>
         <w:ind w:left="0" w:right="0" w:firstLine="709"/>
         <w:jc w:val="both"/>
         <w:rPr/>
@@ -8434,6 +8469,7 @@
       <w:pPr>
         <w:pStyle w:val="Normal"/>
         <w:spacing w:lineRule="auto" w:line="240" w:before="60" w:after="200"/>
+        <w:jc w:val="center"/>
         <w:rPr>
           <w:sz w:val="20"/>
           <w:szCs w:val="20"/>
@@ -9322,6 +9358,7 @@
       <w:pPr>
         <w:pStyle w:val="Normal"/>
         <w:spacing w:lineRule="auto" w:line="240" w:before="60" w:after="200"/>
+        <w:jc w:val="center"/>
         <w:rPr>
           <w:sz w:val="20"/>
           <w:szCs w:val="20"/>
@@ -9339,7 +9376,7 @@
       <w:pPr>
         <w:pStyle w:val="Normal"/>
         <w:widowControl/>
-        <w:spacing w:lineRule="auto" w:line="360" w:before="0" w:after="0"/>
+        <w:spacing w:lineRule="auto" w:line="360" w:before="0" w:after="120"/>
         <w:ind w:left="0" w:right="0" w:firstLine="709"/>
         <w:jc w:val="both"/>
         <w:rPr/>
@@ -9901,6 +9938,7 @@
       <w:pPr>
         <w:pStyle w:val="Normal"/>
         <w:spacing w:lineRule="auto" w:line="240" w:before="60" w:after="200"/>
+        <w:jc w:val="center"/>
         <w:rPr>
           <w:sz w:val="20"/>
           <w:szCs w:val="20"/>
@@ -9948,7 +9986,7 @@
       <w:pPr>
         <w:pStyle w:val="Normal"/>
         <w:widowControl/>
-        <w:spacing w:lineRule="auto" w:line="360" w:before="0" w:after="0"/>
+        <w:spacing w:lineRule="auto" w:line="360" w:before="0" w:after="120"/>
         <w:ind w:left="0" w:right="0" w:firstLine="709"/>
         <w:jc w:val="both"/>
         <w:rPr/>
@@ -9978,7 +10016,7 @@
       <w:pPr>
         <w:pStyle w:val="Normal"/>
         <w:widowControl/>
-        <w:spacing w:lineRule="auto" w:line="360" w:before="0" w:after="0"/>
+        <w:spacing w:lineRule="auto" w:line="360" w:before="0" w:after="120"/>
         <w:ind w:left="0" w:right="0" w:firstLine="709"/>
         <w:jc w:val="both"/>
         <w:rPr/>
@@ -9992,7 +10030,7 @@
       <w:pPr>
         <w:pStyle w:val="Normal"/>
         <w:widowControl/>
-        <w:spacing w:lineRule="auto" w:line="360" w:before="0" w:after="0"/>
+        <w:spacing w:lineRule="auto" w:line="360" w:before="0" w:after="120"/>
         <w:ind w:left="0" w:right="0" w:firstLine="709"/>
         <w:jc w:val="both"/>
         <w:rPr/>
@@ -10014,14 +10052,16 @@
       <w:bookmarkEnd w:id="29"/>
       <w:r>
         <w:rPr/>
-        <w:t>3 CONCLUSÃO</w:t>
+        <w:t>3</w:t>
+        <w:tab/>
+        <w:t>CONCLUSÃO</w:t>
       </w:r>
     </w:p>
     <w:p>
       <w:pPr>
         <w:pStyle w:val="Normal"/>
         <w:widowControl/>
-        <w:spacing w:lineRule="auto" w:line="360" w:before="0" w:after="0"/>
+        <w:spacing w:lineRule="auto" w:line="360" w:before="0" w:after="120"/>
         <w:ind w:left="0" w:right="0" w:firstLine="709"/>
         <w:jc w:val="both"/>
         <w:rPr/>
@@ -10041,7 +10081,7 @@
       <w:pPr>
         <w:pStyle w:val="Normal"/>
         <w:widowControl/>
-        <w:spacing w:lineRule="auto" w:line="360" w:before="0" w:after="0"/>
+        <w:spacing w:lineRule="auto" w:line="360" w:before="0" w:after="120"/>
         <w:ind w:left="0" w:right="0" w:firstLine="709"/>
         <w:jc w:val="both"/>
         <w:rPr/>
@@ -10061,7 +10101,7 @@
       <w:pPr>
         <w:pStyle w:val="Normal"/>
         <w:widowControl/>
-        <w:spacing w:lineRule="auto" w:line="360" w:before="0" w:after="0"/>
+        <w:spacing w:lineRule="auto" w:line="360" w:before="0" w:after="120"/>
         <w:ind w:left="0" w:right="0" w:firstLine="709"/>
         <w:jc w:val="both"/>
         <w:rPr/>
@@ -12383,7 +12423,7 @@
       <w:pPr>
         <w:pStyle w:val="Normal"/>
         <w:widowControl/>
-        <w:spacing w:lineRule="auto" w:line="360" w:before="0" w:after="0"/>
+        <w:spacing w:lineRule="auto" w:line="360" w:before="0" w:after="120"/>
         <w:ind w:left="0" w:right="0" w:firstLine="709"/>
         <w:jc w:val="both"/>
         <w:rPr/>
@@ -12397,7 +12437,7 @@
       <w:pPr>
         <w:pStyle w:val="Normal"/>
         <w:widowControl/>
-        <w:spacing w:lineRule="auto" w:line="360" w:before="0" w:after="0"/>
+        <w:spacing w:lineRule="auto" w:line="360" w:before="0" w:after="120"/>
         <w:ind w:left="0" w:right="0" w:firstLine="709"/>
         <w:jc w:val="both"/>
         <w:rPr/>
@@ -12431,7 +12471,7 @@
       <w:pPr>
         <w:pStyle w:val="Normal"/>
         <w:widowControl/>
-        <w:spacing w:lineRule="auto" w:line="360" w:before="0" w:after="0"/>
+        <w:spacing w:lineRule="auto" w:line="360" w:before="0" w:after="120"/>
         <w:ind w:left="0" w:right="0" w:firstLine="709"/>
         <w:jc w:val="both"/>
         <w:rPr/>
@@ -12657,6 +12697,7 @@
       <w:pPr>
         <w:pStyle w:val="Normal"/>
         <w:spacing w:lineRule="auto" w:line="240" w:before="60" w:after="200"/>
+        <w:jc w:val="center"/>
         <w:rPr>
           <w:sz w:val="20"/>
           <w:szCs w:val="20"/>
@@ -12819,7 +12860,7 @@
         <w:szCs w:val="20"/>
       </w:rPr>
       <w:drawing>
-        <wp:anchor behindDoc="1" distT="0" distB="0" distL="0" distR="0" simplePos="0" locked="0" layoutInCell="0" allowOverlap="1" relativeHeight="20">
+        <wp:anchor behindDoc="1" distT="0" distB="0" distL="0" distR="0" simplePos="0" locked="0" layoutInCell="0" allowOverlap="1" relativeHeight="21">
           <wp:simplePos x="0" y="0"/>
           <wp:positionH relativeFrom="page">
             <wp:posOffset>0</wp:posOffset>
@@ -12884,7 +12925,7 @@
         <w:sz w:val="20"/>
         <w:szCs w:val="20"/>
       </w:rPr>
-      <w:t>30</w:t>
+      <w:t>31</w:t>
     </w:r>
     <w:r>
       <w:rPr>

</xml_diff>

<commit_message>
Documento: histórico da lubrificação e da indústria de celulose na introdução (sugestão do professor), com 4 referências novas e citações renumeradas
Co-Authored-By: Claude Opus 5.5 <noreply@anthropic.com>
</commit_message>
<xml_diff>
--- a/Projeto_Integrador_QRCode_Lubrificantes.docx
+++ b/Projeto_Integrador_QRCode_Lubrificantes.docx
@@ -2135,7 +2135,7 @@
           <w:sz w:val="24"/>
           <w:szCs w:val="24"/>
         </w:rPr>
-        <w:t>9</w:t>
+        <w:t>10</w:t>
       </w:r>
       <w:r>
         <w:rPr>
@@ -2263,7 +2263,7 @@
           <w:sz w:val="24"/>
           <w:szCs w:val="24"/>
         </w:rPr>
-        <w:t>10</w:t>
+        <w:t>11</w:t>
       </w:r>
       <w:r>
         <w:rPr>
@@ -2329,7 +2329,7 @@
           <w:sz w:val="24"/>
           <w:szCs w:val="24"/>
         </w:rPr>
-        <w:t>10</w:t>
+        <w:t>11</w:t>
       </w:r>
       <w:r>
         <w:rPr>
@@ -2459,7 +2459,7 @@
           <w:sz w:val="24"/>
           <w:szCs w:val="24"/>
         </w:rPr>
-        <w:t>11</w:t>
+        <w:t>12</w:t>
       </w:r>
       <w:r>
         <w:rPr>
@@ -2523,7 +2523,7 @@
           <w:sz w:val="24"/>
           <w:szCs w:val="24"/>
         </w:rPr>
-        <w:t>11</w:t>
+        <w:t>12</w:t>
       </w:r>
       <w:r>
         <w:rPr>
@@ -3831,7 +3831,23 @@
       </w:pPr>
       <w:r>
         <w:rPr/>
-        <w:t>Apesar dessa importância, as informações necessárias para lubrificar um equipamento nem sempre estão disponíveis no local de trabalho. O mecânico precisa, muitas vezes, deslocar-se até a sala de manutenção, consultar manuais, fichas técnicas ou o supervisor, ou ainda recorrer à própria memória. Esse processo consome tempo da intervenção e aumenta o risco de aplicação de um produto incorreto ou em quantidade inadequada.</w:t>
+        <w:t>O uso de lubrificantes é muito antigo. Pinturas egípcias de cerca de 1880 a.C. mostram um trabalhador derramando um líquido à frente do trenó que transportava uma estátua, para reduzir o atrito, e gorduras animais já eram aplicadas nos eixos de carros de tração por volta de 1400 a.C.</w:t>
+      </w:r>
+      <w:r>
+        <w:rPr>
+          <w:vertAlign w:val="superscript"/>
+        </w:rPr>
+        <w:t>2</w:t>
+      </w:r>
+      <w:r>
+        <w:rPr/>
+        <w:t xml:space="preserve"> Até o século XIX, os lubrificantes eram principalmente gorduras animais e óleos vegetais; os óleos minerais, derivados do petróleo, só se difundiram a partir da segunda metade daquele século, acompanhando a mecanização da indústria.</w:t>
+      </w:r>
+      <w:r>
+        <w:rPr>
+          <w:vertAlign w:val="superscript"/>
+        </w:rPr>
+        <w:t>2</w:t>
       </w:r>
     </w:p>
     <w:p>
@@ -3845,21 +3861,33 @@
       </w:pPr>
       <w:r>
         <w:rPr/>
-        <w:t>Este trabalho propõe o uso de um QR Code fixado no próprio equipamento, que dá acesso, pelo celular, a uma ficha digital com as informações de lubrificação. O estudo toma como equipamento um redutor de velocidade de coroa e rosca sem fim WEG-Cestari, da linha Magma M, com relação de transmissão 1:25, disponível na oficina de mecânica do SENAI Três Lagoas, e tem como foco a redução do tempo do mecânico na identificação e no registro da lubrificação.</w:t>
-      </w:r>
-    </w:p>
-    <w:p>
-      <w:pPr>
-        <w:pStyle w:val="Heading2"/>
-        <w:rPr/>
-      </w:pPr>
-      <w:bookmarkStart w:id="1" w:name="pag09"/>
-      <w:bookmarkEnd w:id="1"/>
-      <w:r>
-        <w:rPr/>
-        <w:t>1.1</w:t>
-        <w:tab/>
-        <w:t>Justificativa</w:t>
+        <w:t>Nas fábricas de papel e celulose, a lubrificação acompanhou essa evolução. Por muito tempo, ela dependeu do trabalho manual do lubrificador, que percorria a fábrica aplicando óleo e graxa ponto a ponto. Mesmo nos primeiros sistemas de circulação de óleo das máquinas de papel, que chegam a ter cerca de 500 pontos de lubrificação nos mancais de cilindros e rolos, a vazão de cada ponto era ajustada à mão em painéis instalados no porão, sob a máquina, e qualquer mudança nas condições de operação exigia nova regulagem, ponto a ponto.</w:t>
+      </w:r>
+      <w:r>
+        <w:rPr>
+          <w:vertAlign w:val="superscript"/>
+        </w:rPr>
+        <w:t>3</w:t>
+      </w:r>
+      <w:r>
+        <w:rPr/>
+        <w:t xml:space="preserve"> Hoje, as máquinas modernas empregam circulação de óleo nas seções de prensas e de secagem e graxa nas seções de formação,</w:t>
+      </w:r>
+      <w:r>
+        <w:rPr>
+          <w:vertAlign w:val="superscript"/>
+        </w:rPr>
+        <w:t>4</w:t>
+      </w:r>
+      <w:r>
+        <w:rPr/>
+        <w:t xml:space="preserve"> com sistemas que monitoram e controlam a lubrificação de forma automática.</w:t>
+      </w:r>
+      <w:r>
+        <w:rPr>
+          <w:vertAlign w:val="superscript"/>
+        </w:rPr>
+        <w:t>3</w:t>
       </w:r>
     </w:p>
     <w:p>
@@ -3873,13 +3901,79 @@
       </w:pPr>
       <w:r>
         <w:rPr/>
+        <w:t>Em Três Lagoas, a indústria de celulose é recente: a primeira grande fábrica, da Fibria (atual Suzano), instalou-se em 2009, com capacidade de 1,3 milhão de toneladas de celulose por ano, e a Eldorado Brasil começou a operar em 2012, com capacidade de 1,7 milhão de toneladas; em 2021, a Lei nº 14.142 conferiu ao município o título de Capital Nacional da Celulose.</w:t>
+      </w:r>
+      <w:r>
+        <w:rPr>
+          <w:vertAlign w:val="superscript"/>
+        </w:rPr>
+        <w:t>5</w:t>
+      </w:r>
+      <w:r>
+        <w:rPr/>
+        <w:t xml:space="preserve"> Essas fábricas já nasceram com sistemas modernos de lubrificação nas máquinas principais, mas, em equipamentos menores, como redutores, bombas e transportadores, a lubrificação continua sendo feita pelo mecânico, o que mantém atual o problema tratado neste trabalho.</w:t>
+      </w:r>
+    </w:p>
+    <w:p>
+      <w:pPr>
+        <w:pStyle w:val="Normal"/>
+        <w:widowControl/>
+        <w:spacing w:lineRule="auto" w:line="360" w:before="0" w:after="120"/>
+        <w:ind w:left="0" w:right="0" w:firstLine="709"/>
+        <w:jc w:val="both"/>
+        <w:rPr/>
+      </w:pPr>
+      <w:r>
+        <w:rPr/>
+        <w:t>Apesar dessa evolução, as informações necessárias para lubrificar um equipamento nem sempre estão disponíveis no local de trabalho. O mecânico precisa, muitas vezes, deslocar-se até a sala de manutenção, consultar manuais, fichas técnicas ou o supervisor, ou ainda recorrer à própria memória. Esse processo consome tempo da intervenção e aumenta o risco de aplicação de um produto incorreto ou em quantidade inadequada.</w:t>
+      </w:r>
+    </w:p>
+    <w:p>
+      <w:pPr>
+        <w:pStyle w:val="Normal"/>
+        <w:widowControl/>
+        <w:spacing w:lineRule="auto" w:line="360" w:before="0" w:after="120"/>
+        <w:ind w:left="0" w:right="0" w:firstLine="709"/>
+        <w:jc w:val="both"/>
+        <w:rPr/>
+      </w:pPr>
+      <w:r>
+        <w:rPr/>
+        <w:t>Este trabalho propõe o uso de um QR Code fixado no próprio equipamento, que dá acesso, pelo celular, a uma ficha digital com as informações de lubrificação. O estudo toma como equipamento um redutor de velocidade de coroa e rosca sem fim WEG-Cestari, da linha Magma M, com relação de transmissão 1:25, disponível na oficina de mecânica do SENAI Três Lagoas, e tem como foco a redução do tempo do mecânico na identificação e no registro da lubrificação.</w:t>
+      </w:r>
+    </w:p>
+    <w:p>
+      <w:pPr>
+        <w:pStyle w:val="Heading2"/>
+        <w:rPr/>
+      </w:pPr>
+      <w:bookmarkStart w:id="1" w:name="pag09"/>
+      <w:bookmarkEnd w:id="1"/>
+      <w:r>
+        <w:rPr/>
+        <w:t>1.1</w:t>
+        <w:tab/>
+        <w:t>Justificativa</w:t>
+      </w:r>
+    </w:p>
+    <w:p>
+      <w:pPr>
+        <w:pStyle w:val="Normal"/>
+        <w:widowControl/>
+        <w:spacing w:lineRule="auto" w:line="360" w:before="0" w:after="120"/>
+        <w:ind w:left="0" w:right="0" w:firstLine="709"/>
+        <w:jc w:val="both"/>
+        <w:rPr/>
+      </w:pPr>
+      <w:r>
+        <w:rPr/>
         <w:t>A justificativa do trabalho apoia-se em cinco pontos: (i) o tempo do mecânico é um recurso valioso, e a busca por informação é uma etapa que não agrega valor à intervenção; (ii) a aplicação de lubrificante incorreto, a mistura de óleos de bases diferentes ou o volume inadequado podem comprometer o equipamento, e, no redutor estudado, a placa de identificação indica óleo sintético PAO ISO VG 460, que não deve ser misturado com óleo mineral nem com sintético de outra base; (iii) o registro das lubrificações, quando feito em papel e posteriormente, tende a ser incompleto ou a se perder, o que prejudica o Planejamento e Controle da Manutenção (PCM); (iv) o próprio fabricante recomenda que cada redutor tenha um registro individual das manutenções executadas, das peças trocadas e das datas,</w:t>
       </w:r>
       <w:r>
         <w:rPr>
           <w:vertAlign w:val="superscript"/>
         </w:rPr>
-        <w:t>2</w:t>
+        <w:t>6</w:t>
       </w:r>
       <w:r>
         <w:rPr/>
@@ -4217,7 +4311,7 @@
         <w:rPr>
           <w:vertAlign w:val="superscript"/>
         </w:rPr>
-        <w:t>3</w:t>
+        <w:t>7</w:t>
       </w:r>
       <w:r>
         <w:rPr/>
@@ -4291,7 +4385,7 @@
         <w:rPr>
           <w:vertAlign w:val="superscript"/>
         </w:rPr>
-        <w:t>2</w:t>
+        <w:t>6</w:t>
       </w:r>
     </w:p>
     <w:p>
@@ -4311,7 +4405,7 @@
         <w:rPr>
           <w:vertAlign w:val="superscript"/>
         </w:rPr>
-        <w:t>4</w:t>
+        <w:t>8</w:t>
       </w:r>
       <w:r>
         <w:rPr/>
@@ -4321,7 +4415,7 @@
         <w:rPr>
           <w:vertAlign w:val="superscript"/>
         </w:rPr>
-        <w:t>2</w:t>
+        <w:t>6</w:t>
       </w:r>
       <w:r>
         <w:rPr/>
@@ -4331,7 +4425,7 @@
         <w:rPr>
           <w:vertAlign w:val="superscript"/>
         </w:rPr>
-        <w:t>2</w:t>
+        <w:t>6</w:t>
       </w:r>
     </w:p>
     <w:p>
@@ -4351,7 +4445,7 @@
         <w:rPr>
           <w:vertAlign w:val="superscript"/>
         </w:rPr>
-        <w:t>2</w:t>
+        <w:t>6</w:t>
       </w:r>
       <w:r>
         <w:rPr/>
@@ -4375,7 +4469,7 @@
         <w:rPr>
           <w:vertAlign w:val="superscript"/>
         </w:rPr>
-        <w:t>5</w:t>
+        <w:t>9</w:t>
       </w:r>
       <w:r>
         <w:rPr/>
@@ -4385,7 +4479,7 @@
         <w:rPr>
           <w:vertAlign w:val="superscript"/>
         </w:rPr>
-        <w:t>2</w:t>
+        <w:t>6</w:t>
       </w:r>
       <w:r>
         <w:rPr/>
@@ -4453,7 +4547,7 @@
         <w:rPr>
           <w:vertAlign w:val="superscript"/>
         </w:rPr>
-        <w:t>6</w:t>
+        <w:t>10</w:t>
       </w:r>
       <w:r>
         <w:rPr/>
@@ -4532,7 +4626,7 @@
         <w:rPr>
           <w:vertAlign w:val="superscript"/>
         </w:rPr>
-        <w:t>2</w:t>
+        <w:t>6</w:t>
       </w:r>
       <w:r>
         <w:rPr/>
@@ -5625,7 +5719,7 @@
           <w:szCs w:val="20"/>
           <w:vertAlign w:val="superscript"/>
         </w:rPr>
-        <w:t>2</w:t>
+        <w:t>6</w:t>
       </w:r>
     </w:p>
     <w:p>
@@ -5743,7 +5837,7 @@
         <w:rPr>
           <w:vertAlign w:val="superscript"/>
         </w:rPr>
-        <w:t>2</w:t>
+        <w:t>6</w:t>
       </w:r>
       <w:r>
         <w:rPr/>
@@ -5767,7 +5861,7 @@
         <w:rPr>
           <w:vertAlign w:val="superscript"/>
         </w:rPr>
-        <w:t>5</w:t>
+        <w:t>9</w:t>
       </w:r>
       <w:r>
         <w:rPr/>
@@ -6682,7 +6776,7 @@
                 <w:szCs w:val="20"/>
                 <w:vertAlign w:val="superscript"/>
               </w:rPr>
-              <w:t>7</w:t>
+              <w:t>11</w:t>
             </w:r>
           </w:p>
         </w:tc>
@@ -6711,7 +6805,7 @@
           <w:szCs w:val="20"/>
           <w:vertAlign w:val="superscript"/>
         </w:rPr>
-        <w:t>2</w:t>
+        <w:t>6</w:t>
       </w:r>
     </w:p>
     <w:p>
@@ -6781,7 +6875,7 @@
         <w:rPr>
           <w:vertAlign w:val="superscript"/>
         </w:rPr>
-        <w:t>2</w:t>
+        <w:t>6</w:t>
       </w:r>
       <w:r>
         <w:rPr/>
@@ -6819,7 +6913,7 @@
         <w:rPr>
           <w:vertAlign w:val="superscript"/>
         </w:rPr>
-        <w:t>2</w:t>
+        <w:t>6</w:t>
       </w:r>
       <w:r>
         <w:rPr/>
@@ -10009,7 +10103,7 @@
         <w:rPr>
           <w:vertAlign w:val="superscript"/>
         </w:rPr>
-        <w:t>2</w:t>
+        <w:t>6</w:t>
       </w:r>
     </w:p>
     <w:p>
@@ -10167,18 +10261,18 @@
       </w:pPr>
       <w:r>
         <w:rPr/>
-        <w:t xml:space="preserve">2. WEG-CESTARI. </w:t>
-      </w:r>
-      <w:r>
-        <w:rPr>
-          <w:b/>
-          <w:bCs/>
-        </w:rPr>
-        <w:t>Manual de instruções</w:t>
-      </w:r>
-      <w:r>
-        <w:rPr/>
-        <w:t>: linha coroa e rosca. Rev. 01. Monte Alto: WEG-Cestari, 2019. Disponível em: https://static.weg.net/medias/downloadcenter/h37/ha0/WEG-CESTARI-manual-iom-coroa-e-rosca-50111641-portuguese-web.pdf. Acesso em: 7 out. 2026.</w:t>
+        <w:t xml:space="preserve">2. DOWSON, D. </w:t>
+      </w:r>
+      <w:r>
+        <w:rPr>
+          <w:b/>
+          <w:bCs/>
+        </w:rPr>
+        <w:t>History of tribology</w:t>
+      </w:r>
+      <w:r>
+        <w:rPr/>
+        <w:t>. 2. ed. London: Professional Engineering Publishing, 1998.</w:t>
       </w:r>
     </w:p>
     <w:p>
@@ -10190,18 +10284,18 @@
       </w:pPr>
       <w:r>
         <w:rPr/>
-        <w:t xml:space="preserve">3. ASSOCIAÇÃO BRASILEIRA DE NORMAS TÉCNICAS. </w:t>
-      </w:r>
-      <w:r>
-        <w:rPr>
-          <w:b/>
-          <w:bCs/>
-        </w:rPr>
-        <w:t>NBR 5462</w:t>
-      </w:r>
-      <w:r>
-        <w:rPr/>
-        <w:t>: confiabilidade e mantenabilidade. Rio de Janeiro: ABNT, 1994.</w:t>
+        <w:t xml:space="preserve">3. HYVÖNEN, H. et al. </w:t>
+      </w:r>
+      <w:r>
+        <w:rPr>
+          <w:b/>
+          <w:bCs/>
+        </w:rPr>
+        <w:t>System for monitoring and control of the circulation lubrication of the bearings of cylinders and rolls in a paper machine</w:t>
+      </w:r>
+      <w:r>
+        <w:rPr/>
+        <w:t>. Titular: Valmet Oy. US 5813496 A. Depósito: 27 fev. 1996. Concessão: 29 set. 1998. Disponível em: https://patents.google.com/patent/US5813496A/en. Acesso em: 14 out. 2026.</w:t>
       </w:r>
     </w:p>
     <w:p>
@@ -10213,18 +10307,18 @@
       </w:pPr>
       <w:r>
         <w:rPr/>
-        <w:t xml:space="preserve">4. INTERNATIONAL ORGANIZATION FOR STANDARDIZATION. </w:t>
-      </w:r>
-      <w:r>
-        <w:rPr>
-          <w:b/>
-          <w:bCs/>
-        </w:rPr>
-        <w:t>ISO 3448</w:t>
-      </w:r>
-      <w:r>
-        <w:rPr/>
-        <w:t>: industrial liquid lubricants: ISO viscosity classification. Geneva: ISO, 1992.</w:t>
+        <w:t xml:space="preserve">4. HINK, R. Best lubrication practices for the paper industry. </w:t>
+      </w:r>
+      <w:r>
+        <w:rPr>
+          <w:b/>
+          <w:bCs/>
+        </w:rPr>
+        <w:t>Machinery Lubrication</w:t>
+      </w:r>
+      <w:r>
+        <w:rPr/>
+        <w:t>, Tulsa, jan. 2005. Disponível em: https://www.machinerylubrication.com/Read/709/paper-industry-lubrication. Acesso em: 14 out. 2026.</w:t>
       </w:r>
     </w:p>
     <w:p>
@@ -10236,18 +10330,18 @@
       </w:pPr>
       <w:r>
         <w:rPr/>
-        <w:t xml:space="preserve">5. FARIA, V. </w:t>
-      </w:r>
-      <w:r>
-        <w:rPr>
-          <w:b/>
-          <w:bCs/>
-        </w:rPr>
-        <w:t>Posição de montagem de redutores</w:t>
-      </w:r>
-      <w:r>
-        <w:rPr/>
-        <w:t>: o que muda na lubrificação e no desempenho? Blog Acoplast Brasil, 1 out. 2026. Disponível em: https://blog.acoplastbrasil.com.br/posicao-de-montagem-de-redutores/. Acesso em: 7 out. 2026.</w:t>
+        <w:t xml:space="preserve">5. AGÊNCIA SENADO. </w:t>
+      </w:r>
+      <w:r>
+        <w:rPr>
+          <w:b/>
+          <w:bCs/>
+        </w:rPr>
+        <w:t>Sancionada lei que dá o título de Capital Nacional da Celulose a Três Lagoas (MS)</w:t>
+      </w:r>
+      <w:r>
+        <w:rPr/>
+        <w:t>. Brasília, DF, 20 abr. 2021. Disponível em: https://www12.senado.leg.br/noticias/materias/2021/04/20/sancionada-lei-que-da-o-titulo-de-capital-nacional-da-celulose-a-tres-lagoas-ms. Acesso em: 14 out. 2026.</w:t>
       </w:r>
     </w:p>
     <w:p>
@@ -10259,18 +10353,18 @@
       </w:pPr>
       <w:r>
         <w:rPr/>
-        <w:t xml:space="preserve">6. INTERNATIONAL ORGANIZATION FOR STANDARDIZATION; INTERNATIONAL ELECTROTECHNICAL COMMISSION. </w:t>
-      </w:r>
-      <w:r>
-        <w:rPr>
-          <w:b/>
-          <w:bCs/>
-        </w:rPr>
-        <w:t>ISO/IEC 18004</w:t>
-      </w:r>
-      <w:r>
-        <w:rPr/>
-        <w:t>: information technology: automatic identification and data capture techniques: QR Code bar code symbology specification. Geneva: ISO/IEC, 2015.</w:t>
+        <w:t xml:space="preserve">6. WEG-CESTARI. </w:t>
+      </w:r>
+      <w:r>
+        <w:rPr>
+          <w:b/>
+          <w:bCs/>
+        </w:rPr>
+        <w:t>Manual de instruções</w:t>
+      </w:r>
+      <w:r>
+        <w:rPr/>
+        <w:t>: linha coroa e rosca. Rev. 01. Monte Alto: WEG-Cestari, 2019. Disponível em: https://static.weg.net/medias/downloadcenter/h37/ha0/WEG-CESTARI-manual-iom-coroa-e-rosca-50111641-portuguese-web.pdf. Acesso em: 7 out. 2026.</w:t>
       </w:r>
     </w:p>
     <w:p>
@@ -10282,7 +10376,99 @@
       </w:pPr>
       <w:r>
         <w:rPr/>
-        <w:t xml:space="preserve">7. BRASIL. Conselho Nacional do Meio Ambiente. </w:t>
+        <w:t xml:space="preserve">7. ASSOCIAÇÃO BRASILEIRA DE NORMAS TÉCNICAS. </w:t>
+      </w:r>
+      <w:r>
+        <w:rPr>
+          <w:b/>
+          <w:bCs/>
+        </w:rPr>
+        <w:t>NBR 5462</w:t>
+      </w:r>
+      <w:r>
+        <w:rPr/>
+        <w:t>: confiabilidade e mantenabilidade. Rio de Janeiro: ABNT, 1994.</w:t>
+      </w:r>
+    </w:p>
+    <w:p>
+      <w:pPr>
+        <w:pStyle w:val="Normal"/>
+        <w:spacing w:lineRule="auto" w:line="240" w:before="0" w:after="240"/>
+        <w:jc w:val="left"/>
+        <w:rPr/>
+      </w:pPr>
+      <w:r>
+        <w:rPr/>
+        <w:t xml:space="preserve">8. INTERNATIONAL ORGANIZATION FOR STANDARDIZATION. </w:t>
+      </w:r>
+      <w:r>
+        <w:rPr>
+          <w:b/>
+          <w:bCs/>
+        </w:rPr>
+        <w:t>ISO 3448</w:t>
+      </w:r>
+      <w:r>
+        <w:rPr/>
+        <w:t>: industrial liquid lubricants: ISO viscosity classification. Geneva: ISO, 1992.</w:t>
+      </w:r>
+    </w:p>
+    <w:p>
+      <w:pPr>
+        <w:pStyle w:val="Normal"/>
+        <w:spacing w:lineRule="auto" w:line="240" w:before="0" w:after="240"/>
+        <w:jc w:val="left"/>
+        <w:rPr/>
+      </w:pPr>
+      <w:r>
+        <w:rPr/>
+        <w:t xml:space="preserve">9. FARIA, V. </w:t>
+      </w:r>
+      <w:r>
+        <w:rPr>
+          <w:b/>
+          <w:bCs/>
+        </w:rPr>
+        <w:t>Posição de montagem de redutores</w:t>
+      </w:r>
+      <w:r>
+        <w:rPr/>
+        <w:t>: o que muda na lubrificação e no desempenho? Blog Acoplast Brasil, 1 out. 2026. Disponível em: https://blog.acoplastbrasil.com.br/posicao-de-montagem-de-redutores/. Acesso em: 7 out. 2026.</w:t>
+      </w:r>
+    </w:p>
+    <w:p>
+      <w:pPr>
+        <w:pStyle w:val="Normal"/>
+        <w:spacing w:lineRule="auto" w:line="240" w:before="0" w:after="240"/>
+        <w:jc w:val="left"/>
+        <w:rPr/>
+      </w:pPr>
+      <w:r>
+        <w:rPr/>
+        <w:t xml:space="preserve">10. INTERNATIONAL ORGANIZATION FOR STANDARDIZATION; INTERNATIONAL ELECTROTECHNICAL COMMISSION. </w:t>
+      </w:r>
+      <w:r>
+        <w:rPr>
+          <w:b/>
+          <w:bCs/>
+        </w:rPr>
+        <w:t>ISO/IEC 18004</w:t>
+      </w:r>
+      <w:r>
+        <w:rPr/>
+        <w:t>: information technology: automatic identification and data capture techniques: QR Code bar code symbology specification. Geneva: ISO/IEC, 2015.</w:t>
+      </w:r>
+    </w:p>
+    <w:p>
+      <w:pPr>
+        <w:pStyle w:val="Normal"/>
+        <w:spacing w:lineRule="auto" w:line="240" w:before="0" w:after="240"/>
+        <w:jc w:val="left"/>
+        <w:rPr/>
+      </w:pPr>
+      <w:r>
+        <w:rPr/>
+        <w:t xml:space="preserve">11. BRASIL. Conselho Nacional do Meio Ambiente. </w:t>
       </w:r>
       <w:r>
         <w:rPr>
@@ -12484,7 +12670,7 @@
         <w:rPr>
           <w:vertAlign w:val="superscript"/>
         </w:rPr>
-        <w:t>6</w:t>
+        <w:t>10</w:t>
       </w:r>
       <w:r>
         <w:rPr/>
@@ -12860,7 +13046,7 @@
         <w:szCs w:val="20"/>
       </w:rPr>
       <w:drawing>
-        <wp:anchor behindDoc="1" distT="0" distB="0" distL="0" distR="0" simplePos="0" locked="0" layoutInCell="0" allowOverlap="1" relativeHeight="21">
+        <wp:anchor behindDoc="1" distT="0" distB="0" distL="0" distR="0" simplePos="0" locked="0" layoutInCell="0" allowOverlap="1" relativeHeight="20">
           <wp:simplePos x="0" y="0"/>
           <wp:positionH relativeFrom="page">
             <wp:posOffset>0</wp:posOffset>

</xml_diff>

<commit_message>
Documento: citação de Gestão Visual/5S (Osada 1992, Galsworth 2017; refs renumeradas até 13) e linha/tamanho do redutor como premissa; planilha de cronometragem
- 2.1.3: citações indiretas de Osada (5S) e Galsworth (local de trabalho visual)
- Referências 10 e 11 novas; ISO/IEC 18004 → 12, CONAMA 362 → 13
- 2.2.1 e Quadro 1: Magma M 06 identificado pelo código e pelo manual, sem confirmação
  do fabricante (premissa; volume de óleo a conferir antes de aplicação industrial)
- Cronometragem_QRCode.xlsx/.ods: tempos por etapa, médias, redução (%) e ganho anual

Co-Authored-By: Claude Opus 5.5 <noreply@anthropic.com>
</commit_message>
<xml_diff>
--- a/Projeto_Integrador_QRCode_Lubrificantes.docx
+++ b/Projeto_Integrador_QRCode_Lubrificantes.docx
@@ -1264,7 +1264,7 @@
           <w:sz w:val="24"/>
           <w:szCs w:val="24"/>
         </w:rPr>
-        <w:t>31</w:t>
+        <w:t>32</w:t>
       </w:r>
       <w:r>
         <w:rPr>
@@ -3635,7 +3635,7 @@
           <w:sz w:val="24"/>
           <w:szCs w:val="24"/>
         </w:rPr>
-        <w:t>29</w:t>
+        <w:t>30</w:t>
       </w:r>
       <w:r>
         <w:rPr>
@@ -3699,7 +3699,7 @@
           <w:sz w:val="24"/>
           <w:szCs w:val="24"/>
         </w:rPr>
-        <w:t>30</w:t>
+        <w:t>31</w:t>
       </w:r>
       <w:r>
         <w:rPr>
@@ -3773,7 +3773,7 @@
           <w:sz w:val="24"/>
           <w:szCs w:val="24"/>
         </w:rPr>
-        <w:t>31</w:t>
+        <w:t>32</w:t>
       </w:r>
       <w:r>
         <w:rPr>
@@ -4509,13 +4509,23 @@
       </w:pPr>
       <w:r>
         <w:rPr/>
-        <w:t xml:space="preserve">A Gestão Visual consiste em disponibilizar a informação no local e no momento em que ela é necessária, de forma que seja compreendida rapidamente. Está associada ao programa 5S e ao ambiente organizado, em que o que é preciso para executar a tarefa está identificado e ao alcance de quem a executa. A etiqueta de QR Code no redutor pode ser entendida como uma extensão digital da Gestão Visual, pois leva ao ponto de uso informações que ocupariam várias páginas de manual. </w:t>
-      </w:r>
-      <w:r>
-        <w:rPr>
-          <w:shd w:fill="FFFF00" w:val="clear"/>
-        </w:rPr>
-        <w:t>[Inserir citação de um autor sobre Gestão Visual e 5S.]</w:t>
+        <w:t>A Gestão Visual consiste em disponibilizar a informação no local e no momento em que ela é necessária, de forma que seja compreendida rapidamente. Está associada ao programa 5S e ao ambiente organizado, em que o que é preciso para executar a tarefa está identificado e ao alcance de quem a executa. A etiqueta de QR Code no redutor pode ser entendida como uma extensão digital da Gestão Visual, pois leva ao ponto de uso informações que ocupariam várias páginas de manual. Para Osada, os 5S organizam o ambiente de trabalho de modo que cada item necessário tenha um lugar definido e identificado, o que reduz o tempo perdido com procura.</w:t>
+      </w:r>
+      <w:r>
+        <w:rPr>
+          <w:vertAlign w:val="superscript"/>
+        </w:rPr>
+        <w:t>10</w:t>
+      </w:r>
+      <w:r>
+        <w:rPr/>
+        <w:t xml:space="preserve"> Galsworth descreve o local de trabalho visual como aquele que se explica e se regula por si mesmo, porque a informação necessária à tarefa é convertida em dispositivos visuais simples e colocada no ponto de uso.</w:t>
+      </w:r>
+      <w:r>
+        <w:rPr>
+          <w:vertAlign w:val="superscript"/>
+        </w:rPr>
+        <w:t>11</w:t>
       </w:r>
     </w:p>
     <w:p>
@@ -4547,7 +4557,7 @@
         <w:rPr>
           <w:vertAlign w:val="superscript"/>
         </w:rPr>
-        <w:t>10</w:t>
+        <w:t>12</w:t>
       </w:r>
       <w:r>
         <w:rPr/>
@@ -4620,7 +4630,7 @@
       </w:pPr>
       <w:r>
         <w:rPr/>
-        <w:t>O equipamento estudado é um redutor de velocidade de coroa e rosca sem fim, de eixos ortogonais, fabricado pela WEG-Cestari e pertencente à oficina de mecânica do SENAI Três Lagoas. Pela placa de identificação, trata-se do código M0612802V0D001, série 818100, fabricado em 2018, com relação de transmissão 1:25 (1.750 rpm na entrada e 70 rpm na saída) e lubrificação com óleo sintético ISO VG 460 CLP PAO. O código corresponde à linha Magma M, tamanho 06, cujas instruções de instalação, lubrificação e manutenção constam do manual da linha coroa e rosca do fabricante</w:t>
+        <w:t>O equipamento estudado é um redutor de velocidade de coroa e rosca sem fim, de eixos ortogonais, fabricado pela WEG-Cestari e pertencente à oficina de mecânica do SENAI Três Lagoas. Pela placa de identificação, trata-se do código M0612802V0D001, série 818100, fabricado em 2018, com relação de transmissão 1:25 (1.750 rpm na entrada e 70 rpm na saída) e lubrificação com óleo sintético ISO VG 460 CLP PAO. Pela estrutura do código e pelas tabelas do manual da linha coroa e rosca do fabricante,</w:t>
       </w:r>
       <w:r>
         <w:rPr>
@@ -4630,17 +4640,7 @@
       </w:r>
       <w:r>
         <w:rPr/>
-        <w:t xml:space="preserve"> </w:t>
-      </w:r>
-      <w:r>
-        <w:rPr>
-          <w:shd w:fill="FFFF00" w:val="clear"/>
-        </w:rPr>
-        <w:t>[confirmar a linha e o tamanho com o fabricante ou com o professor]</w:t>
-      </w:r>
-      <w:r>
-        <w:rPr/>
-        <w:t>. Os dados da placa, do manual e do levantamento feito pela equipe no próprio redutor, no qual a carcaça e o eixo de saída foram medidos com paquímetro (Figura 1), estão resumidos no Quadro 1.</w:t>
+        <w:t xml:space="preserve"> o redutor foi identificado como da linha Magma M, tamanho 06. Como não foi possível confirmar essa identificação com o fabricante, ela foi adotada como premissa do estudo, e os dados dela derivados, em especial o volume de óleo, devem ser conferidos antes de uma aplicação industrial. Os dados da placa, do manual e do levantamento feito pela equipe no próprio redutor, no qual a carcaça e o eixo de saída foram medidos com paquímetro (Figura 1), estão resumidos no Quadro 1.</w:t>
       </w:r>
     </w:p>
     <w:p>
@@ -4910,7 +4910,7 @@
                 <w:sz w:val="20"/>
                 <w:szCs w:val="20"/>
               </w:rPr>
-              <w:t>Linha Magma M, tamanho 06, um estágio; código M0612802V0D001; série 818100; fabricado em 2018</w:t>
+              <w:t>Linha Magma M, tamanho 06 (identificada pelo código da placa e pelo manual, sem confirmação do fabricante), um estágio; código M0612802V0D001; série 818100; fabricado em 2018</w:t>
             </w:r>
           </w:p>
         </w:tc>
@@ -6776,7 +6776,7 @@
                 <w:szCs w:val="20"/>
                 <w:vertAlign w:val="superscript"/>
               </w:rPr>
-              <w:t>11</w:t>
+              <w:t>13</w:t>
             </w:r>
           </w:p>
         </w:tc>
@@ -10445,18 +10445,18 @@
       </w:pPr>
       <w:r>
         <w:rPr/>
-        <w:t xml:space="preserve">10. INTERNATIONAL ORGANIZATION FOR STANDARDIZATION; INTERNATIONAL ELECTROTECHNICAL COMMISSION. </w:t>
-      </w:r>
-      <w:r>
-        <w:rPr>
-          <w:b/>
-          <w:bCs/>
-        </w:rPr>
-        <w:t>ISO/IEC 18004</w:t>
-      </w:r>
-      <w:r>
-        <w:rPr/>
-        <w:t>: information technology: automatic identification and data capture techniques: QR Code bar code symbology specification. Geneva: ISO/IEC, 2015.</w:t>
+        <w:t xml:space="preserve">10. OSADA, T. </w:t>
+      </w:r>
+      <w:r>
+        <w:rPr>
+          <w:b/>
+          <w:bCs/>
+        </w:rPr>
+        <w:t>Housekeeping, 5S</w:t>
+      </w:r>
+      <w:r>
+        <w:rPr/>
+        <w:t>: seiri, seiton, seiso, seiketsu, shitsuke. São Paulo: Instituto IMAM, 1992.</w:t>
       </w:r>
     </w:p>
     <w:p>
@@ -10468,7 +10468,53 @@
       </w:pPr>
       <w:r>
         <w:rPr/>
-        <w:t xml:space="preserve">11. BRASIL. Conselho Nacional do Meio Ambiente. </w:t>
+        <w:t xml:space="preserve">11. GALSWORTH, G. D. </w:t>
+      </w:r>
+      <w:r>
+        <w:rPr>
+          <w:b/>
+          <w:bCs/>
+        </w:rPr>
+        <w:t>Visual workplace visual thinking</w:t>
+      </w:r>
+      <w:r>
+        <w:rPr/>
+        <w:t>: creating enterprise excellence through the technologies of the visual workplace. 2. ed. New York: Productivity Press, 2017.</w:t>
+      </w:r>
+    </w:p>
+    <w:p>
+      <w:pPr>
+        <w:pStyle w:val="Normal"/>
+        <w:spacing w:lineRule="auto" w:line="240" w:before="0" w:after="240"/>
+        <w:jc w:val="left"/>
+        <w:rPr/>
+      </w:pPr>
+      <w:r>
+        <w:rPr/>
+        <w:t xml:space="preserve">12. INTERNATIONAL ORGANIZATION FOR STANDARDIZATION; INTERNATIONAL ELECTROTECHNICAL COMMISSION. </w:t>
+      </w:r>
+      <w:r>
+        <w:rPr>
+          <w:b/>
+          <w:bCs/>
+        </w:rPr>
+        <w:t>ISO/IEC 18004</w:t>
+      </w:r>
+      <w:r>
+        <w:rPr/>
+        <w:t>: information technology: automatic identification and data capture techniques: QR Code bar code symbology specification. Geneva: ISO/IEC, 2015.</w:t>
+      </w:r>
+    </w:p>
+    <w:p>
+      <w:pPr>
+        <w:pStyle w:val="Normal"/>
+        <w:spacing w:lineRule="auto" w:line="240" w:before="0" w:after="240"/>
+        <w:jc w:val="left"/>
+        <w:rPr/>
+      </w:pPr>
+      <w:r>
+        <w:rPr/>
+        <w:t xml:space="preserve">13. BRASIL. Conselho Nacional do Meio Ambiente. </w:t>
       </w:r>
       <w:r>
         <w:rPr>
@@ -12670,7 +12716,7 @@
         <w:rPr>
           <w:vertAlign w:val="superscript"/>
         </w:rPr>
-        <w:t>10</w:t>
+        <w:t>12</w:t>
       </w:r>
       <w:r>
         <w:rPr/>
@@ -13111,7 +13157,7 @@
         <w:sz w:val="20"/>
         <w:szCs w:val="20"/>
       </w:rPr>
-      <w:t>31</w:t>
+      <w:t>32</w:t>
     </w:r>
     <w:r>
       <w:rPr>

</xml_diff>

<commit_message>
Documento: aplicação hipotética = pequena esteira transportadora; código OLE-04 e cor laranja do galão declarados fictícios
Co-Authored-By: Claude Opus 5.5 <noreply@anthropic.com>
</commit_message>
<xml_diff>
--- a/Projeto_Integrador_QRCode_Lubrificantes.docx
+++ b/Projeto_Integrador_QRCode_Lubrificantes.docx
@@ -1136,7 +1136,7 @@
           <w:sz w:val="24"/>
           <w:szCs w:val="24"/>
         </w:rPr>
-        <w:t>22</w:t>
+        <w:t>23</w:t>
       </w:r>
       <w:r>
         <w:rPr>
@@ -4005,17 +4005,7 @@
       </w:pPr>
       <w:r>
         <w:rPr/>
-        <w:t xml:space="preserve">O estudo limita-se à lubrificação de um redutor de velocidade de coroa e rosca sem fim WEG-Cestari, da linha Magma M, tamanho 06, com relação de transmissão 1:25 (código M0612802V0D001), pertencente à oficina de mecânica do SENAI Três Lagoas e considerado na posição de trabalho adotada pela equipe, vertical, com a placa de identificação voltada para cima. O redutor está disponível em bancada e é tratado em uma aplicação hipotética </w:t>
-      </w:r>
-      <w:r>
-        <w:rPr>
-          <w:shd w:fill="FFFF00" w:val="clear"/>
-        </w:rPr>
-        <w:t>[descrever a aplicação adotada, por exemplo, o acionamento de uma pequena esteira transportadora]</w:t>
-      </w:r>
-      <w:r>
-        <w:rPr/>
-        <w:t>. São consideradas as etapas de identificação do lubrificante, localização dos pontos de enchimento, dreno e nível, e registro da intervenção. Não fazem parte do escopo a análise laboratorial do óleo, a desmontagem do redutor, a avaliação em campo com o equipamento instalado em uma linha de produção e a integração efetiva com sistemas de gestão de manutenção, que é apresentada apenas como proposta, simulada na tela da ficha.</w:t>
+        <w:t>O estudo limita-se à lubrificação de um redutor de velocidade de coroa e rosca sem fim WEG-Cestari, da linha Magma M, tamanho 06, com relação de transmissão 1:25 (código M0612802V0D001), pertencente à oficina de mecânica do SENAI Três Lagoas e considerado na posição de trabalho adotada pela equipe, vertical, com a placa de identificação voltada para cima. O redutor está disponível em bancada e é tratado em uma aplicação hipotética: o acionamento de uma pequena esteira transportadora. São consideradas as etapas de identificação do lubrificante, localização dos pontos de enchimento, dreno e nível, e registro da intervenção. Não fazem parte do escopo a análise laboratorial do óleo, a desmontagem do redutor, a avaliação em campo com o equipamento instalado em uma linha de produção e a integração efetiva com sistemas de gestão de manutenção, que é apresentada apenas como proposta, simulada na tela da ficha.</w:t>
       </w:r>
     </w:p>
     <w:p>
@@ -6680,17 +6670,7 @@
                 <w:sz w:val="20"/>
                 <w:szCs w:val="20"/>
               </w:rPr>
-              <w:t xml:space="preserve">Tag RED-001-OLE-04; galão identificado pela cor laranja </w:t>
-            </w:r>
-            <w:r>
-              <w:rPr>
-                <w:b w:val="false"/>
-                <w:bCs w:val="false"/>
-                <w:sz w:val="20"/>
-                <w:szCs w:val="20"/>
-                <w:shd w:fill="FFFF00" w:val="clear"/>
-              </w:rPr>
-              <w:t>[confirmar o código e a cor adotados]</w:t>
+              <w:t>Tag RED-001-OLE-04; galão identificado pela cor laranja (código e cor fictícios, adotados como exemplo)</w:t>
             </w:r>
           </w:p>
         </w:tc>
@@ -6945,17 +6925,7 @@
       </w:pPr>
       <w:r>
         <w:rPr/>
-        <w:t xml:space="preserve">A ficha também informa como requisitar o lubrificante ao almoxarifado. Cada óleo recebe um tag no mesmo padrão dos tags das peças mostrados no roteiro de inspeção, formado pelo tag do equipamento (RED-001) e pelo código do item (OLE-04), resultando em RED-001-OLE-04, e uma cor, que é a mesma do galão em que o produto é armazenado </w:t>
-      </w:r>
-      <w:r>
-        <w:rPr>
-          <w:shd w:fill="FFFF00" w:val="clear"/>
-        </w:rPr>
-        <w:t>[confirmar o código e a cor adotados]</w:t>
-      </w:r>
-      <w:r>
-        <w:rPr/>
-        <w:t>. O tag e a cor aparecem na ficha, na orientação de troca e na etiqueta fixada no equipamento, o que reduz o risco de aplicação de um produto incorreto.</w:t>
+        <w:t>A ficha também informa como requisitar o lubrificante ao almoxarifado. Cada óleo recebe um tag no mesmo padrão dos tags das peças mostrados no roteiro de inspeção, formado pelo tag do equipamento (RED-001) e pelo código do item (OLE-04), resultando em RED-001-OLE-04, e uma cor, que é a mesma do galão em que o produto é armazenado. O código OLE-04 e a cor laranja são fictícios, adotados como exemplo neste estudo; em uma implantação real, devem seguir o padrão de codificação e de cores do almoxarifado da empresa. O tag e a cor aparecem na ficha, na orientação de troca e na etiqueta fixada no equipamento, o que reduz o risco de aplicação de um produto incorreto.</w:t>
       </w:r>
     </w:p>
     <w:p>

</xml_diff>

<commit_message>
Documento: LOTO validado com o professor (NR-12 como ref. 14) e pente fino
- Inspeção visual sem bloqueio, validada com o professor; complemento e troca com bloqueio (NR-12)
- Resumo/abstract: participantes 'tiveram cronometradas' / 'were timed'
- 2.2.1 deixa de repetir a frase do volume de 2.1.2
- Sigla NR na lista; lista de ilustrações na ordem do texto (Figura 1 após o Quadro 1)
- Conferidos: dados históricos (Agência Senado), ordem das citações 1–14, numeração do sumário
  e das listas, marcas d'água SENAI nas 33 páginas

Co-Authored-By: Claude Opus 5.5 <noreply@anthropic.com>
</commit_message>
<xml_diff>
--- a/Projeto_Integrador_QRCode_Lubrificantes.docx
+++ b/Projeto_Integrador_QRCode_Lubrificantes.docx
@@ -846,7 +846,7 @@
       </w:pPr>
       <w:r>
         <w:rPr/>
-        <w:t xml:space="preserve">Este trabalho apresenta o desenvolvimento e a avaliação de um sistema digital, baseado em QR Code, para apoiar o mecânico na identificação e na aplicação correta do lubrificante em um redutor de velocidade de coroa e rosca sem fim WEG-Cestari, da linha Magma M, com relação de transmissão 1:25, lubrificado por imersão em óleo sintético PAO ISO VG 460 e pertencente à oficina de mecânica do SENAI Três Lagoas. A motivação do estudo está no tempo despendido, durante a manutenção, na busca por informações como tipo de lubrificante, viscosidade, volume e pontos de enchimento, dreno e nível, além do risco de erro na aplicação, em especial a mistura de óleos incompatíveis. A solução consiste em uma etiqueta resistente, fixada junto ao equipamento, que dá acesso, pelo celular ou pelo tablet, a uma ficha objetiva com os dados de lubrificação, alertas de segurança, passo a passo da troca com fotografias do próprio redutor, modelo tridimensional com os pontos de lubrificação, conferência do galão de óleo e registro da intervenção. Os dados do redutor foram obtidos da placa de identificação, do manual do fabricante e do levantamento feito no próprio equipamento, e o ganho de tempo foi avaliado por cronometragem em ambiente didático: cinco participantes cronometraram as etapas de identificação do lubrificante, localização dos pontos e registro, consultando a placa e o manual do fabricante (método tradicional) e a ficha acessada pelo QR Code, em ordem contrabalanceada. Os dados permitem calcular a redução percentual do tempo, o ganho anual e uma estimativa de retorno financeiro, relacionando-os ao tempo de execução da manutenção preventiva e aos princípios da Manutenção Produtiva Total. </w:t>
+        <w:t xml:space="preserve">Este trabalho apresenta o desenvolvimento e a avaliação de um sistema digital, baseado em QR Code, para apoiar o mecânico na identificação e na aplicação correta do lubrificante em um redutor de velocidade de coroa e rosca sem fim WEG-Cestari, da linha Magma M, com relação de transmissão 1:25, lubrificado por imersão em óleo sintético PAO ISO VG 460 e pertencente à oficina de mecânica do SENAI Três Lagoas. A motivação do estudo está no tempo despendido, durante a manutenção, na busca por informações como tipo de lubrificante, viscosidade, volume e pontos de enchimento, dreno e nível, além do risco de erro na aplicação, em especial a mistura de óleos incompatíveis. A solução consiste em uma etiqueta resistente, fixada junto ao equipamento, que dá acesso, pelo celular ou pelo tablet, a uma ficha objetiva com os dados de lubrificação, alertas de segurança, passo a passo da troca com fotografias do próprio redutor, modelo tridimensional com os pontos de lubrificação, conferência do galão de óleo e registro da intervenção. Os dados do redutor foram obtidos da placa de identificação, do manual do fabricante e do levantamento feito no próprio equipamento, e o ganho de tempo foi avaliado por cronometragem em ambiente didático: cinco participantes tiveram cronometradas as etapas de identificação do lubrificante, localização dos pontos e registro, consultando a placa e o manual do fabricante (método tradicional) e a ficha acessada pelo QR Code, em ordem contrabalanceada. Os dados permitem calcular a redução percentual do tempo, o ganho anual e uma estimativa de retorno financeiro, relacionando-os ao tempo de execução da manutenção preventiva e aos princípios da Manutenção Produtiva Total. </w:t>
       </w:r>
       <w:r>
         <w:rPr>
@@ -905,7 +905,7 @@
       </w:pPr>
       <w:r>
         <w:rPr/>
-        <w:t xml:space="preserve">This work presents the development and evaluation of a QR Code-based digital system to support mechanics in identifying and correctly applying the lubricant of a WEG-Cestari Magma M worm gear reducer, with a 1:25 ratio, oil-bath lubricated with ISO VG 460 synthetic PAO oil, belonging to the mechanical workshop of SENAI Três Lagoas. The study is motivated by the time spent during maintenance searching for information such as lubricant type, viscosity, volume and the location of fill, drain and level points, as well as by the risk of application errors, especially the mixing of incompatible oils. The solution consists of a durable label placed next to the equipment that gives access, through a smartphone or tablet, to a concise data sheet with lubrication data, safety alerts, a step-by-step oil change guide with photographs of the reducer itself, a three-dimensional model showing the lubrication points, an oil container check and an intervention record. The reducer data were obtained from its nameplate, from the manufacturer's manual and from a survey of the equipment itself, and the time gain was assessed by time measurements in a teaching environment: five participants timed the identification, point location and recording steps, consulting the nameplate and the manufacturer's manual (traditional method) and the data sheet accessed by the QR Code, in counterbalanced order. The data allow the calculation of the percentage time reduction, the annual gain and an estimate of financial return, relating them to the execution time of preventive maintenance and to the principles of Total Productive Maintenance. </w:t>
+        <w:t xml:space="preserve">This work presents the development and evaluation of a QR Code-based digital system to support mechanics in identifying and correctly applying the lubricant of a WEG-Cestari Magma M worm gear reducer, with a 1:25 ratio, oil-bath lubricated with ISO VG 460 synthetic PAO oil, belonging to the mechanical workshop of SENAI Três Lagoas. The study is motivated by the time spent during maintenance searching for information such as lubricant type, viscosity, volume and the location of fill, drain and level points, as well as by the risk of application errors, especially the mixing of incompatible oils. The solution consists of a durable label placed next to the equipment that gives access, through a smartphone or tablet, to a concise data sheet with lubrication data, safety alerts, a step-by-step oil change guide with photographs of the reducer itself, a three-dimensional model showing the lubrication points, an oil container check and an intervention record. The reducer data were obtained from its nameplate, from the manufacturer's manual and from a survey of the equipment itself, and the time gain was assessed by time measurements in a teaching environment: five participants were timed in the identification, point location and recording steps, consulting the nameplate and the manufacturer's manual (traditional method) and the data sheet accessed by the QR Code, in counterbalanced order. The data allow the calculation of the percentage time reduction, the annual gain and an estimate of financial return, relating them to the execution time of preventive maintenance and to the principles of Total Productive Maintenance. </w:t>
       </w:r>
       <w:r>
         <w:rPr>
@@ -1037,7 +1037,7 @@
           <w:sz w:val="24"/>
           <w:szCs w:val="24"/>
         </w:rPr>
-        <w:t>Quadro 2 – Ficha de lubrificação do redutor RED-001</w:t>
+        <w:t>Figura 1 – Medição da carcaça do redutor com paquímetro</w:t>
       </w:r>
       <w:r>
         <w:rPr>
@@ -1058,7 +1058,7 @@
           <w:sz w:val="24"/>
           <w:szCs w:val="24"/>
         </w:rPr>
-        <w:instrText xml:space="preserve"> PAGEREF pag02 \h </w:instrText>
+        <w:instrText xml:space="preserve"> PAGEREF pagfig1 \h </w:instrText>
       </w:r>
       <w:r>
         <w:rPr>
@@ -1072,7 +1072,7 @@
           <w:sz w:val="24"/>
           <w:szCs w:val="24"/>
         </w:rPr>
-        <w:t>19</w:t>
+        <w:t>18</w:t>
       </w:r>
       <w:r>
         <w:rPr>
@@ -1101,7 +1101,7 @@
           <w:sz w:val="24"/>
           <w:szCs w:val="24"/>
         </w:rPr>
-        <w:t>Quadro 3 – Etapas cronometradas nos dois métodos</w:t>
+        <w:t>Quadro 2 – Ficha de lubrificação do redutor RED-001</w:t>
       </w:r>
       <w:r>
         <w:rPr>
@@ -1122,7 +1122,7 @@
           <w:sz w:val="24"/>
           <w:szCs w:val="24"/>
         </w:rPr>
-        <w:instrText xml:space="preserve"> PAGEREF pag03 \h </w:instrText>
+        <w:instrText xml:space="preserve"> PAGEREF pag02 \h </w:instrText>
       </w:r>
       <w:r>
         <w:rPr>
@@ -1136,7 +1136,7 @@
           <w:sz w:val="24"/>
           <w:szCs w:val="24"/>
         </w:rPr>
-        <w:t>23</w:t>
+        <w:t>19</w:t>
       </w:r>
       <w:r>
         <w:rPr>
@@ -1165,7 +1165,7 @@
           <w:sz w:val="24"/>
           <w:szCs w:val="24"/>
         </w:rPr>
-        <w:t>Figura 1 – Medição da carcaça do redutor com paquímetro</w:t>
+        <w:t>Quadro 3 – Etapas cronometradas nos dois métodos</w:t>
       </w:r>
       <w:r>
         <w:rPr>
@@ -1186,7 +1186,7 @@
           <w:sz w:val="24"/>
           <w:szCs w:val="24"/>
         </w:rPr>
-        <w:instrText xml:space="preserve"> PAGEREF pagfig1 \h </w:instrText>
+        <w:instrText xml:space="preserve"> PAGEREF pag03 \h </w:instrText>
       </w:r>
       <w:r>
         <w:rPr>
@@ -1200,7 +1200,7 @@
           <w:sz w:val="24"/>
           <w:szCs w:val="24"/>
         </w:rPr>
-        <w:t>18</w:t>
+        <w:t>23</w:t>
       </w:r>
       <w:r>
         <w:rPr>
@@ -1807,6 +1807,29 @@
         <w:rPr/>
         <w:tab/>
         <w:t>Near Field Communication</w:t>
+      </w:r>
+    </w:p>
+    <w:p>
+      <w:pPr>
+        <w:pStyle w:val="Normal"/>
+        <w:tabs>
+          <w:tab w:val="clear" w:pos="720"/>
+          <w:tab w:val="left" w:pos="1800" w:leader="none"/>
+        </w:tabs>
+        <w:spacing w:lineRule="auto" w:line="360" w:before="0" w:after="80"/>
+        <w:rPr/>
+      </w:pPr>
+      <w:r>
+        <w:rPr>
+          <w:b/>
+          <w:bCs/>
+        </w:rPr>
+        <w:t>NR</w:t>
+      </w:r>
+      <w:r>
+        <w:rPr/>
+        <w:tab/>
+        <w:t>Norma Regulamentadora</w:t>
       </w:r>
     </w:p>
     <w:p>
@@ -5821,17 +5844,7 @@
       </w:pPr>
       <w:r>
         <w:rPr/>
-        <w:t>Para a linha Magma M, o fabricante informa um único volume de óleo por tamanho, válido para todas as posições de trabalho: 0,87 L no tamanho 06 de um estágio.</w:t>
-      </w:r>
-      <w:r>
-        <w:rPr>
-          <w:vertAlign w:val="superscript"/>
-        </w:rPr>
-        <w:t>6</w:t>
-      </w:r>
-      <w:r>
-        <w:rPr/>
-        <w:t xml:space="preserve"> O redutor do estudo foi considerado na posição de trabalho adotada pela equipe, vertical, com a placa de identificação voltada para cima, e é nessa posição que os pontos de lubrificação foram identificados. O Quadro 2 apresenta a ficha de lubrificação preenchida com esses dados.</w:t>
+        <w:t>Como visto na seção 2.1.2, o volume de óleo da linha Magma M é o mesmo para todas as posições de trabalho (0,87 L no tamanho 06). O redutor do estudo foi considerado na posição de trabalho adotada pela equipe, vertical, com a placa de identificação voltada para cima, e é nessa posição que os pontos de lubrificação foram identificados. O Quadro 2 apresenta a ficha de lubrificação preenchida com esses dados.</w:t>
       </w:r>
     </w:p>
     <w:p>
@@ -6825,17 +6838,17 @@
       </w:pPr>
       <w:r>
         <w:rPr/>
-        <w:t xml:space="preserve">O registro da lubrificação foi projetado para ser feito em poucos toques: o mecânico escolhe o tipo de intervenção (inspeção, complemento ou troca); no complemento e na troca, confirma, em um único item de checklist, que o equipamento está bloqueado e o bocal limpo, e, na troca, a quantidade já aparece preenchida com o volume indicado pelo fabricante. A inspeção é apenas visual, feita por fora e com a máquina em funcionamento (vazamentos, ruído e temperatura da carcaça), sem abertura de bujões e, por isso, sem bloqueio </w:t>
-      </w:r>
-      <w:r>
-        <w:rPr>
-          <w:shd w:fill="FFFF00" w:val="clear"/>
-        </w:rPr>
-        <w:t>[confirmar a regra com o professor e com o procedimento de segurança]</w:t>
-      </w:r>
-      <w:r>
-        <w:rPr/>
-        <w:t>; para conferir o nível ou completar o óleo, a intervenção é registrada como complemento. Há um campo opcional para a temperatura da carcaça, e o nome do responsável fica memorizado no aparelho. O histórico dos últimos registros fica recolhido na tela, para não atrapalhar a consulta. O QR Code é gerado a partir do endereço da página de cada equipamento; como a lubrificação e a inspeção do redutor são trabalhos de projetos integradores diferentes, cada uma tem o seu QR Code, que abre diretamente a parte correspondente.</w:t>
+        <w:t>O registro da lubrificação foi projetado para ser feito em poucos toques: o mecânico escolhe o tipo de intervenção (inspeção, complemento ou troca); no complemento e na troca, confirma, em um único item de checklist, que o equipamento está bloqueado e o bocal limpo, e, na troca, a quantidade já aparece preenchida com o volume indicado pelo fabricante. A inspeção é apenas visual, feita por fora e com a máquina em funcionamento (vazamentos, ruído e temperatura da carcaça), sem abertura de bujões e, por isso, sem bloqueio, regra validada com o professor; já o complemento e a troca, que exigem abrir o redutor, são feitos com o equipamento parado e bloqueado, como determina a NR-12 para as intervenções de manutenção em máquinas;</w:t>
+      </w:r>
+      <w:r>
+        <w:rPr>
+          <w:vertAlign w:val="superscript"/>
+        </w:rPr>
+        <w:t>14</w:t>
+      </w:r>
+      <w:r>
+        <w:rPr/>
+        <w:t xml:space="preserve"> para conferir o nível ou completar o óleo, a intervenção é registrada como complemento. Há um campo opcional para a temperatura da carcaça, e o nome do responsável fica memorizado no aparelho. O histórico dos últimos registros fica recolhido na tela, para não atrapalhar a consulta. O QR Code é gerado a partir do endereço da página de cada equipamento; como a lubrificação e a inspeção do redutor são trabalhos de projetos integradores diferentes, cada uma tem o seu QR Code, que abre diretamente a parte correspondente.</w:t>
       </w:r>
     </w:p>
     <w:p>
@@ -10496,6 +10509,29 @@
       <w:r>
         <w:rPr/>
         <w:t>. Dispõe sobre o recolhimento, coleta e destinação final de óleo lubrificante usado ou contaminado. Brasília, DF: CONAMA, 2005.</w:t>
+      </w:r>
+    </w:p>
+    <w:p>
+      <w:pPr>
+        <w:pStyle w:val="Normal"/>
+        <w:spacing w:lineRule="auto" w:line="240" w:before="0" w:after="240"/>
+        <w:jc w:val="left"/>
+        <w:rPr/>
+      </w:pPr>
+      <w:r>
+        <w:rPr/>
+        <w:t xml:space="preserve">14. BRASIL. Ministério do Trabalho e Emprego. </w:t>
+      </w:r>
+      <w:r>
+        <w:rPr>
+          <w:b/>
+          <w:bCs/>
+        </w:rPr>
+        <w:t>NR 12</w:t>
+      </w:r>
+      <w:r>
+        <w:rPr/>
+        <w:t>: segurança no trabalho em máquinas e equipamentos. Brasília, DF: MTE, 2019.</w:t>
       </w:r>
       <w:r>
         <w:br w:type="page"/>

</xml_diff>

<commit_message>
Documento: inspeção visual mensal (12/ano) e custo da hora do mecânico (Portal Salário/Novo Caged, CBO 9113-05, ref. 15)
- Quadro 2: inspeção visual mensal
- 2.2.4: inspeções visuais mensais de vazamento, ruído e temperatura (o nível é conferido
  no complemento, com bloqueio, como validado com o professor)
- Custo: R$ 3.150/mês, 44 h/semana → R$ 14,32/h (÷ 220 h), sem encargos (conservador)
- Planilha já com 12 intervenções/ano e R$ 14,32/h preenchidos

Co-Authored-By: Claude Opus 5.5 <noreply@anthropic.com>
</commit_message>
<xml_diff>
--- a/Projeto_Integrador_QRCode_Lubrificantes.docx
+++ b/Projeto_Integrador_QRCode_Lubrificantes.docx
@@ -1414,7 +1414,7 @@
           <w:sz w:val="24"/>
           <w:szCs w:val="24"/>
         </w:rPr>
-        <w:t>24</w:t>
+        <w:t>25</w:t>
       </w:r>
       <w:r>
         <w:rPr>
@@ -6369,17 +6369,7 @@
                 <w:sz w:val="20"/>
                 <w:szCs w:val="20"/>
               </w:rPr>
-              <w:t xml:space="preserve">Troca conforme a temperatura do óleo: 15.000 h (80 °C); 10.000 h (85 °C); 7.500 h (90 °C). Avaliar o óleo nas primeiras 500 h. Inspeção visual: </w:t>
-            </w:r>
-            <w:r>
-              <w:rPr>
-                <w:b w:val="false"/>
-                <w:bCs w:val="false"/>
-                <w:sz w:val="20"/>
-                <w:szCs w:val="20"/>
-                <w:shd w:fill="FFFF00" w:val="clear"/>
-              </w:rPr>
-              <w:t>[definir frequência no PCM]</w:t>
+              <w:t>Troca conforme a temperatura do óleo: 15.000 h (80 °C); 10.000 h (85 °C); 7.500 h (90 °C). Avaliar o óleo nas primeiras 500 h. Inspeção visual: mensal</w:t>
             </w:r>
           </w:p>
         </w:tc>
@@ -7587,17 +7577,7 @@
       </w:pPr>
       <w:r>
         <w:rPr/>
-        <w:t xml:space="preserve">Com as médias dos tempos de cada método, a redução percentual foi calculada pela expressão (T tradicional − T QR) ÷ T tradicional × 100. O tempo ganho por ano foi obtido multiplicando-se o tempo ganho em cada intervenção pelo número anual de intervenções de lubrificação do redutor, considerando, para a aplicação hipotética adotada, inspeções periódicas de nível, vazamento e temperatura </w:t>
-      </w:r>
-      <w:r>
-        <w:rPr>
-          <w:shd w:fill="FFFF00" w:val="clear"/>
-        </w:rPr>
-        <w:t>[definir a frequência adotada, por exemplo, mensal, o que resulta em 12 intervenções por ano]</w:t>
-      </w:r>
-      <w:r>
-        <w:rPr/>
-        <w:t>, além das trocas e complementações de óleo. Esse cuidado é necessário porque, no redutor estudado, os intervalos de troca do óleo sintético são longos, e a maior parte das intervenções é de inspeção.</w:t>
+        <w:t>Com as médias dos tempos de cada método, a redução percentual foi calculada pela expressão (T tradicional − T QR) ÷ T tradicional × 100. O tempo ganho por ano foi obtido multiplicando-se o tempo ganho em cada intervenção pelo número anual de intervenções de lubrificação do redutor, considerando, para a aplicação hipotética adotada, inspeções visuais mensais de vazamento, ruído e temperatura da carcaça, o que resulta em 12 intervenções por ano, além das trocas e complementações de óleo. Esse cuidado é necessário porque, no redutor estudado, os intervalos de troca do óleo sintético são longos, e a maior parte das intervenções é de inspeção.</w:t>
       </w:r>
     </w:p>
     <w:p>
@@ -7611,17 +7591,17 @@
       </w:pPr>
       <w:r>
         <w:rPr/>
-        <w:t xml:space="preserve">O retorno financeiro foi estimado comparando-se o custo de implantação (etiquetas, impressão e hospedagem da página) com o custo evitado. Foram considerados dois cenários: quando a busca de informações ocorre com o equipamento parado, o custo evitado corresponde às horas de parada multiplicadas pelo custo horário da linha; quando a busca ocorre antes da parada, o ganho corresponde apenas às horas de trabalho do mecânico multiplicadas pelo custo da sua hora. Como a aplicação é hipotética, os custos horários utilizados são valores de referência </w:t>
-      </w:r>
-      <w:r>
-        <w:rPr>
-          <w:shd w:fill="FFFF00" w:val="clear"/>
-        </w:rPr>
-        <w:t>[indicar os valores adotados e a fonte, por exemplo, o salário médio de um mecânico de manutenção]</w:t>
-      </w:r>
-      <w:r>
-        <w:rPr/>
-        <w:t>.</w:t>
+        <w:t>O retorno financeiro foi estimado comparando-se o custo de implantação (etiquetas, impressão e hospedagem da página) com o custo evitado. Foram considerados dois cenários: quando a busca de informações ocorre com o equipamento parado, o custo evitado corresponde às horas de parada multiplicadas pelo custo horário da linha; quando a busca ocorre antes da parada, o ganho corresponde apenas às horas de trabalho do mecânico multiplicadas pelo custo da sua hora. Como a aplicação é hipotética e não há custo de linha de produção a considerar, foi quantificado o segundo cenário, com o custo da hora do mecânico obtido do salário médio do mecânico de manutenção de máquinas em geral (CBO 9113-05): R$ 3.150,00 por mês, para jornada de 44 horas semanais, segundo dados do Novo Caged reunidos pelo Portal Salário.</w:t>
+      </w:r>
+      <w:r>
+        <w:rPr>
+          <w:vertAlign w:val="superscript"/>
+        </w:rPr>
+        <w:t>15</w:t>
+      </w:r>
+      <w:r>
+        <w:rPr/>
+        <w:t xml:space="preserve"> Dividido por 220 horas mensais, esse salário corresponde a cerca de R$ 14,32 por hora; como os encargos trabalhistas não foram somados, a estimativa é conservadora.</w:t>
       </w:r>
     </w:p>
     <w:p>
@@ -10532,6 +10512,29 @@
       <w:r>
         <w:rPr/>
         <w:t>: segurança no trabalho em máquinas e equipamentos. Brasília, DF: MTE, 2019.</w:t>
+      </w:r>
+    </w:p>
+    <w:p>
+      <w:pPr>
+        <w:pStyle w:val="Normal"/>
+        <w:spacing w:lineRule="auto" w:line="240" w:before="0" w:after="240"/>
+        <w:jc w:val="left"/>
+        <w:rPr/>
+      </w:pPr>
+      <w:r>
+        <w:rPr/>
+        <w:t xml:space="preserve">15. PORTAL SALÁRIO. </w:t>
+      </w:r>
+      <w:r>
+        <w:rPr>
+          <w:b/>
+          <w:bCs/>
+        </w:rPr>
+        <w:t>Mecânico de manutenção de máquinas em geral</w:t>
+      </w:r>
+      <w:r>
+        <w:rPr/>
+        <w:t>: salário 2026 (CBO 9113-05). [S. l.]: Salario.com.br, 2026. Disponível em: https://www.salario.com.br/profissao/mecanico-de-manutencao-de-maquinas-em-geral-cbo-911305/. Acesso em: 19 out. 2026.</w:t>
       </w:r>
       <w:r>
         <w:br w:type="page"/>

</xml_diff>

<commit_message>
Documento: massa do redutor 18,1 kg (pesado sem os bujões de dreno e nível)
Co-Authored-By: Claude Opus 5.5 <noreply@anthropic.com>
</commit_message>
<xml_diff>
--- a/Projeto_Integrador_QRCode_Lubrificantes.docx
+++ b/Projeto_Integrador_QRCode_Lubrificantes.docx
@@ -5693,17 +5693,7 @@
                 <w:sz w:val="20"/>
                 <w:szCs w:val="20"/>
               </w:rPr>
-              <w:t xml:space="preserve">Altura de 225 mm e largura da carcaça de 116 mm (medidas pela equipe com paquímetro); massa: </w:t>
-            </w:r>
-            <w:r>
-              <w:rPr>
-                <w:b w:val="false"/>
-                <w:bCs w:val="false"/>
-                <w:sz w:val="20"/>
-                <w:szCs w:val="20"/>
-                <w:shd w:fill="FFFF00" w:val="clear"/>
-              </w:rPr>
-              <w:t>[pesar o redutor]</w:t>
+              <w:t>Altura de 225 mm e largura da carcaça de 116 mm (medidas pela equipe com paquímetro); massa: 18,1 kg (pesado pela equipe sem os bujões de dreno e de nível)</w:t>
             </w:r>
           </w:p>
         </w:tc>

</xml_diff>

<commit_message>
Documento: carcaça em ferro fundido, manual em PDF no celular, etiqueta no ponto do modelo 3D (plastificada, dupla-face), local da cronometragem; PDFs de impressão separados e etiquetas QR
Co-Authored-By: Claude Opus 5.5 <noreply@anthropic.com>
</commit_message>
<xml_diff>
--- a/Projeto_Integrador_QRCode_Lubrificantes.docx
+++ b/Projeto_Integrador_QRCode_Lubrificantes.docx
@@ -5419,17 +5419,7 @@
                 <w:sz w:val="20"/>
                 <w:szCs w:val="20"/>
               </w:rPr>
-              <w:t xml:space="preserve">Fundida, pintada em azul sobre fundo vermelho, com sapatas de fixação </w:t>
-            </w:r>
-            <w:r>
-              <w:rPr>
-                <w:b w:val="false"/>
-                <w:bCs w:val="false"/>
-                <w:sz w:val="20"/>
-                <w:szCs w:val="20"/>
-                <w:shd w:fill="FFFF00" w:val="clear"/>
-              </w:rPr>
-              <w:t>[confirmar o material]</w:t>
+              <w:t>Fundida, pintada em azul sobre fundo vermelho, com sapatas de fixação ferro fundido (não é de alumínio, conforme verificado pela equipe)</w:t>
             </w:r>
           </w:p>
         </w:tc>
@@ -7188,37 +7178,7 @@
       </w:r>
       <w:r>
         <w:rPr/>
-        <w:t xml:space="preserve">, cada um executando a tarefa pelos dois métodos </w:t>
-      </w:r>
-      <w:r>
-        <w:rPr>
-          <w:shd w:fill="FFFF00" w:val="clear"/>
-        </w:rPr>
-        <w:t>[informar o local: oficina de mecânica, junto ao redutor]</w:t>
-      </w:r>
-      <w:r>
-        <w:rPr/>
-        <w:t xml:space="preserve">. No método tradicional, o participante consultou a placa de identificação e o manual da linha coroa e rosca do fabricante </w:t>
-      </w:r>
-      <w:r>
-        <w:rPr>
-          <w:shd w:fill="FFFF00" w:val="clear"/>
-        </w:rPr>
-        <w:t>[impresso ou em PDF]</w:t>
-      </w:r>
-      <w:r>
-        <w:rPr/>
-        <w:t xml:space="preserve"> e registrou a intervenção em formulário de papel. No método com QR Code, escaneou a etiqueta impressa, afixada </w:t>
-      </w:r>
-      <w:r>
-        <w:rPr>
-          <w:shd w:fill="FFFF00" w:val="clear"/>
-        </w:rPr>
-        <w:t>[no redutor ou junto a ele]</w:t>
-      </w:r>
-      <w:r>
-        <w:rPr/>
-        <w:t>, leu a ficha e registrou a intervenção no celular. Os tempos foram medidos com o cronômetro de um celular. O Quadro 3 apresenta as etapas medidas.</w:t>
+        <w:t>, cada um executando a tarefa pelos dois métodos na oficina de mecânica do SENAI Três Lagoas, junto ao redutor. No método tradicional, o participante consultou a placa de identificação e o manual da linha coroa e rosca do fabricante, em PDF no celular, e registrou a intervenção em formulário de papel. No método com QR Code, escaneou a etiqueta impressa, afixada no próprio redutor, leu a ficha e registrou a intervenção no celular. Os tempos foram medidos com o cronômetro de um celular. O Quadro 3 apresenta as etapas medidas.</w:t>
       </w:r>
     </w:p>
     <w:p>
@@ -12881,27 +12841,7 @@
       </w:pPr>
       <w:r>
         <w:rPr/>
-        <w:t xml:space="preserve">A etiqueta não deve ser colada sobre a placa de identificação do fabricante, sobre o respiro ou os bujões, nem em regiões que esquentam ou recebem respingos de óleo. No redutor estudado, sugere-se a parte superior da face lateral oposta ao motor, que é lisa e fica visível </w:t>
-      </w:r>
-      <w:r>
-        <w:rPr>
-          <w:shd w:fill="FFFF00" w:val="clear"/>
-        </w:rPr>
-        <w:t>[confirmar o local de fixação]</w:t>
-      </w:r>
-      <w:r>
-        <w:rPr/>
-        <w:t xml:space="preserve">, ou uma plaqueta de alumínio presa junto à fixação do redutor, em local de fácil acesso. Na cronometragem, a etiqueta foi impressa em papel e afixada em </w:t>
-      </w:r>
-      <w:r>
-        <w:rPr>
-          <w:shd w:fill="FFFF00" w:val="clear"/>
-        </w:rPr>
-        <w:t>[descrever o suporte usado]</w:t>
-      </w:r>
-      <w:r>
-        <w:rPr/>
-        <w:t>.</w:t>
+        <w:t>A etiqueta não deve ser colada sobre a placa de identificação do fabricante, sobre o respiro ou os bujões, nem em regiões que esquentam ou recebem respingos de óleo. No redutor estudado, a etiqueta foi fixada na parte superior da face oposta ao motor (face da tampa cega), que é lisa e fica visível, no mesmo ponto indicado no modelo tridimensional da ficha digital; em outros equipamentos, pode-se usar uma plaqueta de alumínio presa junto à fixação, em local de fácil acesso. Na cronometragem, a etiqueta foi impressa em papel, plastificada e colada com fita dupla-face.</w:t>
       </w:r>
     </w:p>
     <w:p>
@@ -13667,7 +13607,7 @@
                 <w:sz w:val="20"/>
                 <w:szCs w:val="20"/>
               </w:rPr>
-              <w:t>Metal fundido pintado (ferro fundido ou alumínio, a confirmar); aloja os eixos e guarda o óleo</w:t>
+              <w:t>Ferro fundido pintado; aloja os eixos e guarda o óleo</w:t>
             </w:r>
           </w:p>
         </w:tc>

</xml_diff>

<commit_message>
Resultados da cronometragem no documento e apresentação
</commit_message>
<xml_diff>
--- a/Projeto_Integrador_QRCode_Lubrificantes.docx
+++ b/Projeto_Integrador_QRCode_Lubrificantes.docx
@@ -846,13 +846,7 @@
       </w:pPr>
       <w:r>
         <w:rPr/>
-        <w:t xml:space="preserve">Este trabalho apresenta o desenvolvimento e a avaliação de um sistema digital, baseado em QR Code, para apoiar o mecânico na identificação e na aplicação correta do lubrificante em um redutor de velocidade de coroa e rosca sem fim WEG-Cestari, da linha Magma M, com relação de transmissão 1:25, lubrificado por imersão em óleo sintético PAO ISO VG 460 e pertencente à oficina de mecânica do SENAI Três Lagoas. A motivação do estudo está no tempo despendido, durante a manutenção, na busca por informações como tipo de lubrificante, viscosidade, volume e pontos de enchimento, dreno e nível, além do risco de erro na aplicação, em especial a mistura de óleos incompatíveis. A solução consiste em uma etiqueta resistente, fixada junto ao equipamento, que dá acesso, pelo celular ou pelo tablet, a uma ficha objetiva com os dados de lubrificação, alertas de segurança, passo a passo da troca com fotografias do próprio redutor, modelo tridimensional com os pontos de lubrificação, conferência do galão de óleo e registro da intervenção. Os dados do redutor foram obtidos da placa de identificação, do manual do fabricante e do levantamento feito no próprio equipamento, e o ganho de tempo foi avaliado por cronometragem em ambiente didático: cinco participantes tiveram cronometradas as etapas de identificação do lubrificante, localização dos pontos e registro, consultando a placa e o manual do fabricante (método tradicional) e a ficha acessada pelo QR Code, em ordem contrabalanceada. Os dados permitem calcular a redução percentual do tempo, o ganho anual e uma estimativa de retorno financeiro, relacionando-os ao tempo de execução da manutenção preventiva e aos princípios da Manutenção Produtiva Total. </w:t>
-      </w:r>
-      <w:r>
-        <w:rPr>
-          <w:shd w:fill="FFFF00" w:val="clear"/>
-        </w:rPr>
-        <w:t>[Inserir os principais resultados e conclusões após a cronometragem.]</w:t>
+        <w:t>Este trabalho apresenta o desenvolvimento e a avaliação de um sistema digital, baseado em QR Code, para apoiar o mecânico na identificação e na aplicação correta do lubrificante em um redutor de velocidade de coroa e rosca sem fim WEG-Cestari, da linha Magma M, com relação de transmissão 1:25, lubrificado por imersão em óleo sintético PAO ISO VG 460 e pertencente à oficina de mecânica do SENAI Três Lagoas. A motivação do estudo está no tempo despendido, durante a manutenção, na busca por informações como tipo de lubrificante, viscosidade, volume e pontos de enchimento, dreno e nível, além do risco de erro na aplicação, em especial a mistura de óleos incompatíveis. A solução consiste em uma etiqueta resistente, fixada junto ao equipamento, que dá acesso, pelo celular ou pelo tablet, a uma ficha objetiva com os dados de lubrificação, alertas de segurança, passo a passo da troca com fotografias do próprio redutor, modelo tridimensional com os pontos de lubrificação, conferência do galão de óleo e registro da intervenção. Os dados do redutor foram obtidos da placa de identificação, do manual do fabricante e do levantamento feito no próprio equipamento, e o ganho de tempo foi avaliado por cronometragem em ambiente didático: cinco participantes tiveram cronometrado o tempo total das etapas de identificação do lubrificante, localização dos pontos e registro, consultando a placa e o manual do fabricante (método tradicional) e a ficha acessada pelo QR Code. Os dados permitem calcular a redução percentual do tempo, o ganho anual e uma estimativa de retorno financeiro, relacionando-os ao tempo de execução da manutenção preventiva e aos princípios da Manutenção Produtiva Total. O tempo médio caiu de 10 min 37 s no método tradicional para 2 min 58 s com o QR Code, redução de 72,0 %, e todos os participantes foram mais rápidos com a ficha; o ganho estimado é de cerca de 1,53 h e R$ 21,91 por ano por redutor, valor que cresce com o número de equipamentos atendidos.</w:t>
       </w:r>
     </w:p>
     <w:p>
@@ -905,13 +899,7 @@
       </w:pPr>
       <w:r>
         <w:rPr/>
-        <w:t xml:space="preserve">This work presents the development and evaluation of a QR Code-based digital system to support mechanics in identifying and correctly applying the lubricant of a WEG-Cestari Magma M worm gear reducer, with a 1:25 ratio, oil-bath lubricated with ISO VG 460 synthetic PAO oil, belonging to the mechanical workshop of SENAI Três Lagoas. The study is motivated by the time spent during maintenance searching for information such as lubricant type, viscosity, volume and the location of fill, drain and level points, as well as by the risk of application errors, especially the mixing of incompatible oils. The solution consists of a durable label placed next to the equipment that gives access, through a smartphone or tablet, to a concise data sheet with lubrication data, safety alerts, a step-by-step oil change guide with photographs of the reducer itself, a three-dimensional model showing the lubrication points, an oil container check and an intervention record. The reducer data were obtained from its nameplate, from the manufacturer's manual and from a survey of the equipment itself, and the time gain was assessed by time measurements in a teaching environment: five participants were timed in the identification, point location and recording steps, consulting the nameplate and the manufacturer's manual (traditional method) and the data sheet accessed by the QR Code, in counterbalanced order. The data allow the calculation of the percentage time reduction, the annual gain and an estimate of financial return, relating them to the execution time of preventive maintenance and to the principles of Total Productive Maintenance. </w:t>
-      </w:r>
-      <w:r>
-        <w:rPr>
-          <w:shd w:fill="FFFF00" w:val="clear"/>
-        </w:rPr>
-        <w:t>[Insert the main results and conclusions after the time measurements.]</w:t>
+        <w:t>This work presents the development and evaluation of a QR Code-based digital system to support mechanics in identifying and correctly applying the lubricant of a WEG-Cestari Magma M worm gear reducer, with a 1:25 ratio, oil-bath lubricated with ISO VG 460 synthetic PAO oil, belonging to the mechanical workshop of SENAI Três Lagoas. The study is motivated by the time spent during maintenance searching for information such as lubricant type, viscosity, volume and the location of fill, drain and level points, as well as by the risk of application errors, especially the mixing of incompatible oils. The solution consists of a durable label placed next to the equipment that gives access, through a smartphone or tablet, to a concise data sheet with lubrication data, safety alerts, a step-by-step oil change guide with photographs of the reducer itself, a three-dimensional model showing the lubrication points, an oil container check and an intervention record. The reducer data were obtained from its nameplate, from the manufacturer's manual and from a survey of the equipment itself, and the time gain was assessed by time measurements in a teaching environment: five participants had the total time of the identification, point location and recording steps measured, consulting the nameplate and the manufacturer's manual (traditional method) and the data sheet accessed by the QR Code. The data allow the calculation of the percentage time reduction, the annual gain and an estimate of financial return, relating them to the execution time of preventive maintenance and to the principles of Total Productive Maintenance. The mean time fell from 10 min 37 s with the traditional method to 2 min 58 s with the QR Code, a 72.0 % reduction, and all participants were faster with the data sheet; the estimated gain is about 1.53 h and R$ 21.91 per year per reducer, a value that grows with the number of equipment items covered.</w:t>
       </w:r>
     </w:p>
     <w:p>
@@ -1264,7 +1252,7 @@
           <w:sz w:val="24"/>
           <w:szCs w:val="24"/>
         </w:rPr>
-        <w:t>33</w:t>
+        <w:t>34</w:t>
       </w:r>
       <w:r>
         <w:rPr>
@@ -1328,7 +1316,7 @@
           <w:sz w:val="24"/>
           <w:szCs w:val="24"/>
         </w:rPr>
-        <w:t>34</w:t>
+        <w:t>35</w:t>
       </w:r>
       <w:r>
         <w:rPr>
@@ -1392,7 +1380,7 @@
           <w:sz w:val="24"/>
           <w:szCs w:val="24"/>
         </w:rPr>
-        <w:t>35</w:t>
+        <w:t>36</w:t>
       </w:r>
       <w:r>
         <w:rPr>
@@ -1443,7 +1431,7 @@
           <w:sz w:val="24"/>
           <w:szCs w:val="24"/>
         </w:rPr>
-        <w:t>Tabela 1 – Tempos medidos no método tradicional</w:t>
+        <w:t>Tabela 1 – Tempo total da tarefa por participante nos dois métodos</w:t>
       </w:r>
       <w:r>
         <w:rPr>
@@ -1507,7 +1495,7 @@
           <w:sz w:val="24"/>
           <w:szCs w:val="24"/>
         </w:rPr>
-        <w:t>Tabela 2 – Tempos medidos no método com QR Code</w:t>
+        <w:t>Tabela 2 – Resumo dos tempos por método</w:t>
       </w:r>
       <w:r>
         <w:rPr>
@@ -1542,7 +1530,7 @@
           <w:sz w:val="24"/>
           <w:szCs w:val="24"/>
         </w:rPr>
-        <w:t>25</w:t>
+        <w:t>26</w:t>
       </w:r>
       <w:r>
         <w:rPr>
@@ -1571,7 +1559,7 @@
           <w:sz w:val="24"/>
           <w:szCs w:val="24"/>
         </w:rPr>
-        <w:t>Tabela 3 – Comparação entre os métodos</w:t>
+        <w:t>Tabela 3 – Ganho de tempo e custo evitado por ano, por redutor</w:t>
       </w:r>
       <w:r>
         <w:rPr>
@@ -1606,7 +1594,7 @@
           <w:sz w:val="24"/>
           <w:szCs w:val="24"/>
         </w:rPr>
-        <w:t>25</w:t>
+        <w:t>26</w:t>
       </w:r>
       <w:r>
         <w:rPr>
@@ -3658,7 +3646,7 @@
           <w:sz w:val="24"/>
           <w:szCs w:val="24"/>
         </w:rPr>
-        <w:t>28</w:t>
+        <w:t>29</w:t>
       </w:r>
       <w:r>
         <w:rPr>
@@ -3722,7 +3710,7 @@
           <w:sz w:val="24"/>
           <w:szCs w:val="24"/>
         </w:rPr>
-        <w:t>29</w:t>
+        <w:t>30</w:t>
       </w:r>
       <w:r>
         <w:rPr>
@@ -3786,7 +3774,7 @@
           <w:sz w:val="24"/>
           <w:szCs w:val="24"/>
         </w:rPr>
-        <w:t>31</w:t>
+        <w:t>32</w:t>
       </w:r>
       <w:r>
         <w:rPr>
@@ -3850,7 +3838,7 @@
           <w:sz w:val="24"/>
           <w:szCs w:val="24"/>
         </w:rPr>
-        <w:t>32</w:t>
+        <w:t>33</w:t>
       </w:r>
       <w:r>
         <w:rPr>
@@ -3914,7 +3902,7 @@
           <w:sz w:val="24"/>
           <w:szCs w:val="24"/>
         </w:rPr>
-        <w:t>33</w:t>
+        <w:t>34</w:t>
       </w:r>
       <w:r>
         <w:rPr>
@@ -3988,7 +3976,7 @@
           <w:sz w:val="24"/>
           <w:szCs w:val="24"/>
         </w:rPr>
-        <w:t>34</w:t>
+        <w:t>35</w:t>
       </w:r>
       <w:r>
         <w:rPr>
@@ -4220,7 +4208,7 @@
       </w:pPr>
       <w:r>
         <w:rPr/>
-        <w:t>O estudo limita-se à lubrificação de um redutor de velocidade de coroa e rosca sem fim WEG-Cestari, da linha Magma M, tamanho 06, com relação de transmissão 1:25 (código M0612802V0D001), pertencente à oficina de mecânica do SENAI Três Lagoas e considerado na posição de trabalho adotada pela equipe, vertical, com a placa de identificação voltada para cima. O redutor está disponível em bancada e é tratado em uma aplicação hipotética: o acionamento de uma pequena esteira transportadora. São consideradas as etapas de identificação do lubrificante, localização dos pontos de enchimento, dreno e nível, e registro da intervenção. Não fazem parte do escopo a análise laboratorial do óleo, a desmontagem do redutor, a avaliação em campo com o equipamento instalado em uma linha de produção e a integração efetiva com sistemas de gestão de manutenção, que é apresentada apenas como proposta, simulada na tela da ficha.</w:t>
+        <w:t>O estudo limita-se à lubrificação de um redutor de velocidade de coroa e rosca sem fim WEG-Cestari, da linha Magma M, tamanho 06, com relação de transmissão 1:25 (código M0612802V0D001), pertencente à oficina de mecânica do SENAI Três Lagoas e considerado na posição de trabalho adotada pela equipe, vertical, com a placa de identificação voltada para cima. O redutor está disponível em bancada e é tratado em uma aplicação hipotética: o acionamento de uma pequena esteira transportadora. São consideradas as etapas de identificação do lubrificante, localização dos pontos de enchimento, dreno e nível, e registro da intervenção. Não fazem parte do escopo a análise laboratorial do óleo do próprio redutor (feita apenas como ensaio de aprendizagem, com o óleo de outro equipamento, seção 2.2.2), a desmontagem do redutor, a avaliação em campo com o equipamento instalado em uma linha de produção e a integração efetiva com sistemas de gestão de manutenção, que é apresentada apenas como proposta, simulada na tela da ficha.</w:t>
       </w:r>
     </w:p>
     <w:p>
@@ -7147,18 +7135,6 @@
     </w:p>
     <w:p>
       <w:pPr>
-        <w:pStyle w:val="Heading3"/>
-        <w:rPr/>
-      </w:pPr>
-      <w:bookmarkStart w:id="20" w:name="pag25"/>
-      <w:bookmarkEnd w:id="20"/>
-      <w:r>
-        <w:rPr/>
-        <w:t>2.2.3 Cronometragem</w:t>
-      </w:r>
-    </w:p>
-    <w:p>
-      <w:pPr>
         <w:pStyle w:val="Normal"/>
         <w:widowControl/>
         <w:spacing w:lineRule="auto" w:line="360" w:before="0" w:after="120"/>
@@ -7168,17 +7144,43 @@
       </w:pPr>
       <w:r>
         <w:rPr/>
-        <w:t xml:space="preserve">Para avaliar o ganho de tempo, foi realizada uma cronometragem em ambiente didático com cinco participantes </w:t>
+        <w:t>Para aprender o método de acompanhamento da condição do óleo, a equipe fez, no laboratório do SENAI Três Lagoas, um ensaio de viscosidade com um viscosímetro rotacional digital (Marte MVD-8): mediu o óleo novo e o óleo usado drenado de um torno da oficina, ambos Ipiranga Ipitur HLP ISO VG 68. Como as amostras estavam em temperaturas diferentes (22,7 °C e 27,3 °C), os valores foram levados à mesma temperatura pela curva viscosidade × temperatura do óleo, calculada pela equação de Walther (ASTM D341) com os dados da ficha técnica do fabricante. O óleo usado apresentou viscosidade cerca de 17 % menor que a do óleo novo, além de aspecto esverdeado e turvo e depósito no fundo do béquer, indícios de contaminação. A partir desse ensaio, a ficha do redutor passou a mostrar, logo abaixo da vida útil do óleo, um cartão “Última análise do óleo” com semáforo, segundo critério adotado pelos autores e usual em programas de análise de óleo: variação de viscosidade de até 10 % em relação ao óleo novo, normal; de 10 a 20 %, atenção; acima de 20 %, crítico. Enquanto o óleo do próprio redutor não é analisado – a amostra será coletada na próxima troca, já que a carga é de apenas 0,87 L –, o cartão exibe o ensaio de aprendizagem, identificado como tal, e permite registrar a primeira análise do redutor, cuja variação é calculada pela própria ficha.</w:t>
+      </w:r>
+    </w:p>
+    <w:p>
+      <w:pPr>
+        <w:pStyle w:val="Heading3"/>
+        <w:rPr/>
+      </w:pPr>
+      <w:bookmarkStart w:id="20" w:name="pag25"/>
+      <w:bookmarkEnd w:id="20"/>
+      <w:r>
+        <w:rPr/>
+        <w:t>2.2.3 Cronometragem</w:t>
+      </w:r>
+    </w:p>
+    <w:p>
+      <w:pPr>
+        <w:pStyle w:val="Normal"/>
+        <w:widowControl/>
+        <w:spacing w:lineRule="auto" w:line="360" w:before="0" w:after="120"/>
+        <w:ind w:left="0" w:right="0" w:firstLine="709"/>
+        <w:jc w:val="both"/>
+        <w:rPr/>
+      </w:pPr>
+      <w:r>
+        <w:rPr/>
+        <w:t xml:space="preserve">Para avaliar o ganho de tempo, foi realizada uma cronometragem em ambiente didático com cinco participantes, alunos do SENAI Três Lagoas </w:t>
       </w:r>
       <w:r>
         <w:rPr>
           <w:shd w:fill="FFFF00" w:val="clear"/>
         </w:rPr>
-        <w:t>[descrever: alunos da turma de Técnico em Mecânica, por exemplo]</w:t>
-      </w:r>
-      <w:r>
-        <w:rPr/>
-        <w:t>, cada um executando a tarefa pelos dois métodos na oficina de mecânica do SENAI Três Lagoas, junto ao redutor. No método tradicional, o participante consultou a placa de identificação e o manual da linha coroa e rosca do fabricante, em PDF no celular, e registrou a intervenção em formulário de papel. No método com QR Code, escaneou a etiqueta impressa, afixada no próprio redutor, leu a ficha e registrou a intervenção no celular. Os tempos foram medidos com o cronômetro de um celular. O Quadro 3 apresenta as etapas medidas.</w:t>
+        <w:t>[confirmar a turma]</w:t>
+      </w:r>
+      <w:r>
+        <w:rPr/>
+        <w:t>, cada um executando a tarefa pelos dois métodos na oficina de mecânica, junto ao redutor. No método tradicional, o participante consultou a placa de identificação e o manual da linha coroa e rosca do fabricante, em PDF no celular, e registrou a intervenção em formulário de papel. No método com QR Code, escaneou a etiqueta impressa, afixada no próprio redutor, leu a ficha e registrou a intervenção no celular. Os tempos foram medidos com o cronômetro de um celular. O Quadro 3 apresenta as etapas da tarefa.</w:t>
       </w:r>
     </w:p>
     <w:p>
@@ -7693,7 +7695,7 @@
       </w:pPr>
       <w:r>
         <w:rPr/>
-        <w:t>Cada participante recebeu a mesma ordem de serviço, com o código do equipamento e a posição de trabalho. O cronômetro foi iniciado quando o participante recebeu a tarefa; a etapa A terminou quando ele informou em voz alta o lubrificante e a viscosidade; a etapa B, quando informou o volume e a localização dos pontos; e a etapa C, quando o registro foi concluído (formulário em papel preenchido ou registro salvo no celular). A aplicação do lubrificante em si não foi simulada, pois é igual nos dois métodos.</w:t>
+        <w:t>Cada participante recebeu a mesma ordem de serviço, com o código do equipamento e a posição de trabalho. O cronômetro foi iniciado quando o participante recebeu a tarefa e parado quando o registro foi concluído (formulário em papel preenchido ou registro salvo no celular), de modo que o tempo medido reúne as etapas A, B e C do Quadro 3; as etapas não foram cronometradas separadamente. A aplicação do lubrificante em si não foi simulada, pois é igual nos dois métodos.</w:t>
       </w:r>
     </w:p>
     <w:p>
@@ -7707,7 +7709,7 @@
       </w:pPr>
       <w:r>
         <w:rPr/>
-        <w:t>Como quem executa um método primeiro tende a memorizar as informações e a ganhar tempo no segundo, foi adotada uma ordem contrabalanceada: os participantes 1, 3 e 5 começaram pelo método tradicional, e os participantes 2 e 4, pelo método com QR Code. A cronometragem não inclui o deslocamento até a sala de manutenção nem a consulta ao supervisor, que ocorrem no método tradicional em campo; por isso, os tempos tradicionais medidos tendem a ser menores que os reais, e o ganho calculado deve ser entendido como uma estimativa conservadora.</w:t>
+        <w:t>Como quem executa um método primeiro tende a memorizar as informações e a ganhar tempo no segundo, o planejamento previa uma ordem contrabalanceada; na execução, porém, os participantes começaram pelo método tradicional, o que pode ter favorecido o método com QR Code, feito em seguida, e é tratado como limitação na seção 2.3.2. A cronometragem não inclui o deslocamento até a sala de manutenção nem a consulta ao supervisor, que ocorrem no método tradicional em campo; por isso, os tempos tradicionais medidos tendem a ser menores que os reais.</w:t>
       </w:r>
     </w:p>
     <w:p>
@@ -7798,13 +7800,7 @@
       </w:pPr>
       <w:r>
         <w:rPr/>
-        <w:t xml:space="preserve">As Tabelas 1 e 2 apresentam os tempos medidos em cada etapa, em segundos, por participante, para o método tradicional e para o método com QR Code, respectivamente. </w:t>
-      </w:r>
-      <w:r>
-        <w:rPr>
-          <w:shd w:fill="FFFF00" w:val="clear"/>
-        </w:rPr>
-        <w:t>[Descrever, após a coleta, os participantes, a data, o local e as condições da cronometragem.]</w:t>
+        <w:t>A cronometragem foi realizada em outubro de 2026, na oficina de mecânica do SENAI Três Lagoas, junto ao redutor. A Tabela 1 apresenta o tempo total de cada participante nos dois métodos, a diferença e a redução percentual; a Tabela 2 resume os tempos de cada método.</w:t>
       </w:r>
     </w:p>
     <w:p>
@@ -7830,7 +7826,7 @@
           <w:sz w:val="20"/>
           <w:szCs w:val="20"/>
         </w:rPr>
-        <w:t>Tabela 1 – Tempos medidos no método tradicional</w:t>
+        <w:t>Tabela 1 – Tempo total da tarefa por participante nos dois métodos</w:t>
       </w:r>
     </w:p>
     <w:tbl>
@@ -7918,7 +7914,7 @@
                 <w:sz w:val="20"/>
                 <w:szCs w:val="20"/>
               </w:rPr>
-              <w:t>Etapa A (s)</w:t>
+              <w:t>Tradicional (s)</w:t>
             </w:r>
           </w:p>
         </w:tc>
@@ -7950,7 +7946,7 @@
                 <w:sz w:val="20"/>
                 <w:szCs w:val="20"/>
               </w:rPr>
-              <w:t>Etapa B (s)</w:t>
+              <w:t>QR Code (s)</w:t>
             </w:r>
           </w:p>
         </w:tc>
@@ -7982,7 +7978,7 @@
                 <w:sz w:val="20"/>
                 <w:szCs w:val="20"/>
               </w:rPr>
-              <w:t>Etapa C (s)</w:t>
+              <w:t>Diferença (s)</w:t>
             </w:r>
           </w:p>
         </w:tc>
@@ -8014,7 +8010,7 @@
                 <w:sz w:val="20"/>
                 <w:szCs w:val="20"/>
               </w:rPr>
-              <w:t>Total (s)</w:t>
+              <w:t>Redução (%)</w:t>
             </w:r>
           </w:p>
         </w:tc>
@@ -8069,6 +8065,7 @@
             </w:pPr>
             <w:r>
               <w:rPr/>
+              <w:t>514,64</w:t>
             </w:r>
           </w:p>
         </w:tc>
@@ -8087,6 +8084,7 @@
             </w:pPr>
             <w:r>
               <w:rPr/>
+              <w:t>213,21</w:t>
             </w:r>
           </w:p>
         </w:tc>
@@ -8105,6 +8103,7 @@
             </w:pPr>
             <w:r>
               <w:rPr/>
+              <w:t>301,43</w:t>
             </w:r>
           </w:p>
         </w:tc>
@@ -8123,6 +8122,7 @@
             </w:pPr>
             <w:r>
               <w:rPr/>
+              <w:t>58,6</w:t>
             </w:r>
           </w:p>
         </w:tc>
@@ -8177,6 +8177,7 @@
             </w:pPr>
             <w:r>
               <w:rPr/>
+              <w:t>643,84</w:t>
             </w:r>
           </w:p>
         </w:tc>
@@ -8195,6 +8196,7 @@
             </w:pPr>
             <w:r>
               <w:rPr/>
+              <w:t>180,08</w:t>
             </w:r>
           </w:p>
         </w:tc>
@@ -8213,6 +8215,7 @@
             </w:pPr>
             <w:r>
               <w:rPr/>
+              <w:t>463,76</w:t>
             </w:r>
           </w:p>
         </w:tc>
@@ -8231,6 +8234,7 @@
             </w:pPr>
             <w:r>
               <w:rPr/>
+              <w:t>72,0</w:t>
             </w:r>
           </w:p>
         </w:tc>
@@ -8285,6 +8289,7 @@
             </w:pPr>
             <w:r>
               <w:rPr/>
+              <w:t>726,26</w:t>
             </w:r>
           </w:p>
         </w:tc>
@@ -8303,6 +8308,7 @@
             </w:pPr>
             <w:r>
               <w:rPr/>
+              <w:t>141,18</w:t>
             </w:r>
           </w:p>
         </w:tc>
@@ -8321,6 +8327,7 @@
             </w:pPr>
             <w:r>
               <w:rPr/>
+              <w:t>585,08</w:t>
             </w:r>
           </w:p>
         </w:tc>
@@ -8339,6 +8346,7 @@
             </w:pPr>
             <w:r>
               <w:rPr/>
+              <w:t>80,6</w:t>
             </w:r>
           </w:p>
         </w:tc>
@@ -8393,6 +8401,7 @@
             </w:pPr>
             <w:r>
               <w:rPr/>
+              <w:t>654,55</w:t>
             </w:r>
           </w:p>
         </w:tc>
@@ -8411,6 +8420,7 @@
             </w:pPr>
             <w:r>
               <w:rPr/>
+              <w:t>178,34</w:t>
             </w:r>
           </w:p>
         </w:tc>
@@ -8429,6 +8439,7 @@
             </w:pPr>
             <w:r>
               <w:rPr/>
+              <w:t>476,21</w:t>
             </w:r>
           </w:p>
         </w:tc>
@@ -8447,6 +8458,7 @@
             </w:pPr>
             <w:r>
               <w:rPr/>
+              <w:t>72,8</w:t>
             </w:r>
           </w:p>
         </w:tc>
@@ -8501,6 +8513,7 @@
             </w:pPr>
             <w:r>
               <w:rPr/>
+              <w:t>646,28</w:t>
             </w:r>
           </w:p>
         </w:tc>
@@ -8519,6 +8532,7 @@
             </w:pPr>
             <w:r>
               <w:rPr/>
+              <w:t>177,94</w:t>
             </w:r>
           </w:p>
         </w:tc>
@@ -8537,6 +8551,7 @@
             </w:pPr>
             <w:r>
               <w:rPr/>
+              <w:t>468,34</w:t>
             </w:r>
           </w:p>
         </w:tc>
@@ -8555,6 +8570,7 @@
             </w:pPr>
             <w:r>
               <w:rPr/>
+              <w:t>72,5</w:t>
             </w:r>
           </w:p>
         </w:tc>
@@ -8613,6 +8629,7 @@
             </w:pPr>
             <w:r>
               <w:rPr/>
+              <w:t>637,11</w:t>
             </w:r>
           </w:p>
         </w:tc>
@@ -8633,6 +8650,7 @@
             </w:pPr>
             <w:r>
               <w:rPr/>
+              <w:t>178,15</w:t>
             </w:r>
           </w:p>
         </w:tc>
@@ -8653,6 +8671,7 @@
             </w:pPr>
             <w:r>
               <w:rPr/>
+              <w:t>458,96</w:t>
             </w:r>
           </w:p>
         </w:tc>
@@ -8673,6 +8692,7 @@
             </w:pPr>
             <w:r>
               <w:rPr/>
+              <w:t>72,0</w:t>
             </w:r>
           </w:p>
         </w:tc>
@@ -8719,7 +8739,7 @@
           <w:sz w:val="20"/>
           <w:szCs w:val="20"/>
         </w:rPr>
-        <w:t>Tabela 2 – Tempos medidos no método com QR Code</w:t>
+        <w:t>Tabela 2 – Resumo dos tempos por método</w:t>
       </w:r>
     </w:p>
     <w:tbl>
@@ -8775,7 +8795,7 @@
                 <w:sz w:val="20"/>
                 <w:szCs w:val="20"/>
               </w:rPr>
-              <w:t>Participante</w:t>
+              <w:t>Método</w:t>
             </w:r>
           </w:p>
         </w:tc>
@@ -8807,7 +8827,7 @@
                 <w:sz w:val="20"/>
                 <w:szCs w:val="20"/>
               </w:rPr>
-              <w:t>Etapa A (s)</w:t>
+              <w:t>Média (s)</w:t>
             </w:r>
           </w:p>
         </w:tc>
@@ -8839,7 +8859,7 @@
                 <w:sz w:val="20"/>
                 <w:szCs w:val="20"/>
               </w:rPr>
-              <w:t>Etapa B (s)</w:t>
+              <w:t>Média (min:s)</w:t>
             </w:r>
           </w:p>
         </w:tc>
@@ -8871,7 +8891,7 @@
                 <w:sz w:val="20"/>
                 <w:szCs w:val="20"/>
               </w:rPr>
-              <w:t>Etapa C (s)</w:t>
+              <w:t>Menor (s)</w:t>
             </w:r>
           </w:p>
         </w:tc>
@@ -8903,7 +8923,7 @@
                 <w:sz w:val="20"/>
                 <w:szCs w:val="20"/>
               </w:rPr>
-              <w:t>Total (s)</w:t>
+              <w:t>Maior (s)</w:t>
             </w:r>
           </w:p>
         </w:tc>
@@ -8939,7 +8959,7 @@
                 <w:sz w:val="20"/>
                 <w:szCs w:val="20"/>
               </w:rPr>
-              <w:t>1</w:t>
+              <w:t>Tradicional</w:t>
             </w:r>
           </w:p>
         </w:tc>
@@ -8958,6 +8978,7 @@
             </w:pPr>
             <w:r>
               <w:rPr/>
+              <w:t>637,1</w:t>
             </w:r>
           </w:p>
         </w:tc>
@@ -8976,6 +8997,7 @@
             </w:pPr>
             <w:r>
               <w:rPr/>
+              <w:t>10:37</w:t>
             </w:r>
           </w:p>
         </w:tc>
@@ -8994,6 +9016,7 @@
             </w:pPr>
             <w:r>
               <w:rPr/>
+              <w:t>514,6</w:t>
             </w:r>
           </w:p>
         </w:tc>
@@ -9012,6 +9035,7 @@
             </w:pPr>
             <w:r>
               <w:rPr/>
+              <w:t>726,3</w:t>
             </w:r>
           </w:p>
         </w:tc>
@@ -9023,7 +9047,9 @@
         <w:tc>
           <w:tcPr>
             <w:tcW w:w="1900" w:type="dxa"/>
-            <w:tcBorders/>
+            <w:tcBorders>
+              <w:top w:val="single" w:sz="4" w:space="0" w:color="000000"/>
+            </w:tcBorders>
             <w:vAlign w:val="center"/>
           </w:tcPr>
           <w:p>
@@ -9033,28 +9059,30 @@
               <w:spacing w:lineRule="auto" w:line="240" w:before="0" w:after="0"/>
               <w:jc w:val="left"/>
               <w:rPr>
-                <w:b w:val="false"/>
-                <w:b w:val="false"/>
-                <w:bCs w:val="false"/>
-                <w:sz w:val="20"/>
-                <w:szCs w:val="20"/>
-              </w:rPr>
-            </w:pPr>
-            <w:r>
-              <w:rPr>
-                <w:b w:val="false"/>
-                <w:bCs w:val="false"/>
-                <w:sz w:val="20"/>
-                <w:szCs w:val="20"/>
-              </w:rPr>
-              <w:t>2</w:t>
+                <w:b/>
+                <w:b/>
+                <w:bCs/>
+                <w:sz w:val="20"/>
+                <w:szCs w:val="20"/>
+              </w:rPr>
+            </w:pPr>
+            <w:r>
+              <w:rPr>
+                <w:b/>
+                <w:bCs/>
+                <w:sz w:val="20"/>
+                <w:szCs w:val="20"/>
+              </w:rPr>
+              <w:t>QR Code</w:t>
             </w:r>
           </w:p>
         </w:tc>
         <w:tc>
           <w:tcPr>
             <w:tcW w:w="1792" w:type="dxa"/>
-            <w:tcBorders/>
+            <w:tcBorders>
+              <w:top w:val="single" w:sz="4" w:space="0" w:color="000000"/>
+            </w:tcBorders>
             <w:vAlign w:val="center"/>
           </w:tcPr>
           <w:p>
@@ -9066,13 +9094,16 @@
             </w:pPr>
             <w:r>
               <w:rPr/>
+              <w:t>178,2</w:t>
             </w:r>
           </w:p>
         </w:tc>
         <w:tc>
           <w:tcPr>
             <w:tcW w:w="1794" w:type="dxa"/>
-            <w:tcBorders/>
+            <w:tcBorders>
+              <w:top w:val="single" w:sz="4" w:space="0" w:color="000000"/>
+            </w:tcBorders>
             <w:vAlign w:val="center"/>
           </w:tcPr>
           <w:p>
@@ -9084,13 +9115,16 @@
             </w:pPr>
             <w:r>
               <w:rPr/>
+              <w:t>2:58</w:t>
             </w:r>
           </w:p>
         </w:tc>
         <w:tc>
           <w:tcPr>
             <w:tcW w:w="1792" w:type="dxa"/>
-            <w:tcBorders/>
+            <w:tcBorders>
+              <w:top w:val="single" w:sz="4" w:space="0" w:color="000000"/>
+            </w:tcBorders>
             <w:vAlign w:val="center"/>
           </w:tcPr>
           <w:p>
@@ -9102,13 +9136,16 @@
             </w:pPr>
             <w:r>
               <w:rPr/>
+              <w:t>141,2</w:t>
             </w:r>
           </w:p>
         </w:tc>
         <w:tc>
           <w:tcPr>
             <w:tcW w:w="1793" w:type="dxa"/>
-            <w:tcBorders/>
+            <w:tcBorders>
+              <w:top w:val="single" w:sz="4" w:space="0" w:color="000000"/>
+            </w:tcBorders>
             <w:vAlign w:val="center"/>
           </w:tcPr>
           <w:p>
@@ -9120,448 +9157,7 @@
             </w:pPr>
             <w:r>
               <w:rPr/>
-            </w:r>
-          </w:p>
-        </w:tc>
-      </w:tr>
-      <w:tr>
-        <w:trPr>
-          <w:trHeight w:val="380" w:hRule="atLeast"/>
-        </w:trPr>
-        <w:tc>
-          <w:tcPr>
-            <w:tcW w:w="1900" w:type="dxa"/>
-            <w:tcBorders/>
-            <w:vAlign w:val="center"/>
-          </w:tcPr>
-          <w:p>
-            <w:pPr>
-              <w:pStyle w:val="Normal"/>
-              <w:keepNext w:val="true"/>
-              <w:spacing w:lineRule="auto" w:line="240" w:before="0" w:after="0"/>
-              <w:jc w:val="left"/>
-              <w:rPr>
-                <w:b w:val="false"/>
-                <w:b w:val="false"/>
-                <w:bCs w:val="false"/>
-                <w:sz w:val="20"/>
-                <w:szCs w:val="20"/>
-              </w:rPr>
-            </w:pPr>
-            <w:r>
-              <w:rPr>
-                <w:b w:val="false"/>
-                <w:bCs w:val="false"/>
-                <w:sz w:val="20"/>
-                <w:szCs w:val="20"/>
-              </w:rPr>
-              <w:t>3</w:t>
-            </w:r>
-          </w:p>
-        </w:tc>
-        <w:tc>
-          <w:tcPr>
-            <w:tcW w:w="1792" w:type="dxa"/>
-            <w:tcBorders/>
-            <w:vAlign w:val="center"/>
-          </w:tcPr>
-          <w:p>
-            <w:pPr>
-              <w:pStyle w:val="Normal"/>
-              <w:spacing w:lineRule="auto" w:line="240" w:before="0" w:after="0"/>
-              <w:jc w:val="center"/>
-              <w:rPr/>
-            </w:pPr>
-            <w:r>
-              <w:rPr/>
-            </w:r>
-          </w:p>
-        </w:tc>
-        <w:tc>
-          <w:tcPr>
-            <w:tcW w:w="1794" w:type="dxa"/>
-            <w:tcBorders/>
-            <w:vAlign w:val="center"/>
-          </w:tcPr>
-          <w:p>
-            <w:pPr>
-              <w:pStyle w:val="Normal"/>
-              <w:spacing w:lineRule="auto" w:line="240" w:before="0" w:after="0"/>
-              <w:jc w:val="center"/>
-              <w:rPr/>
-            </w:pPr>
-            <w:r>
-              <w:rPr/>
-            </w:r>
-          </w:p>
-        </w:tc>
-        <w:tc>
-          <w:tcPr>
-            <w:tcW w:w="1792" w:type="dxa"/>
-            <w:tcBorders/>
-            <w:vAlign w:val="center"/>
-          </w:tcPr>
-          <w:p>
-            <w:pPr>
-              <w:pStyle w:val="Normal"/>
-              <w:spacing w:lineRule="auto" w:line="240" w:before="0" w:after="0"/>
-              <w:jc w:val="center"/>
-              <w:rPr/>
-            </w:pPr>
-            <w:r>
-              <w:rPr/>
-            </w:r>
-          </w:p>
-        </w:tc>
-        <w:tc>
-          <w:tcPr>
-            <w:tcW w:w="1793" w:type="dxa"/>
-            <w:tcBorders/>
-            <w:vAlign w:val="center"/>
-          </w:tcPr>
-          <w:p>
-            <w:pPr>
-              <w:pStyle w:val="Normal"/>
-              <w:spacing w:lineRule="auto" w:line="240" w:before="0" w:after="0"/>
-              <w:jc w:val="center"/>
-              <w:rPr/>
-            </w:pPr>
-            <w:r>
-              <w:rPr/>
-            </w:r>
-          </w:p>
-        </w:tc>
-      </w:tr>
-      <w:tr>
-        <w:trPr>
-          <w:trHeight w:val="380" w:hRule="atLeast"/>
-        </w:trPr>
-        <w:tc>
-          <w:tcPr>
-            <w:tcW w:w="1900" w:type="dxa"/>
-            <w:tcBorders/>
-            <w:vAlign w:val="center"/>
-          </w:tcPr>
-          <w:p>
-            <w:pPr>
-              <w:pStyle w:val="Normal"/>
-              <w:keepNext w:val="true"/>
-              <w:spacing w:lineRule="auto" w:line="240" w:before="0" w:after="0"/>
-              <w:jc w:val="left"/>
-              <w:rPr>
-                <w:b w:val="false"/>
-                <w:b w:val="false"/>
-                <w:bCs w:val="false"/>
-                <w:sz w:val="20"/>
-                <w:szCs w:val="20"/>
-              </w:rPr>
-            </w:pPr>
-            <w:r>
-              <w:rPr>
-                <w:b w:val="false"/>
-                <w:bCs w:val="false"/>
-                <w:sz w:val="20"/>
-                <w:szCs w:val="20"/>
-              </w:rPr>
-              <w:t>4</w:t>
-            </w:r>
-          </w:p>
-        </w:tc>
-        <w:tc>
-          <w:tcPr>
-            <w:tcW w:w="1792" w:type="dxa"/>
-            <w:tcBorders/>
-            <w:vAlign w:val="center"/>
-          </w:tcPr>
-          <w:p>
-            <w:pPr>
-              <w:pStyle w:val="Normal"/>
-              <w:spacing w:lineRule="auto" w:line="240" w:before="0" w:after="0"/>
-              <w:jc w:val="center"/>
-              <w:rPr/>
-            </w:pPr>
-            <w:r>
-              <w:rPr/>
-            </w:r>
-          </w:p>
-        </w:tc>
-        <w:tc>
-          <w:tcPr>
-            <w:tcW w:w="1794" w:type="dxa"/>
-            <w:tcBorders/>
-            <w:vAlign w:val="center"/>
-          </w:tcPr>
-          <w:p>
-            <w:pPr>
-              <w:pStyle w:val="Normal"/>
-              <w:spacing w:lineRule="auto" w:line="240" w:before="0" w:after="0"/>
-              <w:jc w:val="center"/>
-              <w:rPr/>
-            </w:pPr>
-            <w:r>
-              <w:rPr/>
-            </w:r>
-          </w:p>
-        </w:tc>
-        <w:tc>
-          <w:tcPr>
-            <w:tcW w:w="1792" w:type="dxa"/>
-            <w:tcBorders/>
-            <w:vAlign w:val="center"/>
-          </w:tcPr>
-          <w:p>
-            <w:pPr>
-              <w:pStyle w:val="Normal"/>
-              <w:spacing w:lineRule="auto" w:line="240" w:before="0" w:after="0"/>
-              <w:jc w:val="center"/>
-              <w:rPr/>
-            </w:pPr>
-            <w:r>
-              <w:rPr/>
-            </w:r>
-          </w:p>
-        </w:tc>
-        <w:tc>
-          <w:tcPr>
-            <w:tcW w:w="1793" w:type="dxa"/>
-            <w:tcBorders/>
-            <w:vAlign w:val="center"/>
-          </w:tcPr>
-          <w:p>
-            <w:pPr>
-              <w:pStyle w:val="Normal"/>
-              <w:spacing w:lineRule="auto" w:line="240" w:before="0" w:after="0"/>
-              <w:jc w:val="center"/>
-              <w:rPr/>
-            </w:pPr>
-            <w:r>
-              <w:rPr/>
-            </w:r>
-          </w:p>
-        </w:tc>
-      </w:tr>
-      <w:tr>
-        <w:trPr>
-          <w:trHeight w:val="380" w:hRule="atLeast"/>
-        </w:trPr>
-        <w:tc>
-          <w:tcPr>
-            <w:tcW w:w="1900" w:type="dxa"/>
-            <w:tcBorders/>
-            <w:vAlign w:val="center"/>
-          </w:tcPr>
-          <w:p>
-            <w:pPr>
-              <w:pStyle w:val="Normal"/>
-              <w:keepNext w:val="true"/>
-              <w:spacing w:lineRule="auto" w:line="240" w:before="0" w:after="0"/>
-              <w:jc w:val="left"/>
-              <w:rPr>
-                <w:b w:val="false"/>
-                <w:b w:val="false"/>
-                <w:bCs w:val="false"/>
-                <w:sz w:val="20"/>
-                <w:szCs w:val="20"/>
-              </w:rPr>
-            </w:pPr>
-            <w:r>
-              <w:rPr>
-                <w:b w:val="false"/>
-                <w:bCs w:val="false"/>
-                <w:sz w:val="20"/>
-                <w:szCs w:val="20"/>
-              </w:rPr>
-              <w:t>5</w:t>
-            </w:r>
-          </w:p>
-        </w:tc>
-        <w:tc>
-          <w:tcPr>
-            <w:tcW w:w="1792" w:type="dxa"/>
-            <w:tcBorders/>
-            <w:vAlign w:val="center"/>
-          </w:tcPr>
-          <w:p>
-            <w:pPr>
-              <w:pStyle w:val="Normal"/>
-              <w:spacing w:lineRule="auto" w:line="240" w:before="0" w:after="0"/>
-              <w:jc w:val="center"/>
-              <w:rPr/>
-            </w:pPr>
-            <w:r>
-              <w:rPr/>
-            </w:r>
-          </w:p>
-        </w:tc>
-        <w:tc>
-          <w:tcPr>
-            <w:tcW w:w="1794" w:type="dxa"/>
-            <w:tcBorders/>
-            <w:vAlign w:val="center"/>
-          </w:tcPr>
-          <w:p>
-            <w:pPr>
-              <w:pStyle w:val="Normal"/>
-              <w:spacing w:lineRule="auto" w:line="240" w:before="0" w:after="0"/>
-              <w:jc w:val="center"/>
-              <w:rPr/>
-            </w:pPr>
-            <w:r>
-              <w:rPr/>
-            </w:r>
-          </w:p>
-        </w:tc>
-        <w:tc>
-          <w:tcPr>
-            <w:tcW w:w="1792" w:type="dxa"/>
-            <w:tcBorders/>
-            <w:vAlign w:val="center"/>
-          </w:tcPr>
-          <w:p>
-            <w:pPr>
-              <w:pStyle w:val="Normal"/>
-              <w:spacing w:lineRule="auto" w:line="240" w:before="0" w:after="0"/>
-              <w:jc w:val="center"/>
-              <w:rPr/>
-            </w:pPr>
-            <w:r>
-              <w:rPr/>
-            </w:r>
-          </w:p>
-        </w:tc>
-        <w:tc>
-          <w:tcPr>
-            <w:tcW w:w="1793" w:type="dxa"/>
-            <w:tcBorders/>
-            <w:vAlign w:val="center"/>
-          </w:tcPr>
-          <w:p>
-            <w:pPr>
-              <w:pStyle w:val="Normal"/>
-              <w:spacing w:lineRule="auto" w:line="240" w:before="0" w:after="0"/>
-              <w:jc w:val="center"/>
-              <w:rPr/>
-            </w:pPr>
-            <w:r>
-              <w:rPr/>
-            </w:r>
-          </w:p>
-        </w:tc>
-      </w:tr>
-      <w:tr>
-        <w:trPr>
-          <w:trHeight w:val="380" w:hRule="atLeast"/>
-        </w:trPr>
-        <w:tc>
-          <w:tcPr>
-            <w:tcW w:w="1900" w:type="dxa"/>
-            <w:tcBorders>
-              <w:top w:val="single" w:sz="4" w:space="0" w:color="000000"/>
-            </w:tcBorders>
-            <w:vAlign w:val="center"/>
-          </w:tcPr>
-          <w:p>
-            <w:pPr>
-              <w:pStyle w:val="Normal"/>
-              <w:keepNext w:val="true"/>
-              <w:spacing w:lineRule="auto" w:line="240" w:before="0" w:after="0"/>
-              <w:jc w:val="left"/>
-              <w:rPr>
-                <w:b/>
-                <w:b/>
-                <w:bCs/>
-                <w:sz w:val="20"/>
-                <w:szCs w:val="20"/>
-              </w:rPr>
-            </w:pPr>
-            <w:r>
-              <w:rPr>
-                <w:b/>
-                <w:bCs/>
-                <w:sz w:val="20"/>
-                <w:szCs w:val="20"/>
-              </w:rPr>
-              <w:t>Média</w:t>
-            </w:r>
-          </w:p>
-        </w:tc>
-        <w:tc>
-          <w:tcPr>
-            <w:tcW w:w="1792" w:type="dxa"/>
-            <w:tcBorders>
-              <w:top w:val="single" w:sz="4" w:space="0" w:color="000000"/>
-            </w:tcBorders>
-            <w:vAlign w:val="center"/>
-          </w:tcPr>
-          <w:p>
-            <w:pPr>
-              <w:pStyle w:val="Normal"/>
-              <w:spacing w:lineRule="auto" w:line="240" w:before="0" w:after="0"/>
-              <w:jc w:val="center"/>
-              <w:rPr/>
-            </w:pPr>
-            <w:r>
-              <w:rPr/>
-            </w:r>
-          </w:p>
-        </w:tc>
-        <w:tc>
-          <w:tcPr>
-            <w:tcW w:w="1794" w:type="dxa"/>
-            <w:tcBorders>
-              <w:top w:val="single" w:sz="4" w:space="0" w:color="000000"/>
-            </w:tcBorders>
-            <w:vAlign w:val="center"/>
-          </w:tcPr>
-          <w:p>
-            <w:pPr>
-              <w:pStyle w:val="Normal"/>
-              <w:spacing w:lineRule="auto" w:line="240" w:before="0" w:after="0"/>
-              <w:jc w:val="center"/>
-              <w:rPr/>
-            </w:pPr>
-            <w:r>
-              <w:rPr/>
-            </w:r>
-          </w:p>
-        </w:tc>
-        <w:tc>
-          <w:tcPr>
-            <w:tcW w:w="1792" w:type="dxa"/>
-            <w:tcBorders>
-              <w:top w:val="single" w:sz="4" w:space="0" w:color="000000"/>
-            </w:tcBorders>
-            <w:vAlign w:val="center"/>
-          </w:tcPr>
-          <w:p>
-            <w:pPr>
-              <w:pStyle w:val="Normal"/>
-              <w:spacing w:lineRule="auto" w:line="240" w:before="0" w:after="0"/>
-              <w:jc w:val="center"/>
-              <w:rPr/>
-            </w:pPr>
-            <w:r>
-              <w:rPr/>
-            </w:r>
-          </w:p>
-        </w:tc>
-        <w:tc>
-          <w:tcPr>
-            <w:tcW w:w="1793" w:type="dxa"/>
-            <w:tcBorders>
-              <w:top w:val="single" w:sz="4" w:space="0" w:color="000000"/>
-            </w:tcBorders>
-            <w:vAlign w:val="center"/>
-          </w:tcPr>
-          <w:p>
-            <w:pPr>
-              <w:pStyle w:val="Normal"/>
-              <w:spacing w:lineRule="auto" w:line="240" w:before="0" w:after="0"/>
-              <w:jc w:val="center"/>
-              <w:rPr/>
-            </w:pPr>
-            <w:r>
-              <w:rPr/>
+              <w:t>213,2</w:t>
             </w:r>
           </w:p>
         </w:tc>
@@ -9596,7 +9192,7 @@
       </w:pPr>
       <w:r>
         <w:rPr/>
-        <w:t>A Tabela 3 compara as médias dos dois métodos e a redução percentual obtida em cada etapa.</w:t>
+        <w:t>A Tabela 3 aplica o tempo médio de cada método às 12 intervenções anuais previstas e ao custo da hora do mecânico (seção 2.2.4).</w:t>
       </w:r>
     </w:p>
     <w:p>
@@ -9622,7 +9218,7 @@
           <w:sz w:val="20"/>
           <w:szCs w:val="20"/>
         </w:rPr>
-        <w:t>Tabela 3 – Comparação entre os métodos</w:t>
+        <w:t>Tabela 3 – Ganho de tempo e custo evitado por ano, por redutor</w:t>
       </w:r>
     </w:p>
     <w:tbl>
@@ -9677,7 +9273,7 @@
                 <w:sz w:val="20"/>
                 <w:szCs w:val="20"/>
               </w:rPr>
-              <w:t>Etapa</w:t>
+              <w:t>Indicador</w:t>
             </w:r>
           </w:p>
         </w:tc>
@@ -9709,7 +9305,7 @@
                 <w:sz w:val="20"/>
                 <w:szCs w:val="20"/>
               </w:rPr>
-              <w:t>Média tradicional (s)</w:t>
+              <w:t>Tradicional</w:t>
             </w:r>
           </w:p>
         </w:tc>
@@ -9741,7 +9337,7 @@
                 <w:sz w:val="20"/>
                 <w:szCs w:val="20"/>
               </w:rPr>
-              <w:t>Média QR Code (s)</w:t>
+              <w:t>QR Code</w:t>
             </w:r>
           </w:p>
         </w:tc>
@@ -9773,7 +9369,7 @@
                 <w:sz w:val="20"/>
                 <w:szCs w:val="20"/>
               </w:rPr>
-              <w:t>Redução (%)</w:t>
+              <w:t>Ganho</w:t>
             </w:r>
           </w:p>
         </w:tc>
@@ -9809,7 +9405,7 @@
                 <w:sz w:val="20"/>
                 <w:szCs w:val="20"/>
               </w:rPr>
-              <w:t>A. Identificar o lubrificante</w:t>
+              <w:t>Tempo médio por intervenção</w:t>
             </w:r>
           </w:p>
         </w:tc>
@@ -9828,6 +9424,7 @@
             </w:pPr>
             <w:r>
               <w:rPr/>
+              <w:t>10 min 37 s</w:t>
             </w:r>
           </w:p>
         </w:tc>
@@ -9846,6 +9443,7 @@
             </w:pPr>
             <w:r>
               <w:rPr/>
+              <w:t>2 min 58 s</w:t>
             </w:r>
           </w:p>
         </w:tc>
@@ -9864,6 +9462,7 @@
             </w:pPr>
             <w:r>
               <w:rPr/>
+              <w:t>7 min 39 s</w:t>
             </w:r>
           </w:p>
         </w:tc>
@@ -9899,7 +9498,7 @@
                 <w:sz w:val="20"/>
                 <w:szCs w:val="20"/>
               </w:rPr>
-              <w:t>B. Volume e pontos</w:t>
+              <w:t>Tempo em 12 intervenções por ano</w:t>
             </w:r>
           </w:p>
         </w:tc>
@@ -9918,6 +9517,7 @@
             </w:pPr>
             <w:r>
               <w:rPr/>
+              <w:t>2,12 h</w:t>
             </w:r>
           </w:p>
         </w:tc>
@@ -9936,6 +9536,7 @@
             </w:pPr>
             <w:r>
               <w:rPr/>
+              <w:t>0,59 h</w:t>
             </w:r>
           </w:p>
         </w:tc>
@@ -9954,6 +9555,7 @@
             </w:pPr>
             <w:r>
               <w:rPr/>
+              <w:t>1,53 h</w:t>
             </w:r>
           </w:p>
         </w:tc>
@@ -9989,7 +9591,7 @@
                 <w:sz w:val="20"/>
                 <w:szCs w:val="20"/>
               </w:rPr>
-              <w:t>C. Registro da intervenção</w:t>
+              <w:t>Custo do tempo do mecânico por ano (R$ 14,32/h)</w:t>
             </w:r>
           </w:p>
         </w:tc>
@@ -10008,6 +9610,7 @@
             </w:pPr>
             <w:r>
               <w:rPr/>
+              <w:t>R$ 30,41</w:t>
             </w:r>
           </w:p>
         </w:tc>
@@ -10026,6 +9629,7 @@
             </w:pPr>
             <w:r>
               <w:rPr/>
+              <w:t>R$ 8,50</w:t>
             </w:r>
           </w:p>
         </w:tc>
@@ -10044,6 +9648,7 @@
             </w:pPr>
             <w:r>
               <w:rPr/>
+              <w:t>R$ 21,91</w:t>
             </w:r>
           </w:p>
         </w:tc>
@@ -10081,7 +9686,7 @@
                 <w:sz w:val="20"/>
                 <w:szCs w:val="20"/>
               </w:rPr>
-              <w:t>Total</w:t>
+              <w:t>Redução do tempo</w:t>
             </w:r>
           </w:p>
         </w:tc>
@@ -10102,6 +9707,7 @@
             </w:pPr>
             <w:r>
               <w:rPr/>
+              <w:t>–</w:t>
             </w:r>
           </w:p>
         </w:tc>
@@ -10122,6 +9728,7 @@
             </w:pPr>
             <w:r>
               <w:rPr/>
+              <w:t>–</w:t>
             </w:r>
           </w:p>
         </w:tc>
@@ -10142,6 +9749,7 @@
             </w:pPr>
             <w:r>
               <w:rPr/>
+              <w:t>72,0 %</w:t>
             </w:r>
           </w:p>
         </w:tc>
@@ -10175,24 +9783,6 @@
       <w:r>
         <w:rPr/>
         <w:t>2.3.2 Discussão</w:t>
-      </w:r>
-    </w:p>
-    <w:p>
-      <w:pPr>
-        <w:pStyle w:val="Normal"/>
-        <w:widowControl/>
-        <w:spacing w:lineRule="auto" w:line="360" w:before="0" w:after="0"/>
-        <w:ind w:left="0" w:right="0" w:firstLine="709"/>
-        <w:jc w:val="both"/>
-        <w:rPr>
-          <w:shd w:fill="FFFF00" w:val="clear"/>
-        </w:rPr>
-      </w:pPr>
-      <w:r>
-        <w:rPr>
-          <w:shd w:fill="FFFF00" w:val="clear"/>
-        </w:rPr>
-        <w:t>[Interpretar os resultados: em qual etapa houve maior redução de tempo, o ganho médio por intervenção, o ganho anual estimado e o resultado da análise de retorno financeiro.]</w:t>
       </w:r>
     </w:p>
     <w:p>
@@ -10206,23 +9796,17 @@
       </w:pPr>
       <w:r>
         <w:rPr/>
-        <w:t>A redução do tempo gasto na identificação das informações tende a diminuir a duração das intervenções preventivas e, quando o equipamento precisa estar parado, a aumentar a sua disponibilidade. De forma indireta, também pode reduzir o MTTR nas situações em que a lubrificação faz parte de um reparo, como na reposição do óleo após a troca de um retentor. O acesso ao dado correto no ponto de uso reduz a dependência da memória do mecânico e do supervisor, o que diminui a chance de aplicação de um produto inadequado, como a mistura do óleo sintético PAO com óleo mineral ou poliglicol. O registro feito no momento da intervenção alimenta o PCM com um histórico confiável, em linha com a manutenção planejada da TPM</w:t>
-      </w:r>
-      <w:r>
-        <w:rPr>
-          <w:vertAlign w:val="superscript"/>
-        </w:rPr>
-        <w:t>1</w:t>
-      </w:r>
-      <w:r>
-        <w:rPr/>
-        <w:t xml:space="preserve"> e com a recomendação do fabricante de manter um registro individual de cada redutor.</w:t>
-      </w:r>
-      <w:r>
-        <w:rPr>
-          <w:vertAlign w:val="superscript"/>
-        </w:rPr>
-        <w:t>6</w:t>
+        <w:t xml:space="preserve">Todos os participantes foram mais rápidos com o QR Code. O tempo médio caiu de 637,1 s (10 min 37 s) no método tradicional para 178,2 s (2 min 58 s) com o QR Code, uma redução de 72,0 %, ou cerca de 7 min 39 s por intervenção. A redução individual variou de 58,6 % a 80,6 %, e os tempos ficaram mais próximos entre si com o QR Code (de 141 a 213 s) do que no método tradicional (de 515 a 726 s), o que indica que a ficha torna a tarefa mais padronizada e menos dependente de quem a executa. Como só o tempo total foi registrado, não é possível dizer em qual etapa houve a maior redução. Aplicado às 12 intervenções anuais, o ganho é de cerca de 1,53 h por ano e por redutor, que, ao custo de R$ 14,32 por hora do mecânico, corresponde a aproximadamente R$ 21,91 por ano (Tabela 3). O custo de implantação também é baixo: a página foi publicada em um serviço de hospedagem gratuito, e a etiqueta exige apenas impressão, plastificação e fita dupla-face </w:t>
+      </w:r>
+      <w:r>
+        <w:rPr>
+          <w:shd w:fill="FFFF00" w:val="clear"/>
+        </w:rPr>
+        <w:t>[informar o custo da etiqueta]</w:t>
+      </w:r>
+      <w:r>
+        <w:rPr/>
+        <w:t>. Assim, o retorno de um único redutor é pequeno em valor, mas positivo, e cresce com o número de equipamentos: para 100 equipamentos, o ganho estimado é de cerca de R$ 2.191 por ano, sem contar o custo da produção parada quando a busca de informações ocorre com o equipamento desligado.</w:t>
       </w:r>
     </w:p>
     <w:p>
@@ -10236,7 +9820,23 @@
       </w:pPr>
       <w:r>
         <w:rPr/>
-        <w:t>Deve-se considerar, ainda, que o redutor estudado é de pequeno porte, com carga de 0,87 L de óleo sintético e longos intervalos de troca. Por isso, o ganho anual em um único equipamento tende a ser modesto, e o benefício da solução cresce com o número de equipamentos atendidos, já que o custo de cada nova ficha e etiqueta é baixo.</w:t>
+        <w:t>A redução do tempo gasto na identificação das informações tende a diminuir a duração das intervenções preventivas e, quando o equipamento precisa estar parado, a aumentar a sua disponibilidade. De forma indireta, também pode reduzir o MTTR nas situações em que a lubrificação faz parte de um reparo, como na reposição do óleo após a troca de um retentor. O acesso ao dado correto no ponto de uso reduz a dependência da memória do mecânico e do supervisor, o que diminui a chance de aplicação de um produto inadequado, como a mistura do óleo sintético PAO com óleo mineral ou poliglicol. O registro feito no momento da intervenção alimenta o PCM com um histórico confiável, em linha com a manutenção planejada da TPM</w:t>
+      </w:r>
+      <w:r>
+        <w:rPr>
+          <w:vertAlign w:val="superscript"/>
+        </w:rPr>
+        <w:t>1</w:t>
+      </w:r>
+      <w:r>
+        <w:rPr/>
+        <w:t xml:space="preserve"> e com a recomendação do fabricante de manter um registro individual de cada redutor.</w:t>
+      </w:r>
+      <w:r>
+        <w:rPr>
+          <w:vertAlign w:val="superscript"/>
+        </w:rPr>
+        <w:t>6</w:t>
       </w:r>
     </w:p>
     <w:p>
@@ -10250,24 +9850,7 @@
       </w:pPr>
       <w:r>
         <w:rPr/>
-        <w:t>Como limitações do estudo, citam-se a realização da cronometragem em ambiente didático, e não com o redutor instalado em uma linha de produção; a não inclusão do deslocamento e da consulta ao supervisor no método tradicional; o número reduzido de participantes, que impede generalizar os valores para outros contextos; o efeito de aprendizado entre os métodos, que a ordem contrabalanceada reduz, mas não elimina; o uso de intervalos de troca do manual geral da linha coroa e rosca do fabricante, que traz também a indicação geral de troca a cada 3.500 horas ou anualmente; a identificação da linha e do tamanho do redutor a partir do código da placa, que deve ser confirmada com o fabricante; a dependência de que a ficha esteja sempre atualizada; a necessidade de um celular com câmera e de conexão com a internet no primeiro acesso à ficha; a estimativa das horas trabalhadas pelo tempo decorrido desde a última troca, que supõe operação contínua e só desconta as paradas informadas manualmente; e o armazenamento dos registros em cada aparelho, sem uma base central que reúna o histórico de todos os usuários. Essas limitações indicam caminhos para trabalhos futuros.</w:t>
-      </w:r>
-      <w:r>
-        <w:br w:type="page"/>
-      </w:r>
-    </w:p>
-    <w:p>
-      <w:pPr>
-        <w:pStyle w:val="Heading1"/>
-        <w:rPr/>
-      </w:pPr>
-      <w:bookmarkStart w:id="29" w:name="pag30"/>
-      <w:bookmarkEnd w:id="29"/>
-      <w:r>
-        <w:rPr/>
-        <w:t>3</w:t>
-        <w:tab/>
-        <w:t>CONCLUSÃO</w:t>
+        <w:t>Deve-se considerar, ainda, que o redutor estudado é de pequeno porte, com carga de 0,87 L de óleo sintético e longos intervalos de troca. Por isso, o ganho anual em um único equipamento tende a ser modesto, e o benefício da solução cresce com o número de equipamentos atendidos, já que o custo de cada nova ficha e etiqueta é baixo.</w:t>
       </w:r>
     </w:p>
     <w:p>
@@ -10281,13 +9864,24 @@
       </w:pPr>
       <w:r>
         <w:rPr/>
-        <w:t xml:space="preserve">O trabalho teve como objetivo reduzir o tempo do mecânico na identificação e no registro da lubrificação de um redutor de coroa e rosca sem fim WEG-Cestari, da linha Magma M, por meio de um QR Code fixado no equipamento. </w:t>
-      </w:r>
-      <w:r>
-        <w:rPr>
-          <w:shd w:fill="FFFF00" w:val="clear"/>
-        </w:rPr>
-        <w:t>[Responder ao problema de pesquisa com base nos resultados: informar se o objetivo foi atingido e a redução de tempo obtida.]</w:t>
+        <w:t>Como limitações do estudo, citam-se a realização da cronometragem em ambiente didático, e não com o redutor instalado em uma linha de produção; a não inclusão do deslocamento e da consulta ao supervisor no método tradicional; o número reduzido de participantes, que impede generalizar os valores para outros contextos; o efeito de aprendizado entre os métodos, já que os participantes executaram primeiro o método tradicional; o registro apenas do tempo total, sem a separação das etapas; o uso de intervalos de troca do manual geral da linha coroa e rosca do fabricante, que traz também a indicação geral de troca a cada 3.500 horas ou anualmente; a identificação da linha e do tamanho do redutor a partir do código da placa, que deve ser confirmada com o fabricante; a dependência de que a ficha esteja sempre atualizada; a necessidade de um celular com câmera e de conexão com a internet no primeiro acesso à ficha; a estimativa das horas trabalhadas pelo tempo decorrido desde a última troca, que supõe operação contínua e só desconta as paradas informadas manualmente; e o armazenamento dos registros em cada aparelho, sem uma base central que reúna o histórico de todos os usuários. Essas limitações indicam caminhos para trabalhos futuros.</w:t>
+      </w:r>
+      <w:r>
+        <w:br w:type="page"/>
+      </w:r>
+    </w:p>
+    <w:p>
+      <w:pPr>
+        <w:pStyle w:val="Heading1"/>
+        <w:rPr/>
+      </w:pPr>
+      <w:bookmarkStart w:id="29" w:name="pag30"/>
+      <w:bookmarkEnd w:id="29"/>
+      <w:r>
+        <w:rPr/>
+        <w:t>3</w:t>
+        <w:tab/>
+        <w:t>CONCLUSÃO</w:t>
       </w:r>
     </w:p>
     <w:p>
@@ -10301,13 +9895,7 @@
       </w:pPr>
       <w:r>
         <w:rPr/>
-        <w:t xml:space="preserve">A solução mostrou-se simples de implantar, por utilizar uma página web acessada pelo celular e uma etiqueta de baixo custo, e coerente com os princípios de Gestão Visual e de TPM. </w:t>
-      </w:r>
-      <w:r>
-        <w:rPr>
-          <w:shd w:fill="FFFF00" w:val="clear"/>
-        </w:rPr>
-        <w:t>[Complementar com a avaliação do retorno financeiro e das limitações observadas.]</w:t>
+        <w:t>O trabalho teve como objetivo reduzir o tempo do mecânico na identificação e no registro da lubrificação de um redutor de coroa e rosca sem fim WEG-Cestari, da linha Magma M, por meio de um QR Code fixado no equipamento. Os resultados respondem ao problema de pesquisa: com a ficha acessada pelo QR Code, o tempo médio para identificar o lubrificante, localizar os pontos e registrar a intervenção caiu de 10 min 37 s para 2 min 58 s, uma redução de 72,0 %, e todos os cinco participantes foram mais rápidos com o QR Code. O objetivo foi, portanto, atingido.</w:t>
       </w:r>
     </w:p>
     <w:p>
@@ -10321,7 +9909,21 @@
       </w:pPr>
       <w:r>
         <w:rPr/>
-        <w:t>Como sugestões para trabalhos futuros, propõem-se a aplicação da solução em um redutor instalado em campo, com mecânicos de manutenção, a ampliação para outros equipamentos da planta, a sincronização dos registros de todos os aparelhos em um banco de dados central, o registro periódico da temperatura da carcaça para acompanhar a condição do óleo, a avaliação de etiquetas NFC para metal em pontos de leitura difícil, a leitura automática das horas de operação por horímetro ou sensor, em substituição à estimativa pelo tempo decorrido, a inclusão da análise de óleo em laboratório, com coleta de amostra e reposição do volume retirado, e a integração da ficha ao sistema SAP da empresa, com a criação automática de reservas de material e de notas de manutenção e o envio do histórico de lubrificações ao PCM.</w:t>
+        <w:t>A solução mostrou-se simples de implantar, por utilizar uma página web acessada pelo celular e uma etiqueta de baixo custo, e coerente com os princípios de Gestão Visual e de TPM. Em um único redutor, o ganho estimado é modesto – cerca de 1,53 h e R$ 21,91 por ano no tempo do mecânico –, mas o benefício cresce com o número de equipamentos atendidos. Além do tempo, a ficha padroniza o acesso às informações, reduz o risco de aplicar o óleo errado, gera um histórico de intervenções para o PCM e passou a mostrar a situação da última análise do óleo. Os resultados devem ser lidos considerando que a cronometragem foi feita em ambiente didático, com poucos participantes, que executaram primeiro o método tradicional.</w:t>
+      </w:r>
+    </w:p>
+    <w:p>
+      <w:pPr>
+        <w:pStyle w:val="Normal"/>
+        <w:widowControl/>
+        <w:spacing w:lineRule="auto" w:line="360" w:before="0" w:after="120"/>
+        <w:ind w:left="0" w:right="0" w:firstLine="709"/>
+        <w:jc w:val="both"/>
+        <w:rPr/>
+      </w:pPr>
+      <w:r>
+        <w:rPr/>
+        <w:t>Como sugestões para trabalhos futuros, propõem-se a aplicação da solução em um redutor instalado em campo, com mecânicos de manutenção, a ampliação para outros equipamentos da planta, a sincronização dos registros de todos os aparelhos em um banco de dados central, o registro periódico da temperatura da carcaça para acompanhar a condição do óleo, a avaliação de etiquetas NFC para metal em pontos de leitura difícil, a leitura automática das horas de operação por horímetro ou sensor, em substituição à estimativa pelo tempo decorrido, a análise do óleo do próprio redutor em laboratório, com a amostra coletada na troca, já prevista na ficha a partir do ensaio de aprendizagem, e a integração da ficha ao sistema SAP da empresa, com a criação automática de reservas de material e de notas de manutenção e o envio do histórico de lubrificações ao PCM.</w:t>
       </w:r>
       <w:r>
         <w:br w:type="page"/>
@@ -12841,7 +12443,7 @@
       </w:pPr>
       <w:r>
         <w:rPr/>
-        <w:t>A etiqueta não deve ser colada sobre a placa de identificação do fabricante, sobre o respiro ou os bujões, nem em regiões que esquentam ou recebem respingos de óleo. No redutor estudado, a etiqueta foi fixada na parte superior da face oposta ao motor (face da tampa cega), que é lisa e fica visível, no mesmo ponto indicado no modelo tridimensional da ficha digital; em outros equipamentos, pode-se usar uma plaqueta de alumínio presa junto à fixação, em local de fácil acesso. Na cronometragem, a etiqueta foi impressa em papel, plastificada e colada com fita dupla-face.</w:t>
+        <w:t>A etiqueta não deve ser colada sobre a placa de identificação do fabricante, sobre o respiro ou os bujões, nem em regiões que esquentam ou recebem respingos de óleo. No redutor estudado, a etiqueta foi fixada na face superior, logo abaixo da etiqueta já existente no equipamento, região lisa e visível para quem se aproxima do redutor; em outros equipamentos, pode-se usar uma plaqueta de alumínio presa junto à fixação, em local de fácil acesso. Na cronometragem, a etiqueta foi impressa em papel, plastificada e colada com fita dupla-face.</w:t>
       </w:r>
     </w:p>
     <w:p>
@@ -15810,7 +15412,7 @@
         <w:szCs w:val="20"/>
       </w:rPr>
       <w:drawing>
-        <wp:anchor behindDoc="1" distT="0" distB="0" distL="0" distR="0" simplePos="0" locked="0" layoutInCell="0" allowOverlap="1" relativeHeight="22">
+        <wp:anchor behindDoc="1" distT="0" distB="0" distL="0" distR="0" simplePos="0" locked="0" layoutInCell="0" allowOverlap="1" relativeHeight="23">
           <wp:simplePos x="0" y="0"/>
           <wp:positionH relativeFrom="page">
             <wp:posOffset>0</wp:posOffset>
@@ -15875,7 +15477,7 @@
         <w:sz w:val="20"/>
         <w:szCs w:val="20"/>
       </w:rPr>
-      <w:t>35</w:t>
+      <w:t>36</w:t>
     </w:r>
     <w:r>
       <w:rPr>

</xml_diff>

<commit_message>
Turma dos participantes, prof. João Vitor e conferência do óleo
</commit_message>
<xml_diff>
--- a/Projeto_Integrador_QRCode_Lubrificantes.docx
+++ b/Projeto_Integrador_QRCode_Lubrificantes.docx
@@ -1188,7 +1188,7 @@
           <w:sz w:val="24"/>
           <w:szCs w:val="24"/>
         </w:rPr>
-        <w:t>23</w:t>
+        <w:t>24</w:t>
       </w:r>
       <w:r>
         <w:rPr>
@@ -7144,7 +7144,7 @@
       </w:pPr>
       <w:r>
         <w:rPr/>
-        <w:t>Para aprender o método de acompanhamento da condição do óleo, a equipe fez, no laboratório do SENAI Três Lagoas, um ensaio de viscosidade com um viscosímetro rotacional digital (Marte MVD-8): mediu o óleo novo e o óleo usado drenado de um torno da oficina, ambos Ipiranga Ipitur HLP ISO VG 68. Como as amostras estavam em temperaturas diferentes (22,7 °C e 27,3 °C), os valores foram levados à mesma temperatura pela curva viscosidade × temperatura do óleo, calculada pela equação de Walther (ASTM D341) com os dados da ficha técnica do fabricante. O óleo usado apresentou viscosidade cerca de 17 % menor que a do óleo novo, além de aspecto esverdeado e turvo e depósito no fundo do béquer, indícios de contaminação. A partir desse ensaio, a ficha do redutor passou a mostrar, logo abaixo da vida útil do óleo, um cartão “Última análise do óleo” com semáforo, segundo critério adotado pelos autores e usual em programas de análise de óleo: variação de viscosidade de até 10 % em relação ao óleo novo, normal; de 10 a 20 %, atenção; acima de 20 %, crítico. Enquanto o óleo do próprio redutor não é analisado – a amostra será coletada na próxima troca, já que a carga é de apenas 0,87 L –, o cartão exibe o ensaio de aprendizagem, identificado como tal, e permite registrar a primeira análise do redutor, cuja variação é calculada pela própria ficha.</w:t>
+        <w:t>Para aprender o método de acompanhamento da condição do óleo, a equipe fez, no laboratório do SENAI Três Lagoas, com o auxílio do professor João Vitor de Moura Barbosa, um ensaio de viscosidade com um viscosímetro rotacional digital (Marte MVD-8): mediu o óleo novo e o óleo usado drenado de um torno da oficina, ambos Ipiranga Ipitur HLP ISO VG 68. Como as amostras estavam em temperaturas diferentes (22,7 °C e 27,3 °C), os valores foram levados à mesma temperatura pela curva viscosidade × temperatura do óleo, calculada pela equação de Walther (ASTM D341) com os dados da ficha técnica do fabricante. O óleo novo medido ficou cerca de 8 % abaixo do valor típico informado na ficha técnica (≈ 66 cSt estimados a 40 °C, contra 70,9 cSt), dentro da faixa do grau ISO VG 68 (61,2 a 74,8 cSt), o que confirmou o óleo indicado na embalagem. O óleo usado apresentou viscosidade cerca de 17 % menor que a do óleo novo, além de aspecto esverdeado e turvo e depósito no fundo do béquer, indícios de contaminação. A partir desse ensaio, a ficha do redutor passou a mostrar, logo abaixo da vida útil do óleo, um cartão “Última análise do óleo” com semáforo, segundo critério adotado pelos autores e usual em programas de análise de óleo: variação de viscosidade de até 10 % em relação ao óleo novo, normal; de 10 a 20 %, atenção; acima de 20 %, crítico. Enquanto o óleo do próprio redutor não é analisado – a amostra será coletada na próxima troca, já que a carga é de apenas 0,87 L –, o cartão exibe o ensaio de aprendizagem, identificado como tal, e permite registrar a primeira análise do redutor, cuja variação é calculada pela própria ficha.</w:t>
       </w:r>
     </w:p>
     <w:p>
@@ -7170,17 +7170,7 @@
       </w:pPr>
       <w:r>
         <w:rPr/>
-        <w:t xml:space="preserve">Para avaliar o ganho de tempo, foi realizada uma cronometragem em ambiente didático com cinco participantes, alunos do SENAI Três Lagoas </w:t>
-      </w:r>
-      <w:r>
-        <w:rPr>
-          <w:shd w:fill="FFFF00" w:val="clear"/>
-        </w:rPr>
-        <w:t>[confirmar a turma]</w:t>
-      </w:r>
-      <w:r>
-        <w:rPr/>
-        <w:t>, cada um executando a tarefa pelos dois métodos na oficina de mecânica, junto ao redutor. No método tradicional, o participante consultou a placa de identificação e o manual da linha coroa e rosca do fabricante, em PDF no celular, e registrou a intervenção em formulário de papel. No método com QR Code, escaneou a etiqueta impressa, afixada no próprio redutor, leu a ficha e registrou a intervenção no celular. Os tempos foram medidos com o cronômetro de um celular. O Quadro 3 apresenta as etapas da tarefa.</w:t>
+        <w:t>Para avaliar o ganho de tempo, foi realizada uma cronometragem em ambiente didático com cinco participantes, alunos da turma TEC.203.PRE.008-TL do curso Técnico em Mecânica do SENAI Três Lagoas, cada um executando a tarefa pelos dois métodos na oficina de mecânica, junto ao redutor. No método tradicional, o participante consultou a placa de identificação e o manual da linha coroa e rosca do fabricante, em PDF no celular, e registrou a intervenção em formulário de papel. No método com QR Code, escaneou a etiqueta impressa, afixada no próprio redutor, leu a ficha e registrou a intervenção no celular. Os tempos foram medidos com o cronômetro de um celular. O Quadro 3 apresenta as etapas da tarefa.</w:t>
       </w:r>
     </w:p>
     <w:p>

</xml_diff>

<commit_message>
Etiqueta do protótipo: papel comum, sem plastificação, fita crepe, sem custo (documento, slides e ficha 3D)
Co-Authored-By: Claude Opus 5.5 <noreply@anthropic.com>
</commit_message>
<xml_diff>
--- a/Projeto_Integrador_QRCode_Lubrificantes.docx
+++ b/Projeto_Integrador_QRCode_Lubrificantes.docx
@@ -9786,17 +9786,7 @@
       </w:pPr>
       <w:r>
         <w:rPr/>
-        <w:t xml:space="preserve">Todos os participantes foram mais rápidos com o QR Code. O tempo médio caiu de 637,1 s (10 min 37 s) no método tradicional para 178,2 s (2 min 58 s) com o QR Code, uma redução de 72,0 %, ou cerca de 7 min 39 s por intervenção. A redução individual variou de 58,6 % a 80,6 %, e os tempos ficaram mais próximos entre si com o QR Code (de 141 a 213 s) do que no método tradicional (de 515 a 726 s), o que indica que a ficha torna a tarefa mais padronizada e menos dependente de quem a executa. Como só o tempo total foi registrado, não é possível dizer em qual etapa houve a maior redução. Aplicado às 12 intervenções anuais, o ganho é de cerca de 1,53 h por ano e por redutor, que, ao custo de R$ 14,32 por hora do mecânico, corresponde a aproximadamente R$ 21,91 por ano (Tabela 3). O custo de implantação também é baixo: a página foi publicada em um serviço de hospedagem gratuito, e a etiqueta exige apenas impressão, plastificação e fita dupla-face </w:t>
-      </w:r>
-      <w:r>
-        <w:rPr>
-          <w:shd w:fill="FFFF00" w:val="clear"/>
-        </w:rPr>
-        <w:t>[informar o custo da etiqueta]</w:t>
-      </w:r>
-      <w:r>
-        <w:rPr/>
-        <w:t>. Assim, o retorno de um único redutor é pequeno em valor, mas positivo, e cresce com o número de equipamentos: para 100 equipamentos, o ganho estimado é de cerca de R$ 2.191 por ano, sem contar o custo da produção parada quando a busca de informações ocorre com o equipamento desligado.</w:t>
+        <w:t>Todos os participantes foram mais rápidos com o QR Code. O tempo médio caiu de 637,1 s (10 min 37 s) no método tradicional para 178,2 s (2 min 58 s) com o QR Code, uma redução de 72,0 %, ou cerca de 7 min 39 s por intervenção. A redução individual variou de 58,6 % a 80,6 %, e os tempos ficaram mais próximos entre si com o QR Code (de 141 a 213 s) do que no método tradicional (de 515 a 726 s), o que indica que a ficha torna a tarefa mais padronizada e menos dependente de quem a executa. Como só o tempo total foi registrado, não é possível dizer em qual etapa houve a maior redução. Aplicado às 12 intervenções anuais, o ganho é de cerca de 1,53 h por ano e por redutor, que, ao custo de R$ 14,32 por hora do mecânico, corresponde a aproximadamente R$ 21,91 por ano (Tabela 3). O custo de implantação também é baixo: a página foi publicada em um serviço de hospedagem gratuito, e no protótipo, a etiqueta não teve custo para a equipe: foi impressa em papel comum, em impressão cedida, e fixada com fita crepe branca. Em uso permanente, recomenda-se plastificá-la ou usar material resistente a óleo e à limpeza, ainda de baixo custo. Assim, o retorno de um único redutor é pequeno em valor, mas positivo, e cresce com o número de equipamentos: para 100 equipamentos, o ganho estimado é de cerca de R$ 2.191 por ano, sem contar o custo da produção parada quando a busca de informações ocorre com o equipamento desligado.</w:t>
       </w:r>
     </w:p>
     <w:p>
@@ -12433,7 +12423,7 @@
       </w:pPr>
       <w:r>
         <w:rPr/>
-        <w:t>A etiqueta não deve ser colada sobre a placa de identificação do fabricante, sobre o respiro ou os bujões, nem em regiões que esquentam ou recebem respingos de óleo. No redutor estudado, a etiqueta foi fixada na face superior, logo abaixo da etiqueta já existente no equipamento, região lisa e visível para quem se aproxima do redutor; em outros equipamentos, pode-se usar uma plaqueta de alumínio presa junto à fixação, em local de fácil acesso. Na cronometragem, a etiqueta foi impressa em papel, plastificada e colada com fita dupla-face.</w:t>
+        <w:t>A etiqueta não deve ser colada sobre a placa de identificação do fabricante, sobre o respiro ou os bujões, nem em regiões que esquentam ou recebem respingos de óleo. No redutor estudado, a etiqueta foi fixada na face superior, logo abaixo da etiqueta já existente no equipamento, região lisa e visível para quem se aproxima do redutor; em outros equipamentos, pode-se usar uma plaqueta de alumínio presa junto à fixação, em local de fácil acesso. Na cronometragem, a etiqueta foi impressa em papel comum, sem plastificação, e fixada com fita crepe branca (423). Para uso permanente, recomenda-se plastificar a etiqueta ou usar etiqueta de material resistente a óleo e à limpeza, mantendo o QR Code com correção de erros nível H.</w:t>
       </w:r>
     </w:p>
     <w:p>
@@ -15229,7 +15219,7 @@
                 <w:sz w:val="20"/>
                 <w:szCs w:val="20"/>
               </w:rPr>
-              <w:t>Papel plastificado; abre a ficha digital do redutor</w:t>
+              <w:t>Papel comum fixado com fita crepe (protótipo); abre a ficha digital do redutor</w:t>
             </w:r>
           </w:p>
         </w:tc>

</xml_diff>

<commit_message>
Tempo tradicional do Felipe corrigido (8:23,27): médias, tabelas, discussão, conclusão, resumo e slides
Co-Authored-By: Claude Opus 5.5 <noreply@anthropic.com>
</commit_message>
<xml_diff>
--- a/Projeto_Integrador_QRCode_Lubrificantes.docx
+++ b/Projeto_Integrador_QRCode_Lubrificantes.docx
@@ -846,7 +846,7 @@
       </w:pPr>
       <w:r>
         <w:rPr/>
-        <w:t>Este trabalho apresenta o desenvolvimento e a avaliação de um sistema digital, baseado em QR Code, para apoiar o mecânico na identificação e na aplicação correta do lubrificante em um redutor de velocidade de coroa e rosca sem fim WEG-Cestari, da linha Magma M, com relação de transmissão 1:25, lubrificado por imersão em óleo sintético PAO ISO VG 460 e pertencente à oficina de mecânica do SENAI Três Lagoas. A motivação do estudo está no tempo despendido, durante a manutenção, na busca por informações como tipo de lubrificante, viscosidade, volume e pontos de enchimento, dreno e nível, além do risco de erro na aplicação, em especial a mistura de óleos incompatíveis. A solução consiste em uma etiqueta resistente, fixada junto ao equipamento, que dá acesso, pelo celular ou pelo tablet, a uma ficha objetiva com os dados de lubrificação, alertas de segurança, passo a passo da troca com fotografias do próprio redutor, modelo tridimensional com os pontos de lubrificação, conferência do galão de óleo e registro da intervenção. Os dados do redutor foram obtidos da placa de identificação, do manual do fabricante e do levantamento feito no próprio equipamento, e o ganho de tempo foi avaliado por cronometragem em ambiente didático: cinco participantes tiveram cronometrado o tempo total das etapas de identificação do lubrificante, localização dos pontos e registro, consultando a placa e o manual do fabricante (método tradicional) e a ficha acessada pelo QR Code. Os dados permitem calcular a redução percentual do tempo, o ganho anual e uma estimativa de retorno financeiro, relacionando-os ao tempo de execução da manutenção preventiva e aos princípios da Manutenção Produtiva Total. O tempo médio caiu de 10 min 37 s no método tradicional para 2 min 58 s com o QR Code, redução de 72,0 %, e todos os participantes foram mais rápidos com a ficha; o ganho estimado é de cerca de 1,53 h e R$ 21,91 por ano por redutor, valor que cresce com o número de equipamentos atendidos.</w:t>
+        <w:t>Este trabalho apresenta o desenvolvimento e a avaliação de um sistema digital, baseado em QR Code, para apoiar o mecânico na identificação e na aplicação correta do lubrificante em um redutor de velocidade de coroa e rosca sem fim WEG-Cestari, da linha Magma M, com relação de transmissão 1:25, lubrificado por imersão em óleo sintético PAO ISO VG 460 e pertencente à oficina de mecânica do SENAI Três Lagoas. A motivação do estudo está no tempo despendido, durante a manutenção, na busca por informações como tipo de lubrificante, viscosidade, volume e pontos de enchimento, dreno e nível, além do risco de erro na aplicação, em especial a mistura de óleos incompatíveis. A solução consiste em uma etiqueta resistente, fixada junto ao equipamento, que dá acesso, pelo celular ou pelo tablet, a uma ficha objetiva com os dados de lubrificação, alertas de segurança, passo a passo da troca com fotografias do próprio redutor, modelo tridimensional com os pontos de lubrificação, conferência do galão de óleo e registro da intervenção. Os dados do redutor foram obtidos da placa de identificação, do manual do fabricante e do levantamento feito no próprio equipamento, e o ganho de tempo foi avaliado por cronometragem em ambiente didático: cinco participantes tiveram cronometrado o tempo total das etapas de identificação do lubrificante, localização dos pontos e registro, consultando a placa e o manual do fabricante (método tradicional) e a ficha acessada pelo QR Code. Os dados permitem calcular a redução percentual do tempo, o ganho anual e uma estimativa de retorno financeiro, relacionando-os ao tempo de execução da manutenção preventiva e aos princípios da Manutenção Produtiva Total. O tempo médio caiu de 10 min 35 s no método tradicional para 2 min 58 s com o QR Code, redução de 71,9 %, e todos os participantes foram mais rápidos com a ficha; o ganho estimado é de cerca de 1,52 h e R$ 21,80 por ano por redutor, valor que cresce com o número de equipamentos atendidos.</w:t>
       </w:r>
     </w:p>
     <w:p>
@@ -899,7 +899,7 @@
       </w:pPr>
       <w:r>
         <w:rPr/>
-        <w:t>This work presents the development and evaluation of a QR Code-based digital system to support mechanics in identifying and correctly applying the lubricant of a WEG-Cestari Magma M worm gear reducer, with a 1:25 ratio, oil-bath lubricated with ISO VG 460 synthetic PAO oil, belonging to the mechanical workshop of SENAI Três Lagoas. The study is motivated by the time spent during maintenance searching for information such as lubricant type, viscosity, volume and the location of fill, drain and level points, as well as by the risk of application errors, especially the mixing of incompatible oils. The solution consists of a durable label placed next to the equipment that gives access, through a smartphone or tablet, to a concise data sheet with lubrication data, safety alerts, a step-by-step oil change guide with photographs of the reducer itself, a three-dimensional model showing the lubrication points, an oil container check and an intervention record. The reducer data were obtained from its nameplate, from the manufacturer's manual and from a survey of the equipment itself, and the time gain was assessed by time measurements in a teaching environment: five participants had the total time of the identification, point location and recording steps measured, consulting the nameplate and the manufacturer's manual (traditional method) and the data sheet accessed by the QR Code. The data allow the calculation of the percentage time reduction, the annual gain and an estimate of financial return, relating them to the execution time of preventive maintenance and to the principles of Total Productive Maintenance. The mean time fell from 10 min 37 s with the traditional method to 2 min 58 s with the QR Code, a 72.0 % reduction, and all participants were faster with the data sheet; the estimated gain is about 1.53 h and R$ 21.91 per year per reducer, a value that grows with the number of equipment items covered.</w:t>
+        <w:t>This work presents the development and evaluation of a QR Code-based digital system to support mechanics in identifying and correctly applying the lubricant of a WEG-Cestari Magma M worm gear reducer, with a 1:25 ratio, oil-bath lubricated with ISO VG 460 synthetic PAO oil, belonging to the mechanical workshop of SENAI Três Lagoas. The study is motivated by the time spent during maintenance searching for information such as lubricant type, viscosity, volume and the location of fill, drain and level points, as well as by the risk of application errors, especially the mixing of incompatible oils. The solution consists of a durable label placed next to the equipment that gives access, through a smartphone or tablet, to a concise data sheet with lubrication data, safety alerts, a step-by-step oil change guide with photographs of the reducer itself, a three-dimensional model showing the lubrication points, an oil container check and an intervention record. The reducer data were obtained from its nameplate, from the manufacturer's manual and from a survey of the equipment itself, and the time gain was assessed by time measurements in a teaching environment: five participants had the total time of the identification, point location and recording steps measured, consulting the nameplate and the manufacturer's manual (traditional method) and the data sheet accessed by the QR Code. The data allow the calculation of the percentage time reduction, the annual gain and an estimate of financial return, relating them to the execution time of preventive maintenance and to the principles of Total Productive Maintenance. The mean time fell from 10 min 35 s with the traditional method to 2 min 58 s with the QR Code, a 71.9 % reduction, and all participants were faster with the data sheet; the estimated gain is about 1.52 h and R$ 21.80 per year per reducer, a value that grows with the number of equipment items covered.</w:t>
       </w:r>
     </w:p>
     <w:p>
@@ -8055,7 +8055,7 @@
             </w:pPr>
             <w:r>
               <w:rPr/>
-              <w:t>514,64</w:t>
+              <w:t>503,27</w:t>
             </w:r>
           </w:p>
         </w:tc>
@@ -8093,7 +8093,7 @@
             </w:pPr>
             <w:r>
               <w:rPr/>
-              <w:t>301,43</w:t>
+              <w:t>290,06</w:t>
             </w:r>
           </w:p>
         </w:tc>
@@ -8112,7 +8112,7 @@
             </w:pPr>
             <w:r>
               <w:rPr/>
-              <w:t>58,6</w:t>
+              <w:t>57,6</w:t>
             </w:r>
           </w:p>
         </w:tc>
@@ -8619,7 +8619,7 @@
             </w:pPr>
             <w:r>
               <w:rPr/>
-              <w:t>637,11</w:t>
+              <w:t>634,84</w:t>
             </w:r>
           </w:p>
         </w:tc>
@@ -8661,7 +8661,7 @@
             </w:pPr>
             <w:r>
               <w:rPr/>
-              <w:t>458,96</w:t>
+              <w:t>456,69</w:t>
             </w:r>
           </w:p>
         </w:tc>
@@ -8682,7 +8682,7 @@
             </w:pPr>
             <w:r>
               <w:rPr/>
-              <w:t>72,0</w:t>
+              <w:t>71,9</w:t>
             </w:r>
           </w:p>
         </w:tc>
@@ -8968,7 +8968,7 @@
             </w:pPr>
             <w:r>
               <w:rPr/>
-              <w:t>637,1</w:t>
+              <w:t>634,8</w:t>
             </w:r>
           </w:p>
         </w:tc>
@@ -8987,7 +8987,7 @@
             </w:pPr>
             <w:r>
               <w:rPr/>
-              <w:t>10:37</w:t>
+              <w:t>10:35</w:t>
             </w:r>
           </w:p>
         </w:tc>
@@ -9006,7 +9006,7 @@
             </w:pPr>
             <w:r>
               <w:rPr/>
-              <w:t>514,6</w:t>
+              <w:t>503,3</w:t>
             </w:r>
           </w:p>
         </w:tc>
@@ -9414,7 +9414,7 @@
             </w:pPr>
             <w:r>
               <w:rPr/>
-              <w:t>10 min 37 s</w:t>
+              <w:t>10 min 35 s</w:t>
             </w:r>
           </w:p>
         </w:tc>
@@ -9452,7 +9452,7 @@
             </w:pPr>
             <w:r>
               <w:rPr/>
-              <w:t>7 min 39 s</w:t>
+              <w:t>7 min 37 s</w:t>
             </w:r>
           </w:p>
         </w:tc>
@@ -9545,7 +9545,7 @@
             </w:pPr>
             <w:r>
               <w:rPr/>
-              <w:t>1,53 h</w:t>
+              <w:t>1,52 h</w:t>
             </w:r>
           </w:p>
         </w:tc>
@@ -9600,7 +9600,7 @@
             </w:pPr>
             <w:r>
               <w:rPr/>
-              <w:t>R$ 30,41</w:t>
+              <w:t>R$ 30,30</w:t>
             </w:r>
           </w:p>
         </w:tc>
@@ -9638,7 +9638,7 @@
             </w:pPr>
             <w:r>
               <w:rPr/>
-              <w:t>R$ 21,91</w:t>
+              <w:t>R$ 21,80</w:t>
             </w:r>
           </w:p>
         </w:tc>
@@ -9739,7 +9739,7 @@
             </w:pPr>
             <w:r>
               <w:rPr/>
-              <w:t>72,0 %</w:t>
+              <w:t>71,9 %</w:t>
             </w:r>
           </w:p>
         </w:tc>
@@ -9786,7 +9786,7 @@
       </w:pPr>
       <w:r>
         <w:rPr/>
-        <w:t>Todos os participantes foram mais rápidos com o QR Code. O tempo médio caiu de 637,1 s (10 min 37 s) no método tradicional para 178,2 s (2 min 58 s) com o QR Code, uma redução de 72,0 %, ou cerca de 7 min 39 s por intervenção. A redução individual variou de 58,6 % a 80,6 %, e os tempos ficaram mais próximos entre si com o QR Code (de 141 a 213 s) do que no método tradicional (de 515 a 726 s), o que indica que a ficha torna a tarefa mais padronizada e menos dependente de quem a executa. Como só o tempo total foi registrado, não é possível dizer em qual etapa houve a maior redução. Aplicado às 12 intervenções anuais, o ganho é de cerca de 1,53 h por ano e por redutor, que, ao custo de R$ 14,32 por hora do mecânico, corresponde a aproximadamente R$ 21,91 por ano (Tabela 3). O custo de implantação também é baixo: a página foi publicada em um serviço de hospedagem gratuito, e no protótipo, a etiqueta não teve custo para a equipe: foi impressa em papel comum, em impressão cedida, e fixada com fita crepe branca. Em uso permanente, recomenda-se plastificá-la ou usar material resistente a óleo e à limpeza, ainda de baixo custo. Assim, o retorno de um único redutor é pequeno em valor, mas positivo, e cresce com o número de equipamentos: para 100 equipamentos, o ganho estimado é de cerca de R$ 2.191 por ano, sem contar o custo da produção parada quando a busca de informações ocorre com o equipamento desligado.</w:t>
+        <w:t>Todos os participantes foram mais rápidos com o QR Code. O tempo médio caiu de 634,8 s (10 min 35 s) no método tradicional para 178,2 s (2 min 58 s) com o QR Code, uma redução de 71,9 %, ou cerca de 7 min 37 s por intervenção. A redução individual variou de 57,6 % a 80,6 %, e os tempos ficaram mais próximos entre si com o QR Code (de 141 a 213 s) do que no método tradicional (de 503 a 726 s), o que indica que a ficha torna a tarefa mais padronizada e menos dependente de quem a executa. Como só o tempo total foi registrado, não é possível dizer em qual etapa houve a maior redução. Aplicado às 12 intervenções anuais, o ganho é de cerca de 1,52 h por ano e por redutor, que, ao custo de R$ 14,32 por hora do mecânico, corresponde a aproximadamente R$ 21,80 por ano (Tabela 3). O custo de implantação também é baixo: a página foi publicada em um serviço de hospedagem gratuito, e no protótipo, a etiqueta não teve custo para a equipe: foi impressa em papel comum, em impressão cedida, e fixada com fita crepe branca. Em uso permanente, recomenda-se plastificá-la ou usar material resistente a óleo e à limpeza, ainda de baixo custo. Assim, o retorno de um único redutor é pequeno em valor, mas positivo, e cresce com o número de equipamentos: para 100 equipamentos, o ganho estimado é de cerca de R$ 2.180 por ano, sem contar o custo da produção parada quando a busca de informações ocorre com o equipamento desligado.</w:t>
       </w:r>
     </w:p>
     <w:p>
@@ -9875,7 +9875,7 @@
       </w:pPr>
       <w:r>
         <w:rPr/>
-        <w:t>O trabalho teve como objetivo reduzir o tempo do mecânico na identificação e no registro da lubrificação de um redutor de coroa e rosca sem fim WEG-Cestari, da linha Magma M, por meio de um QR Code fixado no equipamento. Os resultados respondem ao problema de pesquisa: com a ficha acessada pelo QR Code, o tempo médio para identificar o lubrificante, localizar os pontos e registrar a intervenção caiu de 10 min 37 s para 2 min 58 s, uma redução de 72,0 %, e todos os cinco participantes foram mais rápidos com o QR Code. O objetivo foi, portanto, atingido.</w:t>
+        <w:t>O trabalho teve como objetivo reduzir o tempo do mecânico na identificação e no registro da lubrificação de um redutor de coroa e rosca sem fim WEG-Cestari, da linha Magma M, por meio de um QR Code fixado no equipamento. Os resultados respondem ao problema de pesquisa: com a ficha acessada pelo QR Code, o tempo médio para identificar o lubrificante, localizar os pontos e registrar a intervenção caiu de 10 min 35 s para 2 min 58 s, uma redução de 71,9 %, e todos os cinco participantes foram mais rápidos com o QR Code. O objetivo foi, portanto, atingido.</w:t>
       </w:r>
     </w:p>
     <w:p>
@@ -9889,7 +9889,7 @@
       </w:pPr>
       <w:r>
         <w:rPr/>
-        <w:t>A solução mostrou-se simples de implantar, por utilizar uma página web acessada pelo celular e uma etiqueta de baixo custo, e coerente com os princípios de Gestão Visual e de TPM. Em um único redutor, o ganho estimado é modesto – cerca de 1,53 h e R$ 21,91 por ano no tempo do mecânico –, mas o benefício cresce com o número de equipamentos atendidos. Além do tempo, a ficha padroniza o acesso às informações, reduz o risco de aplicar o óleo errado, gera um histórico de intervenções para o PCM e passou a mostrar a situação da última análise do óleo. Os resultados devem ser lidos considerando que a cronometragem foi feita em ambiente didático, com poucos participantes, que executaram primeiro o método tradicional.</w:t>
+        <w:t>A solução mostrou-se simples de implantar, por utilizar uma página web acessada pelo celular e uma etiqueta de baixo custo, e coerente com os princípios de Gestão Visual e de TPM. Em um único redutor, o ganho estimado é modesto – cerca de 1,52 h e R$ 21,80 por ano no tempo do mecânico –, mas o benefício cresce com o número de equipamentos atendidos. Além do tempo, a ficha padroniza o acesso às informações, reduz o risco de aplicar o óleo errado, gera um histórico de intervenções para o PCM e passou a mostrar a situação da última análise do óleo. Os resultados devem ser lidos considerando que a cronometragem foi feita em ambiente didático, com poucos participantes, que executaram primeiro o método tradicional.</w:t>
       </w:r>
     </w:p>
     <w:p>

</xml_diff>

<commit_message>
Análise do óleo lançada pelo laboratório no SAP: TOR-001 sem formulário, doc 2.2.2 e slides 10/15
TOR-001 também só leitura (fonte sap) com documento IK11 simulado; cache v60. Documento: o
mecânico só coleta a amostra, o laboratório lança no SAP e a ficha puxa. Slide 15 com o novo
fluxo; slide 10 com a vista em corte mostrando o óleo no nível. PPTX regerado.

Co-Authored-By: Claude Opus 5.5 <noreply@anthropic.com>
</commit_message>
<xml_diff>
--- a/Projeto_Integrador_QRCode_Lubrificantes.docx
+++ b/Projeto_Integrador_QRCode_Lubrificantes.docx
@@ -1466,7 +1466,7 @@
           <w:sz w:val="24"/>
           <w:szCs w:val="24"/>
         </w:rPr>
-        <w:t>25</w:t>
+        <w:t>26</w:t>
       </w:r>
       <w:r>
         <w:rPr>
@@ -3384,7 +3384,7 @@
           <w:sz w:val="24"/>
           <w:szCs w:val="24"/>
         </w:rPr>
-        <w:t>24</w:t>
+        <w:t>25</w:t>
       </w:r>
       <w:r>
         <w:rPr>
@@ -4439,7 +4439,7 @@
       </w:pPr>
       <w:r>
         <w:rPr/>
-        <w:t>A metodologia consistiu em quatro etapas: levantamento dos dados do redutor na placa de identificação, no manual do fabricante e no próprio equipamento, onde foram identificados e fotografados os pontos de enchimento, nível e dreno; desenvolvimento de uma ficha digital simples, acessada pelo navegador do celular; geração e impressão da etiqueta de QR Code; e cronometragem das etapas de lubrificação nos dois métodos, com cinco participantes e ordem contrabalanceada, seguida do cálculo da redução de tempo e de uma estimativa de retorno financeiro. O detalhamento está na seção 2.2.</w:t>
+        <w:t>A metodologia consistiu em quatro etapas: levantamento dos dados do redutor na placa de identificação, no manual do fabricante e no próprio equipamento, onde foram identificados e fotografados os pontos de enchimento, nível e dreno; desenvolvimento de uma ficha digital simples, acessada pelo navegador do celular; geração e impressão da etiqueta de QR Code; e cronometragem das etapas de lubrificação nos dois métodos, com cinco participantes, que executaram primeiro o método tradicional, seguida do cálculo da redução de tempo e de uma estimativa de retorno financeiro. O detalhamento está na seção 2.2.</w:t>
       </w:r>
       <w:r>
         <w:br w:type="page"/>
@@ -7060,7 +7060,7 @@
       </w:r>
       <w:r>
         <w:rPr/>
-        <w:t xml:space="preserve"> Neste trabalho, a análise laboratorial não foi incluída: a condição do óleo é acompanhada pela observação do óleo retirado na troca (cor, transparência e presença de partículas), pela temperatura da carcaça e pelas horas de uso, e o passo a passo da troca orienta o mecânico sobre o que cada aspecto pode indicar.</w:t>
+        <w:t xml:space="preserve"> Neste trabalho, o óleo do próprio redutor não foi analisado em laboratório (a análise foi praticada em um ensaio de aprendizagem, descrito adiante): a condição do óleo é acompanhada pela observação do óleo retirado na troca (cor, transparência e presença de partículas), pela temperatura da carcaça e pelas horas de uso, e o passo a passo da troca orienta o mecânico sobre o que cada aspecto pode indicar.</w:t>
       </w:r>
     </w:p>
     <w:p>
@@ -7144,7 +7144,7 @@
       </w:pPr>
       <w:r>
         <w:rPr/>
-        <w:t>Para aprender o método de acompanhamento da condição do óleo, a equipe fez, no laboratório do SENAI Três Lagoas, com o auxílio do professor João Vitor de Moura Barbosa, um ensaio de viscosidade com um viscosímetro rotacional digital (Marte MVD-8): mediu o óleo novo e o óleo usado drenado de um torno da oficina, ambos Ipiranga Ipitur HLP ISO VG 68. Como as amostras estavam em temperaturas diferentes (22,7 °C e 27,3 °C), os valores foram levados à mesma temperatura pela curva viscosidade × temperatura do óleo, calculada pela equação de Walther (ASTM D341) com os dados da ficha técnica do fabricante. O óleo novo medido ficou cerca de 8 % abaixo do valor típico informado na ficha técnica (≈ 66 cSt estimados a 40 °C, contra 70,9 cSt), dentro da faixa do grau ISO VG 68 (61,2 a 74,8 cSt), o que confirmou o óleo indicado na embalagem. O óleo usado apresentou viscosidade cerca de 17 % menor que a do óleo novo, além de aspecto esverdeado e turvo e depósito no fundo do béquer, indícios de contaminação. A partir desse ensaio, a ficha do redutor passou a mostrar, logo abaixo da vida útil do óleo, um cartão “Última análise do óleo” com semáforo, segundo critério adotado pelos autores e usual em programas de análise de óleo: variação de viscosidade de até 10 % em relação ao óleo novo, normal; de 10 a 20 %, atenção; acima de 20 %, crítico. Enquanto o óleo do próprio redutor não é analisado – a amostra será coletada na próxima troca, já que a carga é de apenas 0,87 L –, o cartão exibe o ensaio de aprendizagem, identificado como tal, e permite registrar a primeira análise do redutor, cuja variação é calculada pela própria ficha.</w:t>
+        <w:t>Para aprender o método de acompanhamento da condição do óleo, a equipe fez, no laboratório do SENAI Três Lagoas, com o auxílio do professor João Vitor de Moura Barbosa, um ensaio de viscosidade com um viscosímetro rotacional digital (Marte MVD-8): mediu o óleo novo e o óleo usado drenado de um torno da oficina, ambos Ipiranga Ipitur HLP ISO VG 68. Como as amostras estavam em temperaturas diferentes (22,7 °C e 27,3 °C), os valores foram levados à mesma temperatura pela curva viscosidade × temperatura do óleo, calculada pela equação de Walther (ASTM D341) com os dados da ficha técnica do fabricante. O óleo novo medido ficou cerca de 8 % abaixo do valor típico informado na ficha técnica (≈ 66 cSt estimados a 40 °C, contra 70,9 cSt), dentro da faixa do grau ISO VG 68 (61,2 a 74,8 cSt), o que confirmou o óleo indicado na embalagem. O óleo usado apresentou viscosidade cerca de 17 % menor que a do óleo novo, além de aspecto esverdeado e turvo e depósito no fundo do béquer, indícios de contaminação. A partir desse ensaio, a ficha do redutor passou a mostrar, logo abaixo da vida útil do óleo, um cartão “Última análise do óleo” com semáforo, segundo critério adotado pelos autores e usual em programas de análise de óleo: variação de viscosidade de até 10 % em relação ao óleo novo, normal; de 10 a 20 %, atenção; acima de 20 %, crítico. Enquanto o óleo do próprio redutor não é analisado – a amostra será coletada na próxima troca, já que a carga é de apenas 0,87 L –, o cartão exibe o ensaio de aprendizagem, identificado como tal. O mecânico não registra análises na ficha: na troca, ele apenas coleta a amostra pelo dreno e a envia ao laboratório identificada com o tag do equipamento; o laboratório lança o resultado no SAP, como documento de medição, e a ficha busca esse resultado e calcula a variação e o semáforo. No protótipo, essa integração é simulada na tela.</w:t>
       </w:r>
     </w:p>
     <w:p>
@@ -10313,7 +10313,7 @@
           <w:sz w:val="20"/>
           <w:szCs w:val="20"/>
         </w:rPr>
-        <w:t>Redutor: WEG-Cestari Magma M 06, 1:25 – posição vertical (RED-001) Local: ____________________ Data: ____/____/______</w:t>
+        <w:t>Redutor: WEG-Cestari Magma M 06, 1:25 – posição vertical (RED-001) Local: oficina de mecânica do SENAI Três Lagoas Data: outubro de 2026</w:t>
       </w:r>
     </w:p>
     <w:p>
@@ -10330,7 +10330,7 @@
           <w:sz w:val="20"/>
           <w:szCs w:val="20"/>
         </w:rPr>
-        <w:t>Ordem: participantes 1, 3 e 5 começam pelo método tradicional; participantes 2 e 4 começam pelo método com QR Code.</w:t>
+        <w:t>Ordem prevista: participantes 1, 3 e 5 começariam pelo método tradicional e 2 e 4 pelo método com QR Code; na execução, os participantes começaram pelo método tradicional (seção 2.2.3). Foi registrado apenas o tempo total de cada método; as etapas A, B e C não foram cronometradas separadamente (–).</w:t>
       </w:r>
     </w:p>
     <w:p>
@@ -10616,6 +10616,7 @@
             </w:pPr>
             <w:r>
               <w:rPr/>
+              <w:t>–</w:t>
             </w:r>
           </w:p>
         </w:tc>
@@ -10639,6 +10640,7 @@
             </w:pPr>
             <w:r>
               <w:rPr/>
+              <w:t>–</w:t>
             </w:r>
           </w:p>
         </w:tc>
@@ -10662,6 +10664,7 @@
             </w:pPr>
             <w:r>
               <w:rPr/>
+              <w:t>–</w:t>
             </w:r>
           </w:p>
         </w:tc>
@@ -10685,6 +10688,7 @@
             </w:pPr>
             <w:r>
               <w:rPr/>
+              <w:t>503,27</w:t>
             </w:r>
           </w:p>
         </w:tc>
@@ -10747,6 +10751,7 @@
             </w:pPr>
             <w:r>
               <w:rPr/>
+              <w:t>–</w:t>
             </w:r>
           </w:p>
         </w:tc>
@@ -10770,6 +10775,7 @@
             </w:pPr>
             <w:r>
               <w:rPr/>
+              <w:t>–</w:t>
             </w:r>
           </w:p>
         </w:tc>
@@ -10793,6 +10799,7 @@
             </w:pPr>
             <w:r>
               <w:rPr/>
+              <w:t>–</w:t>
             </w:r>
           </w:p>
         </w:tc>
@@ -10816,6 +10823,7 @@
             </w:pPr>
             <w:r>
               <w:rPr/>
+              <w:t>643,84</w:t>
             </w:r>
           </w:p>
         </w:tc>
@@ -10878,6 +10886,7 @@
             </w:pPr>
             <w:r>
               <w:rPr/>
+              <w:t>–</w:t>
             </w:r>
           </w:p>
         </w:tc>
@@ -10901,6 +10910,7 @@
             </w:pPr>
             <w:r>
               <w:rPr/>
+              <w:t>–</w:t>
             </w:r>
           </w:p>
         </w:tc>
@@ -10924,6 +10934,7 @@
             </w:pPr>
             <w:r>
               <w:rPr/>
+              <w:t>–</w:t>
             </w:r>
           </w:p>
         </w:tc>
@@ -10947,6 +10958,7 @@
             </w:pPr>
             <w:r>
               <w:rPr/>
+              <w:t>726,26</w:t>
             </w:r>
           </w:p>
         </w:tc>
@@ -11009,6 +11021,7 @@
             </w:pPr>
             <w:r>
               <w:rPr/>
+              <w:t>–</w:t>
             </w:r>
           </w:p>
         </w:tc>
@@ -11032,6 +11045,7 @@
             </w:pPr>
             <w:r>
               <w:rPr/>
+              <w:t>–</w:t>
             </w:r>
           </w:p>
         </w:tc>
@@ -11055,6 +11069,7 @@
             </w:pPr>
             <w:r>
               <w:rPr/>
+              <w:t>–</w:t>
             </w:r>
           </w:p>
         </w:tc>
@@ -11078,6 +11093,7 @@
             </w:pPr>
             <w:r>
               <w:rPr/>
+              <w:t>654,55</w:t>
             </w:r>
           </w:p>
         </w:tc>
@@ -11140,6 +11156,7 @@
             </w:pPr>
             <w:r>
               <w:rPr/>
+              <w:t>–</w:t>
             </w:r>
           </w:p>
         </w:tc>
@@ -11163,6 +11180,7 @@
             </w:pPr>
             <w:r>
               <w:rPr/>
+              <w:t>–</w:t>
             </w:r>
           </w:p>
         </w:tc>
@@ -11186,6 +11204,7 @@
             </w:pPr>
             <w:r>
               <w:rPr/>
+              <w:t>–</w:t>
             </w:r>
           </w:p>
         </w:tc>
@@ -11209,6 +11228,7 @@
             </w:pPr>
             <w:r>
               <w:rPr/>
+              <w:t>646,28</w:t>
             </w:r>
           </w:p>
         </w:tc>
@@ -11271,6 +11291,7 @@
             </w:pPr>
             <w:r>
               <w:rPr/>
+              <w:t>–</w:t>
             </w:r>
           </w:p>
         </w:tc>
@@ -11294,6 +11315,7 @@
             </w:pPr>
             <w:r>
               <w:rPr/>
+              <w:t>–</w:t>
             </w:r>
           </w:p>
         </w:tc>
@@ -11317,6 +11339,7 @@
             </w:pPr>
             <w:r>
               <w:rPr/>
+              <w:t>–</w:t>
             </w:r>
           </w:p>
         </w:tc>
@@ -11340,6 +11363,7 @@
             </w:pPr>
             <w:r>
               <w:rPr/>
+              <w:t>634,84</w:t>
             </w:r>
           </w:p>
         </w:tc>
@@ -11628,6 +11652,7 @@
             </w:pPr>
             <w:r>
               <w:rPr/>
+              <w:t>–</w:t>
             </w:r>
           </w:p>
         </w:tc>
@@ -11651,6 +11676,7 @@
             </w:pPr>
             <w:r>
               <w:rPr/>
+              <w:t>–</w:t>
             </w:r>
           </w:p>
         </w:tc>
@@ -11674,6 +11700,7 @@
             </w:pPr>
             <w:r>
               <w:rPr/>
+              <w:t>–</w:t>
             </w:r>
           </w:p>
         </w:tc>
@@ -11697,6 +11724,7 @@
             </w:pPr>
             <w:r>
               <w:rPr/>
+              <w:t>213,21</w:t>
             </w:r>
           </w:p>
         </w:tc>
@@ -11759,6 +11787,7 @@
             </w:pPr>
             <w:r>
               <w:rPr/>
+              <w:t>–</w:t>
             </w:r>
           </w:p>
         </w:tc>
@@ -11782,6 +11811,7 @@
             </w:pPr>
             <w:r>
               <w:rPr/>
+              <w:t>–</w:t>
             </w:r>
           </w:p>
         </w:tc>
@@ -11805,6 +11835,7 @@
             </w:pPr>
             <w:r>
               <w:rPr/>
+              <w:t>–</w:t>
             </w:r>
           </w:p>
         </w:tc>
@@ -11828,6 +11859,7 @@
             </w:pPr>
             <w:r>
               <w:rPr/>
+              <w:t>180,08</w:t>
             </w:r>
           </w:p>
         </w:tc>
@@ -11890,6 +11922,7 @@
             </w:pPr>
             <w:r>
               <w:rPr/>
+              <w:t>–</w:t>
             </w:r>
           </w:p>
         </w:tc>
@@ -11913,6 +11946,7 @@
             </w:pPr>
             <w:r>
               <w:rPr/>
+              <w:t>–</w:t>
             </w:r>
           </w:p>
         </w:tc>
@@ -11936,6 +11970,7 @@
             </w:pPr>
             <w:r>
               <w:rPr/>
+              <w:t>–</w:t>
             </w:r>
           </w:p>
         </w:tc>
@@ -11959,6 +11994,7 @@
             </w:pPr>
             <w:r>
               <w:rPr/>
+              <w:t>141,18</w:t>
             </w:r>
           </w:p>
         </w:tc>
@@ -12021,6 +12057,7 @@
             </w:pPr>
             <w:r>
               <w:rPr/>
+              <w:t>–</w:t>
             </w:r>
           </w:p>
         </w:tc>
@@ -12044,6 +12081,7 @@
             </w:pPr>
             <w:r>
               <w:rPr/>
+              <w:t>–</w:t>
             </w:r>
           </w:p>
         </w:tc>
@@ -12067,6 +12105,7 @@
             </w:pPr>
             <w:r>
               <w:rPr/>
+              <w:t>–</w:t>
             </w:r>
           </w:p>
         </w:tc>
@@ -12090,6 +12129,7 @@
             </w:pPr>
             <w:r>
               <w:rPr/>
+              <w:t>178,34</w:t>
             </w:r>
           </w:p>
         </w:tc>
@@ -12152,6 +12192,7 @@
             </w:pPr>
             <w:r>
               <w:rPr/>
+              <w:t>–</w:t>
             </w:r>
           </w:p>
         </w:tc>
@@ -12175,6 +12216,7 @@
             </w:pPr>
             <w:r>
               <w:rPr/>
+              <w:t>–</w:t>
             </w:r>
           </w:p>
         </w:tc>
@@ -12198,6 +12240,7 @@
             </w:pPr>
             <w:r>
               <w:rPr/>
+              <w:t>–</w:t>
             </w:r>
           </w:p>
         </w:tc>
@@ -12221,6 +12264,7 @@
             </w:pPr>
             <w:r>
               <w:rPr/>
+              <w:t>177,94</w:t>
             </w:r>
           </w:p>
         </w:tc>
@@ -12283,6 +12327,7 @@
             </w:pPr>
             <w:r>
               <w:rPr/>
+              <w:t>–</w:t>
             </w:r>
           </w:p>
         </w:tc>
@@ -12306,6 +12351,7 @@
             </w:pPr>
             <w:r>
               <w:rPr/>
+              <w:t>–</w:t>
             </w:r>
           </w:p>
         </w:tc>
@@ -12329,6 +12375,7 @@
             </w:pPr>
             <w:r>
               <w:rPr/>
+              <w:t>–</w:t>
             </w:r>
           </w:p>
         </w:tc>
@@ -12352,6 +12399,7 @@
             </w:pPr>
             <w:r>
               <w:rPr/>
+              <w:t>178,15</w:t>
             </w:r>
           </w:p>
         </w:tc>

</xml_diff>

<commit_message>
Separa os projetos: Inspeção fica RED-001 e Lubrificação vira RED-002, no mesmo site
Cadastro próprio do RED-002, /l/RED-001 redireciona, registros do aparelho migram, novas etiquetas e
QR. Documento e slides atualizados. Cache v63.

Co-Authored-By: Claude Opus 5.5 <noreply@anthropic.com>
</commit_message>
<xml_diff>
--- a/Projeto_Integrador_QRCode_Lubrificantes.docx
+++ b/Projeto_Integrador_QRCode_Lubrificantes.docx
@@ -1089,7 +1089,7 @@
           <w:sz w:val="24"/>
           <w:szCs w:val="24"/>
         </w:rPr>
-        <w:t>Quadro 2 – Ficha de lubrificação do redutor RED-001</w:t>
+        <w:t>Quadro 2 – Ficha de lubrificação do redutor RED-002</w:t>
       </w:r>
       <w:r>
         <w:rPr>
@@ -1217,7 +1217,7 @@
           <w:sz w:val="24"/>
           <w:szCs w:val="24"/>
         </w:rPr>
-        <w:t>Figura 2 – Telas da ficha digital do redutor RED-001</w:t>
+        <w:t>Figura 2 – Telas da ficha digital do redutor RED-002</w:t>
       </w:r>
       <w:r>
         <w:rPr>
@@ -1281,7 +1281,7 @@
           <w:sz w:val="24"/>
           <w:szCs w:val="24"/>
         </w:rPr>
-        <w:t>Figura 3 – Vista explodida e em corte do redutor RED-001</w:t>
+        <w:t>Figura 3 – Vista explodida e em corte do redutor RED-002</w:t>
       </w:r>
       <w:r>
         <w:rPr>
@@ -1345,7 +1345,7 @@
           <w:sz w:val="24"/>
           <w:szCs w:val="24"/>
         </w:rPr>
-        <w:t>Quadro 4 – Componentes do redutor RED-001 e tags</w:t>
+        <w:t>Quadro 4 – Componentes do redutor RED-002 e tags</w:t>
       </w:r>
       <w:r>
         <w:rPr>
@@ -6057,7 +6057,7 @@
           <w:sz w:val="20"/>
           <w:szCs w:val="20"/>
         </w:rPr>
-        <w:t>Quadro 2 – Ficha de lubrificação do redutor RED-001</w:t>
+        <w:t>Quadro 2 – Ficha de lubrificação do redutor RED-002</w:t>
       </w:r>
     </w:p>
     <w:tbl>
@@ -6225,7 +6225,7 @@
                 <w:sz w:val="20"/>
                 <w:szCs w:val="20"/>
               </w:rPr>
-              <w:t>Redutor coroa e rosca WEG-Cestari, linha Magma M, tamanho 06, relação 1:25 / RED-001</w:t>
+              <w:t>Redutor coroa e rosca WEG-Cestari, linha Magma M, tamanho 06, relação 1:25 / RED-002</w:t>
             </w:r>
           </w:p>
         </w:tc>
@@ -6833,7 +6833,7 @@
                 <w:sz w:val="20"/>
                 <w:szCs w:val="20"/>
               </w:rPr>
-              <w:t>Tag RED-001-OLE-04; galão identificado pela cor laranja (código e cor fictícios, adotados como exemplo)</w:t>
+              <w:t>Tag RED-002-OLE-04; galão identificado pela cor laranja (código e cor fictícios, adotados como exemplo)</w:t>
             </w:r>
           </w:p>
         </w:tc>
@@ -6998,7 +6998,7 @@
       </w:r>
       <w:r>
         <w:rPr/>
-        <w:t xml:space="preserve"> para conferir o nível ou completar o óleo, a intervenção é registrada como complemento. Há um campo opcional para a temperatura da carcaça, e o nome do responsável fica memorizado no aparelho. O histórico dos últimos registros fica recolhido na tela, para não atrapalhar a consulta. O QR Code é gerado a partir do endereço da página de cada equipamento; como a lubrificação e a inspeção do redutor são trabalhos de projetos integradores diferentes, cada uma tem o seu QR Code, que abre diretamente a parte correspondente.</w:t>
+        <w:t xml:space="preserve"> para conferir o nível ou completar o óleo, a intervenção é registrada como complemento. Há um campo opcional para a temperatura da carcaça, e o nome do responsável fica memorizado no aparelho. O histórico dos últimos registros fica recolhido na tela, para não atrapalhar a consulta. O QR Code é gerado a partir do endereço da página de cada equipamento; como a lubrificação e a inspeção do redutor são trabalhos de projetos integradores diferentes, cada uma tem o seu código e o seu QR Code, no mesmo site: a lubrificação usa RED-002 e a inspeção, RED-001.</w:t>
       </w:r>
     </w:p>
     <w:p>
@@ -7036,7 +7036,7 @@
       </w:pPr>
       <w:r>
         <w:rPr/>
-        <w:t>Além da lubrificação, o mesmo site reúne o roteiro de inspeção do redutor, desenvolvido em outro projeto integrador, com um modelo tridimensional das peças e uma lista de verificação. Quando o horímetro é informado nessa inspeção, a página calcula as horas trabalhadas desde a inspeção anterior e, no modo com horímetro, soma esse valor às horas de uso do óleo.</w:t>
+        <w:t>Além da lubrificação, o mesmo site reúne o roteiro de inspeção do redutor, desenvolvido em outro projeto integrador, com um modelo tridimensional das peças e uma lista de verificação. Quando o horímetro é informado nessa inspeção, a página calcula as horas trabalhadas desde a inspeção anterior.</w:t>
       </w:r>
     </w:p>
     <w:p>
@@ -7088,7 +7088,7 @@
       </w:pPr>
       <w:r>
         <w:rPr/>
-        <w:t>A ficha também informa como requisitar o lubrificante ao almoxarifado. Cada óleo recebe um tag no mesmo padrão dos tags das peças mostrados no roteiro de inspeção, formado pelo tag do equipamento (RED-001) e pelo código do item (OLE-04), resultando em RED-001-OLE-04, e uma cor, que é a mesma do galão em que o produto é armazenado. O código OLE-04 e a cor laranja são fictícios, adotados como exemplo neste estudo; em uma implantação real, devem seguir o padrão de codificação e de cores do almoxarifado da empresa. O tag e a cor aparecem na ficha, na orientação de troca e na etiqueta fixada no equipamento, o que reduz o risco de aplicação de um produto incorreto.</w:t>
+        <w:t>A ficha também informa como requisitar o lubrificante ao almoxarifado. Cada óleo recebe um tag no mesmo padrão dos tags das peças mostrados no roteiro de inspeção, formado pelo tag do equipamento (RED-002) e pelo código do item (OLE-04), resultando em RED-002-OLE-04, e uma cor, que é a mesma do galão em que o produto é armazenado. O código OLE-04 e a cor laranja são fictícios, adotados como exemplo neste estudo; em uma implantação real, devem seguir o padrão de codificação e de cores do almoxarifado da empresa. O tag e a cor aparecem na ficha, na orientação de troca e na etiqueta fixada no equipamento, o que reduz o risco de aplicação de um produto incorreto.</w:t>
       </w:r>
     </w:p>
     <w:p>
@@ -7130,7 +7130,7 @@
       </w:pPr>
       <w:r>
         <w:rPr/>
-        <w:t>Como a equipe não teve acesso ao manual de peças do fabricante, o mesmo modelo foi ampliado para servir de referência dos componentes do redutor. Na vista explodida, as peças se afastam da carcaça e recebem um número; ao tocar no número ou na peça, a ficha mostra o nome, o tipo, o material, a função, o que observar na inspeção e as falhas mais comuns, além do tag do componente, formado pelo tag do equipamento e pelo código da peça (por exemplo, RED-001-COR-01 para a coroa). Uma vista em corte deixa a carcaça transparente e mostra a coroa de bronze, a rosca sem fim, os rolamentos e os eixos. As peças externas foram desenhadas a partir das fotografias e das medidas do redutor da oficina; as internas seguem o arranjo usual de um redutor coroa e rosca e são ilustrativas, devendo ter quantidades, medidas e códigos confirmados em uma desmontagem. A vista explodida e a lista de componentes com os tags estão no Apêndice D (Figura 3 e Quadro 4).</w:t>
+        <w:t>Como a equipe não teve acesso ao manual de peças do fabricante, o mesmo modelo foi ampliado para servir de referência dos componentes do redutor. Na vista explodida, as peças se afastam da carcaça e recebem um número; ao tocar no número ou na peça, a ficha mostra o nome, o tipo, o material, a função, o que observar na inspeção e as falhas mais comuns, além do tag do componente, formado pelo tag do equipamento e pelo código da peça (por exemplo, RED-002-COR-01 para a coroa). Uma vista em corte deixa a carcaça transparente e mostra a coroa de bronze, a rosca sem fim, os rolamentos e os eixos. As peças externas foram desenhadas a partir das fotografias e das medidas do redutor da oficina; as internas seguem o arranjo usual de um redutor coroa e rosca e são ilustrativas, devendo ter quantidades, medidas e códigos confirmados em uma desmontagem. A vista explodida e a lista de componentes com os tags estão no Apêndice D (Figura 3 e Quadro 4).</w:t>
       </w:r>
     </w:p>
     <w:p>
@@ -10313,7 +10313,7 @@
           <w:sz w:val="20"/>
           <w:szCs w:val="20"/>
         </w:rPr>
-        <w:t>Redutor: WEG-Cestari Magma M 06, 1:25 – posição vertical (RED-001) Local: oficina de mecânica do SENAI Três Lagoas Data: outubro de 2026</w:t>
+        <w:t>Redutor: WEG-Cestari Magma M 06, 1:25 – posição vertical (RED-002) Local: oficina de mecânica do SENAI Três Lagoas Data: outubro de 2026</w:t>
       </w:r>
     </w:p>
     <w:p>
@@ -12495,7 +12495,7 @@
       </w:r>
       <w:r>
         <w:rPr/>
-        <w:t xml:space="preserve"> Como regra prática, a distância de leitura é de cerca de dez vezes o lado do código; um código de 3 cm × 3 cm permite leitura a aproximadamente 30 cm. Dimensão adotada: 3 cm × 3 cm. Endereço codificado: https://ficha-lubrificacao.vercel.app/l/RED-001. Além do QR Code e do código do equipamento, a etiqueta traz a cor do galão e o tag do óleo, com o nome da cor escrito por extenso, para que a identificação não dependa de impressão colorida. A etiqueta da inspeção, do outro projeto integrador, leva ao endereço https://ficha-lubrificacao.vercel.app/i/RED-001, e cada galão de óleo recebe uma etiqueta própria, com QR Code que abre a página do óleo e é usado na conferência do galão antes do abastecimento.</w:t>
+        <w:t xml:space="preserve"> Como regra prática, a distância de leitura é de cerca de dez vezes o lado do código; um código de 3 cm × 3 cm permite leitura a aproximadamente 30 cm. Dimensão adotada: 3 cm × 3 cm. Endereço codificado: https://ficha-lubrificacao.vercel.app/l/RED-002. Além do QR Code e do código do equipamento, a etiqueta traz a cor do galão e o tag do óleo, com o nome da cor escrito por extenso, para que a identificação não dependa de impressão colorida. A etiqueta da inspeção, do outro projeto integrador, leva ao endereço https://ficha-lubrificacao.vercel.app/i/RED-001, e cada galão de óleo recebe uma etiqueta própria, com QR Code que abre a página do óleo e é usado na conferência do galão antes do abastecimento.</w:t>
       </w:r>
       <w:r>
         <w:br w:type="page"/>
@@ -12545,7 +12545,7 @@
           <w:sz w:val="20"/>
           <w:szCs w:val="20"/>
         </w:rPr>
-        <w:t>Figura 2 – Telas da ficha digital do redutor RED-001: segurança e vida útil do óleo, com as datas da última e da próxima troca (à esquerda); modelo tridimensional com a localização do bujão de nível e a fotografia do redutor (ao centro); registro da intervenção (à direita)</w:t>
+        <w:t>Figura 2 – Telas da ficha digital do redutor RED-002: segurança e vida útil do óleo, com as datas da última e da próxima troca (à esquerda); modelo tridimensional com a localização do bujão de nível e a fotografia do redutor (ao centro); registro da intervenção (à direita)</w:t>
       </w:r>
     </w:p>
     <w:p>
@@ -12753,7 +12753,7 @@
       </w:pPr>
       <w:r>
         <w:rPr/>
-        <w:t>Sem o manual de peças do fabricante, os componentes do redutor RED-001 foram identificados no modelo tridimensional da ficha digital. A Figura 3 mostra o modelo em vista explodida, com os componentes numerados, e em corte; o Quadro 4 relaciona cada número ao componente e ao seu tag. O tag completo de cada componente é formado pelo tag do equipamento seguido do código da peça, por exemplo RED-001-COR-01.</w:t>
+        <w:t>Sem o manual de peças do fabricante, os componentes do redutor RED-002 foram identificados no modelo tridimensional da ficha digital. A Figura 3 mostra o modelo em vista explodida, com os componentes numerados, e em corte; o Quadro 4 relaciona cada número ao componente e ao seu tag. O tag completo de cada componente é formado pelo tag do equipamento seguido do código da peça, por exemplo RED-002-COR-01.</w:t>
       </w:r>
     </w:p>
     <w:p>
@@ -12779,7 +12779,7 @@
           <w:sz w:val="20"/>
           <w:szCs w:val="20"/>
         </w:rPr>
-        <w:t>Figura 3 – Modelo tridimensional do redutor RED-001: vista explodida com os componentes numerados (à esquerda) e vista em corte, com a carcaça transparente (à direita)</w:t>
+        <w:t>Figura 3 – Modelo tridimensional do redutor RED-002: vista explodida com os componentes numerados (à esquerda) e vista em corte, com a carcaça transparente (à direita)</w:t>
       </w:r>
     </w:p>
     <w:p>
@@ -12929,7 +12929,7 @@
           <w:sz w:val="20"/>
           <w:szCs w:val="20"/>
         </w:rPr>
-        <w:t>Quadro 4 – Componentes do redutor RED-001 e tags</w:t>
+        <w:t>Quadro 4 – Componentes do redutor RED-002 e tags</w:t>
       </w:r>
     </w:p>
     <w:tbl>

</xml_diff>